<commit_message>
add the highlights in sf doc.
</commit_message>
<xml_diff>
--- a/Salesforce_Notes.docx
+++ b/Salesforce_Notes.docx
@@ -11,6 +11,8 @@
       <w:r>
         <w:br/>
         <w:t>==============================</w:t>
+      </w:r>
+      <w:r>
         <w:br/>
       </w:r>
     </w:p>
@@ -62,7 +64,56 @@
     </w:p>
     <w:p>
       <w:r>
-        <w:t>Objects are connected through specific relationship types. Lookup relationships provide a loose link between two objects. Master-Detail relationships create a tight coupling where the child record's security and lifecycle are governed by the parent. Many-to-Many relationships are achieved using a third junction object with two master-detail fields.</w:t>
+        <w:t xml:space="preserve">Objects are connected through specific relationship types. </w:t>
+      </w:r>
+    </w:p>
+    <w:p>
+      <w:r>
+        <w:rPr>
+          <w:b/>
+          <w:bCs/>
+        </w:rPr>
+        <w:t>Lookup relationships</w:t>
+      </w:r>
+      <w:r>
+        <w:t xml:space="preserve"> provide a loose link between two objects. </w:t>
+      </w:r>
+    </w:p>
+    <w:p>
+      <w:r>
+        <w:rPr>
+          <w:b/>
+          <w:bCs/>
+        </w:rPr>
+        <w:t>Master-Detail relationships</w:t>
+      </w:r>
+      <w:r>
+        <w:t xml:space="preserve"> create a tight coupling where the child record's security and lifecycle are governed by the parent. </w:t>
+      </w:r>
+    </w:p>
+    <w:p>
+      <w:r>
+        <w:rPr>
+          <w:b/>
+          <w:bCs/>
+        </w:rPr>
+        <w:t xml:space="preserve">Many-to-Many relationships </w:t>
+      </w:r>
+      <w:r>
+        <w:t xml:space="preserve">are achieved </w:t>
+      </w:r>
+      <w:r>
+        <w:rPr>
+          <w:b/>
+          <w:bCs/>
+        </w:rPr>
+        <w:t>using a third junction object</w:t>
+      </w:r>
+      <w:r>
+        <w:t xml:space="preserve"> with two master-detail fields</w:t>
+      </w:r>
+      <w:r>
+        <w:t xml:space="preserve"> or look up relationship object</w:t>
       </w:r>
     </w:p>
     <w:p>
@@ -75,7 +126,68 @@
     </w:p>
     <w:p>
       <w:r>
-        <w:t>Beyond standard storage, Salesforce offers External Objects for data residing in outside systems via Salesforce Connect, Big Objects for managing massive datasets with high-volume storage, and Platform Events for event-driven messaging architectures.</w:t>
+        <w:t xml:space="preserve">Beyond standard storage, Salesforce offers </w:t>
+      </w:r>
+    </w:p>
+    <w:p>
+      <w:pPr>
+        <w:rPr>
+          <w:u w:val="single"/>
+        </w:rPr>
+      </w:pPr>
+      <w:r>
+        <w:rPr>
+          <w:b/>
+          <w:bCs/>
+        </w:rPr>
+        <w:t>External Objects</w:t>
+      </w:r>
+      <w:r>
+        <w:t xml:space="preserve"> </w:t>
+      </w:r>
+      <w:r>
+        <w:t xml:space="preserve">for data residing in outside systems via </w:t>
+      </w:r>
+      <w:r>
+        <w:rPr>
+          <w:u w:val="single"/>
+        </w:rPr>
+        <w:t xml:space="preserve">Salesforce Connect, </w:t>
+      </w:r>
+    </w:p>
+    <w:p>
+      <w:r>
+        <w:rPr>
+          <w:b/>
+          <w:bCs/>
+        </w:rPr>
+        <w:t>Big Objects</w:t>
+      </w:r>
+      <w:r>
+        <w:t xml:space="preserve"> for managing massive datasets with high-volume storage, and Platform Events for event-driven messaging architectures.</w:t>
+      </w:r>
+    </w:p>
+    <w:p>
+      <w:r>
+        <w:t>Junction</w:t>
+      </w:r>
+      <w:r>
+        <w:t xml:space="preserve"> Object : Many to Many relationships</w:t>
+      </w:r>
+      <w:r>
+        <w:t xml:space="preserve"> </w:t>
+      </w:r>
+      <w:r>
+        <w:sym w:font="Wingdings" w:char="F0E0"/>
+      </w:r>
+      <w:r>
+        <w:t xml:space="preserve"> master details </w:t>
+      </w:r>
+      <w:r>
+        <w:sym w:font="Wingdings" w:char="F0E0"/>
+      </w:r>
+      <w:r>
+        <w:t xml:space="preserve"> at most two objects</w:t>
       </w:r>
     </w:p>
     <w:p>
@@ -105,9 +217,40 @@
     <w:p>
       <w:pPr>
         <w:pStyle w:val="ListBullet"/>
+        <w:rPr>
+          <w:b/>
+          <w:bCs/>
+          <w:highlight w:val="yellow"/>
+        </w:rPr>
       </w:pPr>
       <w:r>
-        <w:t>Limit the use of Master-Detail relationships to avoid complex record-locking scenarios and rigid sharing models.</w:t>
+        <w:rPr>
+          <w:highlight w:val="yellow"/>
+        </w:rPr>
+        <w:lastRenderedPageBreak/>
+        <w:t xml:space="preserve">Limit the use of Master-Detail relationships </w:t>
+      </w:r>
+      <w:r>
+        <w:rPr>
+          <w:b/>
+          <w:bCs/>
+          <w:highlight w:val="yellow"/>
+        </w:rPr>
+        <w:t>to avoid complex record-locking scenarios</w:t>
+      </w:r>
+      <w:r>
+        <w:rPr>
+          <w:highlight w:val="yellow"/>
+        </w:rPr>
+        <w:t xml:space="preserve"> and </w:t>
+      </w:r>
+      <w:r>
+        <w:rPr>
+          <w:b/>
+          <w:bCs/>
+          <w:highlight w:val="yellow"/>
+        </w:rPr>
+        <w:t>rigid sharing models.</w:t>
       </w:r>
     </w:p>
     <w:p>
@@ -115,7 +258,14 @@
         <w:pStyle w:val="ListBullet"/>
       </w:pPr>
       <w:r>
-        <w:t>Implement custom indexes on frequently queried fields to ensure optimal SOQL performance in large data volumes.</w:t>
+        <w:rPr>
+          <w:b/>
+          <w:bCs/>
+        </w:rPr>
+        <w:t>Implement custom indexes</w:t>
+      </w:r>
+      <w:r>
+        <w:t xml:space="preserve"> on frequently queried fields to ensure optimal SOQL performance in large data volumes.</w:t>
       </w:r>
     </w:p>
     <w:p>
@@ -137,9 +287,30 @@
     <w:p>
       <w:pPr>
         <w:pStyle w:val="ListBullet"/>
+        <w:rPr>
+          <w:b/>
+          <w:bCs/>
+        </w:rPr>
       </w:pPr>
       <w:r>
-        <w:t>Custom object limits are based on the Salesforce Edition (e.g., 2,000 for Unlimited, 200 for Enterprise).</w:t>
+        <w:t xml:space="preserve">Custom object limits are based on the Salesforce Edition (e.g., </w:t>
+      </w:r>
+      <w:r>
+        <w:rPr>
+          <w:b/>
+          <w:bCs/>
+        </w:rPr>
+        <w:t>2,000 for Unlimited</w:t>
+      </w:r>
+      <w:r>
+        <w:t xml:space="preserve">, </w:t>
+      </w:r>
+      <w:r>
+        <w:rPr>
+          <w:b/>
+          <w:bCs/>
+        </w:rPr>
+        <w:t>200 for Enterprise).</w:t>
       </w:r>
     </w:p>
     <w:p>
@@ -153,9 +324,102 @@
     <w:p>
       <w:pPr>
         <w:pStyle w:val="ListBullet"/>
+        <w:tabs>
+          <w:tab w:val="clear" w:pos="360"/>
+          <w:tab w:val="num" w:pos="720"/>
+        </w:tabs>
+        <w:ind w:left="720"/>
       </w:pPr>
       <w:r>
-        <w:t>Total field limits per object usually range between 500 and 800 depending on the edition.</w:t>
+        <w:t>which are used to create tight parent-child relationships and enable rollup summary fields</w:t>
+      </w:r>
+    </w:p>
+    <w:p>
+      <w:pPr>
+        <w:pStyle w:val="ListBullet"/>
+        <w:tabs>
+          <w:tab w:val="clear" w:pos="360"/>
+          <w:tab w:val="num" w:pos="720"/>
+        </w:tabs>
+        <w:ind w:left="720"/>
+      </w:pPr>
+      <w:r>
+        <w:t xml:space="preserve">Many to many relationships </w:t>
+      </w:r>
+      <w:r>
+        <w:sym w:font="Wingdings" w:char="F0E0"/>
+      </w:r>
+      <w:r>
+        <w:t xml:space="preserve"> we can connect to at most 2 object</w:t>
+      </w:r>
+    </w:p>
+    <w:p>
+      <w:pPr>
+        <w:pStyle w:val="ListBullet"/>
+        <w:tabs>
+          <w:tab w:val="clear" w:pos="360"/>
+          <w:tab w:val="num" w:pos="720"/>
+        </w:tabs>
+        <w:ind w:left="720"/>
+      </w:pPr>
+      <w:r>
+        <w:t xml:space="preserve">This </w:t>
+      </w:r>
+      <w:r>
+        <w:rPr>
+          <w:b/>
+          <w:bCs/>
+        </w:rPr>
+        <w:t>limit</w:t>
+      </w:r>
+      <w:r>
+        <w:t xml:space="preserve"> applies to the "</w:t>
+      </w:r>
+      <w:r>
+        <w:rPr>
+          <w:b/>
+          <w:bCs/>
+        </w:rPr>
+        <w:t>detail</w:t>
+      </w:r>
+      <w:r>
+        <w:t>" (child) side, meaning a single object can be a child to at most two parent objects</w:t>
+      </w:r>
+    </w:p>
+    <w:p>
+      <w:pPr>
+        <w:pStyle w:val="ListBullet"/>
+        <w:tabs>
+          <w:tab w:val="clear" w:pos="360"/>
+          <w:tab w:val="num" w:pos="720"/>
+        </w:tabs>
+        <w:ind w:left="720"/>
+      </w:pPr>
+    </w:p>
+    <w:p>
+      <w:pPr>
+        <w:pStyle w:val="ListBullet"/>
+        <w:rPr>
+          <w:b/>
+          <w:bCs/>
+        </w:rPr>
+      </w:pPr>
+      <w:r>
+        <w:rPr>
+          <w:b/>
+          <w:bCs/>
+        </w:rPr>
+        <w:t>Total field limits</w:t>
+      </w:r>
+      <w:r>
+        <w:t xml:space="preserve"> per object usually range between </w:t>
+      </w:r>
+      <w:r>
+        <w:rPr>
+          <w:b/>
+          <w:bCs/>
+        </w:rPr>
+        <w:t>500 and 800 depending on the edition.</w:t>
       </w:r>
     </w:p>
     <w:p>
@@ -163,7 +427,24 @@
         <w:pStyle w:val="ListBullet"/>
       </w:pPr>
       <w:r>
-        <w:t>Relationships are limited to 5 levels of depth for parent-to-child SOQL queries.</w:t>
+        <w:rPr>
+          <w:b/>
+          <w:bCs/>
+        </w:rPr>
+        <w:t>Relationships</w:t>
+      </w:r>
+      <w:r>
+        <w:t xml:space="preserve"> are </w:t>
+      </w:r>
+      <w:r>
+        <w:rPr>
+          <w:b/>
+          <w:bCs/>
+        </w:rPr>
+        <w:t>limited to 5 levels of depth for parent-to-child SOQL queries</w:t>
+      </w:r>
+      <w:r>
+        <w:t>.</w:t>
       </w:r>
     </w:p>
     <w:p>
@@ -339,7 +620,7 @@
   <w:abstractNum w:abstractNumId="8" w15:restartNumberingAfterBreak="0">
     <w:nsid w:val="FFFFFF89"/>
     <w:multiLevelType w:val="singleLevel"/>
-    <w:tmpl w:val="29761A62"/>
+    <w:tmpl w:val="796A3260"/>
     <w:lvl w:ilvl="0">
       <w:start w:val="1"/>
       <w:numFmt w:val="bullet"/>
@@ -990,7 +1271,6 @@
   <w:style w:type="character" w:default="1" w:styleId="DefaultParagraphFont">
     <w:name w:val="Default Paragraph Font"/>
     <w:uiPriority w:val="1"/>
-    <w:semiHidden/>
     <w:unhideWhenUsed/>
   </w:style>
   <w:style w:type="table" w:default="1" w:styleId="TableNormal">

</xml_diff>

<commit_message>
add salesforce topic till validation rules.
</commit_message>
<xml_diff>
--- a/Salesforce_Notes.docx
+++ b/Salesforce_Notes.docx
@@ -25,7 +25,23 @@
           <w:b/>
           <w:sz w:val="36"/>
         </w:rPr>
-        <w:t>What is Salesforce and its key features?</w:t>
+        <w:t xml:space="preserve">What </w:t>
+      </w:r>
+      <w:proofErr w:type="gramStart"/>
+      <w:r>
+        <w:rPr>
+          <w:b/>
+          <w:sz w:val="36"/>
+        </w:rPr>
+        <w:t>is</w:t>
+      </w:r>
+      <w:proofErr w:type="gramEnd"/>
+      <w:r>
+        <w:rPr>
+          <w:b/>
+          <w:sz w:val="36"/>
+        </w:rPr>
+        <w:t xml:space="preserve"> Salesforce and its key features?</w:t>
       </w:r>
     </w:p>
     <w:p>
@@ -69,66 +85,96 @@
         <w:pStyle w:val="ListBullet"/>
       </w:pPr>
       <w:r>
-        <w:t xml:space="preserve">It operates on a </w:t>
+        <w:t xml:space="preserve">It operates on </w:t>
+      </w:r>
+      <w:proofErr w:type="gramStart"/>
+      <w:r>
+        <w:t xml:space="preserve">a </w:t>
       </w:r>
       <w:r>
         <w:rPr>
           <w:b/>
           <w:bCs/>
         </w:rPr>
-        <w:t>multi-tenant architecture,</w:t>
-      </w:r>
-      <w:r>
-        <w:t xml:space="preserve"> providing high scalability, security, and frequent automated updates.</w:t>
-      </w:r>
-    </w:p>
-    <w:p>
-      <w:pPr>
-        <w:pStyle w:val="Heading2"/>
-      </w:pPr>
-      <w:r>
-        <w:t>Core Architecture and Multi-tenancy</w:t>
-      </w:r>
-    </w:p>
-    <w:p>
-      <w:pPr>
-        <w:pStyle w:val="ListBullet"/>
-      </w:pPr>
-      <w:r>
-        <w:t xml:space="preserve">Salesforce utilizes a </w:t>
-      </w:r>
+        <w:t>multi</w:t>
+      </w:r>
+      <w:proofErr w:type="gramEnd"/>
       <w:r>
         <w:rPr>
           <w:b/>
           <w:bCs/>
         </w:rPr>
+        <w:t>-tenant architecture,</w:t>
+      </w:r>
+      <w:r>
+        <w:t xml:space="preserve"> providing high scalability, security, and frequent automated updates.</w:t>
+      </w:r>
+    </w:p>
+    <w:p>
+      <w:pPr>
+        <w:pStyle w:val="Heading2"/>
+      </w:pPr>
+      <w:r>
+        <w:t>Core Architecture and Multi-tenancy</w:t>
+      </w:r>
+    </w:p>
+    <w:p>
+      <w:pPr>
+        <w:pStyle w:val="ListBullet"/>
+      </w:pPr>
+      <w:r>
+        <w:t xml:space="preserve">Salesforce utilizes a </w:t>
+      </w:r>
+      <w:r>
+        <w:rPr>
+          <w:b/>
+          <w:bCs/>
+          <w:highlight w:val="yellow"/>
+        </w:rPr>
         <w:t>multi-tenant architecture</w:t>
       </w:r>
       <w:r>
         <w:t xml:space="preserve"> where </w:t>
+      </w:r>
+      <w:r>
+        <w:rPr>
+          <w:b/>
+          <w:bCs/>
+          <w:highlight w:val="yellow"/>
+        </w:rPr>
+        <w:t>multiple customers share the same infrastructure</w:t>
       </w:r>
       <w:r>
         <w:rPr>
           <w:b/>
           <w:bCs/>
         </w:rPr>
-        <w:t>multiple customers share the same infrastructure and platform resources.</w:t>
-      </w:r>
-      <w:r>
-        <w:t xml:space="preserve"> To ensure performance, </w:t>
-      </w:r>
-    </w:p>
-    <w:p>
-      <w:pPr>
-        <w:pStyle w:val="ListBullet"/>
-      </w:pPr>
-      <w:r>
-        <w:t xml:space="preserve">Salesforce enforces </w:t>
+        <w:t xml:space="preserve"> and </w:t>
       </w:r>
       <w:r>
         <w:rPr>
           <w:b/>
           <w:bCs/>
+          <w:highlight w:val="yellow"/>
+        </w:rPr>
+        <w:t>platform resources.</w:t>
+      </w:r>
+      <w:r>
+        <w:t xml:space="preserve"> To ensure performance, </w:t>
+      </w:r>
+    </w:p>
+    <w:p>
+      <w:pPr>
+        <w:pStyle w:val="ListBullet"/>
+      </w:pPr>
+      <w:r>
+        <w:t xml:space="preserve">Salesforce enforces </w:t>
+      </w:r>
+      <w:r>
+        <w:rPr>
+          <w:b/>
+          <w:bCs/>
+          <w:highlight w:val="yellow"/>
         </w:rPr>
         <w:t>'Governor Limits'</w:t>
       </w:r>
@@ -152,6 +198,7 @@
         <w:rPr>
           <w:b/>
           <w:bCs/>
+          <w:highlight w:val="yellow"/>
         </w:rPr>
         <w:t>runtime limits to prevent any single tenant from monopolizing shared resources</w:t>
       </w:r>
@@ -253,9 +300,11 @@
         </w:tabs>
         <w:ind w:left="720"/>
       </w:pPr>
+      <w:proofErr w:type="spellStart"/>
       <w:r>
         <w:t>Soql</w:t>
       </w:r>
+      <w:proofErr w:type="spellEnd"/>
     </w:p>
     <w:p>
       <w:pPr>
@@ -278,7 +327,15 @@
         <w:pStyle w:val="ListBullet"/>
       </w:pPr>
       <w:r>
-        <w:t>Ensure all Apex code is 'Bulkified' to handle multiple records simultaneously.</w:t>
+        <w:t>Ensure all Apex code is '</w:t>
+      </w:r>
+      <w:proofErr w:type="spellStart"/>
+      <w:r>
+        <w:t>Bulkified</w:t>
+      </w:r>
+      <w:proofErr w:type="spellEnd"/>
+      <w:r>
+        <w:t>' to handle multiple records simultaneously.</w:t>
       </w:r>
     </w:p>
     <w:p>
@@ -295,7 +352,15 @@
         <w:pStyle w:val="ListBullet"/>
       </w:pPr>
       <w:r>
-        <w:t>Use the Salesforce Lightning Design System (SLDS) for a consistent user experience.</w:t>
+        <w:t xml:space="preserve">Use the Salesforce Lightning Design System (SLDS) for </w:t>
+      </w:r>
+      <w:proofErr w:type="gramStart"/>
+      <w:r>
+        <w:t>a consistent</w:t>
+      </w:r>
+      <w:proofErr w:type="gramEnd"/>
+      <w:r>
+        <w:t xml:space="preserve"> user experience.</w:t>
       </w:r>
     </w:p>
     <w:p>
@@ -336,6 +401,1681 @@
       </w:pPr>
       <w:r>
         <w:t>Storage limits for both data and files are strictly enforced and may require additional costs.</w:t>
+      </w:r>
+    </w:p>
+    <w:p>
+      <w:pPr>
+        <w:pStyle w:val="Heading4"/>
+      </w:pPr>
+      <w:r>
+        <w:t>Example</w:t>
+      </w:r>
+    </w:p>
+    <w:p>
+      <w:r>
+        <w:br/>
+        <w:t>==============================</w:t>
+      </w:r>
+      <w:r>
+        <w:br/>
+      </w:r>
+    </w:p>
+    <w:p>
+      <w:pPr>
+        <w:pStyle w:val="Title"/>
+      </w:pPr>
+      <w:r>
+        <w:rPr>
+          <w:b/>
+          <w:sz w:val="36"/>
+        </w:rPr>
+        <w:t>Salesforce Objects and Their Types</w:t>
+      </w:r>
+    </w:p>
+    <w:p>
+      <w:pPr>
+        <w:pStyle w:val="Heading1"/>
+      </w:pPr>
+      <w:r>
+        <w:t>Summary</w:t>
+      </w:r>
+    </w:p>
+    <w:p>
+      <w:pPr>
+        <w:pStyle w:val="ListBullet"/>
+      </w:pPr>
+      <w:r>
+        <w:rPr>
+          <w:highlight w:val="yellow"/>
+        </w:rPr>
+        <w:t xml:space="preserve">Salesforce objects </w:t>
+      </w:r>
+      <w:r>
+        <w:rPr>
+          <w:b/>
+          <w:bCs/>
+          <w:highlight w:val="yellow"/>
+        </w:rPr>
+        <w:t>are database tables that allow you to store data specific to an organization</w:t>
+      </w:r>
+      <w:r>
+        <w:rPr>
+          <w:b/>
+          <w:bCs/>
+        </w:rPr>
+        <w:t>.</w:t>
+      </w:r>
+      <w:r>
+        <w:t xml:space="preserve"> </w:t>
+      </w:r>
+    </w:p>
+    <w:p>
+      <w:pPr>
+        <w:pStyle w:val="ListBullet"/>
+      </w:pPr>
+      <w:r>
+        <w:t>They encompass standard structures provided by Salesforce, custom structures defined by users, and specialized types for external data or high-volume messaging.</w:t>
+      </w:r>
+    </w:p>
+    <w:p>
+      <w:pPr>
+        <w:pStyle w:val="Heading2"/>
+      </w:pPr>
+      <w:r>
+        <w:t>Standard Objects</w:t>
+      </w:r>
+    </w:p>
+    <w:p>
+      <w:pPr>
+        <w:pStyle w:val="ListBullet"/>
+      </w:pPr>
+      <w:r>
+        <w:t>Standard objects are pre-built by Salesforce to handle common business processes. Key examples include Accounts (companies), Contacts (individuals), Leads (potential customers), and Opportunities (deals in progress). These objects come with predefined fields and relationships but can be customized with additional fields and page layouts.</w:t>
+      </w:r>
+    </w:p>
+    <w:p>
+      <w:pPr>
+        <w:pStyle w:val="Heading2"/>
+      </w:pPr>
+      <w:r>
+        <w:t>Custom Objects</w:t>
+      </w:r>
+    </w:p>
+    <w:p>
+      <w:pPr>
+        <w:pStyle w:val="ListBullet"/>
+      </w:pPr>
+      <w:r>
+        <w:t>Custom objects are created by administrators to store information unique to their business. When created, they automatically generate a unique API name suffixed with '__c'. They provide full control over fields, relationships, sharing rules, and user interfaces.</w:t>
+      </w:r>
+    </w:p>
+    <w:p>
+      <w:pPr>
+        <w:pStyle w:val="Heading2"/>
+      </w:pPr>
+      <w:r>
+        <w:t>External Objects</w:t>
+      </w:r>
+    </w:p>
+    <w:p>
+      <w:pPr>
+        <w:pStyle w:val="ListBullet"/>
+      </w:pPr>
+      <w:r>
+        <w:rPr>
+          <w:highlight w:val="yellow"/>
+        </w:rPr>
+        <w:t>External objects map to data stored outside of Salesforce, such as in an ERP system or another database</w:t>
+      </w:r>
+      <w:r>
+        <w:rPr>
+          <w:b/>
+          <w:bCs/>
+        </w:rPr>
+        <w:t xml:space="preserve"> </w:t>
+      </w:r>
+      <w:r>
+        <w:rPr>
+          <w:b/>
+          <w:bCs/>
+          <w:highlight w:val="yellow"/>
+        </w:rPr>
+        <w:t>Using Salesforce Connect</w:t>
+      </w:r>
+      <w:r>
+        <w:t xml:space="preserve">, </w:t>
+      </w:r>
+    </w:p>
+    <w:p>
+      <w:pPr>
+        <w:pStyle w:val="ListBullet"/>
+      </w:pPr>
+      <w:proofErr w:type="gramStart"/>
+      <w:r>
+        <w:t>these</w:t>
+      </w:r>
+      <w:proofErr w:type="gramEnd"/>
+      <w:r>
+        <w:t xml:space="preserve"> objects allow users to view and search external data in real-time without duplicating it. They are identified by the '__x' suffix.</w:t>
+      </w:r>
+    </w:p>
+    <w:p>
+      <w:pPr>
+        <w:pStyle w:val="ListBullet"/>
+      </w:pPr>
+      <w:r>
+        <w:t xml:space="preserve">Suffix </w:t>
+      </w:r>
+      <w:r>
+        <w:sym w:font="Wingdings" w:char="F0E0"/>
+      </w:r>
+      <w:r>
+        <w:t xml:space="preserve"> </w:t>
+      </w:r>
+      <w:r>
+        <w:rPr>
+          <w:b/>
+          <w:bCs/>
+          <w:highlight w:val="yellow"/>
+        </w:rPr>
+        <w:t>‘</w:t>
+      </w:r>
+      <w:r>
+        <w:rPr>
+          <w:b/>
+          <w:bCs/>
+          <w:highlight w:val="yellow"/>
+        </w:rPr>
+        <w:t>__X</w:t>
+      </w:r>
+      <w:r>
+        <w:rPr>
+          <w:b/>
+          <w:bCs/>
+          <w:highlight w:val="yellow"/>
+        </w:rPr>
+        <w:t>’</w:t>
+      </w:r>
+    </w:p>
+    <w:p>
+      <w:pPr>
+        <w:pStyle w:val="Heading2"/>
+      </w:pPr>
+      <w:r>
+        <w:lastRenderedPageBreak/>
+        <w:t>Big Objects</w:t>
+      </w:r>
+    </w:p>
+    <w:p>
+      <w:pPr>
+        <w:pStyle w:val="ListBullet"/>
+      </w:pPr>
+      <w:r>
+        <w:t xml:space="preserve">Big Objects allow you to store and manage massive amounts of data (billions of records) within Salesforce without impacting performance. </w:t>
+      </w:r>
+    </w:p>
+    <w:p>
+      <w:pPr>
+        <w:pStyle w:val="ListBullet"/>
+      </w:pPr>
+      <w:r>
+        <w:t xml:space="preserve">They are typically used for historical archiving or audit logs and have </w:t>
+      </w:r>
+      <w:r>
+        <w:rPr>
+          <w:b/>
+          <w:bCs/>
+        </w:rPr>
+        <w:t>the '__b' suffix</w:t>
+      </w:r>
+      <w:r>
+        <w:t>. They require specialized querying methods like Async SOQL.</w:t>
+      </w:r>
+    </w:p>
+    <w:p>
+      <w:pPr>
+        <w:pStyle w:val="Heading2"/>
+      </w:pPr>
+      <w:r>
+        <w:t>Platform Events</w:t>
+      </w:r>
+      <w:r>
+        <w:t xml:space="preserve"> </w:t>
+      </w:r>
+      <w:r>
+        <w:sym w:font="Wingdings" w:char="F0E0"/>
+      </w:r>
+      <w:r>
+        <w:t xml:space="preserve"> Used for event driven message</w:t>
+      </w:r>
+    </w:p>
+    <w:p>
+      <w:pPr>
+        <w:pStyle w:val="ListBullet"/>
+      </w:pPr>
+      <w:r>
+        <w:t xml:space="preserve">Platform Events are </w:t>
+      </w:r>
+      <w:r>
+        <w:rPr>
+          <w:b/>
+          <w:bCs/>
+          <w:highlight w:val="yellow"/>
+        </w:rPr>
+        <w:t>specialized objects used for event-driven messaging.</w:t>
+      </w:r>
+      <w:r>
+        <w:t xml:space="preserve"> </w:t>
+      </w:r>
+    </w:p>
+    <w:p>
+      <w:pPr>
+        <w:pStyle w:val="ListBullet"/>
+      </w:pPr>
+      <w:r>
+        <w:t xml:space="preserve">They allow applications to communicate </w:t>
+      </w:r>
+      <w:r>
+        <w:rPr>
+          <w:b/>
+          <w:bCs/>
+          <w:highlight w:val="yellow"/>
+        </w:rPr>
+        <w:t>inside and outside of Salesforce using a pub/sub model.</w:t>
+      </w:r>
+      <w:r>
+        <w:t xml:space="preserve"> These objects end with the </w:t>
+      </w:r>
+      <w:r>
+        <w:rPr>
+          <w:b/>
+          <w:bCs/>
+        </w:rPr>
+        <w:t>'__e' suffix</w:t>
+      </w:r>
+      <w:r>
+        <w:t xml:space="preserve"> and </w:t>
+      </w:r>
+    </w:p>
+    <w:p>
+      <w:pPr>
+        <w:pStyle w:val="ListBullet"/>
+        <w:rPr>
+          <w:b/>
+          <w:bCs/>
+        </w:rPr>
+      </w:pPr>
+      <w:proofErr w:type="gramStart"/>
+      <w:r>
+        <w:t>Limitations :</w:t>
+      </w:r>
+      <w:proofErr w:type="gramEnd"/>
+      <w:r>
+        <w:t xml:space="preserve"> </w:t>
+      </w:r>
+      <w:r>
+        <w:rPr>
+          <w:b/>
+          <w:bCs/>
+          <w:highlight w:val="yellow"/>
+        </w:rPr>
+        <w:t>do not support standard page layouts or record-level security</w:t>
+      </w:r>
+      <w:r>
+        <w:rPr>
+          <w:b/>
+          <w:bCs/>
+        </w:rPr>
+        <w:t>.</w:t>
+      </w:r>
+    </w:p>
+    <w:p>
+      <w:pPr>
+        <w:pStyle w:val="Heading3"/>
+      </w:pPr>
+      <w:r>
+        <w:t>Best Practices</w:t>
+      </w:r>
+    </w:p>
+    <w:p>
+      <w:pPr>
+        <w:pStyle w:val="ListBullet"/>
+      </w:pPr>
+      <w:r>
+        <w:t>Leverage Standard Objects first to benefit from built-in functionality and reporting features.</w:t>
+      </w:r>
+    </w:p>
+    <w:p>
+      <w:pPr>
+        <w:pStyle w:val="ListBullet"/>
+      </w:pPr>
+      <w:r>
+        <w:t>Maintain a consistent naming convention and always provide meaningful descriptions for custom objects.</w:t>
+      </w:r>
+    </w:p>
+    <w:p>
+      <w:pPr>
+        <w:pStyle w:val="ListBullet"/>
+        <w:rPr>
+          <w:highlight w:val="yellow"/>
+        </w:rPr>
+      </w:pPr>
+      <w:r>
+        <w:rPr>
+          <w:highlight w:val="yellow"/>
+        </w:rPr>
+        <w:t>Minimize the use of Master-Detail relationships to avoid tight coupling and locking issues during high-volume data loads.</w:t>
+      </w:r>
+    </w:p>
+    <w:p>
+      <w:pPr>
+        <w:pStyle w:val="ListBullet"/>
+        <w:rPr>
+          <w:highlight w:val="yellow"/>
+        </w:rPr>
+      </w:pPr>
+      <w:r>
+        <w:rPr>
+          <w:highlight w:val="yellow"/>
+        </w:rPr>
+        <w:t>Use External Objects for large datasets that do not require frequent updates or complex Salesforce automation.</w:t>
+      </w:r>
+    </w:p>
+    <w:p>
+      <w:pPr>
+        <w:pStyle w:val="Heading3"/>
+      </w:pPr>
+      <w:r>
+        <w:t>Limitations</w:t>
+      </w:r>
+    </w:p>
+    <w:p>
+      <w:pPr>
+        <w:pStyle w:val="ListBullet"/>
+      </w:pPr>
+      <w:r>
+        <w:t xml:space="preserve">The number of custom objects is limited based on the Salesforce Edition (e.g., </w:t>
+      </w:r>
+      <w:r>
+        <w:rPr>
+          <w:b/>
+          <w:bCs/>
+          <w:highlight w:val="yellow"/>
+        </w:rPr>
+        <w:t>2000 for Enterprise/Unlimited</w:t>
+      </w:r>
+      <w:r>
+        <w:t>).</w:t>
+      </w:r>
+    </w:p>
+    <w:p>
+      <w:pPr>
+        <w:pStyle w:val="ListBullet"/>
+        <w:tabs>
+          <w:tab w:val="clear" w:pos="360"/>
+          <w:tab w:val="num" w:pos="720"/>
+        </w:tabs>
+        <w:ind w:left="720"/>
+      </w:pPr>
+      <w:r>
+        <w:t xml:space="preserve">2000 custom </w:t>
+      </w:r>
+      <w:proofErr w:type="gramStart"/>
+      <w:r>
+        <w:t>object</w:t>
+      </w:r>
+      <w:proofErr w:type="gramEnd"/>
+      <w:r>
+        <w:t xml:space="preserve"> can be created</w:t>
+      </w:r>
+    </w:p>
+    <w:p>
+      <w:pPr>
+        <w:pStyle w:val="ListBullet"/>
+      </w:pPr>
+      <w:r>
+        <w:t xml:space="preserve">A custom object can have a </w:t>
+      </w:r>
+      <w:r>
+        <w:rPr>
+          <w:b/>
+          <w:bCs/>
+          <w:highlight w:val="yellow"/>
+        </w:rPr>
+        <w:t>maximum of 40 lookup relationships</w:t>
+      </w:r>
+      <w:r>
+        <w:rPr>
+          <w:b/>
+          <w:bCs/>
+        </w:rPr>
+        <w:t>.</w:t>
+      </w:r>
+    </w:p>
+    <w:p>
+      <w:pPr>
+        <w:pStyle w:val="ListBullet"/>
+      </w:pPr>
+      <w:r>
+        <w:t>Standard objects cannot be deleted and have limitations on changing certain field types.</w:t>
+      </w:r>
+    </w:p>
+    <w:p>
+      <w:pPr>
+        <w:pStyle w:val="ListBullet"/>
+        <w:rPr>
+          <w:b/>
+          <w:bCs/>
+          <w:highlight w:val="yellow"/>
+        </w:rPr>
+      </w:pPr>
+      <w:r>
+        <w:rPr>
+          <w:highlight w:val="yellow"/>
+        </w:rPr>
+        <w:t xml:space="preserve">External objects have limited support for </w:t>
+      </w:r>
+      <w:r>
+        <w:rPr>
+          <w:b/>
+          <w:bCs/>
+          <w:highlight w:val="yellow"/>
+        </w:rPr>
+        <w:t>formulas, roll-up summaries, and certain sharing features.</w:t>
+      </w:r>
+    </w:p>
+    <w:p>
+      <w:pPr>
+        <w:pStyle w:val="Heading4"/>
+      </w:pPr>
+      <w:r>
+        <w:t>Example</w:t>
+      </w:r>
+    </w:p>
+    <w:p>
+      <w:r>
+        <w:br/>
+        <w:t>==============================</w:t>
+      </w:r>
+      <w:r>
+        <w:br/>
+      </w:r>
+    </w:p>
+    <w:p>
+      <w:pPr>
+        <w:pStyle w:val="Title"/>
+      </w:pPr>
+      <w:r>
+        <w:rPr>
+          <w:b/>
+          <w:sz w:val="36"/>
+        </w:rPr>
+        <w:t>Salesforce Fields and Their Relationships</w:t>
+      </w:r>
+    </w:p>
+    <w:p>
+      <w:pPr>
+        <w:pStyle w:val="Heading1"/>
+      </w:pPr>
+      <w:r>
+        <w:t>Summary</w:t>
+      </w:r>
+    </w:p>
+    <w:p>
+      <w:pPr>
+        <w:pStyle w:val="ListBullet"/>
+      </w:pPr>
+      <w:r>
+        <w:t>A comprehensive technical guide detailing Salesforce field types, data integrity through relationships, and architectural patterns for linking objects in a multi-tenant environment.</w:t>
+      </w:r>
+    </w:p>
+    <w:p>
+      <w:pPr>
+        <w:pStyle w:val="Heading2"/>
+      </w:pPr>
+      <w:r>
+        <w:lastRenderedPageBreak/>
+        <w:t>Fundamental Field Types</w:t>
+      </w:r>
+    </w:p>
+    <w:p>
+      <w:pPr>
+        <w:pStyle w:val="ListBullet"/>
+      </w:pPr>
+      <w:r>
+        <w:t xml:space="preserve">Salesforce provides a variety of field types to enforce data integrity. Standard types include Checkbox, Currency, Date, Email, Number, and Picklists. Advanced fields include Formulas, which are read-only fields that calculate values based on other fields, and </w:t>
+      </w:r>
+      <w:r>
+        <w:rPr>
+          <w:b/>
+          <w:bCs/>
+        </w:rPr>
+        <w:t>Roll-up Summaries, which aggregate data from child records in a Master-Detail relationship.</w:t>
+      </w:r>
+    </w:p>
+    <w:p>
+      <w:pPr>
+        <w:pStyle w:val="Heading2"/>
+      </w:pPr>
+      <w:r>
+        <w:t>Lookup vs. Master-Detail Relationships</w:t>
+      </w:r>
+    </w:p>
+    <w:p>
+      <w:pPr>
+        <w:pStyle w:val="ListBullet"/>
+      </w:pPr>
+      <w:r>
+        <w:t xml:space="preserve">Lookup relationships are </w:t>
+      </w:r>
+    </w:p>
+    <w:p>
+      <w:pPr>
+        <w:pStyle w:val="ListBullet"/>
+        <w:tabs>
+          <w:tab w:val="clear" w:pos="360"/>
+          <w:tab w:val="num" w:pos="1080"/>
+        </w:tabs>
+        <w:ind w:left="1080"/>
+      </w:pPr>
+      <w:r>
+        <w:t>loosely coupled,</w:t>
+      </w:r>
+    </w:p>
+    <w:p>
+      <w:pPr>
+        <w:pStyle w:val="ListBullet"/>
+        <w:tabs>
+          <w:tab w:val="clear" w:pos="360"/>
+          <w:tab w:val="num" w:pos="1080"/>
+        </w:tabs>
+        <w:ind w:left="1080"/>
+      </w:pPr>
+      <w:r>
+        <w:t xml:space="preserve">the child record can exist independently of the parent, </w:t>
+      </w:r>
+    </w:p>
+    <w:p>
+      <w:pPr>
+        <w:pStyle w:val="ListBullet"/>
+        <w:tabs>
+          <w:tab w:val="clear" w:pos="360"/>
+          <w:tab w:val="num" w:pos="1080"/>
+        </w:tabs>
+        <w:ind w:left="1080"/>
+      </w:pPr>
+      <w:r>
+        <w:t xml:space="preserve">Security settings are independent. </w:t>
+      </w:r>
+      <w:r>
+        <w:t xml:space="preserve"> </w:t>
+      </w:r>
+      <w:r>
+        <w:sym w:font="Wingdings" w:char="F0E0"/>
+      </w:r>
+      <w:r>
+        <w:t xml:space="preserve"> </w:t>
+      </w:r>
+      <w:proofErr w:type="gramStart"/>
+      <w:r>
+        <w:t>ownership</w:t>
+      </w:r>
+      <w:proofErr w:type="gramEnd"/>
+      <w:r>
+        <w:t xml:space="preserve"> will be present</w:t>
+      </w:r>
+    </w:p>
+    <w:p>
+      <w:pPr>
+        <w:pStyle w:val="ListBullet"/>
+      </w:pPr>
+      <w:r>
+        <w:t xml:space="preserve">Master-Detail relationships are </w:t>
+      </w:r>
+    </w:p>
+    <w:p>
+      <w:pPr>
+        <w:pStyle w:val="ListBullet"/>
+        <w:tabs>
+          <w:tab w:val="clear" w:pos="360"/>
+          <w:tab w:val="num" w:pos="720"/>
+        </w:tabs>
+        <w:ind w:left="720"/>
+      </w:pPr>
+      <w:r>
+        <w:t xml:space="preserve">tightly coupled: </w:t>
+      </w:r>
+    </w:p>
+    <w:p>
+      <w:pPr>
+        <w:pStyle w:val="ListBullet"/>
+        <w:tabs>
+          <w:tab w:val="clear" w:pos="360"/>
+          <w:tab w:val="num" w:pos="720"/>
+        </w:tabs>
+        <w:ind w:left="720"/>
+      </w:pPr>
+      <w:r>
+        <w:rPr>
+          <w:highlight w:val="yellow"/>
+        </w:rPr>
+        <w:t xml:space="preserve">the parent field is required </w:t>
+      </w:r>
+      <w:proofErr w:type="gramStart"/>
+      <w:r>
+        <w:rPr>
+          <w:highlight w:val="yellow"/>
+        </w:rPr>
+        <w:t>on</w:t>
+      </w:r>
+      <w:proofErr w:type="gramEnd"/>
+      <w:r>
+        <w:rPr>
+          <w:highlight w:val="yellow"/>
+        </w:rPr>
+        <w:t xml:space="preserve"> the child</w:t>
+      </w:r>
+      <w:r>
+        <w:t xml:space="preserve">, </w:t>
+      </w:r>
+    </w:p>
+    <w:p>
+      <w:pPr>
+        <w:pStyle w:val="ListBullet"/>
+        <w:tabs>
+          <w:tab w:val="clear" w:pos="360"/>
+          <w:tab w:val="num" w:pos="720"/>
+        </w:tabs>
+        <w:ind w:left="720"/>
+      </w:pPr>
+      <w:proofErr w:type="gramStart"/>
+      <w:r>
+        <w:t>the</w:t>
+      </w:r>
+      <w:proofErr w:type="gramEnd"/>
+      <w:r>
+        <w:t xml:space="preserve"> child's visibility is determined by the parent, and deleting the parent automatically deletes the child. </w:t>
+      </w:r>
+    </w:p>
+    <w:p>
+      <w:pPr>
+        <w:pStyle w:val="ListBullet"/>
+        <w:tabs>
+          <w:tab w:val="clear" w:pos="360"/>
+          <w:tab w:val="num" w:pos="720"/>
+        </w:tabs>
+        <w:ind w:left="720"/>
+      </w:pPr>
+      <w:r>
+        <w:t>Master-Detail is required for creating Roll-up Summary fields.</w:t>
+      </w:r>
+    </w:p>
+    <w:p>
+      <w:pPr>
+        <w:pStyle w:val="Heading2"/>
+      </w:pPr>
+      <w:r>
+        <w:t>Many-to-Many and Self-Relationships</w:t>
+      </w:r>
+    </w:p>
+    <w:p>
+      <w:pPr>
+        <w:pStyle w:val="ListBullet"/>
+      </w:pPr>
+      <w:r>
+        <w:rPr>
+          <w:b/>
+          <w:bCs/>
+        </w:rPr>
+        <w:t>Many-to-Many relationships</w:t>
+      </w:r>
+      <w:r>
+        <w:t xml:space="preserve"> </w:t>
+      </w:r>
+      <w:r>
+        <w:sym w:font="Wingdings" w:char="F0E0"/>
+      </w:r>
+      <w:r>
+        <w:t xml:space="preserve"> referred </w:t>
+      </w:r>
+      <w:proofErr w:type="gramStart"/>
+      <w:r>
+        <w:t xml:space="preserve">as  </w:t>
+      </w:r>
+      <w:r>
+        <w:t>Junction</w:t>
+      </w:r>
+      <w:proofErr w:type="gramEnd"/>
+      <w:r>
+        <w:t xml:space="preserve"> Object, </w:t>
+      </w:r>
+    </w:p>
+    <w:p>
+      <w:pPr>
+        <w:pStyle w:val="ListBullet"/>
+        <w:tabs>
+          <w:tab w:val="clear" w:pos="360"/>
+          <w:tab w:val="num" w:pos="720"/>
+        </w:tabs>
+        <w:ind w:left="720"/>
+      </w:pPr>
+      <w:r>
+        <w:t xml:space="preserve">which contains two Master-Detail relationships to the objects being linked. </w:t>
+      </w:r>
+    </w:p>
+    <w:p>
+      <w:pPr>
+        <w:pStyle w:val="ListBullet"/>
+      </w:pPr>
+      <w:r>
+        <w:rPr>
+          <w:b/>
+          <w:bCs/>
+        </w:rPr>
+        <w:t>Self-relationships</w:t>
+      </w:r>
+      <w:r>
+        <w:t xml:space="preserve"> allow an object to reference itself, such as the Parent Account field on the Account object, which is essential for hierarchical data modeling.</w:t>
+      </w:r>
+    </w:p>
+    <w:p>
+      <w:pPr>
+        <w:pStyle w:val="Heading3"/>
+      </w:pPr>
+      <w:r>
+        <w:t>Best Practices</w:t>
+      </w:r>
+    </w:p>
+    <w:p>
+      <w:pPr>
+        <w:pStyle w:val="ListBullet"/>
+        <w:rPr>
+          <w:highlight w:val="yellow"/>
+        </w:rPr>
+      </w:pPr>
+      <w:r>
+        <w:rPr>
+          <w:highlight w:val="yellow"/>
+        </w:rPr>
+        <w:t xml:space="preserve">Use Master-Detail only when the </w:t>
+      </w:r>
+      <w:proofErr w:type="gramStart"/>
+      <w:r>
+        <w:rPr>
+          <w:highlight w:val="yellow"/>
+        </w:rPr>
+        <w:t>child</w:t>
+      </w:r>
+      <w:proofErr w:type="gramEnd"/>
+      <w:r>
+        <w:rPr>
+          <w:highlight w:val="yellow"/>
+        </w:rPr>
+        <w:t xml:space="preserve"> record should not exist without a parent.</w:t>
+      </w:r>
+    </w:p>
+    <w:p>
+      <w:pPr>
+        <w:pStyle w:val="ListBullet"/>
+        <w:rPr>
+          <w:highlight w:val="yellow"/>
+        </w:rPr>
+      </w:pPr>
+      <w:r>
+        <w:rPr>
+          <w:highlight w:val="yellow"/>
+        </w:rPr>
+        <w:t>Limit the number of Roll-up Summary fields to avoid performance degradation during record saves.</w:t>
+      </w:r>
+    </w:p>
+    <w:p>
+      <w:pPr>
+        <w:pStyle w:val="ListBullet"/>
+      </w:pPr>
+      <w:r>
+        <w:t xml:space="preserve">Always provide field descriptions and </w:t>
+      </w:r>
+      <w:proofErr w:type="gramStart"/>
+      <w:r>
+        <w:t>help</w:t>
+      </w:r>
+      <w:proofErr w:type="gramEnd"/>
+      <w:r>
+        <w:t xml:space="preserve"> text for better maintainability.</w:t>
+      </w:r>
+    </w:p>
+    <w:p>
+      <w:pPr>
+        <w:pStyle w:val="ListBullet"/>
+      </w:pPr>
+      <w:r>
+        <w:t>Use External IDs for fields that will serve as keys for data integration to prevent duplicates.</w:t>
+      </w:r>
+    </w:p>
+    <w:p>
+      <w:pPr>
+        <w:pStyle w:val="ListBullet"/>
+      </w:pPr>
+      <w:r>
+        <w:t>Choose the narrowest data type possible to ensure data quality and better reporting.</w:t>
+      </w:r>
+    </w:p>
+    <w:p>
+      <w:pPr>
+        <w:pStyle w:val="Heading3"/>
+      </w:pPr>
+      <w:r>
+        <w:t>Limitations</w:t>
+      </w:r>
+    </w:p>
+    <w:p>
+      <w:pPr>
+        <w:pStyle w:val="ListBullet"/>
+        <w:rPr>
+          <w:highlight w:val="yellow"/>
+        </w:rPr>
+      </w:pPr>
+      <w:r>
+        <w:rPr>
+          <w:highlight w:val="yellow"/>
+        </w:rPr>
+        <w:t>An object can have a maximum of two Master-Detail relationships.</w:t>
+      </w:r>
+    </w:p>
+    <w:p>
+      <w:pPr>
+        <w:pStyle w:val="ListBullet"/>
+      </w:pPr>
+      <w:r>
+        <w:rPr>
+          <w:highlight w:val="yellow"/>
+        </w:rPr>
+        <w:t>Custom field limits vary by edition, typically 500 for Enterprise and 800 for Unlimited</w:t>
+      </w:r>
+      <w:r>
+        <w:t>.</w:t>
+      </w:r>
+    </w:p>
+    <w:p>
+      <w:pPr>
+        <w:pStyle w:val="ListBullet"/>
+        <w:rPr>
+          <w:highlight w:val="yellow"/>
+        </w:rPr>
+      </w:pPr>
+      <w:r>
+        <w:rPr>
+          <w:highlight w:val="yellow"/>
+        </w:rPr>
+        <w:t>Lookup relationships do not support Roll-up Summary fields natively without Apex or declarative tools.</w:t>
+      </w:r>
+    </w:p>
+    <w:p>
+      <w:pPr>
+        <w:pStyle w:val="ListBullet"/>
+      </w:pPr>
+      <w:r>
+        <w:rPr>
+          <w:highlight w:val="yellow"/>
+        </w:rPr>
+        <w:t>Changing a field type may result in data loss</w:t>
+      </w:r>
+      <w:r>
+        <w:t xml:space="preserve"> if the types are incompatible, such as converting a Long Text Area to a Picklist.</w:t>
+      </w:r>
+    </w:p>
+    <w:p>
+      <w:pPr>
+        <w:pStyle w:val="Heading4"/>
+      </w:pPr>
+      <w:r>
+        <w:lastRenderedPageBreak/>
+        <w:t>Example</w:t>
+      </w:r>
+    </w:p>
+    <w:p>
+      <w:r>
+        <w:br/>
+        <w:t>==============================</w:t>
+      </w:r>
+      <w:r>
+        <w:br/>
+      </w:r>
+    </w:p>
+    <w:p>
+      <w:pPr>
+        <w:pStyle w:val="Title"/>
+      </w:pPr>
+      <w:r>
+        <w:rPr>
+          <w:b/>
+          <w:sz w:val="36"/>
+        </w:rPr>
+        <w:t>Salesforce Record Types</w:t>
+      </w:r>
+    </w:p>
+    <w:p>
+      <w:pPr>
+        <w:pStyle w:val="Heading1"/>
+      </w:pPr>
+      <w:r>
+        <w:t>Summary</w:t>
+      </w:r>
+    </w:p>
+    <w:p>
+      <w:pPr>
+        <w:pStyle w:val="ListBullet"/>
+      </w:pPr>
+      <w:r>
+        <w:t xml:space="preserve">Record Types allow you to offer </w:t>
+      </w:r>
+    </w:p>
+    <w:p>
+      <w:pPr>
+        <w:pStyle w:val="ListBullet"/>
+        <w:tabs>
+          <w:tab w:val="clear" w:pos="360"/>
+          <w:tab w:val="num" w:pos="720"/>
+        </w:tabs>
+        <w:ind w:left="720"/>
+        <w:rPr>
+          <w:highlight w:val="yellow"/>
+        </w:rPr>
+      </w:pPr>
+      <w:r>
+        <w:rPr>
+          <w:highlight w:val="yellow"/>
+        </w:rPr>
+        <w:t xml:space="preserve">different business processes, picklist values, and page layouts to different users based on their profile. </w:t>
+      </w:r>
+    </w:p>
+    <w:p>
+      <w:pPr>
+        <w:pStyle w:val="ListBullet"/>
+        <w:tabs>
+          <w:tab w:val="clear" w:pos="360"/>
+          <w:tab w:val="num" w:pos="720"/>
+        </w:tabs>
+        <w:ind w:left="720"/>
+        <w:rPr>
+          <w:highlight w:val="yellow"/>
+        </w:rPr>
+      </w:pPr>
+      <w:r>
+        <w:rPr>
+          <w:highlight w:val="yellow"/>
+        </w:rPr>
+        <w:t xml:space="preserve">They are a fundamental tool for tailoring the </w:t>
+      </w:r>
+      <w:proofErr w:type="gramStart"/>
+      <w:r>
+        <w:rPr>
+          <w:highlight w:val="yellow"/>
+        </w:rPr>
+        <w:t>user</w:t>
+      </w:r>
+      <w:proofErr w:type="gramEnd"/>
+      <w:r>
+        <w:rPr>
+          <w:highlight w:val="yellow"/>
+        </w:rPr>
+        <w:t xml:space="preserve"> experience within a single object to meet various business requirements.</w:t>
+      </w:r>
+    </w:p>
+    <w:p>
+      <w:pPr>
+        <w:pStyle w:val="Heading2"/>
+      </w:pPr>
+      <w:r>
+        <w:t>Core Concepts and Functionality</w:t>
+      </w:r>
+    </w:p>
+    <w:p>
+      <w:pPr>
+        <w:pStyle w:val="ListBullet"/>
+      </w:pPr>
+      <w:r>
+        <w:t>Record Types serve as a bridge between the data layer and the presentation layer. They allow a single object to support multiple business scenarios by filtering picklist values and assigning specific Page Layouts. For example, a 'Service' account may require different fields and picklist options than a 'Sales' account. Record Types are assigned at the Profile or Permission Set level, allowing administrators to control which users can create records of a specific type.</w:t>
+      </w:r>
+    </w:p>
+    <w:p>
+      <w:pPr>
+        <w:pStyle w:val="Heading2"/>
+      </w:pPr>
+      <w:r>
+        <w:t>Business Processes Integration</w:t>
+      </w:r>
+    </w:p>
+    <w:p>
+      <w:pPr>
+        <w:pStyle w:val="ListBullet"/>
+        <w:rPr>
+          <w:highlight w:val="yellow"/>
+        </w:rPr>
+      </w:pPr>
+      <w:r>
+        <w:rPr>
+          <w:highlight w:val="yellow"/>
+        </w:rPr>
+        <w:t xml:space="preserve">Certain standard objects require a </w:t>
+      </w:r>
+      <w:r>
+        <w:rPr>
+          <w:b/>
+          <w:bCs/>
+          <w:highlight w:val="yellow"/>
+        </w:rPr>
+        <w:t>'Business Process'</w:t>
+      </w:r>
+      <w:r>
+        <w:rPr>
+          <w:highlight w:val="yellow"/>
+        </w:rPr>
+        <w:t xml:space="preserve"> to be defined before a Record Type can be created. </w:t>
+      </w:r>
+    </w:p>
+    <w:p>
+      <w:pPr>
+        <w:pStyle w:val="ListBullet"/>
+        <w:tabs>
+          <w:tab w:val="clear" w:pos="360"/>
+          <w:tab w:val="num" w:pos="720"/>
+        </w:tabs>
+        <w:ind w:left="720"/>
+        <w:rPr>
+          <w:highlight w:val="yellow"/>
+        </w:rPr>
+      </w:pPr>
+      <w:r>
+        <w:rPr>
+          <w:highlight w:val="yellow"/>
+        </w:rPr>
+        <w:t xml:space="preserve">Opportunities (Sales Processes), </w:t>
+      </w:r>
+    </w:p>
+    <w:p>
+      <w:pPr>
+        <w:pStyle w:val="ListBullet"/>
+        <w:tabs>
+          <w:tab w:val="clear" w:pos="360"/>
+          <w:tab w:val="num" w:pos="720"/>
+        </w:tabs>
+        <w:ind w:left="720"/>
+        <w:rPr>
+          <w:highlight w:val="yellow"/>
+        </w:rPr>
+      </w:pPr>
+      <w:r>
+        <w:rPr>
+          <w:highlight w:val="yellow"/>
+        </w:rPr>
+        <w:t>Cases (Support Processes),</w:t>
+      </w:r>
+    </w:p>
+    <w:p>
+      <w:pPr>
+        <w:pStyle w:val="ListBullet"/>
+        <w:tabs>
+          <w:tab w:val="clear" w:pos="360"/>
+          <w:tab w:val="num" w:pos="720"/>
+        </w:tabs>
+        <w:ind w:left="720"/>
+        <w:rPr>
+          <w:highlight w:val="yellow"/>
+        </w:rPr>
+      </w:pPr>
+      <w:r>
+        <w:rPr>
+          <w:highlight w:val="yellow"/>
+        </w:rPr>
+        <w:t xml:space="preserve"> Leads (Lead Processes), and </w:t>
+      </w:r>
+    </w:p>
+    <w:p>
+      <w:pPr>
+        <w:pStyle w:val="ListBullet"/>
+        <w:tabs>
+          <w:tab w:val="clear" w:pos="360"/>
+          <w:tab w:val="num" w:pos="720"/>
+        </w:tabs>
+        <w:ind w:left="720"/>
+        <w:rPr>
+          <w:highlight w:val="yellow"/>
+        </w:rPr>
+      </w:pPr>
+      <w:r>
+        <w:rPr>
+          <w:highlight w:val="yellow"/>
+        </w:rPr>
+        <w:t xml:space="preserve">Solutions (Solution Processes). </w:t>
+      </w:r>
+    </w:p>
+    <w:p>
+      <w:pPr>
+        <w:pStyle w:val="ListBullet"/>
+        <w:numPr>
+          <w:ilvl w:val="0"/>
+          <w:numId w:val="0"/>
+        </w:numPr>
+        <w:ind w:left="360" w:hanging="360"/>
+      </w:pPr>
+      <w:r>
+        <w:rPr>
+          <w:b/>
+          <w:bCs/>
+        </w:rPr>
+        <w:t>The Business Process</w:t>
+      </w:r>
+      <w:r>
+        <w:t xml:space="preserve"> defines the lifecycle stages—such as Status or Stage picklist values—that are available for that specific Record Type.</w:t>
+      </w:r>
+    </w:p>
+    <w:p>
+      <w:pPr>
+        <w:pStyle w:val="Heading2"/>
+      </w:pPr>
+      <w:r>
+        <w:t>Metadata and API Considerations</w:t>
+      </w:r>
+    </w:p>
+    <w:p>
+      <w:pPr>
+        <w:pStyle w:val="ListBullet"/>
+      </w:pPr>
+      <w:r>
+        <w:t>In the underlying metadata, Record Types are identified by their DeveloperName or Id. When working with Apex or the REST API, it is essential to reference Record Types dynamically.</w:t>
+      </w:r>
+    </w:p>
+    <w:p>
+      <w:pPr>
+        <w:pStyle w:val="ListBullet"/>
+      </w:pPr>
+      <w:r>
+        <w:rPr>
+          <w:b/>
+          <w:bCs/>
+        </w:rPr>
+        <w:t>Dynamic fetch reco</w:t>
+      </w:r>
+      <w:r>
+        <w:rPr>
+          <w:b/>
+          <w:bCs/>
+        </w:rPr>
+        <w:t>r</w:t>
+      </w:r>
+      <w:r>
+        <w:rPr>
+          <w:b/>
+          <w:bCs/>
+        </w:rPr>
+        <w:t>d</w:t>
+      </w:r>
+      <w:r>
+        <w:rPr>
+          <w:b/>
+          <w:bCs/>
+        </w:rPr>
+        <w:t xml:space="preserve"> </w:t>
+      </w:r>
+      <w:r>
+        <w:rPr>
+          <w:b/>
+          <w:bCs/>
+        </w:rPr>
+        <w:t xml:space="preserve">Type </w:t>
+      </w:r>
+      <w:proofErr w:type="gramStart"/>
+      <w:r>
+        <w:rPr>
+          <w:b/>
+          <w:bCs/>
+        </w:rPr>
+        <w:t>values</w:t>
+      </w:r>
+      <w:r>
+        <w:t xml:space="preserve"> :</w:t>
+      </w:r>
+      <w:proofErr w:type="gramEnd"/>
+      <w:r>
+        <w:t xml:space="preserve">  </w:t>
+      </w:r>
+    </w:p>
+    <w:p>
+      <w:pPr>
+        <w:pStyle w:val="ListBullet"/>
+        <w:tabs>
+          <w:tab w:val="clear" w:pos="360"/>
+          <w:tab w:val="num" w:pos="720"/>
+        </w:tabs>
+        <w:ind w:left="720"/>
+        <w:rPr>
+          <w:highlight w:val="yellow"/>
+        </w:rPr>
+      </w:pPr>
+      <w:r>
+        <w:rPr>
+          <w:highlight w:val="yellow"/>
+        </w:rPr>
+        <w:t xml:space="preserve">The </w:t>
+      </w:r>
+      <w:proofErr w:type="spellStart"/>
+      <w:r>
+        <w:rPr>
+          <w:highlight w:val="yellow"/>
+        </w:rPr>
+        <w:t>Schema.DescribeSObjectResult</w:t>
+      </w:r>
+      <w:proofErr w:type="spellEnd"/>
+      <w:r>
+        <w:rPr>
+          <w:highlight w:val="yellow"/>
+        </w:rPr>
+        <w:t xml:space="preserve"> and </w:t>
+      </w:r>
+    </w:p>
+    <w:p>
+      <w:pPr>
+        <w:pStyle w:val="ListBullet"/>
+        <w:tabs>
+          <w:tab w:val="clear" w:pos="360"/>
+          <w:tab w:val="num" w:pos="720"/>
+        </w:tabs>
+        <w:ind w:left="720"/>
+      </w:pPr>
+      <w:proofErr w:type="spellStart"/>
+      <w:r>
+        <w:rPr>
+          <w:highlight w:val="yellow"/>
+        </w:rPr>
+        <w:t>Schema.RecordTypeInfo</w:t>
+      </w:r>
+      <w:proofErr w:type="spellEnd"/>
+      <w:r>
+        <w:rPr>
+          <w:highlight w:val="yellow"/>
+        </w:rPr>
+        <w:t xml:space="preserve"> classes in Apex are used to retrieve record type</w:t>
+      </w:r>
+      <w:r>
+        <w:t xml:space="preserve"> information without hardcoding IDs, ensuring code portability across environments.</w:t>
+      </w:r>
+    </w:p>
+    <w:p>
+      <w:pPr>
+        <w:pStyle w:val="Heading3"/>
+      </w:pPr>
+      <w:r>
+        <w:lastRenderedPageBreak/>
+        <w:t>Best Practices</w:t>
+      </w:r>
+    </w:p>
+    <w:p>
+      <w:pPr>
+        <w:pStyle w:val="ListBullet"/>
+      </w:pPr>
+      <w:r>
+        <w:t>Always use Developer Names instead of hardcoded IDs in Apex code and Flows.</w:t>
+      </w:r>
+    </w:p>
+    <w:p>
+      <w:pPr>
+        <w:pStyle w:val="ListBullet"/>
+      </w:pPr>
+      <w:r>
+        <w:t>Limit the number of record types per object to avoid 'Configuration Sprawl' and high maintenance overhead.</w:t>
+      </w:r>
+    </w:p>
+    <w:p>
+      <w:pPr>
+        <w:pStyle w:val="ListBullet"/>
+        <w:rPr>
+          <w:highlight w:val="yellow"/>
+        </w:rPr>
+      </w:pPr>
+      <w:r>
+        <w:rPr>
+          <w:highlight w:val="yellow"/>
+        </w:rPr>
+        <w:t xml:space="preserve">Use Record Types to control picklist </w:t>
+      </w:r>
+      <w:r>
+        <w:rPr>
+          <w:highlight w:val="yellow"/>
+        </w:rPr>
+        <w:t>values but</w:t>
+      </w:r>
+      <w:r>
+        <w:rPr>
+          <w:highlight w:val="yellow"/>
+        </w:rPr>
+        <w:t xml:space="preserve"> use Page Layouts or Lightning Record Pages to control the UI layout.</w:t>
+      </w:r>
+    </w:p>
+    <w:p>
+      <w:pPr>
+        <w:pStyle w:val="ListBullet"/>
+      </w:pPr>
+      <w:r>
+        <w:t>Provide clear descriptions for each Record Type so users understand which one to select during record creation.</w:t>
+      </w:r>
+    </w:p>
+    <w:p>
+      <w:pPr>
+        <w:pStyle w:val="ListBullet"/>
+      </w:pPr>
+      <w:r>
+        <w:t>Group similar business units into the same Record Type if their picklist needs and processes are 80 percent identical.</w:t>
+      </w:r>
+    </w:p>
+    <w:p>
+      <w:pPr>
+        <w:pStyle w:val="Heading3"/>
+      </w:pPr>
+      <w:r>
+        <w:t>Limitations</w:t>
+      </w:r>
+    </w:p>
+    <w:p>
+      <w:pPr>
+        <w:pStyle w:val="ListBullet"/>
+      </w:pPr>
+      <w:r>
+        <w:t>A single record can only be assigned to one Record Type at a time.</w:t>
+      </w:r>
+    </w:p>
+    <w:p>
+      <w:pPr>
+        <w:pStyle w:val="ListBullet"/>
+      </w:pPr>
+      <w:r>
+        <w:t>Record Types cannot be deleted if they are referenced in code or have active records assigned to them; they must be deactivated first.</w:t>
+      </w:r>
+    </w:p>
+    <w:p>
+      <w:pPr>
+        <w:pStyle w:val="ListBullet"/>
+        <w:rPr>
+          <w:highlight w:val="yellow"/>
+        </w:rPr>
+      </w:pPr>
+      <w:r>
+        <w:rPr>
+          <w:highlight w:val="yellow"/>
+        </w:rPr>
+        <w:t>Record Types do not provide data security; they only control UI visibility and picklist options, not field-level security or sharing.</w:t>
+      </w:r>
+    </w:p>
+    <w:p>
+      <w:pPr>
+        <w:pStyle w:val="ListBullet"/>
+      </w:pPr>
+      <w:r>
+        <w:t>There is a limit to the number of picklist values that can be modified via the Record Type interface for very large sets.</w:t>
+      </w:r>
+    </w:p>
+    <w:p>
+      <w:pPr>
+        <w:pStyle w:val="Heading4"/>
+      </w:pPr>
+      <w:r>
+        <w:t>Example</w:t>
+      </w:r>
+    </w:p>
+    <w:p>
+      <w:r>
+        <w:br/>
+        <w:t>==============================</w:t>
+      </w:r>
+      <w:r>
+        <w:br/>
+      </w:r>
+    </w:p>
+    <w:p>
+      <w:pPr>
+        <w:pStyle w:val="Title"/>
+      </w:pPr>
+      <w:r>
+        <w:rPr>
+          <w:b/>
+          <w:sz w:val="36"/>
+        </w:rPr>
+        <w:t>Salesforce Validation Rules</w:t>
+      </w:r>
+    </w:p>
+    <w:p>
+      <w:pPr>
+        <w:pStyle w:val="Heading1"/>
+      </w:pPr>
+      <w:r>
+        <w:t>Summary</w:t>
+      </w:r>
+    </w:p>
+    <w:p>
+      <w:pPr>
+        <w:pStyle w:val="ListBullet"/>
+      </w:pPr>
+      <w:r>
+        <w:t>Validation rules verify that the data a user enters in a record meets the standards you specify before the user can save the record. They contain a formula or expression that evaluates data and returns a value of True or False. If the formula returns True, an error message is displayed and the save operation is halted.</w:t>
+      </w:r>
+    </w:p>
+    <w:p>
+      <w:pPr>
+        <w:pStyle w:val="Heading2"/>
+      </w:pPr>
+      <w:r>
+        <w:t>Core Fundamentals</w:t>
+      </w:r>
+    </w:p>
+    <w:p>
+      <w:pPr>
+        <w:pStyle w:val="ListBullet"/>
+      </w:pPr>
+      <w:r>
+        <w:t>At their basic level, validation rules are comprised of two parts: the error condition formula and the error message. The formula defines the criteria for what constitutes 'bad data'. When this criteria is met (evaluates to true), the error message is triggered. These rules apply to new records as well as updates to existing records.</w:t>
+      </w:r>
+    </w:p>
+    <w:p>
+      <w:pPr>
+        <w:pStyle w:val="Heading2"/>
+      </w:pPr>
+      <w:r>
+        <w:t>Advanced Logic and State Management</w:t>
+      </w:r>
+    </w:p>
+    <w:p>
+      <w:pPr>
+        <w:pStyle w:val="ListBullet"/>
+      </w:pPr>
+      <w:r>
+        <w:t xml:space="preserve">For expert users, validation rules provide powerful functions like ISCHANGED(), PRIORVALUE(), and REGEX(). ISCHANGED checks if a field value has been modified </w:t>
+      </w:r>
+      <w:r>
+        <w:lastRenderedPageBreak/>
+        <w:t>during the current transaction, while PRIORVALUE allows you to compare the new data against the value stored in the database before the edit. REGEX allows for complex pattern matching, such as validating social security numbers or custom ID formats.</w:t>
+      </w:r>
+    </w:p>
+    <w:p>
+      <w:pPr>
+        <w:pStyle w:val="Heading2"/>
+      </w:pPr>
+      <w:r>
+        <w:t>Order of Execution</w:t>
+      </w:r>
+    </w:p>
+    <w:p>
+      <w:pPr>
+        <w:pStyle w:val="ListBullet"/>
+        <w:rPr>
+          <w:color w:val="17365D" w:themeColor="text2" w:themeShade="BF"/>
+          <w:highlight w:val="yellow"/>
+        </w:rPr>
+      </w:pPr>
+      <w:r>
+        <w:rPr>
+          <w:color w:val="17365D" w:themeColor="text2" w:themeShade="BF"/>
+          <w:highlight w:val="yellow"/>
+        </w:rPr>
+        <w:t xml:space="preserve">Validation rules </w:t>
+      </w:r>
+      <w:r>
+        <w:rPr>
+          <w:color w:val="17365D" w:themeColor="text2" w:themeShade="BF"/>
+          <w:highlight w:val="yellow"/>
+        </w:rPr>
+        <w:t xml:space="preserve">run after system-level validation (like field types and requiredness) </w:t>
+      </w:r>
+    </w:p>
+    <w:p>
+      <w:pPr>
+        <w:pStyle w:val="ListBullet"/>
+        <w:tabs>
+          <w:tab w:val="clear" w:pos="360"/>
+          <w:tab w:val="num" w:pos="720"/>
+        </w:tabs>
+        <w:ind w:left="720"/>
+        <w:rPr>
+          <w:color w:val="17365D" w:themeColor="text2" w:themeShade="BF"/>
+          <w:highlight w:val="yellow"/>
+        </w:rPr>
+      </w:pPr>
+      <w:r>
+        <w:rPr>
+          <w:color w:val="17365D" w:themeColor="text2" w:themeShade="BF"/>
+          <w:highlight w:val="yellow"/>
+        </w:rPr>
+        <w:t xml:space="preserve">but before triggers, assignment rules, and workflow rules. </w:t>
+      </w:r>
+    </w:p>
+    <w:p>
+      <w:pPr>
+        <w:pStyle w:val="Heading3"/>
+      </w:pPr>
+      <w:r>
+        <w:t>Best Practices</w:t>
+      </w:r>
+    </w:p>
+    <w:p>
+      <w:pPr>
+        <w:pStyle w:val="ListBullet"/>
+      </w:pPr>
+      <w:r>
+        <w:t>Provide clear, actionable error messages that tell the user exactly how to fix the problem.</w:t>
+      </w:r>
+    </w:p>
+    <w:p>
+      <w:pPr>
+        <w:pStyle w:val="ListBullet"/>
+        <w:rPr>
+          <w:highlight w:val="yellow"/>
+        </w:rPr>
+      </w:pPr>
+      <w:r>
+        <w:rPr>
+          <w:highlight w:val="yellow"/>
+        </w:rPr>
+        <w:t>Use Custom Permissions or Custom Settings to create 'bypass' logic for integration users or system administrators.</w:t>
+      </w:r>
+    </w:p>
+    <w:p>
+      <w:pPr>
+        <w:pStyle w:val="ListBullet"/>
+      </w:pPr>
+      <w:r>
+        <w:t>Avoid hardcoding IDs in formulas; use Developer Names or System Variables instead.</w:t>
+      </w:r>
+    </w:p>
+    <w:p>
+      <w:pPr>
+        <w:pStyle w:val="ListBullet"/>
+      </w:pPr>
+      <w:r>
+        <w:t>Group multiple conditions using AND() and OR() functions to keep the rule logic organized and readable.</w:t>
+      </w:r>
+    </w:p>
+    <w:p>
+      <w:pPr>
+        <w:pStyle w:val="ListBullet"/>
+      </w:pPr>
+      <w:r>
+        <w:t>Document the purpose of each rule in the description field for future maintenance.</w:t>
+      </w:r>
+    </w:p>
+    <w:p>
+      <w:pPr>
+        <w:pStyle w:val="Heading3"/>
+      </w:pPr>
+      <w:r>
+        <w:t>Limitations</w:t>
+      </w:r>
+    </w:p>
+    <w:p>
+      <w:pPr>
+        <w:pStyle w:val="ListBullet"/>
+      </w:pPr>
+      <w:r>
+        <w:t xml:space="preserve">Each object has a limit on the number of active validation rules </w:t>
+      </w:r>
+    </w:p>
+    <w:p>
+      <w:pPr>
+        <w:pStyle w:val="ListBullet"/>
+        <w:rPr>
+          <w:highlight w:val="yellow"/>
+        </w:rPr>
+      </w:pPr>
+      <w:r>
+        <w:rPr>
+          <w:highlight w:val="yellow"/>
+        </w:rPr>
+        <w:t>(</w:t>
+      </w:r>
+      <w:proofErr w:type="gramStart"/>
+      <w:r>
+        <w:rPr>
+          <w:highlight w:val="yellow"/>
+        </w:rPr>
+        <w:t>typically</w:t>
+      </w:r>
+      <w:proofErr w:type="gramEnd"/>
+      <w:r>
+        <w:rPr>
+          <w:highlight w:val="yellow"/>
+        </w:rPr>
+        <w:t xml:space="preserve"> 100 for Enterprise/Unlimited).</w:t>
+      </w:r>
+    </w:p>
+    <w:p>
+      <w:pPr>
+        <w:pStyle w:val="ListBullet"/>
+      </w:pPr>
+      <w:r>
+        <w:rPr>
+          <w:highlight w:val="yellow"/>
+        </w:rPr>
+        <w:t>Validation rules cannot prevent the deletion of a record; that requires an Apex Trigger.</w:t>
+      </w:r>
+    </w:p>
+    <w:p>
+      <w:pPr>
+        <w:pStyle w:val="ListBullet"/>
+      </w:pPr>
+      <w:r>
+        <w:t>The formula character limit is 8,192 characters per rule.</w:t>
+      </w:r>
+    </w:p>
+    <w:p>
+      <w:pPr>
+        <w:pStyle w:val="ListBullet"/>
+        <w:rPr>
+          <w:highlight w:val="yellow"/>
+        </w:rPr>
+      </w:pPr>
+      <w:r>
+        <w:rPr>
+          <w:highlight w:val="yellow"/>
+        </w:rPr>
+        <w:t>Validation rules are not triggered by certain automated processes like Lead Conversion or mass record updates via specific legacy tools unless configured otherwise.</w:t>
       </w:r>
     </w:p>
     <w:p>
@@ -555,6 +2295,9 @@
   </w:num>
   <w:num w:numId="9" w16cid:durableId="902717095">
     <w:abstractNumId w:val="0"/>
+  </w:num>
+  <w:num w:numId="10" w16cid:durableId="819155200">
+    <w:abstractNumId w:val="8"/>
   </w:num>
 </w:numbering>
 </file>
@@ -1162,6 +2905,7 @@
   <w:style w:type="character" w:default="1" w:styleId="DefaultParagraphFont">
     <w:name w:val="Default Paragraph Font"/>
     <w:uiPriority w:val="1"/>
+    <w:semiHidden/>
     <w:unhideWhenUsed/>
   </w:style>
   <w:style w:type="table" w:default="1" w:styleId="TableNormal">

</xml_diff>

<commit_message>
add salesforce doc and topic made dynamic in sfDocumentBuilder
</commit_message>
<xml_diff>
--- a/Salesforce_Notes.docx
+++ b/Salesforce_Notes.docx
@@ -1916,14 +1916,7 @@
           <w:color w:val="17365D" w:themeColor="text2" w:themeShade="BF"/>
           <w:highlight w:val="yellow"/>
         </w:rPr>
-        <w:t xml:space="preserve">Validation rules </w:t>
-      </w:r>
-      <w:r>
-        <w:rPr>
-          <w:color w:val="17365D" w:themeColor="text2" w:themeShade="BF"/>
-          <w:highlight w:val="yellow"/>
-        </w:rPr>
-        <w:t xml:space="preserve">run after system-level validation (like field types and requiredness) </w:t>
+        <w:t xml:space="preserve">Validation rules run after system-level validation (like field types and requiredness) </w:t>
       </w:r>
     </w:p>
     <w:p>
@@ -2076,6 +2069,326 @@
           <w:highlight w:val="yellow"/>
         </w:rPr>
         <w:t>Validation rules are not triggered by certain automated processes like Lead Conversion or mass record updates via specific legacy tools unless configured otherwise.</w:t>
+      </w:r>
+    </w:p>
+    <w:p>
+      <w:pPr>
+        <w:pStyle w:val="Heading4"/>
+      </w:pPr>
+      <w:r>
+        <w:t>Example</w:t>
+      </w:r>
+    </w:p>
+    <w:p>
+      <w:r>
+        <w:br/>
+        <w:t>==============================</w:t>
+      </w:r>
+      <w:r>
+        <w:br/>
+      </w:r>
+    </w:p>
+    <w:p>
+      <w:pPr>
+        <w:pStyle w:val="Title"/>
+      </w:pPr>
+      <w:r>
+        <w:rPr>
+          <w:b/>
+          <w:sz w:val="36"/>
+        </w:rPr>
+        <w:t>Salesforce Formula Fields</w:t>
+      </w:r>
+    </w:p>
+    <w:p>
+      <w:pPr>
+        <w:pStyle w:val="Heading1"/>
+      </w:pPr>
+      <w:r>
+        <w:t>Summary</w:t>
+      </w:r>
+    </w:p>
+    <w:p>
+      <w:pPr>
+        <w:pStyle w:val="ListBullet"/>
+      </w:pPr>
+      <w:r>
+        <w:t>Formula fields are read-only fields that automatically calculate values based on other fields, expressions, or constants. They provide real-time data insights and automation without the need for custom code.</w:t>
+      </w:r>
+    </w:p>
+    <w:p>
+      <w:pPr>
+        <w:pStyle w:val="Heading2"/>
+      </w:pPr>
+      <w:r>
+        <w:t>Core Mechanics</w:t>
+      </w:r>
+    </w:p>
+    <w:p>
+      <w:pPr>
+        <w:pStyle w:val="ListBullet"/>
+      </w:pPr>
+      <w:r>
+        <w:t>Calculated at runtime whenever the record is viewed or queried; Supports various return types including Currency, Date, Number, and Text.</w:t>
+      </w:r>
+    </w:p>
+    <w:p>
+      <w:pPr>
+        <w:pStyle w:val="Heading2"/>
+      </w:pPr>
+      <w:r>
+        <w:lastRenderedPageBreak/>
+        <w:t>Logic and Relationship Features</w:t>
+      </w:r>
+    </w:p>
+    <w:p>
+      <w:pPr>
+        <w:pStyle w:val="ListBullet"/>
+      </w:pPr>
+      <w:r>
+        <w:t xml:space="preserve">Cross-object formulas allow pulling data from </w:t>
+      </w:r>
+      <w:r>
+        <w:rPr>
+          <w:highlight w:val="yellow"/>
+        </w:rPr>
+        <w:t>parent records up to 10 levels deep;</w:t>
+      </w:r>
+      <w:r>
+        <w:t xml:space="preserve"> Built-in functions like IF, CASE, and </w:t>
+      </w:r>
+      <w:proofErr w:type="gramStart"/>
+      <w:r>
+        <w:t>BR(</w:t>
+      </w:r>
+      <w:proofErr w:type="gramEnd"/>
+      <w:r>
+        <w:t>) enable complex string and logical manipulation.</w:t>
+      </w:r>
+    </w:p>
+    <w:p>
+      <w:pPr>
+        <w:pStyle w:val="Heading3"/>
+      </w:pPr>
+      <w:r>
+        <w:t>Best Practices</w:t>
+      </w:r>
+    </w:p>
+    <w:p>
+      <w:pPr>
+        <w:pStyle w:val="ListBullet"/>
+      </w:pPr>
+      <w:r>
+        <w:t>Use the BLANKVALUE function to handle null field scenarios gracefully</w:t>
+      </w:r>
+    </w:p>
+    <w:p>
+      <w:pPr>
+        <w:pStyle w:val="ListBullet"/>
+      </w:pPr>
+      <w:r>
+        <w:t>Document complex logic using comments within the formula editor for future maintenance</w:t>
+      </w:r>
+    </w:p>
+    <w:p>
+      <w:pPr>
+        <w:pStyle w:val="ListBullet"/>
+      </w:pPr>
+      <w:r>
+        <w:t>Keep compiled size low by using CASE instead of multiple nested IF statements</w:t>
+      </w:r>
+    </w:p>
+    <w:p>
+      <w:pPr>
+        <w:pStyle w:val="Heading3"/>
+      </w:pPr>
+      <w:r>
+        <w:t>Limitations</w:t>
+      </w:r>
+    </w:p>
+    <w:p>
+      <w:pPr>
+        <w:pStyle w:val="ListBullet"/>
+      </w:pPr>
+      <w:r>
+        <w:t>Maximum compiled size limit of 15,000 bytes per formula field</w:t>
+      </w:r>
+    </w:p>
+    <w:p>
+      <w:pPr>
+        <w:pStyle w:val="ListBullet"/>
+        <w:rPr>
+          <w:highlight w:val="yellow"/>
+        </w:rPr>
+      </w:pPr>
+      <w:r>
+        <w:rPr>
+          <w:highlight w:val="yellow"/>
+        </w:rPr>
+        <w:t>Cannot reference Long Text Area, Rich Text Area, or Encrypted fields</w:t>
+      </w:r>
+    </w:p>
+    <w:p>
+      <w:pPr>
+        <w:pStyle w:val="ListBullet"/>
+      </w:pPr>
+      <w:r>
+        <w:t>Values are not stored in the database, which can impact performance in large reports if used as filters</w:t>
+      </w:r>
+    </w:p>
+    <w:p>
+      <w:pPr>
+        <w:pStyle w:val="Heading4"/>
+      </w:pPr>
+      <w:r>
+        <w:t>Example</w:t>
+      </w:r>
+    </w:p>
+    <w:p>
+      <w:r>
+        <w:br/>
+        <w:t>==============================</w:t>
+        <w:br/>
+      </w:r>
+    </w:p>
+    <w:p>
+      <w:pPr>
+        <w:pStyle w:val="Title"/>
+      </w:pPr>
+      <w:r>
+        <w:rPr>
+          <w:b/>
+          <w:sz w:val="36"/>
+        </w:rPr>
+        <w:t>Salesforce Roll-Up Summary Fields</w:t>
+      </w:r>
+    </w:p>
+    <w:p>
+      <w:pPr>
+        <w:pStyle w:val="Heading1"/>
+      </w:pPr>
+      <w:r>
+        <w:t>Summary</w:t>
+      </w:r>
+    </w:p>
+    <w:p>
+      <w:pPr>
+        <w:pStyle w:val="ListBullet"/>
+      </w:pPr>
+      <w:r>
+        <w:t>Roll-up summary fields are declarative tools used to calculate values from related records in a master-detail relationship. They provide a native way to aggregate data such as sums, counts, minimums, and maximums without writing code.</w:t>
+      </w:r>
+    </w:p>
+    <w:p>
+      <w:pPr>
+        <w:pStyle w:val="Heading2"/>
+      </w:pPr>
+      <w:r>
+        <w:t>Core Mechanics</w:t>
+      </w:r>
+    </w:p>
+    <w:p>
+      <w:pPr>
+        <w:pStyle w:val="ListBullet"/>
+      </w:pPr>
+      <w:r>
+        <w:t>Operates exclusively over master-detail relationships where the parent is the master; Supports four primary functions: COUNT, SUM, MIN, and MAX; Automatically recalculates whenever child records are created, updated, or deleted.</w:t>
+      </w:r>
+    </w:p>
+    <w:p>
+      <w:pPr>
+        <w:pStyle w:val="Heading2"/>
+      </w:pPr>
+      <w:r>
+        <w:t>Filtering Logic</w:t>
+      </w:r>
+    </w:p>
+    <w:p>
+      <w:pPr>
+        <w:pStyle w:val="ListBullet"/>
+      </w:pPr>
+      <w:r>
+        <w:t>Allows developers to define specific criteria so only a subset of child records are included in the calculation; Does not support cross-object formula fields or certain dynamic date functions in filter criteria; Supports 'All records' or 'Records meeting certain criteria' modes.</w:t>
+      </w:r>
+    </w:p>
+    <w:p>
+      <w:pPr>
+        <w:pStyle w:val="Heading3"/>
+      </w:pPr>
+      <w:r>
+        <w:t>Best Practices</w:t>
+      </w:r>
+    </w:p>
+    <w:p>
+      <w:pPr>
+        <w:pStyle w:val="ListBullet"/>
+      </w:pPr>
+      <w:r>
+        <w:t>Prefer roll-up summary fields over Apex triggers for simple aggregations to reduce technical debt</w:t>
+      </w:r>
+    </w:p>
+    <w:p>
+      <w:pPr>
+        <w:pStyle w:val="ListBullet"/>
+      </w:pPr>
+      <w:r>
+        <w:t>Monitor the limit of 25 roll-up summary fields per object to avoid architectural bottlenecks</w:t>
+      </w:r>
+    </w:p>
+    <w:p>
+      <w:pPr>
+        <w:pStyle w:val="ListBullet"/>
+      </w:pPr>
+      <w:r>
+        <w:t>Use the 'MIN' or 'MAX' functions on date fields to identify the earliest or latest activity related to a record</w:t>
+      </w:r>
+    </w:p>
+    <w:p>
+      <w:pPr>
+        <w:pStyle w:val="ListBullet"/>
+      </w:pPr>
+      <w:r>
+        <w:t>Ensure that users have at least read access to the master record to view aggregated data from the child records</w:t>
+      </w:r>
+    </w:p>
+    <w:p>
+      <w:pPr>
+        <w:pStyle w:val="Heading3"/>
+      </w:pPr>
+      <w:r>
+        <w:t>Limitations</w:t>
+      </w:r>
+    </w:p>
+    <w:p>
+      <w:pPr>
+        <w:pStyle w:val="ListBullet"/>
+      </w:pPr>
+      <w:r>
+        <w:t>Cannot be used in Lookup relationships unless using external tools or custom Apex</w:t>
+      </w:r>
+    </w:p>
+    <w:p>
+      <w:pPr>
+        <w:pStyle w:val="ListBullet"/>
+      </w:pPr>
+      <w:r>
+        <w:t>Formula fields that derive values from other objects cannot be the target of a roll-up summary</w:t>
+      </w:r>
+    </w:p>
+    <w:p>
+      <w:pPr>
+        <w:pStyle w:val="ListBullet"/>
+      </w:pPr>
+      <w:r>
+        <w:t>Values are not updated if the calculation involves a formula field that uses dynamic functions like TODAY() or LDAY()</w:t>
+      </w:r>
+    </w:p>
+    <w:p>
+      <w:pPr>
+        <w:pStyle w:val="ListBullet"/>
+      </w:pPr>
+      <w:r>
+        <w:t>The parent record's 'Last Modified Date' is not updated when a roll-up summary field changes</w:t>
       </w:r>
     </w:p>
     <w:p>

</xml_diff>

<commit_message>
add HTML changes and doc Generator change added.
</commit_message>
<xml_diff>
--- a/Salesforce_Notes.docx
+++ b/Salesforce_Notes.docx
@@ -294,11 +294,9 @@
         </w:tabs>
         <w:ind w:left="720"/>
       </w:pPr>
-      <w:proofErr w:type="spellStart"/>
       <w:r>
         <w:t>Soql</w:t>
       </w:r>
-      <w:proofErr w:type="spellEnd"/>
     </w:p>
     <w:p>
       <w:pPr>
@@ -321,15 +319,7 @@
         <w:pStyle w:val="ListBullet"/>
       </w:pPr>
       <w:r>
-        <w:t>Ensure all Apex code is '</w:t>
-      </w:r>
-      <w:proofErr w:type="spellStart"/>
-      <w:r>
-        <w:t>Bulkified</w:t>
-      </w:r>
-      <w:proofErr w:type="spellEnd"/>
-      <w:r>
-        <w:t>' to handle multiple records simultaneously.</w:t>
+        <w:t>Ensure all Apex code is 'Bulkified' to handle multiple records simultaneously.</w:t>
       </w:r>
     </w:p>
     <w:p>
@@ -1096,6 +1086,12 @@
       <w:r>
         <w:t xml:space="preserve">, </w:t>
       </w:r>
+      <w:r>
+        <w:rPr>
+          <w:color w:val="EE0000"/>
+        </w:rPr>
+        <w:t>!important</w:t>
+      </w:r>
     </w:p>
     <w:p>
       <w:pPr>
@@ -1443,7 +1439,37 @@
         <w:pStyle w:val="ListBullet"/>
       </w:pPr>
       <w:r>
-        <w:t>Record Types serve as a bridge between the data layer and the presentation layer. They allow a single object to support multiple business scenarios by filtering picklist values and assigning specific Page Layouts. For example, a 'Service' account may require different fields and picklist options than a 'Sales' account. Record Types are assigned at the Profile or Permission Set level, allowing administrators to control which users can create records of a specific type.</w:t>
+        <w:t xml:space="preserve">Record Types serve as a bridge between the data layer and the presentation layer. They allow a single object to support multiple business scenarios by filtering picklist values and assigning specific Page Layouts. For example, a 'Service' account may require different fields and picklist options than a 'Sales' account. </w:t>
+      </w:r>
+    </w:p>
+    <w:p>
+      <w:pPr>
+        <w:pStyle w:val="ListBullet"/>
+      </w:pPr>
+      <w:r>
+        <w:rPr>
+          <w:color w:val="EE0000"/>
+          <w:highlight w:val="yellow"/>
+        </w:rPr>
+        <w:t>*</w:t>
+      </w:r>
+      <w:r>
+        <w:rPr>
+          <w:highlight w:val="yellow"/>
+        </w:rPr>
+        <w:t>Record Types are assigned at the Profile or Permission Set level,</w:t>
+      </w:r>
+      <w:r>
+        <w:t xml:space="preserve"> </w:t>
+      </w:r>
+      <w:r>
+        <w:rPr>
+          <w:highlight w:val="yellow"/>
+        </w:rPr>
+        <w:t>allowing administrators to control</w:t>
+      </w:r>
+      <w:r>
+        <w:t xml:space="preserve"> which users can create records of a specific type.</w:t>
       </w:r>
     </w:p>
     <w:p>
@@ -1591,15 +1617,7 @@
         <w:pStyle w:val="ListBullet"/>
       </w:pPr>
       <w:r>
-        <w:t xml:space="preserve">In the underlying metadata, Record Types are identified by their </w:t>
-      </w:r>
-      <w:proofErr w:type="spellStart"/>
-      <w:r>
-        <w:t>DeveloperName</w:t>
-      </w:r>
-      <w:proofErr w:type="spellEnd"/>
-      <w:r>
-        <w:t xml:space="preserve"> or Id. When working with Apex or the REST API, it is essential to reference Record Types dynamically.</w:t>
+        <w:t>In the underlying metadata, Record Types are identified by their DeveloperName or Id. When working with Apex or the REST API, it is essential to reference Record Types dynamically.</w:t>
       </w:r>
     </w:p>
     <w:p>
@@ -1661,21 +1679,7 @@
         <w:rPr>
           <w:highlight w:val="yellow"/>
         </w:rPr>
-        <w:t xml:space="preserve">The </w:t>
-      </w:r>
-      <w:proofErr w:type="spellStart"/>
-      <w:r>
-        <w:rPr>
-          <w:highlight w:val="yellow"/>
-        </w:rPr>
-        <w:t>Schema.DescribeSObjectResult</w:t>
-      </w:r>
-      <w:proofErr w:type="spellEnd"/>
-      <w:r>
-        <w:rPr>
-          <w:highlight w:val="yellow"/>
-        </w:rPr>
-        <w:t xml:space="preserve"> and </w:t>
+        <w:t xml:space="preserve">The Schema.DescribeSObjectResult and </w:t>
       </w:r>
     </w:p>
     <w:p>
@@ -1687,19 +1691,11 @@
         </w:tabs>
         <w:ind w:left="720"/>
       </w:pPr>
-      <w:proofErr w:type="spellStart"/>
-      <w:r>
-        <w:rPr>
-          <w:highlight w:val="yellow"/>
-        </w:rPr>
-        <w:t>Schema.RecordTypeInfo</w:t>
-      </w:r>
-      <w:proofErr w:type="spellEnd"/>
-      <w:r>
-        <w:rPr>
-          <w:highlight w:val="yellow"/>
-        </w:rPr>
-        <w:t xml:space="preserve"> classes in Apex are used to retrieve record type</w:t>
+      <w:r>
+        <w:rPr>
+          <w:highlight w:val="yellow"/>
+        </w:rPr>
+        <w:t>Schema.RecordTypeInfo classes in Apex are used to retrieve record type</w:t>
       </w:r>
       <w:r>
         <w:t xml:space="preserve"> information without hardcoding IDs, ensuring code portability across environments.</w:t>
@@ -1813,8 +1809,14 @@
     <w:p>
       <w:pPr>
         <w:pStyle w:val="ListBullet"/>
-      </w:pPr>
-      <w:r>
+        <w:rPr>
+          <w:highlight w:val="yellow"/>
+        </w:rPr>
+      </w:pPr>
+      <w:r>
+        <w:rPr>
+          <w:highlight w:val="yellow"/>
+        </w:rPr>
         <w:t>There is a limit to the number of picklist values that can be modified via the Record Type interface for very large sets.</w:t>
       </w:r>
     </w:p>
@@ -1860,7 +1862,13 @@
         <w:pStyle w:val="ListBullet"/>
       </w:pPr>
       <w:r>
-        <w:t>Validation rules verify that the data a user enters in a record meets the standards you specify before the user can save the record. They contain a formula or expression that evaluates data and returns a value of True or False. If the formula returns True, an error message is displayed and the save operation is halted.</w:t>
+        <w:rPr>
+          <w:highlight w:val="yellow"/>
+        </w:rPr>
+        <w:t>Validation rules verify that the data a user enters in a record meets the standards you specify before the user can save the record.</w:t>
+      </w:r>
+      <w:r>
+        <w:t xml:space="preserve"> They contain a formula or expression that evaluates data and returns a value of True or False. If the formula returns True, an error message is displayed and the save operation is halted.</w:t>
       </w:r>
     </w:p>
     <w:p>
@@ -1929,23 +1937,7 @@
           <w:color w:val="17365D" w:themeColor="text2" w:themeShade="BF"/>
           <w:highlight w:val="yellow"/>
         </w:rPr>
-        <w:t xml:space="preserve">Validation rules run after system-level validation (like field types and </w:t>
-      </w:r>
-      <w:proofErr w:type="spellStart"/>
-      <w:r>
-        <w:rPr>
-          <w:color w:val="17365D" w:themeColor="text2" w:themeShade="BF"/>
-          <w:highlight w:val="yellow"/>
-        </w:rPr>
-        <w:t>requiredness</w:t>
-      </w:r>
-      <w:proofErr w:type="spellEnd"/>
-      <w:r>
-        <w:rPr>
-          <w:color w:val="17365D" w:themeColor="text2" w:themeShade="BF"/>
-          <w:highlight w:val="yellow"/>
-        </w:rPr>
-        <w:t xml:space="preserve">) </w:t>
+        <w:t xml:space="preserve">Validation rules run after system-level validation (like field types and requiredness) </w:t>
       </w:r>
     </w:p>
     <w:p>
@@ -2059,9 +2051,17 @@
       </w:pPr>
       <w:r>
         <w:rPr>
-          <w:highlight w:val="yellow"/>
-        </w:rPr>
-        <w:t>Validation rules cannot prevent the deletion of a record; that requires an Apex Trigger.</w:t>
+          <w:sz w:val="32"/>
+          <w:szCs w:val="32"/>
+          <w:highlight w:val="yellow"/>
+        </w:rPr>
+        <w:t>**Validation rules cannot prevent the deletion of a record; that requires an Apex Trigger</w:t>
+      </w:r>
+      <w:r>
+        <w:rPr>
+          <w:highlight w:val="yellow"/>
+        </w:rPr>
+        <w:t>.</w:t>
       </w:r>
     </w:p>
     <w:p>
@@ -2088,243 +2088,68 @@
     </w:p>
     <w:p>
       <w:pPr>
-        <w:pStyle w:val="Heading4"/>
-      </w:pPr>
-      <w:r>
-        <w:t>Example</w:t>
-      </w:r>
-    </w:p>
-    <w:p>
-      <w:r>
-        <w:br/>
-        <w:t>==============================</w:t>
-      </w:r>
-      <w:r>
-        <w:br/>
-      </w:r>
-    </w:p>
-    <w:p>
-      <w:pPr>
-        <w:pStyle w:val="Title"/>
-      </w:pPr>
-      <w:r>
-        <w:rPr>
-          <w:b/>
-          <w:sz w:val="36"/>
-        </w:rPr>
-        <w:t>Salesforce Formula Fields</w:t>
-      </w:r>
-    </w:p>
-    <w:p>
-      <w:pPr>
-        <w:pStyle w:val="Heading1"/>
-      </w:pPr>
-      <w:r>
-        <w:t>Summary</w:t>
-      </w:r>
-    </w:p>
-    <w:p>
-      <w:pPr>
-        <w:pStyle w:val="ListBullet"/>
-      </w:pPr>
-      <w:r>
-        <w:rPr>
-          <w:highlight w:val="yellow"/>
-        </w:rPr>
-        <w:t>Formula fields are read-only fields that automatically</w:t>
-      </w:r>
-      <w:r>
-        <w:t xml:space="preserve"> calculate values based on other fields, expressions, or constants. They provide real-time data insights and automation without the need for custom code.</w:t>
-      </w:r>
-    </w:p>
-    <w:p>
-      <w:pPr>
-        <w:pStyle w:val="Heading2"/>
-      </w:pPr>
-      <w:r>
-        <w:t>Core Mechanics</w:t>
-      </w:r>
-    </w:p>
-    <w:p>
-      <w:pPr>
-        <w:pStyle w:val="ListBullet"/>
-      </w:pPr>
-      <w:r>
-        <w:t>Calculated at runtime whenever the record is viewed or queried; Supports various return types including Currency, Date, Number, and Text.</w:t>
-      </w:r>
-    </w:p>
-    <w:p>
-      <w:pPr>
-        <w:pStyle w:val="Heading2"/>
-      </w:pPr>
-      <w:r>
-        <w:lastRenderedPageBreak/>
-        <w:t>Logic and Relationship Features</w:t>
-      </w:r>
-    </w:p>
-    <w:p>
-      <w:pPr>
-        <w:pStyle w:val="ListBullet"/>
-      </w:pPr>
-      <w:r>
-        <w:t xml:space="preserve">Cross-object formulas allow pulling data from </w:t>
-      </w:r>
-      <w:r>
-        <w:rPr>
-          <w:highlight w:val="yellow"/>
-        </w:rPr>
-        <w:t>parent records up to 10 levels deep;</w:t>
-      </w:r>
-      <w:r>
-        <w:t xml:space="preserve"> Built-in functions like IF, CASE, and BR() enable complex string and logical manipulation.</w:t>
-      </w:r>
-    </w:p>
-    <w:p>
-      <w:pPr>
-        <w:pStyle w:val="Heading3"/>
-      </w:pPr>
-      <w:r>
-        <w:t>Best Practices</w:t>
-      </w:r>
-    </w:p>
-    <w:p>
-      <w:pPr>
-        <w:pStyle w:val="ListBullet"/>
-      </w:pPr>
-      <w:r>
-        <w:t>Use the BLANKVALUE function to handle null field scenarios gracefully</w:t>
-      </w:r>
-    </w:p>
-    <w:p>
-      <w:pPr>
-        <w:pStyle w:val="ListBullet"/>
-      </w:pPr>
-      <w:r>
-        <w:t>Document complex logic using comments within the formula editor for future maintenance</w:t>
-      </w:r>
-    </w:p>
-    <w:p>
-      <w:pPr>
-        <w:pStyle w:val="ListBullet"/>
-      </w:pPr>
-      <w:r>
-        <w:t>Keep compiled size low by using CASE instead of multiple nested IF statements</w:t>
-      </w:r>
-    </w:p>
-    <w:p>
-      <w:pPr>
-        <w:pStyle w:val="Heading3"/>
-      </w:pPr>
-      <w:r>
-        <w:t>Limitations</w:t>
-      </w:r>
-    </w:p>
-    <w:p>
-      <w:pPr>
-        <w:pStyle w:val="ListBullet"/>
-      </w:pPr>
-      <w:r>
-        <w:t xml:space="preserve">Maximum compiled size limit of </w:t>
-      </w:r>
-      <w:r>
-        <w:rPr>
-          <w:highlight w:val="yellow"/>
-        </w:rPr>
-        <w:t>15,000 bytes</w:t>
-      </w:r>
-      <w:r>
-        <w:t xml:space="preserve"> per formula field</w:t>
-      </w:r>
-    </w:p>
-    <w:p>
-      <w:pPr>
-        <w:pStyle w:val="ListBullet"/>
-        <w:rPr>
-          <w:highlight w:val="yellow"/>
-        </w:rPr>
-      </w:pPr>
-      <w:r>
-        <w:rPr>
-          <w:highlight w:val="yellow"/>
-        </w:rPr>
-        <w:t>Cannot reference Long Text Area, Rich Text Area, or Encrypted fields</w:t>
-      </w:r>
-    </w:p>
-    <w:p>
-      <w:pPr>
-        <w:pStyle w:val="ListBullet"/>
-      </w:pPr>
-      <w:r>
-        <w:t>Values are not stored in the database, which can impact performance in large reports if used as filters</w:t>
-      </w:r>
-    </w:p>
-    <w:p>
-      <w:pPr>
-        <w:pStyle w:val="Heading4"/>
-      </w:pPr>
-      <w:r>
-        <w:t>Example</w:t>
-      </w:r>
-    </w:p>
-    <w:p>
-      <w:r>
-        <w:br/>
-        <w:t>==============================</w:t>
-      </w:r>
-      <w:r>
-        <w:br/>
-      </w:r>
-    </w:p>
-    <w:p>
-      <w:pPr>
-        <w:pStyle w:val="Title"/>
-      </w:pPr>
-      <w:r>
-        <w:rPr>
-          <w:b/>
-          <w:sz w:val="36"/>
-        </w:rPr>
-        <w:t>Salesforce Roll-Up Summary Fields</w:t>
-      </w:r>
-    </w:p>
-    <w:p>
-      <w:pPr>
-        <w:pStyle w:val="Heading1"/>
-      </w:pPr>
-      <w:r>
-        <w:t>Summary</w:t>
-      </w:r>
-    </w:p>
-    <w:p>
-      <w:pPr>
-        <w:pStyle w:val="ListBullet"/>
-      </w:pPr>
-      <w:r>
-        <w:rPr>
-          <w:b/>
-          <w:bCs/>
-        </w:rPr>
-        <w:t>Roll-up summary fields</w:t>
-      </w:r>
-      <w:r>
-        <w:t xml:space="preserve"> are declarative tools used to calculate values from related records in a </w:t>
-      </w:r>
-      <w:r>
-        <w:rPr>
-          <w:highlight w:val="yellow"/>
-        </w:rPr>
-        <w:t>master-detail relationship.</w:t>
-      </w:r>
-      <w:r>
-        <w:t xml:space="preserve"> </w:t>
-      </w:r>
-    </w:p>
-    <w:p>
-      <w:pPr>
-        <w:pStyle w:val="ListBullet"/>
-      </w:pPr>
-      <w:r>
-        <w:t xml:space="preserve">They provide a native way to aggregate data such as </w:t>
+        <w:pStyle w:val="ListBullet"/>
+        <w:numPr>
+          <w:ilvl w:val="0"/>
+          <w:numId w:val="0"/>
+        </w:numPr>
+        <w:ind w:left="360" w:hanging="360"/>
+        <w:rPr>
+          <w:highlight w:val="yellow"/>
+        </w:rPr>
+      </w:pPr>
+      <w:r>
+        <w:rPr>
+          <w:color w:val="EE0000"/>
+          <w:highlight w:val="yellow"/>
+        </w:rPr>
+        <w:t>Note</w:t>
+      </w:r>
+      <w:r>
+        <w:rPr>
+          <w:highlight w:val="yellow"/>
+        </w:rPr>
+        <w:t xml:space="preserve"> :  </w:t>
+      </w:r>
+    </w:p>
+    <w:p>
+      <w:pPr>
+        <w:pStyle w:val="ListBullet"/>
+        <w:tabs>
+          <w:tab w:val="clear" w:pos="360"/>
+          <w:tab w:val="num" w:pos="720"/>
+        </w:tabs>
+        <w:ind w:left="720"/>
+        <w:rPr>
+          <w:highlight w:val="yellow"/>
+        </w:rPr>
+      </w:pPr>
+      <w:r>
+        <w:rPr>
+          <w:color w:val="EE0000"/>
+          <w:highlight w:val="yellow"/>
+        </w:rPr>
+        <w:t>Validation rules can’t prevent the deletion of a record</w:t>
+      </w:r>
+    </w:p>
+    <w:p>
+      <w:pPr>
+        <w:pStyle w:val="ListBullet"/>
+        <w:tabs>
+          <w:tab w:val="clear" w:pos="360"/>
+          <w:tab w:val="num" w:pos="720"/>
+        </w:tabs>
+        <w:ind w:left="720"/>
+        <w:rPr>
+          <w:highlight w:val="yellow"/>
+        </w:rPr>
+      </w:pPr>
+      <w:r>
+        <w:rPr>
+          <w:color w:val="EE0000"/>
+          <w:highlight w:val="yellow"/>
+        </w:rPr>
+        <w:t>Validation rules are not triggered by certain automated process</w:t>
       </w:r>
     </w:p>
     <w:p>
@@ -2335,9 +2160,16 @@
           <w:tab w:val="num" w:pos="1080"/>
         </w:tabs>
         <w:ind w:left="1080"/>
-      </w:pPr>
-      <w:r>
-        <w:t xml:space="preserve">sums, </w:t>
+        <w:rPr>
+          <w:highlight w:val="yellow"/>
+        </w:rPr>
+      </w:pPr>
+      <w:r>
+        <w:rPr>
+          <w:color w:val="EE0000"/>
+          <w:highlight w:val="yellow"/>
+        </w:rPr>
+        <w:t>Lead conversion</w:t>
       </w:r>
     </w:p>
     <w:p>
@@ -2348,9 +2180,286 @@
           <w:tab w:val="num" w:pos="1080"/>
         </w:tabs>
         <w:ind w:left="1080"/>
-      </w:pPr>
-      <w:r>
-        <w:t>counts,</w:t>
+        <w:rPr>
+          <w:highlight w:val="yellow"/>
+        </w:rPr>
+      </w:pPr>
+      <w:r>
+        <w:rPr>
+          <w:color w:val="EE0000"/>
+          <w:highlight w:val="yellow"/>
+        </w:rPr>
+        <w:t>Mass record updates</w:t>
+      </w:r>
+      <w:r>
+        <w:rPr>
+          <w:highlight w:val="yellow"/>
+        </w:rPr>
+        <w:t xml:space="preserve"> via specific legacy tools</w:t>
+      </w:r>
+    </w:p>
+    <w:p>
+      <w:pPr>
+        <w:pStyle w:val="Heading4"/>
+      </w:pPr>
+      <w:r>
+        <w:t>Example</w:t>
+      </w:r>
+    </w:p>
+    <w:p>
+      <w:r>
+        <w:br/>
+        <w:t>==============================</w:t>
+      </w:r>
+      <w:r>
+        <w:br/>
+      </w:r>
+    </w:p>
+    <w:p>
+      <w:pPr>
+        <w:pStyle w:val="Title"/>
+      </w:pPr>
+      <w:r>
+        <w:rPr>
+          <w:b/>
+          <w:sz w:val="36"/>
+        </w:rPr>
+        <w:t>Salesforce Formula Fields</w:t>
+      </w:r>
+    </w:p>
+    <w:p>
+      <w:pPr>
+        <w:pStyle w:val="Heading1"/>
+      </w:pPr>
+      <w:r>
+        <w:lastRenderedPageBreak/>
+        <w:t>Summary</w:t>
+      </w:r>
+    </w:p>
+    <w:p>
+      <w:pPr>
+        <w:pStyle w:val="ListBullet"/>
+      </w:pPr>
+      <w:r>
+        <w:rPr>
+          <w:highlight w:val="yellow"/>
+        </w:rPr>
+        <w:t>Formula fields are read-only fields that automatically</w:t>
+      </w:r>
+      <w:r>
+        <w:t xml:space="preserve"> calculate values based on other fields, expressions, or constants. They provide real-time data insights and automation without the need for custom code.</w:t>
+      </w:r>
+    </w:p>
+    <w:p>
+      <w:pPr>
+        <w:pStyle w:val="Heading2"/>
+      </w:pPr>
+      <w:r>
+        <w:t>Core Mechanics</w:t>
+      </w:r>
+    </w:p>
+    <w:p>
+      <w:pPr>
+        <w:pStyle w:val="ListBullet"/>
+      </w:pPr>
+      <w:r>
+        <w:t>Calculated at runtime whenever the record is viewed or queried; Supports various return types including Currency, Date, Number, and Text.</w:t>
+      </w:r>
+    </w:p>
+    <w:p>
+      <w:pPr>
+        <w:pStyle w:val="Heading2"/>
+      </w:pPr>
+      <w:r>
+        <w:t>Logic and Relationship Features</w:t>
+      </w:r>
+    </w:p>
+    <w:p>
+      <w:pPr>
+        <w:pStyle w:val="ListBullet"/>
+      </w:pPr>
+      <w:r>
+        <w:t>Cross-object formulas allow pulling data from</w:t>
+      </w:r>
+    </w:p>
+    <w:p>
+      <w:pPr>
+        <w:pStyle w:val="ListBullet"/>
+        <w:tabs>
+          <w:tab w:val="clear" w:pos="360"/>
+          <w:tab w:val="num" w:pos="720"/>
+        </w:tabs>
+        <w:ind w:left="720"/>
+      </w:pPr>
+      <w:r>
+        <w:t xml:space="preserve"> </w:t>
+      </w:r>
+      <w:r>
+        <w:rPr>
+          <w:highlight w:val="yellow"/>
+        </w:rPr>
+        <w:t>parent records up to 10 levels deep;</w:t>
+      </w:r>
+    </w:p>
+    <w:p>
+      <w:pPr>
+        <w:pStyle w:val="ListBullet"/>
+        <w:tabs>
+          <w:tab w:val="clear" w:pos="360"/>
+          <w:tab w:val="num" w:pos="720"/>
+        </w:tabs>
+        <w:ind w:left="720"/>
+      </w:pPr>
+      <w:r>
+        <w:t xml:space="preserve"> Built-in functions like IF, CASE, and BR() enable complex string and logical manipulation.</w:t>
+      </w:r>
+    </w:p>
+    <w:p>
+      <w:pPr>
+        <w:pStyle w:val="Heading3"/>
+      </w:pPr>
+      <w:r>
+        <w:t>Best Practices</w:t>
+      </w:r>
+    </w:p>
+    <w:p>
+      <w:pPr>
+        <w:pStyle w:val="ListBullet"/>
+      </w:pPr>
+      <w:r>
+        <w:t>Use the BLANKVALUE function to handle null field scenarios gracefully</w:t>
+      </w:r>
+    </w:p>
+    <w:p>
+      <w:pPr>
+        <w:pStyle w:val="ListBullet"/>
+      </w:pPr>
+      <w:r>
+        <w:t>Document complex logic using comments within the formula editor for future maintenance</w:t>
+      </w:r>
+    </w:p>
+    <w:p>
+      <w:pPr>
+        <w:pStyle w:val="ListBullet"/>
+      </w:pPr>
+      <w:r>
+        <w:t>Keep compiled size low by using CASE instead of multiple nested IF statements</w:t>
+      </w:r>
+    </w:p>
+    <w:p>
+      <w:pPr>
+        <w:pStyle w:val="Heading3"/>
+      </w:pPr>
+      <w:r>
+        <w:t>Limitations</w:t>
+      </w:r>
+    </w:p>
+    <w:p>
+      <w:pPr>
+        <w:pStyle w:val="ListBullet"/>
+      </w:pPr>
+      <w:r>
+        <w:t xml:space="preserve">Maximum compiled size limit of </w:t>
+      </w:r>
+      <w:r>
+        <w:rPr>
+          <w:highlight w:val="yellow"/>
+        </w:rPr>
+        <w:t>15,000 bytes</w:t>
+      </w:r>
+      <w:r>
+        <w:t xml:space="preserve"> per formula field</w:t>
+      </w:r>
+    </w:p>
+    <w:p>
+      <w:pPr>
+        <w:pStyle w:val="ListBullet"/>
+        <w:rPr>
+          <w:highlight w:val="yellow"/>
+        </w:rPr>
+      </w:pPr>
+      <w:r>
+        <w:rPr>
+          <w:highlight w:val="yellow"/>
+        </w:rPr>
+        <w:t>Cannot reference Long Text Area, Rich Text Area, or Encrypted fields</w:t>
+      </w:r>
+    </w:p>
+    <w:p>
+      <w:pPr>
+        <w:pStyle w:val="ListBullet"/>
+      </w:pPr>
+      <w:r>
+        <w:t>Values are not stored in the database, which can impact performance in large reports if used as filters</w:t>
+      </w:r>
+    </w:p>
+    <w:p>
+      <w:pPr>
+        <w:pStyle w:val="Heading4"/>
+      </w:pPr>
+      <w:r>
+        <w:t>Example</w:t>
+      </w:r>
+    </w:p>
+    <w:p>
+      <w:r>
+        <w:br/>
+        <w:t>==============================</w:t>
+      </w:r>
+      <w:r>
+        <w:br/>
+      </w:r>
+    </w:p>
+    <w:p>
+      <w:pPr>
+        <w:pStyle w:val="Title"/>
+      </w:pPr>
+      <w:r>
+        <w:rPr>
+          <w:b/>
+          <w:sz w:val="36"/>
+        </w:rPr>
+        <w:t>Salesforce Roll-Up Summary Fields</w:t>
+      </w:r>
+    </w:p>
+    <w:p>
+      <w:pPr>
+        <w:pStyle w:val="Heading1"/>
+      </w:pPr>
+      <w:r>
+        <w:t>Summary</w:t>
+      </w:r>
+    </w:p>
+    <w:p>
+      <w:pPr>
+        <w:pStyle w:val="ListBullet"/>
+      </w:pPr>
+      <w:r>
+        <w:rPr>
+          <w:b/>
+          <w:bCs/>
+        </w:rPr>
+        <w:t>Roll-up summary fields</w:t>
+      </w:r>
+      <w:r>
+        <w:t xml:space="preserve"> are declarative tools used to calculate values from related records in a </w:t>
+      </w:r>
+      <w:r>
+        <w:rPr>
+          <w:highlight w:val="yellow"/>
+        </w:rPr>
+        <w:t>master-detail relationship.</w:t>
+      </w:r>
+      <w:r>
+        <w:t xml:space="preserve"> </w:t>
+      </w:r>
+    </w:p>
+    <w:p>
+      <w:pPr>
+        <w:pStyle w:val="ListBullet"/>
+      </w:pPr>
+      <w:r>
+        <w:t xml:space="preserve">They provide a native way to aggregate data such as </w:t>
       </w:r>
     </w:p>
     <w:p>
@@ -2363,7 +2472,7 @@
         <w:ind w:left="1080"/>
       </w:pPr>
       <w:r>
-        <w:t xml:space="preserve">minimums, and </w:t>
+        <w:t xml:space="preserve">sums, </w:t>
       </w:r>
     </w:p>
     <w:p>
@@ -2376,6 +2485,32 @@
         <w:ind w:left="1080"/>
       </w:pPr>
       <w:r>
+        <w:t>counts,</w:t>
+      </w:r>
+    </w:p>
+    <w:p>
+      <w:pPr>
+        <w:pStyle w:val="ListBullet"/>
+        <w:tabs>
+          <w:tab w:val="clear" w:pos="360"/>
+          <w:tab w:val="num" w:pos="1080"/>
+        </w:tabs>
+        <w:ind w:left="1080"/>
+      </w:pPr>
+      <w:r>
+        <w:t xml:space="preserve">minimums, and </w:t>
+      </w:r>
+    </w:p>
+    <w:p>
+      <w:pPr>
+        <w:pStyle w:val="ListBullet"/>
+        <w:tabs>
+          <w:tab w:val="clear" w:pos="360"/>
+          <w:tab w:val="num" w:pos="1080"/>
+        </w:tabs>
+        <w:ind w:left="1080"/>
+      </w:pPr>
+      <w:r>
         <w:t>maximums without writing code.</w:t>
       </w:r>
     </w:p>
@@ -2384,6 +2519,7 @@
         <w:pStyle w:val="Heading2"/>
       </w:pPr>
       <w:r>
+        <w:lastRenderedPageBreak/>
         <w:t>Core Mechanics</w:t>
       </w:r>
     </w:p>
@@ -2408,11 +2544,7 @@
         <w:pStyle w:val="ListBullet"/>
       </w:pPr>
       <w:r>
-        <w:t xml:space="preserve">Allows developers to define specific criteria so only a subset of child records are included in the calculation; Does not support cross-object formula fields or certain </w:t>
-      </w:r>
-      <w:r>
-        <w:lastRenderedPageBreak/>
-        <w:t>dynamic date functions in filter criteria; Supports 'All records' or 'Records meeting certain criteria' modes.</w:t>
+        <w:t>Allows developers to define specific criteria so only a subset of child records are included in the calculation; Does not support cross-object formula fields or certain dynamic date functions in filter criteria; Supports 'All records' or 'Records meeting certain criteria' modes.</w:t>
       </w:r>
     </w:p>
     <w:p>
@@ -2599,6 +2731,7 @@
         <w:ind w:left="720"/>
       </w:pPr>
       <w:r>
+        <w:lastRenderedPageBreak/>
         <w:t xml:space="preserve">Organization, </w:t>
       </w:r>
     </w:p>
@@ -2658,6 +2791,9 @@
       <w:pPr>
         <w:pStyle w:val="Heading2"/>
       </w:pPr>
+      <w:r>
+        <w:t>Data Security</w:t>
+      </w:r>
     </w:p>
     <w:p>
       <w:pPr>
@@ -2807,6 +2943,44 @@
     </w:p>
     <w:p>
       <w:pPr>
+        <w:pStyle w:val="ListBullet"/>
+        <w:numPr>
+          <w:ilvl w:val="0"/>
+          <w:numId w:val="0"/>
+        </w:numPr>
+        <w:tabs>
+          <w:tab w:val="num" w:pos="1080"/>
+        </w:tabs>
+        <w:ind w:left="360" w:hanging="360"/>
+        <w:rPr>
+          <w:highlight w:val="yellow"/>
+        </w:rPr>
+      </w:pPr>
+    </w:p>
+    <w:p>
+      <w:pPr>
+        <w:pStyle w:val="ListBullet"/>
+        <w:numPr>
+          <w:ilvl w:val="0"/>
+          <w:numId w:val="0"/>
+        </w:numPr>
+        <w:tabs>
+          <w:tab w:val="num" w:pos="1080"/>
+        </w:tabs>
+        <w:ind w:left="360" w:hanging="360"/>
+        <w:rPr>
+          <w:highlight w:val="yellow"/>
+        </w:rPr>
+      </w:pPr>
+      <w:r>
+        <w:rPr>
+          <w:highlight w:val="yellow"/>
+        </w:rPr>
+        <w:t>Profile and permission set controls the object and field level security</w:t>
+      </w:r>
+    </w:p>
+    <w:p>
+      <w:pPr>
         <w:pStyle w:val="Heading2"/>
       </w:pPr>
       <w:r>
@@ -2909,8 +3083,14 @@
     <w:p>
       <w:pPr>
         <w:pStyle w:val="ListBullet"/>
-      </w:pPr>
-      <w:r>
+        <w:rPr>
+          <w:highlight w:val="yellow"/>
+        </w:rPr>
+      </w:pPr>
+      <w:r>
+        <w:rPr>
+          <w:highlight w:val="yellow"/>
+        </w:rPr>
         <w:t xml:space="preserve">FLS is the most restrictive setting; </w:t>
       </w:r>
     </w:p>
@@ -2919,35 +3099,19 @@
         <w:pStyle w:val="ListBullet"/>
       </w:pPr>
       <w:r>
+        <w:rPr>
+          <w:highlight w:val="yellow"/>
+        </w:rPr>
         <w:t xml:space="preserve">it overrides Object-level </w:t>
       </w:r>
       <w:r>
-        <w:t>permissions. Hidden</w:t>
-      </w:r>
-      <w:r>
-        <w:t xml:space="preserve"> fields are not visible in reports, search results, or related lists.Applied to both standard fields and custom fields (__c).</w:t>
-      </w:r>
-    </w:p>
-    <w:p>
-      <w:pPr>
-        <w:pStyle w:val="Heading2"/>
-      </w:pPr>
-      <w:r>
-        <w:t>Record-Level Security (Sharing)</w:t>
-      </w:r>
-    </w:p>
-    <w:p>
-      <w:pPr>
-        <w:pStyle w:val="ListBullet"/>
-      </w:pPr>
-      <w:r>
-        <w:rPr>
-          <w:highlight w:val="yellow"/>
-        </w:rPr>
-        <w:t>Organization-Wide Defaults (OWD) set the baseline level of access</w:t>
-      </w:r>
-      <w:r>
-        <w:t xml:space="preserve"> (</w:t>
+        <w:rPr>
+          <w:highlight w:val="yellow"/>
+        </w:rPr>
+        <w:t>permissions.</w:t>
+      </w:r>
+      <w:r>
+        <w:t xml:space="preserve"> </w:t>
       </w:r>
     </w:p>
     <w:p>
@@ -2963,7 +3127,80 @@
         <w:rPr>
           <w:highlight w:val="yellow"/>
         </w:rPr>
-        <w:t>Private, Public Read Only, Public Read/Write).</w:t>
+        <w:t>Hidden fields are not visible in reports, search results, or related lists.</w:t>
+      </w:r>
+      <w:r>
+        <w:t>Applied to both standard fields and custom fields (__c).</w:t>
+      </w:r>
+    </w:p>
+    <w:p>
+      <w:pPr>
+        <w:pStyle w:val="Heading2"/>
+      </w:pPr>
+      <w:r>
+        <w:t>Record-Level Security (Sharing)</w:t>
+      </w:r>
+    </w:p>
+    <w:p>
+      <w:pPr>
+        <w:pStyle w:val="ListBullet"/>
+      </w:pPr>
+      <w:r>
+        <w:rPr>
+          <w:highlight w:val="yellow"/>
+        </w:rPr>
+        <w:t>Organization-Wide Defaults (OWD) set the baseline level of access</w:t>
+      </w:r>
+      <w:r>
+        <w:t xml:space="preserve"> (</w:t>
+      </w:r>
+    </w:p>
+    <w:p>
+      <w:pPr>
+        <w:pStyle w:val="ListBullet"/>
+        <w:tabs>
+          <w:tab w:val="clear" w:pos="360"/>
+          <w:tab w:val="num" w:pos="1080"/>
+        </w:tabs>
+        <w:ind w:left="1080"/>
+      </w:pPr>
+      <w:r>
+        <w:rPr>
+          <w:highlight w:val="yellow"/>
+        </w:rPr>
+        <w:t xml:space="preserve">Private, </w:t>
+      </w:r>
+    </w:p>
+    <w:p>
+      <w:pPr>
+        <w:pStyle w:val="ListBullet"/>
+        <w:tabs>
+          <w:tab w:val="clear" w:pos="360"/>
+          <w:tab w:val="num" w:pos="1080"/>
+        </w:tabs>
+        <w:ind w:left="1080"/>
+      </w:pPr>
+      <w:r>
+        <w:rPr>
+          <w:highlight w:val="yellow"/>
+        </w:rPr>
+        <w:t xml:space="preserve">Public Read Only, </w:t>
+      </w:r>
+    </w:p>
+    <w:p>
+      <w:pPr>
+        <w:pStyle w:val="ListBullet"/>
+        <w:tabs>
+          <w:tab w:val="clear" w:pos="360"/>
+          <w:tab w:val="num" w:pos="1080"/>
+        </w:tabs>
+        <w:ind w:left="1080"/>
+      </w:pPr>
+      <w:r>
+        <w:rPr>
+          <w:highlight w:val="yellow"/>
+        </w:rPr>
+        <w:t>Public Read/Write).</w:t>
       </w:r>
     </w:p>
     <w:p>
@@ -2976,7 +3213,13 @@
         <w:ind w:left="720"/>
       </w:pPr>
       <w:r>
-        <w:t>Role Hierarchy automatically grants access to records owned by subordinates to users higher in the tree.</w:t>
+        <w:t xml:space="preserve">Role Hierarchy </w:t>
+      </w:r>
+      <w:r>
+        <w:t xml:space="preserve">: </w:t>
+      </w:r>
+      <w:r>
+        <w:t>grants access to records owned by subordinates to users higher in the tree.</w:t>
       </w:r>
     </w:p>
     <w:p>
@@ -2989,7 +3232,17 @@
         <w:ind w:left="720"/>
       </w:pPr>
       <w:r>
-        <w:t>Sharing Rules extend access to groups of users based on record ownership or criteria.</w:t>
+        <w:lastRenderedPageBreak/>
+        <w:t xml:space="preserve">Sharing Rules </w:t>
+      </w:r>
+      <w:r>
+        <w:t xml:space="preserve">: </w:t>
+      </w:r>
+      <w:r>
+        <w:t xml:space="preserve"> </w:t>
+      </w:r>
+      <w:r>
+        <w:t>access to groups of users based on record ownership or criteria.</w:t>
       </w:r>
     </w:p>
     <w:p>
@@ -3002,15 +3255,13 @@
         <w:ind w:left="720"/>
       </w:pPr>
       <w:r>
-        <w:t>Manual Sharing allows record owners to share specific records with individual users or groups.Apex Managed Sharing utilizes the [</w:t>
-      </w:r>
-      <w:proofErr w:type="spellStart"/>
-      <w:r>
-        <w:t>Object_Name</w:t>
-      </w:r>
-      <w:proofErr w:type="spellEnd"/>
-      <w:r>
-        <w:t>]__</w:t>
+        <w:t>Manual Sharing</w:t>
+      </w:r>
+      <w:r>
+        <w:t xml:space="preserve"> :</w:t>
+      </w:r>
+      <w:r>
+        <w:t xml:space="preserve"> allows record owners to share specific records with individual users or groups.Apex Managed Sharing utilizes the [Object_Name]__</w:t>
       </w:r>
     </w:p>
     <w:p>
@@ -3047,14 +3298,26 @@
         <w:pStyle w:val="ListBullet"/>
       </w:pPr>
       <w:r>
-        <w:t>Use Permission Sets and Permission Set Groups for flexibility instead of numerous Profiles.</w:t>
-      </w:r>
-    </w:p>
-    <w:p>
-      <w:pPr>
-        <w:pStyle w:val="ListBullet"/>
-      </w:pPr>
-      <w:r>
+        <w:rPr>
+          <w:highlight w:val="yellow"/>
+        </w:rPr>
+        <w:t>Use Permission Sets and Permission Set Groups</w:t>
+      </w:r>
+      <w:r>
+        <w:t xml:space="preserve"> for flexibility instead of numerous Profiles.</w:t>
+      </w:r>
+    </w:p>
+    <w:p>
+      <w:pPr>
+        <w:pStyle w:val="ListBullet"/>
+        <w:rPr>
+          <w:highlight w:val="yellow"/>
+        </w:rPr>
+      </w:pPr>
+      <w:r>
+        <w:rPr>
+          <w:highlight w:val="yellow"/>
+        </w:rPr>
         <w:t>Leverage Salesforce Shield for encryption of data-at-rest (Platform Encryption).</w:t>
       </w:r>
     </w:p>
@@ -3071,7 +3334,6 @@
         <w:pStyle w:val="ListBullet"/>
       </w:pPr>
       <w:r>
-        <w:lastRenderedPageBreak/>
         <w:t>Avoid using 'View All Data' or 'Modify All Data' for non-admin users.</w:t>
       </w:r>
     </w:p>
@@ -3095,6 +3357,24 @@
           <w:highlight w:val="yellow"/>
         </w:rPr>
         <w:t>Criteria-based sharing rules are limited to 300 per object.</w:t>
+      </w:r>
+      <w:r>
+        <w:rPr>
+          <w:highlight w:val="yellow"/>
+        </w:rPr>
+        <w:t xml:space="preserve"> </w:t>
+      </w:r>
+      <w:r>
+        <w:rPr>
+          <w:highlight w:val="yellow"/>
+        </w:rPr>
+        <w:sym w:font="Wingdings" w:char="F0E0"/>
+      </w:r>
+      <w:r>
+        <w:rPr>
+          <w:highlight w:val="yellow"/>
+        </w:rPr>
+        <w:t xml:space="preserve"> 300 </w:t>
       </w:r>
     </w:p>
     <w:p>
@@ -3206,7 +3486,21 @@
         <w:pStyle w:val="ListBullet"/>
       </w:pPr>
       <w:r>
-        <w:t>Object-Level Security (OLS) and Field-Level Security (FLS) constitute the metadata-level security layer in Salesforce, determining a user's ability to interact with specific data structures before record-level sharing logic is evaluated.</w:t>
+        <w:rPr>
+          <w:highlight w:val="yellow"/>
+        </w:rPr>
+        <w:t>Object-Level Security (OLS) and Field-Level Security (FLS) constitute the metadata-level security layer in Salesforce</w:t>
+      </w:r>
+      <w:r>
+        <w:t xml:space="preserve">, </w:t>
+      </w:r>
+    </w:p>
+    <w:p>
+      <w:pPr>
+        <w:pStyle w:val="ListBullet"/>
+      </w:pPr>
+      <w:r>
+        <w:t>determining a user's ability to interact with specific data structures before record-level sharing logic is evaluated.</w:t>
       </w:r>
     </w:p>
     <w:p>
@@ -3214,6 +3508,7 @@
         <w:pStyle w:val="Heading2"/>
       </w:pPr>
       <w:r>
+        <w:lastRenderedPageBreak/>
         <w:t>Core Permission Structures</w:t>
       </w:r>
     </w:p>
@@ -3222,7 +3517,58 @@
         <w:pStyle w:val="ListBullet"/>
       </w:pPr>
       <w:r>
-        <w:t>Profiles: Historically the primary container for permissions; now recommended to be used as a 'Minimum Access' baseline.Permission Sets: The modern architect's tool for additive permissions, enabling granular OLS/FLS assignments without profile bloat.Permission Set Groups (PSG): Logical bundles of Permission Sets representing a functional persona or job role.Muting Permission Sets: Tools used within PSGs to explicitly revoke permissions granted by bundled Permission Sets for specific subsets of users.Metadata API: Permissions are represented as &lt;fieldPermissions&gt; and &lt;objectPermissions&gt; within .profile and .permissionset files.</w:t>
+        <w:rPr>
+          <w:highlight w:val="yellow"/>
+        </w:rPr>
+        <w:t>Profiles:</w:t>
+      </w:r>
+      <w:r>
+        <w:t xml:space="preserve"> Historically the primary container for permissions; now recommended to be used as a 'Minimum Access' baseline.Permission Sets: The modern architect's tool for additive permissions, enabling granular OLS/FLS assignments without profile bloat</w:t>
+      </w:r>
+    </w:p>
+    <w:p>
+      <w:pPr>
+        <w:pStyle w:val="ListBullet"/>
+      </w:pPr>
+      <w:r>
+        <w:t>.</w:t>
+      </w:r>
+      <w:r>
+        <w:rPr>
+          <w:highlight w:val="yellow"/>
+        </w:rPr>
+        <w:t>Permission Set Groups (PSG):</w:t>
+      </w:r>
+      <w:r>
+        <w:t xml:space="preserve"> Logical bundles of Permission Sets representing a functional persona or job role.</w:t>
+      </w:r>
+    </w:p>
+    <w:p>
+      <w:pPr>
+        <w:pStyle w:val="ListBullet"/>
+      </w:pPr>
+      <w:r>
+        <w:rPr>
+          <w:highlight w:val="yellow"/>
+        </w:rPr>
+        <w:t>Muting Permission Sets:</w:t>
+      </w:r>
+      <w:r>
+        <w:t xml:space="preserve"> Tools used within PSGs to explicitly revoke permissions granted by bundled Permission Sets for specific subsets of users.</w:t>
+      </w:r>
+    </w:p>
+    <w:p>
+      <w:pPr>
+        <w:pStyle w:val="ListBullet"/>
+      </w:pPr>
+      <w:r>
+        <w:rPr>
+          <w:highlight w:val="yellow"/>
+        </w:rPr>
+        <w:t>Metadata API:</w:t>
+      </w:r>
+      <w:r>
+        <w:t xml:space="preserve"> Permissions are represented as &lt;fieldPermissions&gt; and &lt;objectPermissions&gt; within .profile and .permissionset files.</w:t>
       </w:r>
     </w:p>
     <w:p>
@@ -3238,27 +3584,170 @@
         <w:pStyle w:val="ListBullet"/>
       </w:pPr>
       <w:r>
-        <w:t xml:space="preserve">CRUD Permissions: Create, Read, Edit, and Delete controls defined at the object level; View All and Modify All provide administrative overrides.Field-Level Visibility: Controls if a field is visible (Read) or editable (Edit) on Page Layouts, LWCs, and via API.Schema </w:t>
-      </w:r>
+        <w:rPr>
+          <w:highlight w:val="yellow"/>
+        </w:rPr>
+        <w:t>CRUD Permissions: Create, Read, Edit, and Delete controls defined at the object level;</w:t>
+      </w:r>
+      <w:r>
+        <w:t xml:space="preserve"> View All and Modify All provide administrative overrides.</w:t>
+      </w:r>
+    </w:p>
+    <w:p>
+      <w:pPr>
+        <w:pStyle w:val="ListBullet"/>
+      </w:pPr>
+      <w:r>
+        <w:rPr>
+          <w:highlight w:val="yellow"/>
+        </w:rPr>
+        <w:t>Field-Level Visibility:</w:t>
+      </w:r>
+      <w:r>
+        <w:t xml:space="preserve"> Controls if a field is visible (Read) or editable (Edit) on Page Layouts, LWCs, and via API.Schema Methods: </w:t>
+      </w:r>
+    </w:p>
+    <w:p>
+      <w:pPr>
+        <w:pStyle w:val="ListBullet"/>
+        <w:tabs>
+          <w:tab w:val="clear" w:pos="360"/>
+          <w:tab w:val="num" w:pos="720"/>
+        </w:tabs>
+        <w:ind w:left="720"/>
+      </w:pPr>
+      <w:r>
+        <w:rPr>
+          <w:highlight w:val="yellow"/>
+        </w:rPr>
+        <w:t>Apex developers must use Schema.SObjectType.Account.isAccessible() or similar methods to manually verify permissions in legacy code</w:t>
+      </w:r>
+    </w:p>
+    <w:p>
+      <w:pPr>
+        <w:pStyle w:val="ListBullet"/>
+        <w:tabs>
+          <w:tab w:val="clear" w:pos="360"/>
+          <w:tab w:val="num" w:pos="720"/>
+        </w:tabs>
+        <w:ind w:left="720"/>
+      </w:pPr>
+      <w:r>
+        <w:rPr>
+          <w:highlight w:val="yellow"/>
+        </w:rPr>
+        <w:t>.</w:t>
+      </w:r>
+      <w:r>
+        <w:t xml:space="preserve">User Mode Operations: Utilizing </w:t>
+      </w:r>
+      <w:r>
+        <w:rPr>
+          <w:highlight w:val="yellow"/>
+        </w:rPr>
+        <w:t>'WITH USER_MODE'</w:t>
+      </w:r>
+      <w:r>
+        <w:t xml:space="preserve"> in SOQL and DML to automatically enforce OLS/FLS at runtime.Security.stripInaccessible(): A robust Apex method to strip fields from sObject lists that the current user context cannot access.</w:t>
+      </w:r>
+    </w:p>
+    <w:p>
+      <w:pPr>
+        <w:pStyle w:val="Heading2"/>
+      </w:pPr>
+      <w:r>
+        <w:t>Architectural Considerations</w:t>
+      </w:r>
+    </w:p>
+    <w:p>
+      <w:pPr>
+        <w:pStyle w:val="ListBullet"/>
+      </w:pPr>
+      <w:r>
+        <w:t>System vs. User Context: Standard Apex runs in System Mode (ignoring OLS/FLS) unless specified; Lightning Web Components (LWC) and Flow generally respect FLS/OLS.Relationship Impact: Master-Detail relationships require specific OLS on the Master to affect the Detail, though Detail records inherit sharing from Master.</w:t>
+      </w:r>
+    </w:p>
+    <w:p>
+      <w:pPr>
+        <w:pStyle w:val="ListBullet"/>
+      </w:pPr>
+      <w:r>
+        <w:t>Integration Users: Must follow the 'Least Privilege' model; use dedicated Permission Sets for API users rather than 'Modify All Data'.</w:t>
+      </w:r>
+    </w:p>
+    <w:p>
+      <w:pPr>
+        <w:pStyle w:val="ListBullet"/>
+      </w:pPr>
+      <w:r>
+        <w:t>Encrypted Fields: FLS interacts with the 'View Encrypted Data' permission to control visibility of Classic and Shield Platform Encryption fields.Package Security: Managed packages may include protected custom settings or metadata that bypass standard OLS/FLS unless explicitly checked.</w:t>
+      </w:r>
+    </w:p>
+    <w:p>
+      <w:pPr>
+        <w:pStyle w:val="Heading3"/>
+      </w:pPr>
+      <w:r>
+        <w:t>Best Practices</w:t>
+      </w:r>
+    </w:p>
+    <w:p>
+      <w:pPr>
+        <w:pStyle w:val="ListBullet"/>
+      </w:pPr>
+      <w:r>
+        <w:t>Adopt a 'Permission Set First' strategy to minimize Profile count and maximize modularity.</w:t>
+      </w:r>
+    </w:p>
+    <w:p>
+      <w:pPr>
+        <w:pStyle w:val="ListBullet"/>
+      </w:pPr>
+      <w:r>
+        <w:t xml:space="preserve">Use the </w:t>
+      </w:r>
+      <w:r>
+        <w:rPr>
+          <w:highlight w:val="yellow"/>
+        </w:rPr>
+        <w:t>'Restrict Access to Custom Metadata Types'</w:t>
+      </w:r>
+      <w:r>
+        <w:t xml:space="preserve"> setting to secure sensitive configuration data.</w:t>
+      </w:r>
+    </w:p>
+    <w:p>
+      <w:pPr>
+        <w:pStyle w:val="ListBullet"/>
+      </w:pPr>
+      <w:r>
+        <w:t>Implement Field Audit Trail for highly sensitive fields where FLS changes need strict governance.</w:t>
+      </w:r>
+    </w:p>
+    <w:p>
+      <w:pPr>
+        <w:pStyle w:val="ListBullet"/>
+      </w:pPr>
       <w:r>
         <w:lastRenderedPageBreak/>
-        <w:t>Methods: Apex developers must use Schema.SObjectType.Account.isAccessible() or similar methods to manually verify permissions in legacy code.User Mode Operations: Utilizing 'WITH USER_MODE' in SOQL and DML to automatically enforce OLS/FLS at runtime.Security.stripInaccessible(): A robust Apex method to strip fields from sObject lists that the current user context cannot access.</w:t>
-      </w:r>
-    </w:p>
-    <w:p>
-      <w:pPr>
-        <w:pStyle w:val="Heading2"/>
-      </w:pPr>
-      <w:r>
-        <w:t>Architectural Considerations</w:t>
-      </w:r>
-    </w:p>
-    <w:p>
-      <w:pPr>
-        <w:pStyle w:val="ListBullet"/>
-      </w:pPr>
-      <w:r>
-        <w:t>System vs. User Context: Standard Apex runs in System Mode (ignoring OLS/FLS) unless specified; Lightning Web Components (LWC) and Flow generally respect FLS/OLS.Relationship Impact: Master-Detail relationships require specific OLS on the Master to affect the Detail, though Detail records inherit sharing from Master.Integration Users: Must follow the 'Least Privilege' model; use dedicated Permission Sets for API users rather than 'Modify All Data'.Encrypted Fields: FLS interacts with the 'View Encrypted Data' permission to control visibility of Classic and Shield Platform Encryption fields.Package Security: Managed packages may include protected custom settings or metadata that bypass standard OLS/FLS unless explicitly checked.</w:t>
+        <w:t xml:space="preserve">Always use </w:t>
+      </w:r>
+      <w:r>
+        <w:rPr>
+          <w:highlight w:val="yellow"/>
+        </w:rPr>
+        <w:t>'WITH USER_MODE'</w:t>
+      </w:r>
+      <w:r>
+        <w:t xml:space="preserve"> in Apex to ensure security compliance by default and pass AppExchange Security Review.</w:t>
+      </w:r>
+    </w:p>
+    <w:p>
+      <w:pPr>
+        <w:pStyle w:val="ListBullet"/>
+      </w:pPr>
+      <w:r>
+        <w:t>Leverage Permission Set Groups to simplify user provisioning and reduce administrative overhead.</w:t>
       </w:r>
     </w:p>
     <w:p>
@@ -3266,54 +3755,6 @@
         <w:pStyle w:val="Heading3"/>
       </w:pPr>
       <w:r>
-        <w:t>Best Practices</w:t>
-      </w:r>
-    </w:p>
-    <w:p>
-      <w:pPr>
-        <w:pStyle w:val="ListBullet"/>
-      </w:pPr>
-      <w:r>
-        <w:t>Adopt a 'Permission Set First' strategy to minimize Profile count and maximize modularity.</w:t>
-      </w:r>
-    </w:p>
-    <w:p>
-      <w:pPr>
-        <w:pStyle w:val="ListBullet"/>
-      </w:pPr>
-      <w:r>
-        <w:t>Use the 'Restrict Access to Custom Metadata Types' setting to secure sensitive configuration data.</w:t>
-      </w:r>
-    </w:p>
-    <w:p>
-      <w:pPr>
-        <w:pStyle w:val="ListBullet"/>
-      </w:pPr>
-      <w:r>
-        <w:t>Implement Field Audit Trail for highly sensitive fields where FLS changes need strict governance.</w:t>
-      </w:r>
-    </w:p>
-    <w:p>
-      <w:pPr>
-        <w:pStyle w:val="ListBullet"/>
-      </w:pPr>
-      <w:r>
-        <w:t>Always use 'WITH USER_MODE' in Apex to ensure security compliance by default and pass AppExchange Security Review.</w:t>
-      </w:r>
-    </w:p>
-    <w:p>
-      <w:pPr>
-        <w:pStyle w:val="ListBullet"/>
-      </w:pPr>
-      <w:r>
-        <w:t>Leverage Permission Set Groups to simplify user provisioning and reduce administrative overhead.</w:t>
-      </w:r>
-    </w:p>
-    <w:p>
-      <w:pPr>
-        <w:pStyle w:val="Heading3"/>
-      </w:pPr>
-      <w:r>
         <w:t>Limitations</w:t>
       </w:r>
     </w:p>
@@ -3322,22 +3763,40 @@
         <w:pStyle w:val="ListBullet"/>
       </w:pPr>
       <w:r>
-        <w:t>FLS does not prevent a user from searching for a record based on a hidden field's value in some scenarios.</w:t>
-      </w:r>
-    </w:p>
-    <w:p>
-      <w:pPr>
-        <w:pStyle w:val="ListBullet"/>
-      </w:pPr>
-      <w:r>
-        <w:t>There is a hard limit of 1000 Permission Sets per org, requiring careful architectural planning for large-scale implementations.</w:t>
-      </w:r>
-    </w:p>
-    <w:p>
-      <w:pPr>
-        <w:pStyle w:val="ListBullet"/>
-      </w:pPr>
-      <w:r>
+        <w:rPr>
+          <w:highlight w:val="yellow"/>
+        </w:rPr>
+        <w:t>FLS does not prevent a user from searching for a record based</w:t>
+      </w:r>
+      <w:r>
+        <w:t xml:space="preserve"> on a hidden field's value in some scenarios.</w:t>
+      </w:r>
+    </w:p>
+    <w:p>
+      <w:pPr>
+        <w:pStyle w:val="ListBullet"/>
+      </w:pPr>
+      <w:r>
+        <w:rPr>
+          <w:highlight w:val="yellow"/>
+        </w:rPr>
+        <w:t>There is a hard limit of 1000 Permission Sets per org,</w:t>
+      </w:r>
+      <w:r>
+        <w:t xml:space="preserve"> requiring careful architectural planning for large-scale implementations.</w:t>
+      </w:r>
+    </w:p>
+    <w:p>
+      <w:pPr>
+        <w:pStyle w:val="ListBullet"/>
+        <w:rPr>
+          <w:highlight w:val="yellow"/>
+        </w:rPr>
+      </w:pPr>
+      <w:r>
+        <w:rPr>
+          <w:highlight w:val="yellow"/>
+        </w:rPr>
         <w:t>FLS cannot be set on specific system fields like Id, CreatedDate, or LastModifiedDate.</w:t>
       </w:r>
     </w:p>
@@ -3362,7 +3821,6 @@
         <w:pStyle w:val="Heading1"/>
       </w:pPr>
       <w:r>
-        <w:lastRenderedPageBreak/>
         <w:t>Data Access Flow</w:t>
       </w:r>
     </w:p>
@@ -3416,6 +3874,1750 @@
         <w:t>https://developer.salesforce.com/docs/atlas.en-us.260.0.salesforce_record_access_under_the_hood.meta/salesforce_record_access_under_the_hood/uth_grants.htm</w:t>
       </w:r>
     </w:p>
+    <w:p>
+      <w:r>
+        <w:br/>
+        <w:t>==============================</w:t>
+      </w:r>
+      <w:r>
+        <w:br/>
+      </w:r>
+    </w:p>
+    <w:p>
+      <w:pPr>
+        <w:pStyle w:val="Title"/>
+      </w:pPr>
+      <w:r>
+        <w:rPr>
+          <w:b/>
+          <w:sz w:val="36"/>
+        </w:rPr>
+        <w:t>Explicit Grants</w:t>
+      </w:r>
+    </w:p>
+    <w:p>
+      <w:pPr>
+        <w:pStyle w:val="Heading1"/>
+      </w:pPr>
+      <w:r>
+        <w:t>Summary</w:t>
+      </w:r>
+    </w:p>
+    <w:p>
+      <w:pPr>
+        <w:pStyle w:val="ListBullet"/>
+      </w:pPr>
+      <w:r>
+        <w:rPr>
+          <w:highlight w:val="yellow"/>
+        </w:rPr>
+        <w:t>Explicit grants represent direct record access permissions granted to users or groups</w:t>
+      </w:r>
+      <w:r>
+        <w:t xml:space="preserve"> through </w:t>
+      </w:r>
+    </w:p>
+    <w:p>
+      <w:pPr>
+        <w:pStyle w:val="ListBullet"/>
+        <w:tabs>
+          <w:tab w:val="clear" w:pos="360"/>
+          <w:tab w:val="num" w:pos="720"/>
+        </w:tabs>
+        <w:ind w:left="720"/>
+      </w:pPr>
+      <w:r>
+        <w:t xml:space="preserve">manual sharing, </w:t>
+      </w:r>
+    </w:p>
+    <w:p>
+      <w:pPr>
+        <w:pStyle w:val="ListBullet"/>
+        <w:tabs>
+          <w:tab w:val="clear" w:pos="360"/>
+          <w:tab w:val="num" w:pos="720"/>
+        </w:tabs>
+        <w:ind w:left="720"/>
+      </w:pPr>
+      <w:r>
+        <w:t xml:space="preserve">sharing rules, or programmatic Apex logic, </w:t>
+      </w:r>
+    </w:p>
+    <w:p>
+      <w:pPr>
+        <w:pStyle w:val="ListBullet"/>
+        <w:tabs>
+          <w:tab w:val="clear" w:pos="360"/>
+          <w:tab w:val="num" w:pos="720"/>
+        </w:tabs>
+        <w:ind w:left="720"/>
+      </w:pPr>
+      <w:r>
+        <w:t>managed via specialized Share objects in the Salesforce data model.</w:t>
+      </w:r>
+    </w:p>
+    <w:p>
+      <w:pPr>
+        <w:pStyle w:val="ListBullet"/>
+        <w:tabs>
+          <w:tab w:val="clear" w:pos="360"/>
+          <w:tab w:val="num" w:pos="720"/>
+        </w:tabs>
+        <w:ind w:left="720"/>
+      </w:pPr>
+      <w:r>
+        <w:t xml:space="preserve">Team sharing </w:t>
+      </w:r>
+      <w:r>
+        <w:sym w:font="Wingdings" w:char="F0E0"/>
+      </w:r>
+      <w:r>
+        <w:t xml:space="preserve">  </w:t>
+      </w:r>
+    </w:p>
+    <w:p>
+      <w:pPr>
+        <w:pStyle w:val="ListBullet"/>
+        <w:tabs>
+          <w:tab w:val="clear" w:pos="360"/>
+          <w:tab w:val="num" w:pos="720"/>
+        </w:tabs>
+        <w:ind w:left="720"/>
+      </w:pPr>
+      <w:r>
+        <w:t>Territory Sharing</w:t>
+      </w:r>
+      <w:r>
+        <w:t xml:space="preserve"> </w:t>
+      </w:r>
+      <w:r>
+        <w:sym w:font="Wingdings" w:char="F0E0"/>
+      </w:r>
+    </w:p>
+    <w:p>
+      <w:pPr>
+        <w:pStyle w:val="Heading2"/>
+      </w:pPr>
+      <w:r>
+        <w:t>The Share Object Data Model</w:t>
+      </w:r>
+    </w:p>
+    <w:p>
+      <w:pPr>
+        <w:pStyle w:val="ListBullet"/>
+      </w:pPr>
+      <w:r>
+        <w:t xml:space="preserve">Explicit grants are persisted in </w:t>
+      </w:r>
+      <w:r>
+        <w:rPr>
+          <w:highlight w:val="yellow"/>
+        </w:rPr>
+        <w:t>Share objects</w:t>
+      </w:r>
+      <w:r>
+        <w:t xml:space="preserve">, which are automatically created for objects with Org-Wide Defaults (OWD) set to </w:t>
+      </w:r>
+      <w:r>
+        <w:rPr>
+          <w:highlight w:val="yellow"/>
+        </w:rPr>
+        <w:t>Private or Public Read Only</w:t>
+      </w:r>
+      <w:r>
+        <w:t>.</w:t>
+      </w:r>
+    </w:p>
+    <w:p>
+      <w:pPr>
+        <w:pStyle w:val="ListBullet"/>
+      </w:pPr>
+      <w:r>
+        <w:t>Standard objects use a naming convention like AccountShare or CaseShare, while custom objects use the __Share suffix.</w:t>
+      </w:r>
+    </w:p>
+    <w:p>
+      <w:pPr>
+        <w:pStyle w:val="ListBullet"/>
+      </w:pPr>
+      <w:r>
+        <w:t xml:space="preserve">Key fields include </w:t>
+      </w:r>
+    </w:p>
+    <w:p>
+      <w:pPr>
+        <w:pStyle w:val="ListBullet"/>
+        <w:tabs>
+          <w:tab w:val="clear" w:pos="360"/>
+          <w:tab w:val="num" w:pos="720"/>
+        </w:tabs>
+        <w:ind w:left="720"/>
+      </w:pPr>
+      <w:r>
+        <w:t>ParentId (ID of the record being shared),</w:t>
+      </w:r>
+    </w:p>
+    <w:p>
+      <w:pPr>
+        <w:pStyle w:val="ListBullet"/>
+        <w:tabs>
+          <w:tab w:val="clear" w:pos="360"/>
+          <w:tab w:val="num" w:pos="720"/>
+        </w:tabs>
+        <w:ind w:left="720"/>
+      </w:pPr>
+      <w:r>
+        <w:t>UserOrGroupId (ID of the user, group, or role receiving access), and</w:t>
+      </w:r>
+    </w:p>
+    <w:p>
+      <w:pPr>
+        <w:pStyle w:val="ListBullet"/>
+        <w:tabs>
+          <w:tab w:val="clear" w:pos="360"/>
+          <w:tab w:val="num" w:pos="720"/>
+        </w:tabs>
+        <w:ind w:left="720"/>
+      </w:pPr>
+      <w:r>
+        <w:t>AccessLevel (Read, Edit, or All).</w:t>
+      </w:r>
+    </w:p>
+    <w:p>
+      <w:pPr>
+        <w:pStyle w:val="ListBullet"/>
+        <w:tabs>
+          <w:tab w:val="clear" w:pos="360"/>
+          <w:tab w:val="num" w:pos="720"/>
+        </w:tabs>
+        <w:ind w:left="720"/>
+      </w:pPr>
+      <w:r>
+        <w:t xml:space="preserve">The RowCause field is critical for identifying </w:t>
+      </w:r>
+    </w:p>
+    <w:p>
+      <w:pPr>
+        <w:pStyle w:val="ListBullet"/>
+        <w:tabs>
+          <w:tab w:val="clear" w:pos="360"/>
+          <w:tab w:val="num" w:pos="1080"/>
+        </w:tabs>
+        <w:ind w:left="1080"/>
+      </w:pPr>
+      <w:r>
+        <w:t>why a grant exists, distinguishing between Manual, Owner, Rule, and custom Apex sharing reasons.</w:t>
+      </w:r>
+    </w:p>
+    <w:p>
+      <w:pPr>
+        <w:pStyle w:val="Heading2"/>
+      </w:pPr>
+      <w:r>
+        <w:t>Sharing Rules and Group Maintenance</w:t>
+      </w:r>
+    </w:p>
+    <w:p>
+      <w:pPr>
+        <w:pStyle w:val="ListBullet"/>
+      </w:pPr>
+      <w:r>
+        <w:t>Sharing rules provide a way to automate explicit grants based on record ownership or field criteria.</w:t>
+      </w:r>
+    </w:p>
+    <w:p>
+      <w:pPr>
+        <w:pStyle w:val="ListBullet"/>
+      </w:pPr>
+      <w:r>
+        <w:t xml:space="preserve">Owner-based sharing rules grant access to roles or groups based on who owns the record, </w:t>
+      </w:r>
+    </w:p>
+    <w:p>
+      <w:pPr>
+        <w:pStyle w:val="ListBullet"/>
+      </w:pPr>
+      <w:r>
+        <w:t>Criteria-based sharing rules use object field values.</w:t>
+      </w:r>
+    </w:p>
+    <w:p>
+      <w:pPr>
+        <w:pStyle w:val="ListBullet"/>
+      </w:pPr>
+      <w:r>
+        <w:t xml:space="preserve">Under the hood, </w:t>
+      </w:r>
+      <w:r>
+        <w:rPr>
+          <w:highlight w:val="yellow"/>
+        </w:rPr>
+        <w:t>sharing rules populate the Share table with a RowCause of 'Rule'</w:t>
+      </w:r>
+      <w:r>
+        <w:t>.</w:t>
+      </w:r>
+    </w:p>
+    <w:p>
+      <w:pPr>
+        <w:pStyle w:val="ListBullet"/>
+      </w:pPr>
+      <w:r>
+        <w:t>Large-scale updates to sharing rules trigger asynchronous recalculation processes which can lock records and impact system performance.</w:t>
+      </w:r>
+    </w:p>
+    <w:p>
+      <w:pPr>
+        <w:pStyle w:val="Heading2"/>
+      </w:pPr>
+      <w:r>
+        <w:lastRenderedPageBreak/>
+        <w:t>Apex Managed Sharing for Architects</w:t>
+      </w:r>
+    </w:p>
+    <w:p>
+      <w:pPr>
+        <w:pStyle w:val="ListBullet"/>
+      </w:pPr>
+      <w:r>
+        <w:t>Apex Managed Sharing allows developers to programmatically create share records to support complex security requirements that exceed standard rule limits.</w:t>
+      </w:r>
+    </w:p>
+    <w:p>
+      <w:pPr>
+        <w:pStyle w:val="ListBullet"/>
+      </w:pPr>
+      <w:r>
+        <w:rPr>
+          <w:highlight w:val="yellow"/>
+        </w:rPr>
+        <w:t>Only custom objects support 'Custom Sharing Reasons' (RowCause),</w:t>
+      </w:r>
+      <w:r>
+        <w:t xml:space="preserve"> which ensure that the share record is not deleted when the record owner changes.</w:t>
+      </w:r>
+    </w:p>
+    <w:p>
+      <w:pPr>
+        <w:pStyle w:val="ListBullet"/>
+      </w:pPr>
+      <w:r>
+        <w:rPr>
+          <w:highlight w:val="yellow"/>
+        </w:rPr>
+        <w:t>Architects should utilize the 'Without Sharing' keyword in Apex controllers when system-level access is required to manipulate share records</w:t>
+      </w:r>
+    </w:p>
+    <w:p>
+      <w:pPr>
+        <w:pStyle w:val="ListBullet"/>
+      </w:pPr>
+      <w:r>
+        <w:rPr>
+          <w:highlight w:val="yellow"/>
+        </w:rPr>
+        <w:t xml:space="preserve">.For standard objects, programmatic sharing must use the 'Manual' RowCause, </w:t>
+      </w:r>
+    </w:p>
+    <w:p>
+      <w:pPr>
+        <w:pStyle w:val="ListBullet"/>
+        <w:tabs>
+          <w:tab w:val="clear" w:pos="360"/>
+          <w:tab w:val="num" w:pos="720"/>
+        </w:tabs>
+        <w:ind w:left="720"/>
+        <w:rPr>
+          <w:highlight w:val="yellow"/>
+        </w:rPr>
+      </w:pPr>
+      <w:r>
+        <w:rPr>
+          <w:highlight w:val="yellow"/>
+        </w:rPr>
+        <w:t>which is volatile and can be cleared during ownership changes.</w:t>
+      </w:r>
+    </w:p>
+    <w:p>
+      <w:pPr>
+        <w:pStyle w:val="Heading2"/>
+      </w:pPr>
+      <w:r>
+        <w:t>Scalability and Large Data Volume (LDV) Considerations</w:t>
+      </w:r>
+    </w:p>
+    <w:p>
+      <w:pPr>
+        <w:pStyle w:val="ListBullet"/>
+      </w:pPr>
+      <w:r>
+        <w:t xml:space="preserve">Excessive explicit grants can lead to 'Share Table Bloat', significantly slowing down SOQL queries and DML operations.To optimize performance, </w:t>
+      </w:r>
+    </w:p>
+    <w:p>
+      <w:pPr>
+        <w:pStyle w:val="ListBullet"/>
+        <w:rPr>
+          <w:highlight w:val="yellow"/>
+        </w:rPr>
+      </w:pPr>
+      <w:r>
+        <w:rPr>
+          <w:highlight w:val="yellow"/>
+        </w:rPr>
+        <w:t>architects should share with Public Groups or Roles rather than individual users to reduce the total number of rows in the Share table.</w:t>
+      </w:r>
+    </w:p>
+    <w:p>
+      <w:pPr>
+        <w:pStyle w:val="ListBullet"/>
+      </w:pPr>
+      <w:r>
+        <w:t xml:space="preserve">Utilize the </w:t>
+      </w:r>
+      <w:r>
+        <w:rPr>
+          <w:highlight w:val="yellow"/>
+        </w:rPr>
+        <w:t>'Defer Sharing Calculation' feature</w:t>
+      </w:r>
+      <w:r>
+        <w:t xml:space="preserve"> </w:t>
+      </w:r>
+      <w:r>
+        <w:rPr>
+          <w:highlight w:val="yellow"/>
+        </w:rPr>
+        <w:t>during bulk data imports to prevent the Sharing Engine from recalculating after every record insertion.</w:t>
+      </w:r>
+    </w:p>
+    <w:p>
+      <w:pPr>
+        <w:pStyle w:val="ListBullet"/>
+      </w:pPr>
+      <w:r>
+        <w:t>Avoid 'Granular Locking' issues by scheduling bulk sharing updates during off-peak hours and ensuring a clean Role Hierarchy.</w:t>
+      </w:r>
+    </w:p>
+    <w:p>
+      <w:pPr>
+        <w:pStyle w:val="Heading3"/>
+      </w:pPr>
+      <w:r>
+        <w:t>Best Practices</w:t>
+      </w:r>
+    </w:p>
+    <w:p>
+      <w:pPr>
+        <w:pStyle w:val="ListBullet"/>
+      </w:pPr>
+      <w:r>
+        <w:t>Favor Public Groups over individual User IDs in UserOrGroupId to minimize Share table rows.</w:t>
+      </w:r>
+    </w:p>
+    <w:p>
+      <w:pPr>
+        <w:pStyle w:val="ListBullet"/>
+      </w:pPr>
+      <w:r>
+        <w:t>Use Custom Sharing Reasons for Apex Managed Sharing on custom objects to prevent accidental deletion.</w:t>
+      </w:r>
+    </w:p>
+    <w:p>
+      <w:pPr>
+        <w:pStyle w:val="ListBullet"/>
+      </w:pPr>
+      <w:r>
+        <w:t>Monitor the size of Share tables for objects with millions of records using the 'Storage Usage' setup page.</w:t>
+      </w:r>
+    </w:p>
+    <w:p>
+      <w:pPr>
+        <w:pStyle w:val="ListBullet"/>
+      </w:pPr>
+      <w:r>
+        <w:t>Leverage Inherited Sharing in Apex classes to maintain security context while allowing explicit grant logic to execute.</w:t>
+      </w:r>
+    </w:p>
+    <w:p>
+      <w:pPr>
+        <w:pStyle w:val="ListBullet"/>
+      </w:pPr>
+      <w:r>
+        <w:t>Regularly audit Manual Sharing records to ensure they align with current compliance and security policies.</w:t>
+      </w:r>
+    </w:p>
+    <w:p>
+      <w:pPr>
+        <w:pStyle w:val="Heading3"/>
+      </w:pPr>
+      <w:r>
+        <w:t>Limitations</w:t>
+      </w:r>
+    </w:p>
+    <w:p>
+      <w:pPr>
+        <w:pStyle w:val="ListBullet"/>
+        <w:rPr>
+          <w:highlight w:val="yellow"/>
+        </w:rPr>
+      </w:pPr>
+      <w:r>
+        <w:t xml:space="preserve">Criteria-based sharing rules are limited to </w:t>
+      </w:r>
+      <w:r>
+        <w:rPr>
+          <w:highlight w:val="yellow"/>
+        </w:rPr>
+        <w:t>50 per object and 300 total sharing rules per object.</w:t>
+      </w:r>
+    </w:p>
+    <w:p>
+      <w:pPr>
+        <w:pStyle w:val="ListBullet"/>
+        <w:rPr>
+          <w:highlight w:val="yellow"/>
+        </w:rPr>
+      </w:pPr>
+      <w:r>
+        <w:rPr>
+          <w:highlight w:val="yellow"/>
+        </w:rPr>
+        <w:t>Explicit grants (Manual Sharing) are automatically removed when a record owner changes, unless using Apex Managed Sharing with custom RowCauses.</w:t>
+      </w:r>
+    </w:p>
+    <w:p>
+      <w:pPr>
+        <w:pStyle w:val="ListBullet"/>
+        <w:rPr>
+          <w:highlight w:val="yellow"/>
+        </w:rPr>
+      </w:pPr>
+      <w:r>
+        <w:rPr>
+          <w:highlight w:val="yellow"/>
+        </w:rPr>
+        <w:t>Standard objects do not support custom Sharing Reasons for Apex Managed Sharing.</w:t>
+      </w:r>
+    </w:p>
+    <w:p>
+      <w:pPr>
+        <w:pStyle w:val="ListBullet"/>
+        <w:rPr>
+          <w:highlight w:val="yellow"/>
+        </w:rPr>
+      </w:pPr>
+      <w:r>
+        <w:rPr>
+          <w:highlight w:val="yellow"/>
+        </w:rPr>
+        <w:t>Share records cannot be created for objects with OWD set to Public Read/Write.</w:t>
+      </w:r>
+    </w:p>
+    <w:p>
+      <w:pPr>
+        <w:pStyle w:val="ListBullet"/>
+        <w:rPr>
+          <w:highlight w:val="yellow"/>
+        </w:rPr>
+      </w:pPr>
+      <w:r>
+        <w:rPr>
+          <w:highlight w:val="yellow"/>
+        </w:rPr>
+        <w:t>The maximum number of explicit grants can impact the 'Group Maintenance' table and performance of the 'Sharing Table'.</w:t>
+      </w:r>
+    </w:p>
+    <w:p>
+      <w:pPr>
+        <w:pStyle w:val="Heading1"/>
+      </w:pPr>
+      <w:r>
+        <w:lastRenderedPageBreak/>
+        <w:t>Data Access Flow</w:t>
+      </w:r>
+    </w:p>
+    <w:tbl>
+      <w:tblPr>
+        <w:tblStyle w:val="LightGrid-Accent1"/>
+        <w:tblW w:w="0" w:type="auto"/>
+        <w:tblLook w:val="04A0" w:firstRow="1" w:lastRow="0" w:firstColumn="1" w:lastColumn="0" w:noHBand="0" w:noVBand="1"/>
+      </w:tblPr>
+      <w:tblGrid>
+        <w:gridCol w:w="8640"/>
+      </w:tblGrid>
+      <w:tr>
+        <w:trPr>
+          <w:cnfStyle w:val="100000000000" w:firstRow="1" w:lastRow="0" w:firstColumn="0" w:lastColumn="0" w:oddVBand="0" w:evenVBand="0" w:oddHBand="0" w:evenHBand="0" w:firstRowFirstColumn="0" w:firstRowLastColumn="0" w:lastRowFirstColumn="0" w:lastRowLastColumn="0"/>
+        </w:trPr>
+        <w:tc>
+          <w:tcPr>
+            <w:cnfStyle w:val="001000000000" w:firstRow="0" w:lastRow="0" w:firstColumn="1" w:lastColumn="0" w:oddVBand="0" w:evenVBand="0" w:oddHBand="0" w:evenHBand="0" w:firstRowFirstColumn="0" w:firstRowLastColumn="0" w:lastRowFirstColumn="0" w:lastRowLastColumn="0"/>
+            <w:tcW w:w="8640" w:type="dxa"/>
+          </w:tcPr>
+          <w:p>
+            <w:pPr>
+              <w:jc w:val="center"/>
+            </w:pPr>
+            <w:r>
+              <w:t>Access Request  ➔  [Evaluate OWD: Private/Read-Only?]  ➔  [Trigger: Manual/Rule/Apex]  ➔  [Create Record in __Share Table]  ➔  [Set ParentId/UserOrGroupId/AccessLevel/RowCause]  ➔  [Salesforce Sharing Engine Process]  ➔  [Update Group Maintenance Table]  ➔  [Result: Record Visible to Grantee]</w:t>
+            </w:r>
+          </w:p>
+        </w:tc>
+      </w:tr>
+    </w:tbl>
+    <w:p>
+      <w:pPr>
+        <w:pStyle w:val="Heading4"/>
+      </w:pPr>
+      <w:r>
+        <w:t>Example</w:t>
+      </w:r>
+    </w:p>
+    <w:p/>
+    <w:p>
+      <w:pPr>
+        <w:rPr>
+          <w:b/>
+          <w:bCs/>
+        </w:rPr>
+      </w:pPr>
+      <w:r>
+        <w:rPr>
+          <w:b/>
+          <w:bCs/>
+        </w:rPr>
+        <w:t>R</w:t>
+      </w:r>
+      <w:r>
+        <w:rPr>
+          <w:b/>
+          <w:bCs/>
+        </w:rPr>
+        <w:t>ole hierarchy</w:t>
+      </w:r>
+    </w:p>
+    <w:p>
+      <w:pPr>
+        <w:rPr>
+          <w:b/>
+          <w:bCs/>
+          <w:lang w:val="en-IN"/>
+        </w:rPr>
+      </w:pPr>
+      <w:r>
+        <w:rPr>
+          <w:b/>
+          <w:bCs/>
+          <w:lang w:val="en-IN"/>
+        </w:rPr>
+        <w:t>Manager's Record Access Matrix</w:t>
+      </w:r>
+    </w:p>
+    <w:tbl>
+      <w:tblPr>
+        <w:tblW w:w="0" w:type="auto"/>
+        <w:tblCellSpacing w:w="15" w:type="dxa"/>
+        <w:tblCellMar>
+          <w:top w:w="15" w:type="dxa"/>
+          <w:left w:w="15" w:type="dxa"/>
+          <w:bottom w:w="15" w:type="dxa"/>
+          <w:right w:w="15" w:type="dxa"/>
+        </w:tblCellMar>
+        <w:tblLook w:val="04A0" w:firstRow="1" w:lastRow="0" w:firstColumn="1" w:lastColumn="0" w:noHBand="0" w:noVBand="1"/>
+      </w:tblPr>
+      <w:tblGrid>
+        <w:gridCol w:w="2218"/>
+        <w:gridCol w:w="2109"/>
+        <w:gridCol w:w="2127"/>
+        <w:gridCol w:w="2306"/>
+      </w:tblGrid>
+      <w:tr>
+        <w:trPr>
+          <w:tblHeader/>
+          <w:tblCellSpacing w:w="15" w:type="dxa"/>
+        </w:trPr>
+        <w:tc>
+          <w:tcPr>
+            <w:tcW w:w="0" w:type="auto"/>
+            <w:tcBorders>
+              <w:top w:val="single" w:sz="6" w:space="0" w:color="auto"/>
+              <w:left w:val="single" w:sz="6" w:space="0" w:color="auto"/>
+              <w:bottom w:val="single" w:sz="6" w:space="0" w:color="auto"/>
+              <w:right w:val="single" w:sz="6" w:space="0" w:color="auto"/>
+            </w:tcBorders>
+            <w:vAlign w:val="center"/>
+            <w:hideMark/>
+          </w:tcPr>
+          <w:p>
+            <w:pPr>
+              <w:rPr>
+                <w:lang w:val="en-IN"/>
+              </w:rPr>
+            </w:pPr>
+            <w:r>
+              <w:rPr>
+                <w:b/>
+                <w:bCs/>
+                <w:lang w:val="en-IN"/>
+              </w:rPr>
+              <w:t>Record Owner</w:t>
+            </w:r>
+          </w:p>
+        </w:tc>
+        <w:tc>
+          <w:tcPr>
+            <w:tcW w:w="0" w:type="auto"/>
+            <w:tcBorders>
+              <w:top w:val="single" w:sz="6" w:space="0" w:color="auto"/>
+              <w:left w:val="single" w:sz="6" w:space="0" w:color="auto"/>
+              <w:bottom w:val="single" w:sz="6" w:space="0" w:color="auto"/>
+              <w:right w:val="single" w:sz="6" w:space="0" w:color="auto"/>
+            </w:tcBorders>
+            <w:vAlign w:val="center"/>
+            <w:hideMark/>
+          </w:tcPr>
+          <w:p>
+            <w:pPr>
+              <w:rPr>
+                <w:lang w:val="en-IN"/>
+              </w:rPr>
+            </w:pPr>
+            <w:r>
+              <w:rPr>
+                <w:b/>
+                <w:bCs/>
+                <w:lang w:val="en-IN"/>
+              </w:rPr>
+              <w:t>If OWD is Private</w:t>
+            </w:r>
+          </w:p>
+        </w:tc>
+        <w:tc>
+          <w:tcPr>
+            <w:tcW w:w="0" w:type="auto"/>
+            <w:tcBorders>
+              <w:top w:val="single" w:sz="6" w:space="0" w:color="auto"/>
+              <w:left w:val="single" w:sz="6" w:space="0" w:color="auto"/>
+              <w:bottom w:val="single" w:sz="6" w:space="0" w:color="auto"/>
+              <w:right w:val="single" w:sz="6" w:space="0" w:color="auto"/>
+            </w:tcBorders>
+            <w:vAlign w:val="center"/>
+            <w:hideMark/>
+          </w:tcPr>
+          <w:p>
+            <w:pPr>
+              <w:rPr>
+                <w:lang w:val="en-IN"/>
+              </w:rPr>
+            </w:pPr>
+            <w:r>
+              <w:rPr>
+                <w:b/>
+                <w:bCs/>
+                <w:lang w:val="en-IN"/>
+              </w:rPr>
+              <w:t>If OWD is Public Read-Only</w:t>
+            </w:r>
+          </w:p>
+        </w:tc>
+        <w:tc>
+          <w:tcPr>
+            <w:tcW w:w="0" w:type="auto"/>
+            <w:tcBorders>
+              <w:top w:val="single" w:sz="6" w:space="0" w:color="auto"/>
+              <w:left w:val="single" w:sz="6" w:space="0" w:color="auto"/>
+              <w:bottom w:val="single" w:sz="6" w:space="0" w:color="auto"/>
+              <w:right w:val="single" w:sz="6" w:space="0" w:color="auto"/>
+            </w:tcBorders>
+            <w:vAlign w:val="center"/>
+            <w:hideMark/>
+          </w:tcPr>
+          <w:p>
+            <w:pPr>
+              <w:rPr>
+                <w:lang w:val="en-IN"/>
+              </w:rPr>
+            </w:pPr>
+            <w:r>
+              <w:rPr>
+                <w:b/>
+                <w:bCs/>
+                <w:lang w:val="en-IN"/>
+              </w:rPr>
+              <w:t>If OWD is Public Read/Write</w:t>
+            </w:r>
+          </w:p>
+        </w:tc>
+      </w:tr>
+      <w:tr>
+        <w:trPr>
+          <w:tblCellSpacing w:w="15" w:type="dxa"/>
+        </w:trPr>
+        <w:tc>
+          <w:tcPr>
+            <w:tcW w:w="0" w:type="auto"/>
+            <w:tcBorders>
+              <w:top w:val="single" w:sz="6" w:space="0" w:color="auto"/>
+              <w:left w:val="single" w:sz="6" w:space="0" w:color="auto"/>
+              <w:bottom w:val="single" w:sz="6" w:space="0" w:color="auto"/>
+              <w:right w:val="single" w:sz="6" w:space="0" w:color="auto"/>
+            </w:tcBorders>
+            <w:vAlign w:val="center"/>
+            <w:hideMark/>
+          </w:tcPr>
+          <w:p>
+            <w:pPr>
+              <w:rPr>
+                <w:lang w:val="en-IN"/>
+              </w:rPr>
+            </w:pPr>
+            <w:r>
+              <w:rPr>
+                <w:b/>
+                <w:bCs/>
+                <w:lang w:val="en-IN"/>
+              </w:rPr>
+              <w:t>Their Subordinate</w:t>
+            </w:r>
+          </w:p>
+        </w:tc>
+        <w:tc>
+          <w:tcPr>
+            <w:tcW w:w="0" w:type="auto"/>
+            <w:tcBorders>
+              <w:top w:val="single" w:sz="6" w:space="0" w:color="auto"/>
+              <w:left w:val="single" w:sz="6" w:space="0" w:color="auto"/>
+              <w:bottom w:val="single" w:sz="6" w:space="0" w:color="auto"/>
+              <w:right w:val="single" w:sz="6" w:space="0" w:color="auto"/>
+            </w:tcBorders>
+            <w:vAlign w:val="center"/>
+            <w:hideMark/>
+          </w:tcPr>
+          <w:p>
+            <w:pPr>
+              <w:rPr>
+                <w:lang w:val="en-IN"/>
+              </w:rPr>
+            </w:pPr>
+            <w:r>
+              <w:rPr>
+                <w:b/>
+                <w:bCs/>
+                <w:lang w:val="en-IN"/>
+              </w:rPr>
+              <w:t>Read / Write</w:t>
+            </w:r>
+          </w:p>
+          <w:p>
+            <w:pPr>
+              <w:rPr>
+                <w:lang w:val="en-IN"/>
+              </w:rPr>
+            </w:pPr>
+            <w:r>
+              <w:rPr>
+                <w:lang w:val="en-IN"/>
+              </w:rPr>
+              <w:br/>
+            </w:r>
+          </w:p>
+          <w:p>
+            <w:pPr>
+              <w:rPr>
+                <w:lang w:val="en-IN"/>
+              </w:rPr>
+            </w:pPr>
+            <w:r>
+              <w:rPr>
+                <w:i/>
+                <w:iCs/>
+                <w:lang w:val="en-IN"/>
+              </w:rPr>
+              <w:t>(Inherited via Role Hierarchy)</w:t>
+            </w:r>
+          </w:p>
+        </w:tc>
+        <w:tc>
+          <w:tcPr>
+            <w:tcW w:w="0" w:type="auto"/>
+            <w:tcBorders>
+              <w:top w:val="single" w:sz="6" w:space="0" w:color="auto"/>
+              <w:left w:val="single" w:sz="6" w:space="0" w:color="auto"/>
+              <w:bottom w:val="single" w:sz="6" w:space="0" w:color="auto"/>
+              <w:right w:val="single" w:sz="6" w:space="0" w:color="auto"/>
+            </w:tcBorders>
+            <w:vAlign w:val="center"/>
+            <w:hideMark/>
+          </w:tcPr>
+          <w:p>
+            <w:pPr>
+              <w:rPr>
+                <w:lang w:val="en-IN"/>
+              </w:rPr>
+            </w:pPr>
+            <w:r>
+              <w:rPr>
+                <w:b/>
+                <w:bCs/>
+                <w:lang w:val="en-IN"/>
+              </w:rPr>
+              <w:t>Read / Write</w:t>
+            </w:r>
+          </w:p>
+          <w:p>
+            <w:pPr>
+              <w:rPr>
+                <w:lang w:val="en-IN"/>
+              </w:rPr>
+            </w:pPr>
+            <w:r>
+              <w:rPr>
+                <w:lang w:val="en-IN"/>
+              </w:rPr>
+              <w:br/>
+            </w:r>
+          </w:p>
+          <w:p>
+            <w:pPr>
+              <w:rPr>
+                <w:lang w:val="en-IN"/>
+              </w:rPr>
+            </w:pPr>
+            <w:r>
+              <w:rPr>
+                <w:i/>
+                <w:iCs/>
+                <w:lang w:val="en-IN"/>
+              </w:rPr>
+              <w:t>(Inherited via Role Hierarchy)</w:t>
+            </w:r>
+          </w:p>
+        </w:tc>
+        <w:tc>
+          <w:tcPr>
+            <w:tcW w:w="0" w:type="auto"/>
+            <w:tcBorders>
+              <w:top w:val="single" w:sz="6" w:space="0" w:color="auto"/>
+              <w:left w:val="single" w:sz="6" w:space="0" w:color="auto"/>
+              <w:bottom w:val="single" w:sz="6" w:space="0" w:color="auto"/>
+              <w:right w:val="single" w:sz="6" w:space="0" w:color="auto"/>
+            </w:tcBorders>
+            <w:vAlign w:val="center"/>
+            <w:hideMark/>
+          </w:tcPr>
+          <w:p>
+            <w:pPr>
+              <w:rPr>
+                <w:lang w:val="en-IN"/>
+              </w:rPr>
+            </w:pPr>
+            <w:r>
+              <w:rPr>
+                <w:b/>
+                <w:bCs/>
+                <w:lang w:val="en-IN"/>
+              </w:rPr>
+              <w:t>Read / Write</w:t>
+            </w:r>
+          </w:p>
+          <w:p>
+            <w:pPr>
+              <w:rPr>
+                <w:lang w:val="en-IN"/>
+              </w:rPr>
+            </w:pPr>
+            <w:r>
+              <w:rPr>
+                <w:lang w:val="en-IN"/>
+              </w:rPr>
+              <w:br/>
+            </w:r>
+          </w:p>
+          <w:p>
+            <w:pPr>
+              <w:rPr>
+                <w:lang w:val="en-IN"/>
+              </w:rPr>
+            </w:pPr>
+            <w:r>
+              <w:rPr>
+                <w:i/>
+                <w:iCs/>
+                <w:lang w:val="en-IN"/>
+              </w:rPr>
+              <w:t>(Granted via OWD &amp; Hierarchy)</w:t>
+            </w:r>
+          </w:p>
+        </w:tc>
+      </w:tr>
+      <w:tr>
+        <w:trPr>
+          <w:tblCellSpacing w:w="15" w:type="dxa"/>
+        </w:trPr>
+        <w:tc>
+          <w:tcPr>
+            <w:tcW w:w="0" w:type="auto"/>
+            <w:tcBorders>
+              <w:top w:val="single" w:sz="6" w:space="0" w:color="auto"/>
+              <w:left w:val="single" w:sz="6" w:space="0" w:color="auto"/>
+              <w:bottom w:val="single" w:sz="6" w:space="0" w:color="auto"/>
+              <w:right w:val="single" w:sz="6" w:space="0" w:color="auto"/>
+            </w:tcBorders>
+            <w:vAlign w:val="center"/>
+            <w:hideMark/>
+          </w:tcPr>
+          <w:p>
+            <w:pPr>
+              <w:rPr>
+                <w:lang w:val="en-IN"/>
+              </w:rPr>
+            </w:pPr>
+            <w:r>
+              <w:rPr>
+                <w:b/>
+                <w:bCs/>
+                <w:lang w:val="en-IN"/>
+              </w:rPr>
+              <w:t>Another User</w:t>
+            </w:r>
+          </w:p>
+          <w:p>
+            <w:pPr>
+              <w:rPr>
+                <w:lang w:val="en-IN"/>
+              </w:rPr>
+            </w:pPr>
+            <w:r>
+              <w:rPr>
+                <w:lang w:val="en-IN"/>
+              </w:rPr>
+              <w:br/>
+            </w:r>
+          </w:p>
+          <w:p>
+            <w:pPr>
+              <w:rPr>
+                <w:lang w:val="en-IN"/>
+              </w:rPr>
+            </w:pPr>
+            <w:r>
+              <w:rPr>
+                <w:i/>
+                <w:iCs/>
+                <w:lang w:val="en-IN"/>
+              </w:rPr>
+              <w:t>(Peer or outside their branch)</w:t>
+            </w:r>
+          </w:p>
+        </w:tc>
+        <w:tc>
+          <w:tcPr>
+            <w:tcW w:w="0" w:type="auto"/>
+            <w:tcBorders>
+              <w:top w:val="single" w:sz="6" w:space="0" w:color="auto"/>
+              <w:left w:val="single" w:sz="6" w:space="0" w:color="auto"/>
+              <w:bottom w:val="single" w:sz="6" w:space="0" w:color="auto"/>
+              <w:right w:val="single" w:sz="6" w:space="0" w:color="auto"/>
+            </w:tcBorders>
+            <w:vAlign w:val="center"/>
+            <w:hideMark/>
+          </w:tcPr>
+          <w:p>
+            <w:pPr>
+              <w:rPr>
+                <w:lang w:val="en-IN"/>
+              </w:rPr>
+            </w:pPr>
+            <w:r>
+              <w:rPr>
+                <w:b/>
+                <w:bCs/>
+                <w:lang w:val="en-IN"/>
+              </w:rPr>
+              <w:t>No Access</w:t>
+            </w:r>
+          </w:p>
+          <w:p>
+            <w:pPr>
+              <w:rPr>
+                <w:lang w:val="en-IN"/>
+              </w:rPr>
+            </w:pPr>
+            <w:r>
+              <w:rPr>
+                <w:lang w:val="en-IN"/>
+              </w:rPr>
+              <w:br/>
+            </w:r>
+          </w:p>
+          <w:p>
+            <w:pPr>
+              <w:rPr>
+                <w:lang w:val="en-IN"/>
+              </w:rPr>
+            </w:pPr>
+            <w:r>
+              <w:rPr>
+                <w:i/>
+                <w:iCs/>
+                <w:lang w:val="en-IN"/>
+              </w:rPr>
+              <w:t>(Hidden by OWD)</w:t>
+            </w:r>
+          </w:p>
+        </w:tc>
+        <w:tc>
+          <w:tcPr>
+            <w:tcW w:w="0" w:type="auto"/>
+            <w:tcBorders>
+              <w:top w:val="single" w:sz="6" w:space="0" w:color="auto"/>
+              <w:left w:val="single" w:sz="6" w:space="0" w:color="auto"/>
+              <w:bottom w:val="single" w:sz="6" w:space="0" w:color="auto"/>
+              <w:right w:val="single" w:sz="6" w:space="0" w:color="auto"/>
+            </w:tcBorders>
+            <w:vAlign w:val="center"/>
+            <w:hideMark/>
+          </w:tcPr>
+          <w:p>
+            <w:pPr>
+              <w:rPr>
+                <w:lang w:val="en-IN"/>
+              </w:rPr>
+            </w:pPr>
+            <w:r>
+              <w:rPr>
+                <w:b/>
+                <w:bCs/>
+                <w:lang w:val="en-IN"/>
+              </w:rPr>
+              <w:t>Read Only</w:t>
+            </w:r>
+          </w:p>
+          <w:p>
+            <w:pPr>
+              <w:rPr>
+                <w:lang w:val="en-IN"/>
+              </w:rPr>
+            </w:pPr>
+            <w:r>
+              <w:rPr>
+                <w:lang w:val="en-IN"/>
+              </w:rPr>
+              <w:br/>
+            </w:r>
+          </w:p>
+          <w:p>
+            <w:pPr>
+              <w:rPr>
+                <w:lang w:val="en-IN"/>
+              </w:rPr>
+            </w:pPr>
+            <w:r>
+              <w:rPr>
+                <w:i/>
+                <w:iCs/>
+                <w:lang w:val="en-IN"/>
+              </w:rPr>
+              <w:t>(Controlled by OWD)</w:t>
+            </w:r>
+          </w:p>
+        </w:tc>
+        <w:tc>
+          <w:tcPr>
+            <w:tcW w:w="0" w:type="auto"/>
+            <w:tcBorders>
+              <w:top w:val="single" w:sz="6" w:space="0" w:color="auto"/>
+              <w:left w:val="single" w:sz="6" w:space="0" w:color="auto"/>
+              <w:bottom w:val="single" w:sz="6" w:space="0" w:color="auto"/>
+              <w:right w:val="single" w:sz="6" w:space="0" w:color="auto"/>
+            </w:tcBorders>
+            <w:vAlign w:val="center"/>
+            <w:hideMark/>
+          </w:tcPr>
+          <w:p>
+            <w:pPr>
+              <w:rPr>
+                <w:lang w:val="en-IN"/>
+              </w:rPr>
+            </w:pPr>
+            <w:r>
+              <w:rPr>
+                <w:b/>
+                <w:bCs/>
+                <w:lang w:val="en-IN"/>
+              </w:rPr>
+              <w:t>Read / Write</w:t>
+            </w:r>
+          </w:p>
+          <w:p>
+            <w:pPr>
+              <w:rPr>
+                <w:lang w:val="en-IN"/>
+              </w:rPr>
+            </w:pPr>
+            <w:r>
+              <w:rPr>
+                <w:lang w:val="en-IN"/>
+              </w:rPr>
+              <w:br/>
+            </w:r>
+          </w:p>
+          <w:p>
+            <w:pPr>
+              <w:rPr>
+                <w:lang w:val="en-IN"/>
+              </w:rPr>
+            </w:pPr>
+            <w:r>
+              <w:rPr>
+                <w:i/>
+                <w:iCs/>
+                <w:lang w:val="en-IN"/>
+              </w:rPr>
+              <w:t>(Controlled by OWD)</w:t>
+            </w:r>
+          </w:p>
+        </w:tc>
+      </w:tr>
+      <w:tr>
+        <w:trPr>
+          <w:tblCellSpacing w:w="15" w:type="dxa"/>
+        </w:trPr>
+        <w:tc>
+          <w:tcPr>
+            <w:tcW w:w="0" w:type="auto"/>
+            <w:tcBorders>
+              <w:top w:val="single" w:sz="6" w:space="0" w:color="auto"/>
+              <w:left w:val="single" w:sz="6" w:space="0" w:color="auto"/>
+              <w:bottom w:val="single" w:sz="6" w:space="0" w:color="auto"/>
+              <w:right w:val="single" w:sz="6" w:space="0" w:color="auto"/>
+            </w:tcBorders>
+            <w:vAlign w:val="center"/>
+            <w:hideMark/>
+          </w:tcPr>
+          <w:p>
+            <w:pPr>
+              <w:rPr>
+                <w:lang w:val="en-IN"/>
+              </w:rPr>
+            </w:pPr>
+            <w:r>
+              <w:rPr>
+                <w:b/>
+                <w:bCs/>
+                <w:lang w:val="en-IN"/>
+              </w:rPr>
+              <w:t>The Manager Them-self</w:t>
+            </w:r>
+          </w:p>
+        </w:tc>
+        <w:tc>
+          <w:tcPr>
+            <w:tcW w:w="0" w:type="auto"/>
+            <w:tcBorders>
+              <w:top w:val="single" w:sz="6" w:space="0" w:color="auto"/>
+              <w:left w:val="single" w:sz="6" w:space="0" w:color="auto"/>
+              <w:bottom w:val="single" w:sz="6" w:space="0" w:color="auto"/>
+              <w:right w:val="single" w:sz="6" w:space="0" w:color="auto"/>
+            </w:tcBorders>
+            <w:vAlign w:val="center"/>
+            <w:hideMark/>
+          </w:tcPr>
+          <w:p>
+            <w:pPr>
+              <w:rPr>
+                <w:lang w:val="en-IN"/>
+              </w:rPr>
+            </w:pPr>
+            <w:r>
+              <w:rPr>
+                <w:b/>
+                <w:bCs/>
+                <w:lang w:val="en-IN"/>
+              </w:rPr>
+              <w:t>Read / Write</w:t>
+            </w:r>
+          </w:p>
+          <w:p>
+            <w:pPr>
+              <w:rPr>
+                <w:lang w:val="en-IN"/>
+              </w:rPr>
+            </w:pPr>
+            <w:r>
+              <w:rPr>
+                <w:lang w:val="en-IN"/>
+              </w:rPr>
+              <w:br/>
+            </w:r>
+          </w:p>
+          <w:p>
+            <w:pPr>
+              <w:rPr>
+                <w:lang w:val="en-IN"/>
+              </w:rPr>
+            </w:pPr>
+            <w:r>
+              <w:rPr>
+                <w:i/>
+                <w:iCs/>
+                <w:lang w:val="en-IN"/>
+              </w:rPr>
+              <w:t>(Standard Owner Rights)</w:t>
+            </w:r>
+          </w:p>
+        </w:tc>
+        <w:tc>
+          <w:tcPr>
+            <w:tcW w:w="0" w:type="auto"/>
+            <w:tcBorders>
+              <w:top w:val="single" w:sz="6" w:space="0" w:color="auto"/>
+              <w:left w:val="single" w:sz="6" w:space="0" w:color="auto"/>
+              <w:bottom w:val="single" w:sz="6" w:space="0" w:color="auto"/>
+              <w:right w:val="single" w:sz="6" w:space="0" w:color="auto"/>
+            </w:tcBorders>
+            <w:vAlign w:val="center"/>
+            <w:hideMark/>
+          </w:tcPr>
+          <w:p>
+            <w:pPr>
+              <w:rPr>
+                <w:lang w:val="en-IN"/>
+              </w:rPr>
+            </w:pPr>
+            <w:r>
+              <w:rPr>
+                <w:b/>
+                <w:bCs/>
+                <w:lang w:val="en-IN"/>
+              </w:rPr>
+              <w:t>Read / Write</w:t>
+            </w:r>
+          </w:p>
+          <w:p>
+            <w:pPr>
+              <w:rPr>
+                <w:lang w:val="en-IN"/>
+              </w:rPr>
+            </w:pPr>
+            <w:r>
+              <w:rPr>
+                <w:lang w:val="en-IN"/>
+              </w:rPr>
+              <w:br/>
+            </w:r>
+          </w:p>
+          <w:p>
+            <w:pPr>
+              <w:rPr>
+                <w:lang w:val="en-IN"/>
+              </w:rPr>
+            </w:pPr>
+            <w:r>
+              <w:rPr>
+                <w:i/>
+                <w:iCs/>
+                <w:lang w:val="en-IN"/>
+              </w:rPr>
+              <w:t>(Standard Owner Rights)</w:t>
+            </w:r>
+          </w:p>
+        </w:tc>
+        <w:tc>
+          <w:tcPr>
+            <w:tcW w:w="0" w:type="auto"/>
+            <w:tcBorders>
+              <w:top w:val="single" w:sz="6" w:space="0" w:color="auto"/>
+              <w:left w:val="single" w:sz="6" w:space="0" w:color="auto"/>
+              <w:bottom w:val="single" w:sz="6" w:space="0" w:color="auto"/>
+              <w:right w:val="single" w:sz="6" w:space="0" w:color="auto"/>
+            </w:tcBorders>
+            <w:vAlign w:val="center"/>
+            <w:hideMark/>
+          </w:tcPr>
+          <w:p>
+            <w:pPr>
+              <w:rPr>
+                <w:lang w:val="en-IN"/>
+              </w:rPr>
+            </w:pPr>
+            <w:r>
+              <w:rPr>
+                <w:b/>
+                <w:bCs/>
+                <w:lang w:val="en-IN"/>
+              </w:rPr>
+              <w:t>Read / Write</w:t>
+            </w:r>
+          </w:p>
+          <w:p>
+            <w:pPr>
+              <w:rPr>
+                <w:lang w:val="en-IN"/>
+              </w:rPr>
+            </w:pPr>
+            <w:r>
+              <w:rPr>
+                <w:lang w:val="en-IN"/>
+              </w:rPr>
+              <w:br/>
+            </w:r>
+          </w:p>
+          <w:p>
+            <w:pPr>
+              <w:rPr>
+                <w:lang w:val="en-IN"/>
+              </w:rPr>
+            </w:pPr>
+            <w:r>
+              <w:rPr>
+                <w:i/>
+                <w:iCs/>
+                <w:lang w:val="en-IN"/>
+              </w:rPr>
+              <w:t>(Standard Owner Rights)</w:t>
+            </w:r>
+          </w:p>
+        </w:tc>
+      </w:tr>
+    </w:tbl>
+    <w:p>
+      <w:pPr>
+        <w:rPr>
+          <w:b/>
+          <w:bCs/>
+          <w:lang w:val="en-IN"/>
+        </w:rPr>
+      </w:pPr>
+      <w:r>
+        <w:rPr>
+          <w:b/>
+          <w:bCs/>
+          <w:lang w:val="en-IN"/>
+        </w:rPr>
+        <w:t>3 Key Takeaways From This Table:</w:t>
+      </w:r>
+    </w:p>
+    <w:p>
+      <w:pPr>
+        <w:numPr>
+          <w:ilvl w:val="0"/>
+          <w:numId w:val="11"/>
+        </w:numPr>
+        <w:rPr>
+          <w:lang w:val="en-IN"/>
+        </w:rPr>
+      </w:pPr>
+      <w:r>
+        <w:rPr>
+          <w:b/>
+          <w:bCs/>
+          <w:lang w:val="en-IN"/>
+        </w:rPr>
+        <w:t>The Subordinate Column is Always Read/Write:</w:t>
+      </w:r>
+      <w:r>
+        <w:rPr>
+          <w:lang w:val="en-IN"/>
+        </w:rPr>
+        <w:t xml:space="preserve"> Notice how the first row never changes. No matter how restrictive the OWD gets (even down to Private), the manager keeps </w:t>
+      </w:r>
+      <w:r>
+        <w:rPr>
+          <w:b/>
+          <w:bCs/>
+          <w:lang w:val="en-IN"/>
+        </w:rPr>
+        <w:t>Read/Write</w:t>
+      </w:r>
+      <w:r>
+        <w:rPr>
+          <w:lang w:val="en-IN"/>
+        </w:rPr>
+        <w:t xml:space="preserve"> access to their subordinate's records.</w:t>
+      </w:r>
+    </w:p>
+    <w:p>
+      <w:pPr>
+        <w:numPr>
+          <w:ilvl w:val="0"/>
+          <w:numId w:val="11"/>
+        </w:numPr>
+        <w:rPr>
+          <w:lang w:val="en-IN"/>
+        </w:rPr>
+      </w:pPr>
+      <w:r>
+        <w:rPr>
+          <w:b/>
+          <w:bCs/>
+          <w:lang w:val="en-IN"/>
+        </w:rPr>
+        <w:lastRenderedPageBreak/>
+        <w:t>OWD Only Restricts "Other Users":</w:t>
+      </w:r>
+      <w:r>
+        <w:rPr>
+          <w:lang w:val="en-IN"/>
+        </w:rPr>
+        <w:t xml:space="preserve"> The OWD settings only kick in for the manager when they try to access a record owned by a peer or someone outside their reporting line (the second row).</w:t>
+      </w:r>
+    </w:p>
+    <w:p>
+      <w:pPr>
+        <w:numPr>
+          <w:ilvl w:val="0"/>
+          <w:numId w:val="11"/>
+        </w:numPr>
+        <w:rPr>
+          <w:lang w:val="en-IN"/>
+        </w:rPr>
+      </w:pPr>
+      <w:r>
+        <w:rPr>
+          <w:b/>
+          <w:bCs/>
+          <w:lang w:val="en-IN"/>
+        </w:rPr>
+        <w:t>The "Grant Access Using Hierarchies" Checkbox:</w:t>
+      </w:r>
+      <w:r>
+        <w:rPr>
+          <w:lang w:val="en-IN"/>
+        </w:rPr>
+        <w:t xml:space="preserve"> This behavior is active by default for standard objects. For custom objects, it works exactly like this table as long as the "Grant Access Using Hierarchies" checkbox remains checked on the object settings.</w:t>
+      </w:r>
+    </w:p>
+    <w:p/>
+    <w:p>
+      <w:r>
+        <w:br/>
+        <w:t>==============================</w:t>
+        <w:br/>
+      </w:r>
+    </w:p>
+    <w:p>
+      <w:pPr>
+        <w:pStyle w:val="Title"/>
+      </w:pPr>
+      <w:r>
+        <w:rPr>
+          <w:b/>
+          <w:sz w:val="36"/>
+        </w:rPr>
+        <w:t>Public Groups</w:t>
+      </w:r>
+    </w:p>
+    <w:p>
+      <w:pPr>
+        <w:pStyle w:val="Heading1"/>
+      </w:pPr>
+      <w:r>
+        <w:t>Summary</w:t>
+      </w:r>
+    </w:p>
+    <w:p>
+      <w:pPr>
+        <w:pStyle w:val="ListBullet"/>
+      </w:pPr>
+      <w:r>
+        <w:t>Public Groups are administrative containers in Salesforce used to group sets of users, roles, and other groups to simplify the management of record sharing, folder access, and permissions. They serve as a foundational element in the Salesforce Sharing Model, enabling efficient data visibility management without individual record-level assignments.</w:t>
+      </w:r>
+    </w:p>
+    <w:p>
+      <w:pPr>
+        <w:pStyle w:val="Heading2"/>
+      </w:pPr>
+      <w:r>
+        <w:t>Core Architecture and Data Model</w:t>
+      </w:r>
+    </w:p>
+    <w:p>
+      <w:pPr>
+        <w:pStyle w:val="ListBullet"/>
+      </w:pPr>
+      <w:r>
+        <w:t>Represented by the Group object in the SOAP API with Type='Regular'.GroupMember junction object links users, roles, or other groups to a specific Group.Supports nested structures where Groups can contain other Groups, facilitating inheritance of permissions.Does not grant permissions directly via Profiles or Permission Sets; instead, controls record-level visibility and folder access.Group IDs are prefixed with '00G' and are unique across the organization.</w:t>
+      </w:r>
+    </w:p>
+    <w:p>
+      <w:pPr>
+        <w:pStyle w:val="Heading2"/>
+      </w:pPr>
+      <w:r>
+        <w:t>Sharing and Visibility Mechanisms</w:t>
+      </w:r>
+    </w:p>
+    <w:p>
+      <w:pPr>
+        <w:pStyle w:val="ListBullet"/>
+      </w:pPr>
+      <w:r>
+        <w:t>Used as targets in Criteria-Based Sharing Rules and Owner-Based Sharing Rules.Facilitates Manual Sharing by allowing users to share records with a defined group of people at once.Controls access to Report and Dashboard folders, as well as Document and Library folders.Enables Apex Managed Sharing by using the Group ID in the UserOrGroupId field of Share objects (e.g., AccountShare, CustomObject__Share).Used in List View visibility settings to restrict access to specific subsets of users.</w:t>
+      </w:r>
+    </w:p>
+    <w:p>
+      <w:pPr>
+        <w:pStyle w:val="Heading2"/>
+      </w:pPr>
+      <w:r>
+        <w:t>Performance and Scalability Considerations</w:t>
+      </w:r>
+    </w:p>
+    <w:p>
+      <w:pPr>
+        <w:pStyle w:val="ListBullet"/>
+      </w:pPr>
+      <w:r>
+        <w:t>Group Membership changes trigger asynchronous Sharing Recalculation which can impact system performance in large data volumes (LDV).Avoid 'Granular Locking' issues by managing GroupMembership via the 'Defer Sharing Calculation' feature during bulk data loads.Deep nesting of groups (groups within groups within groups) can increase the complexity of the 'Group Maintenance Table' and slow down access checks.The Salesforce Sharing Engine calculates a flattened version of group membership to determine record access at runtime.</w:t>
+      </w:r>
+    </w:p>
+    <w:p>
+      <w:pPr>
+        <w:pStyle w:val="Heading2"/>
+      </w:pPr>
+      <w:r>
+        <w:t>Governance and Security Implications</w:t>
+      </w:r>
+    </w:p>
+    <w:p>
+      <w:pPr>
+        <w:pStyle w:val="ListBullet"/>
+      </w:pPr>
+      <w:r>
+        <w:t>Groups do not bypass the 'Grant Access Using Hierarchies' setting; if enabled, managers still see records shared with subordinates in a group.Public Groups can include 'Roles', 'Roles and Subordinates', or 'Roles and Internal Subordinates' to dynamically include users based on the hierarchy.Changes to Public Group membership are captured in the Setup Audit Trail for compliance monitoring.Unlike Queues, Public Groups cannot own records; they only provide access to them.</w:t>
+      </w:r>
+    </w:p>
+    <w:p>
+      <w:pPr>
+        <w:pStyle w:val="Heading3"/>
+      </w:pPr>
+      <w:r>
+        <w:t>Best Practices</w:t>
+      </w:r>
+    </w:p>
+    <w:p>
+      <w:pPr>
+        <w:pStyle w:val="ListBullet"/>
+      </w:pPr>
+      <w:r>
+        <w:t>Prefer Public Groups over individual User assignments in Sharing Rules to reduce administrative overhead and technical debt.</w:t>
+      </w:r>
+    </w:p>
+    <w:p>
+      <w:pPr>
+        <w:pStyle w:val="ListBullet"/>
+      </w:pPr>
+      <w:r>
+        <w:t>Use descriptive naming conventions that indicate the purpose of the group (e.g., 'PG_Sales_North_America_Read_Only').</w:t>
+      </w:r>
+    </w:p>
+    <w:p>
+      <w:pPr>
+        <w:pStyle w:val="ListBullet"/>
+      </w:pPr>
+      <w:r>
+        <w:t>Limit the depth of nested groups to 5 levels to maintain optimal sharing performance.</w:t>
+      </w:r>
+    </w:p>
+    <w:p>
+      <w:pPr>
+        <w:pStyle w:val="ListBullet"/>
+      </w:pPr>
+      <w:r>
+        <w:t>Utilize 'Roles and Internal Subordinates' to exclude Community/Portal users from internal record sharing visibility.</w:t>
+      </w:r>
+    </w:p>
+    <w:p>
+      <w:pPr>
+        <w:pStyle w:val="ListBullet"/>
+      </w:pPr>
+      <w:r>
+        <w:t>Audit group memberships quarterly using SOQL on the GroupMember object to ensure compliance with the Principle of Least Privilege.</w:t>
+      </w:r>
+    </w:p>
+    <w:p>
+      <w:pPr>
+        <w:pStyle w:val="Heading3"/>
+      </w:pPr>
+      <w:r>
+        <w:t>Limitations</w:t>
+      </w:r>
+    </w:p>
+    <w:p>
+      <w:pPr>
+        <w:pStyle w:val="ListBullet"/>
+      </w:pPr>
+      <w:r>
+        <w:t>Maximum number of members in a single group is generally recommended to be under 100,000 for performance stability.</w:t>
+      </w:r>
+    </w:p>
+    <w:p>
+      <w:pPr>
+        <w:pStyle w:val="ListBullet"/>
+      </w:pPr>
+      <w:r>
+        <w:t>Sharing rules using Public Groups may fail if the resulting sharing table exceeds 100 million rows.</w:t>
+      </w:r>
+    </w:p>
+    <w:p>
+      <w:pPr>
+        <w:pStyle w:val="ListBullet"/>
+      </w:pPr>
+      <w:r>
+        <w:t>Groups cannot be used as the 'Owner' of a record; only Users and Queues have ownership capabilities.</w:t>
+      </w:r>
+    </w:p>
+    <w:p>
+      <w:pPr>
+        <w:pStyle w:val="ListBullet"/>
+      </w:pPr>
+      <w:r>
+        <w:t>Dynamic inclusion in groups is limited to Role-based hierarchies; complex attribute-based membership requires custom Apex or Flow automation.</w:t>
+      </w:r>
+    </w:p>
+    <w:p>
+      <w:pPr>
+        <w:pStyle w:val="Heading1"/>
+      </w:pPr>
+      <w:r>
+        <w:t>Data Access Flow</w:t>
+      </w:r>
+    </w:p>
+    <w:tbl>
+      <w:tblPr>
+        <w:tblStyle w:val="LightGrid-Accent1"/>
+        <w:tblW w:type="auto" w:w="0"/>
+        <w:tblLook w:firstColumn="1" w:firstRow="1" w:lastColumn="0" w:lastRow="0" w:noHBand="0" w:noVBand="1" w:val="04A0"/>
+      </w:tblPr>
+      <w:tblGrid>
+        <w:gridCol w:w="8640"/>
+      </w:tblGrid>
+      <w:tr>
+        <w:tc>
+          <w:tcPr>
+            <w:tcW w:type="dxa" w:w="8640"/>
+          </w:tcPr>
+          <w:p>
+            <w:pPr>
+              <w:jc w:val="center"/>
+            </w:pPr>
+            <w:r>
+              <w:t>[User/Role/Sub-Group]  ➔  [GroupMember Record]  ➔  [Public Group (Group Object)]  ➔  [Sharing Rule / Folder / Apex Share]  ➔  [Record Access / Visibility]</w:t>
+            </w:r>
+          </w:p>
+        </w:tc>
+      </w:tr>
+    </w:tbl>
+    <w:p>
+      <w:pPr>
+        <w:pStyle w:val="Heading4"/>
+      </w:pPr>
+      <w:r>
+        <w:t>Example</w:t>
+      </w:r>
+    </w:p>
     <w:sectPr>
       <w:pgSz w:w="12240" w:h="15840"/>
       <w:pgMar w:top="1440" w:right="1800" w:bottom="1440" w:left="1800" w:header="720" w:footer="720" w:gutter="0"/>
@@ -3581,7 +5783,7 @@
   <w:abstractNum w:abstractNumId="8" w15:restartNumberingAfterBreak="0">
     <w:nsid w:val="FFFFFF89"/>
     <w:multiLevelType w:val="singleLevel"/>
-    <w:tmpl w:val="E33AE6D2"/>
+    <w:tmpl w:val="1DCC8170"/>
     <w:lvl w:ilvl="0">
       <w:start w:val="1"/>
       <w:numFmt w:val="bullet"/>
@@ -3597,6 +5799,119 @@
       <w:rPr>
         <w:rFonts w:ascii="Symbol" w:hAnsi="Symbol" w:hint="default"/>
       </w:rPr>
+    </w:lvl>
+  </w:abstractNum>
+  <w:abstractNum w:abstractNumId="9" w15:restartNumberingAfterBreak="0">
+    <w:nsid w:val="572C6A25"/>
+    <w:multiLevelType w:val="multilevel"/>
+    <w:tmpl w:val="C0B0BCA8"/>
+    <w:lvl w:ilvl="0">
+      <w:start w:val="1"/>
+      <w:numFmt w:val="decimal"/>
+      <w:lvlText w:val="%1."/>
+      <w:lvlJc w:val="left"/>
+      <w:pPr>
+        <w:tabs>
+          <w:tab w:val="num" w:pos="720"/>
+        </w:tabs>
+        <w:ind w:left="720" w:hanging="360"/>
+      </w:pPr>
+    </w:lvl>
+    <w:lvl w:ilvl="1" w:tentative="1">
+      <w:start w:val="1"/>
+      <w:numFmt w:val="decimal"/>
+      <w:lvlText w:val="%2."/>
+      <w:lvlJc w:val="left"/>
+      <w:pPr>
+        <w:tabs>
+          <w:tab w:val="num" w:pos="1440"/>
+        </w:tabs>
+        <w:ind w:left="1440" w:hanging="360"/>
+      </w:pPr>
+    </w:lvl>
+    <w:lvl w:ilvl="2" w:tentative="1">
+      <w:start w:val="1"/>
+      <w:numFmt w:val="decimal"/>
+      <w:lvlText w:val="%3."/>
+      <w:lvlJc w:val="left"/>
+      <w:pPr>
+        <w:tabs>
+          <w:tab w:val="num" w:pos="2160"/>
+        </w:tabs>
+        <w:ind w:left="2160" w:hanging="360"/>
+      </w:pPr>
+    </w:lvl>
+    <w:lvl w:ilvl="3" w:tentative="1">
+      <w:start w:val="1"/>
+      <w:numFmt w:val="decimal"/>
+      <w:lvlText w:val="%4."/>
+      <w:lvlJc w:val="left"/>
+      <w:pPr>
+        <w:tabs>
+          <w:tab w:val="num" w:pos="2880"/>
+        </w:tabs>
+        <w:ind w:left="2880" w:hanging="360"/>
+      </w:pPr>
+    </w:lvl>
+    <w:lvl w:ilvl="4" w:tentative="1">
+      <w:start w:val="1"/>
+      <w:numFmt w:val="decimal"/>
+      <w:lvlText w:val="%5."/>
+      <w:lvlJc w:val="left"/>
+      <w:pPr>
+        <w:tabs>
+          <w:tab w:val="num" w:pos="3600"/>
+        </w:tabs>
+        <w:ind w:left="3600" w:hanging="360"/>
+      </w:pPr>
+    </w:lvl>
+    <w:lvl w:ilvl="5" w:tentative="1">
+      <w:start w:val="1"/>
+      <w:numFmt w:val="decimal"/>
+      <w:lvlText w:val="%6."/>
+      <w:lvlJc w:val="left"/>
+      <w:pPr>
+        <w:tabs>
+          <w:tab w:val="num" w:pos="4320"/>
+        </w:tabs>
+        <w:ind w:left="4320" w:hanging="360"/>
+      </w:pPr>
+    </w:lvl>
+    <w:lvl w:ilvl="6" w:tentative="1">
+      <w:start w:val="1"/>
+      <w:numFmt w:val="decimal"/>
+      <w:lvlText w:val="%7."/>
+      <w:lvlJc w:val="left"/>
+      <w:pPr>
+        <w:tabs>
+          <w:tab w:val="num" w:pos="5040"/>
+        </w:tabs>
+        <w:ind w:left="5040" w:hanging="360"/>
+      </w:pPr>
+    </w:lvl>
+    <w:lvl w:ilvl="7" w:tentative="1">
+      <w:start w:val="1"/>
+      <w:numFmt w:val="decimal"/>
+      <w:lvlText w:val="%8."/>
+      <w:lvlJc w:val="left"/>
+      <w:pPr>
+        <w:tabs>
+          <w:tab w:val="num" w:pos="5760"/>
+        </w:tabs>
+        <w:ind w:left="5760" w:hanging="360"/>
+      </w:pPr>
+    </w:lvl>
+    <w:lvl w:ilvl="8" w:tentative="1">
+      <w:start w:val="1"/>
+      <w:numFmt w:val="decimal"/>
+      <w:lvlText w:val="%9."/>
+      <w:lvlJc w:val="left"/>
+      <w:pPr>
+        <w:tabs>
+          <w:tab w:val="num" w:pos="6480"/>
+        </w:tabs>
+        <w:ind w:left="6480" w:hanging="360"/>
+      </w:pPr>
     </w:lvl>
   </w:abstractNum>
   <w:num w:numId="1" w16cid:durableId="1309900730">
@@ -3628,6 +5943,9 @@
   </w:num>
   <w:num w:numId="10" w16cid:durableId="819155200">
     <w:abstractNumId w:val="8"/>
+  </w:num>
+  <w:num w:numId="11" w16cid:durableId="60644571">
+    <w:abstractNumId w:val="9"/>
   </w:num>
 </w:numbering>
 </file>
@@ -4234,7 +6552,6 @@
   <w:style w:type="character" w:default="1" w:styleId="DefaultParagraphFont">
     <w:name w:val="Default Paragraph Font"/>
     <w:uiPriority w:val="1"/>
-    <w:semiHidden/>
     <w:unhideWhenUsed/>
   </w:style>
   <w:style w:type="table" w:default="1" w:styleId="TableNormal">

</xml_diff>

<commit_message>
add sfDocumentBuilder code changes.
</commit_message>
<xml_diff>
--- a/Salesforce_Notes.docx
+++ b/Salesforce_Notes.docx
@@ -25,7 +25,23 @@
           <w:b/>
           <w:sz w:val="36"/>
         </w:rPr>
-        <w:t>What is Salesforce and its key features?</w:t>
+        <w:t xml:space="preserve">What </w:t>
+      </w:r>
+      <w:proofErr w:type="gramStart"/>
+      <w:r>
+        <w:rPr>
+          <w:b/>
+          <w:sz w:val="36"/>
+        </w:rPr>
+        <w:t>is</w:t>
+      </w:r>
+      <w:proofErr w:type="gramEnd"/>
+      <w:r>
+        <w:rPr>
+          <w:b/>
+          <w:sz w:val="36"/>
+        </w:rPr>
+        <w:t xml:space="preserve"> Salesforce and its key features?</w:t>
       </w:r>
     </w:p>
     <w:p>
@@ -82,14 +98,26 @@
         <w:pStyle w:val="ListBullet"/>
       </w:pPr>
       <w:r>
-        <w:t xml:space="preserve">It operates on a </w:t>
+        <w:t xml:space="preserve">It operates on </w:t>
+      </w:r>
+      <w:proofErr w:type="gramStart"/>
+      <w:r>
+        <w:t xml:space="preserve">a </w:t>
       </w:r>
       <w:r>
         <w:rPr>
           <w:b/>
           <w:bCs/>
         </w:rPr>
-        <w:t>multi-tenant architecture,</w:t>
+        <w:t>multi</w:t>
+      </w:r>
+      <w:proofErr w:type="gramEnd"/>
+      <w:r>
+        <w:rPr>
+          <w:b/>
+          <w:bCs/>
+        </w:rPr>
+        <w:t>-tenant architecture,</w:t>
       </w:r>
       <w:r>
         <w:t xml:space="preserve"> providing high scalability, security, and frequent automated updates.</w:t>
@@ -294,9 +322,11 @@
         </w:tabs>
         <w:ind w:left="720"/>
       </w:pPr>
+      <w:proofErr w:type="spellStart"/>
       <w:r>
         <w:t>Soql</w:t>
       </w:r>
+      <w:proofErr w:type="spellEnd"/>
     </w:p>
     <w:p>
       <w:pPr>
@@ -319,7 +349,15 @@
         <w:pStyle w:val="ListBullet"/>
       </w:pPr>
       <w:r>
-        <w:t>Ensure all Apex code is 'Bulkified' to handle multiple records simultaneously.</w:t>
+        <w:t>Ensure all Apex code is '</w:t>
+      </w:r>
+      <w:proofErr w:type="spellStart"/>
+      <w:r>
+        <w:t>Bulkified</w:t>
+      </w:r>
+      <w:proofErr w:type="spellEnd"/>
+      <w:r>
+        <w:t>' to handle multiple records simultaneously.</w:t>
       </w:r>
     </w:p>
     <w:p>
@@ -336,7 +374,15 @@
         <w:pStyle w:val="ListBullet"/>
       </w:pPr>
       <w:r>
-        <w:t>Use the Salesforce Lightning Design System (SLDS) for a consistent user experience.</w:t>
+        <w:t xml:space="preserve">Use the Salesforce Lightning Design System (SLDS) for </w:t>
+      </w:r>
+      <w:proofErr w:type="gramStart"/>
+      <w:r>
+        <w:t>a consistent</w:t>
+      </w:r>
+      <w:proofErr w:type="gramEnd"/>
+      <w:r>
+        <w:t xml:space="preserve"> user experience.</w:t>
       </w:r>
     </w:p>
     <w:p>
@@ -540,8 +586,13 @@
       <w:pPr>
         <w:pStyle w:val="ListBullet"/>
       </w:pPr>
-      <w:r>
-        <w:t>these objects allow users to view and search external data in real-time without duplicating it. They are identified by the '__x' suffix.</w:t>
+      <w:proofErr w:type="gramStart"/>
+      <w:r>
+        <w:t>these</w:t>
+      </w:r>
+      <w:proofErr w:type="gramEnd"/>
+      <w:r>
+        <w:t xml:space="preserve"> objects allow users to view and search external data in real-time without duplicating it. They are identified by the '__x' suffix.</w:t>
       </w:r>
     </w:p>
     <w:p>
@@ -705,8 +756,13 @@
           <w:bCs/>
         </w:rPr>
       </w:pPr>
-      <w:r>
-        <w:t xml:space="preserve">Limitations : </w:t>
+      <w:proofErr w:type="gramStart"/>
+      <w:r>
+        <w:t>Limitations :</w:t>
+      </w:r>
+      <w:proofErr w:type="gramEnd"/>
+      <w:r>
+        <w:t xml:space="preserve"> </w:t>
       </w:r>
       <w:r>
         <w:rPr>
@@ -813,7 +869,15 @@
         <w:ind w:left="720"/>
       </w:pPr>
       <w:r>
-        <w:t>2000 custom object can be created</w:t>
+        <w:t xml:space="preserve">2000 custom </w:t>
+      </w:r>
+      <w:proofErr w:type="gramStart"/>
+      <w:r>
+        <w:t>object</w:t>
+      </w:r>
+      <w:proofErr w:type="gramEnd"/>
+      <w:r>
+        <w:t xml:space="preserve"> can be created</w:t>
       </w:r>
     </w:p>
     <w:p>
@@ -1038,7 +1102,21 @@
         <w:rPr>
           <w:highlight w:val="yellow"/>
         </w:rPr>
-        <w:t xml:space="preserve"> ownership will be present</w:t>
+        <w:t xml:space="preserve"> </w:t>
+      </w:r>
+      <w:proofErr w:type="gramStart"/>
+      <w:r>
+        <w:rPr>
+          <w:highlight w:val="yellow"/>
+        </w:rPr>
+        <w:t>ownership</w:t>
+      </w:r>
+      <w:proofErr w:type="gramEnd"/>
+      <w:r>
+        <w:rPr>
+          <w:highlight w:val="yellow"/>
+        </w:rPr>
+        <w:t xml:space="preserve"> will be present</w:t>
       </w:r>
     </w:p>
     <w:p>
@@ -1083,6 +1161,7 @@
         </w:rPr>
         <w:t>the parent field is required on the child</w:t>
       </w:r>
+      <w:proofErr w:type="gramStart"/>
       <w:r>
         <w:t xml:space="preserve">, </w:t>
       </w:r>
@@ -1092,6 +1171,7 @@
         </w:rPr>
         <w:t>!important</w:t>
       </w:r>
+      <w:proofErr w:type="gramEnd"/>
     </w:p>
     <w:p>
       <w:pPr>
@@ -1102,11 +1182,19 @@
         </w:tabs>
         <w:ind w:left="720"/>
       </w:pPr>
-      <w:r>
-        <w:rPr>
-          <w:highlight w:val="yellow"/>
-        </w:rPr>
-        <w:t>the child's visibility is determined by the parent, and deleting the parent</w:t>
+      <w:proofErr w:type="gramStart"/>
+      <w:r>
+        <w:rPr>
+          <w:highlight w:val="yellow"/>
+        </w:rPr>
+        <w:t>the</w:t>
+      </w:r>
+      <w:proofErr w:type="gramEnd"/>
+      <w:r>
+        <w:rPr>
+          <w:highlight w:val="yellow"/>
+        </w:rPr>
+        <w:t xml:space="preserve"> child's visibility is determined by the parent, and deleting the parent</w:t>
       </w:r>
       <w:r>
         <w:t xml:space="preserve"> </w:t>
@@ -1171,6 +1259,7 @@
       <w:r>
         <w:t xml:space="preserve"> referred </w:t>
       </w:r>
+      <w:proofErr w:type="gramStart"/>
       <w:r>
         <w:rPr>
           <w:highlight w:val="yellow"/>
@@ -1181,7 +1270,14 @@
         <w:rPr>
           <w:highlight w:val="yellow"/>
         </w:rPr>
-        <w:t xml:space="preserve">Junction Object, </w:t>
+        <w:t>Junction</w:t>
+      </w:r>
+      <w:proofErr w:type="gramEnd"/>
+      <w:r>
+        <w:rPr>
+          <w:highlight w:val="yellow"/>
+        </w:rPr>
+        <w:t xml:space="preserve"> Object, </w:t>
       </w:r>
     </w:p>
     <w:p>
@@ -1231,7 +1327,21 @@
         <w:rPr>
           <w:highlight w:val="yellow"/>
         </w:rPr>
-        <w:t>Use Master-Detail only when the child record should not exist without a parent.</w:t>
+        <w:t xml:space="preserve">Use Master-Detail only when the </w:t>
+      </w:r>
+      <w:proofErr w:type="gramStart"/>
+      <w:r>
+        <w:rPr>
+          <w:highlight w:val="yellow"/>
+        </w:rPr>
+        <w:t>child</w:t>
+      </w:r>
+      <w:proofErr w:type="gramEnd"/>
+      <w:r>
+        <w:rPr>
+          <w:highlight w:val="yellow"/>
+        </w:rPr>
+        <w:t xml:space="preserve"> record should not exist without a parent.</w:t>
       </w:r>
     </w:p>
     <w:p>
@@ -1253,7 +1363,15 @@
         <w:pStyle w:val="ListBullet"/>
       </w:pPr>
       <w:r>
-        <w:t>Always provide field descriptions and help text for better maintainability.</w:t>
+        <w:t xml:space="preserve">Always provide field descriptions and </w:t>
+      </w:r>
+      <w:proofErr w:type="gramStart"/>
+      <w:r>
+        <w:t>help</w:t>
+      </w:r>
+      <w:proofErr w:type="gramEnd"/>
+      <w:r>
+        <w:t xml:space="preserve"> text for better maintainability.</w:t>
       </w:r>
     </w:p>
     <w:p>
@@ -1423,7 +1541,21 @@
         <w:rPr>
           <w:highlight w:val="yellow"/>
         </w:rPr>
-        <w:t>They are a fundamental tool for tailoring the user experience within a single object to meet various business requirements.</w:t>
+        <w:t xml:space="preserve">They are a fundamental tool for tailoring the </w:t>
+      </w:r>
+      <w:proofErr w:type="gramStart"/>
+      <w:r>
+        <w:rPr>
+          <w:highlight w:val="yellow"/>
+        </w:rPr>
+        <w:t>user</w:t>
+      </w:r>
+      <w:proofErr w:type="gramEnd"/>
+      <w:r>
+        <w:rPr>
+          <w:highlight w:val="yellow"/>
+        </w:rPr>
+        <w:t xml:space="preserve"> experience within a single object to meet various business requirements.</w:t>
       </w:r>
     </w:p>
     <w:p>
@@ -1617,7 +1749,15 @@
         <w:pStyle w:val="ListBullet"/>
       </w:pPr>
       <w:r>
-        <w:t>In the underlying metadata, Record Types are identified by their DeveloperName or Id. When working with Apex or the REST API, it is essential to reference Record Types dynamically.</w:t>
+        <w:t xml:space="preserve">In the underlying metadata, Record Types are identified by their </w:t>
+      </w:r>
+      <w:proofErr w:type="spellStart"/>
+      <w:r>
+        <w:t>DeveloperName</w:t>
+      </w:r>
+      <w:proofErr w:type="spellEnd"/>
+      <w:r>
+        <w:t xml:space="preserve"> or Id. When working with Apex or the REST API, it is essential to reference Record Types dynamically.</w:t>
       </w:r>
     </w:p>
     <w:p>
@@ -1657,10 +1797,22 @@
           <w:b/>
           <w:bCs/>
         </w:rPr>
-        <w:t>Type values</w:t>
-      </w:r>
-      <w:r>
-        <w:t xml:space="preserve"> :  </w:t>
+        <w:t xml:space="preserve">Type </w:t>
+      </w:r>
+      <w:proofErr w:type="gramStart"/>
+      <w:r>
+        <w:rPr>
+          <w:b/>
+          <w:bCs/>
+        </w:rPr>
+        <w:t>values</w:t>
+      </w:r>
+      <w:r>
+        <w:t xml:space="preserve"> :</w:t>
+      </w:r>
+      <w:proofErr w:type="gramEnd"/>
+      <w:r>
+        <w:t xml:space="preserve">  </w:t>
       </w:r>
     </w:p>
     <w:p>
@@ -1679,7 +1831,21 @@
         <w:rPr>
           <w:highlight w:val="yellow"/>
         </w:rPr>
-        <w:t xml:space="preserve">The Schema.DescribeSObjectResult and </w:t>
+        <w:t xml:space="preserve">The </w:t>
+      </w:r>
+      <w:proofErr w:type="spellStart"/>
+      <w:r>
+        <w:rPr>
+          <w:highlight w:val="yellow"/>
+        </w:rPr>
+        <w:t>Schema.DescribeSObjectResult</w:t>
+      </w:r>
+      <w:proofErr w:type="spellEnd"/>
+      <w:r>
+        <w:rPr>
+          <w:highlight w:val="yellow"/>
+        </w:rPr>
+        <w:t xml:space="preserve"> and </w:t>
       </w:r>
     </w:p>
     <w:p>
@@ -1691,11 +1857,19 @@
         </w:tabs>
         <w:ind w:left="720"/>
       </w:pPr>
-      <w:r>
-        <w:rPr>
-          <w:highlight w:val="yellow"/>
-        </w:rPr>
-        <w:t>Schema.RecordTypeInfo classes in Apex are used to retrieve record type</w:t>
+      <w:proofErr w:type="spellStart"/>
+      <w:r>
+        <w:rPr>
+          <w:highlight w:val="yellow"/>
+        </w:rPr>
+        <w:t>Schema.RecordTypeInfo</w:t>
+      </w:r>
+      <w:proofErr w:type="spellEnd"/>
+      <w:r>
+        <w:rPr>
+          <w:highlight w:val="yellow"/>
+        </w:rPr>
+        <w:t xml:space="preserve"> classes in Apex are used to retrieve record type</w:t>
       </w:r>
       <w:r>
         <w:t xml:space="preserve"> information without hardcoding IDs, ensuring code portability across environments.</w:t>
@@ -1884,7 +2058,15 @@
         <w:pStyle w:val="ListBullet"/>
       </w:pPr>
       <w:r>
-        <w:t>At their basic level, validation rules are comprised of two parts: the error condition formula and the error message. The formula defines the criteria for what constitutes 'bad data'. When this criteria is met (evaluates to true), the error message is triggered. These rules apply to new records as well as updates to existing records.</w:t>
+        <w:t xml:space="preserve">At their basic level, validation rules are comprised of two parts: the error condition formula and the error message. The formula defines the criteria for what constitutes 'bad data'. When </w:t>
+      </w:r>
+      <w:proofErr w:type="gramStart"/>
+      <w:r>
+        <w:t>this criteria</w:t>
+      </w:r>
+      <w:proofErr w:type="gramEnd"/>
+      <w:r>
+        <w:t xml:space="preserve"> is met (evaluates to true), the error message is triggered. These rules apply to new records as well as updates to existing records.</w:t>
       </w:r>
     </w:p>
     <w:p>
@@ -1900,13 +2082,43 @@
         <w:pStyle w:val="ListBullet"/>
       </w:pPr>
       <w:r>
-        <w:t xml:space="preserve">For expert users, validation rules provide powerful functions like ISCHANGED(), </w:t>
-      </w:r>
-      <w:r>
-        <w:rPr>
-          <w:highlight w:val="yellow"/>
-        </w:rPr>
-        <w:t>PRIORVALUE(), and REGEX(). ISCHANGED</w:t>
+        <w:t xml:space="preserve">For expert users, validation rules provide powerful functions like </w:t>
+      </w:r>
+      <w:proofErr w:type="gramStart"/>
+      <w:r>
+        <w:t>ISCHANGED(</w:t>
+      </w:r>
+      <w:proofErr w:type="gramEnd"/>
+      <w:r>
+        <w:t xml:space="preserve">), </w:t>
+      </w:r>
+      <w:proofErr w:type="gramStart"/>
+      <w:r>
+        <w:rPr>
+          <w:highlight w:val="yellow"/>
+        </w:rPr>
+        <w:t>PRIORVALUE(</w:t>
+      </w:r>
+      <w:proofErr w:type="gramEnd"/>
+      <w:r>
+        <w:rPr>
+          <w:highlight w:val="yellow"/>
+        </w:rPr>
+        <w:t xml:space="preserve">), and </w:t>
+      </w:r>
+      <w:proofErr w:type="gramStart"/>
+      <w:r>
+        <w:rPr>
+          <w:highlight w:val="yellow"/>
+        </w:rPr>
+        <w:t>REGEX(</w:t>
+      </w:r>
+      <w:proofErr w:type="gramEnd"/>
+      <w:r>
+        <w:rPr>
+          <w:highlight w:val="yellow"/>
+        </w:rPr>
+        <w:t>). ISCHANGED</w:t>
       </w:r>
       <w:r>
         <w:t xml:space="preserve"> checks if a field value has been modified </w:t>
@@ -1937,7 +2149,23 @@
           <w:color w:val="17365D" w:themeColor="text2" w:themeShade="BF"/>
           <w:highlight w:val="yellow"/>
         </w:rPr>
-        <w:t xml:space="preserve">Validation rules run after system-level validation (like field types and requiredness) </w:t>
+        <w:t xml:space="preserve">Validation rules run after system-level validation (like field types and </w:t>
+      </w:r>
+      <w:proofErr w:type="spellStart"/>
+      <w:r>
+        <w:rPr>
+          <w:color w:val="17365D" w:themeColor="text2" w:themeShade="BF"/>
+          <w:highlight w:val="yellow"/>
+        </w:rPr>
+        <w:t>requiredness</w:t>
+      </w:r>
+      <w:proofErr w:type="spellEnd"/>
+      <w:r>
+        <w:rPr>
+          <w:color w:val="17365D" w:themeColor="text2" w:themeShade="BF"/>
+          <w:highlight w:val="yellow"/>
+        </w:rPr>
+        <w:t xml:space="preserve">) </w:t>
       </w:r>
     </w:p>
     <w:p>
@@ -2004,7 +2232,23 @@
         <w:pStyle w:val="ListBullet"/>
       </w:pPr>
       <w:r>
-        <w:t>Group multiple conditions using AND() and OR() functions to keep the rule logic organized and readable.</w:t>
+        <w:t xml:space="preserve">Group multiple conditions using </w:t>
+      </w:r>
+      <w:proofErr w:type="gramStart"/>
+      <w:r>
+        <w:t>AND(</w:t>
+      </w:r>
+      <w:proofErr w:type="gramEnd"/>
+      <w:r>
+        <w:t xml:space="preserve">) and </w:t>
+      </w:r>
+      <w:proofErr w:type="gramStart"/>
+      <w:r>
+        <w:t>OR(</w:t>
+      </w:r>
+      <w:proofErr w:type="gramEnd"/>
+      <w:r>
+        <w:t>) functions to keep the rule logic organized and readable.</w:t>
       </w:r>
     </w:p>
     <w:p>
@@ -2042,7 +2286,21 @@
         <w:rPr>
           <w:highlight w:val="yellow"/>
         </w:rPr>
-        <w:t>(typically 100 for Enterprise/Unlimited).</w:t>
+        <w:t>(</w:t>
+      </w:r>
+      <w:proofErr w:type="gramStart"/>
+      <w:r>
+        <w:rPr>
+          <w:highlight w:val="yellow"/>
+        </w:rPr>
+        <w:t>typically</w:t>
+      </w:r>
+      <w:proofErr w:type="gramEnd"/>
+      <w:r>
+        <w:rPr>
+          <w:highlight w:val="yellow"/>
+        </w:rPr>
+        <w:t xml:space="preserve"> 100 for Enterprise/Unlimited).</w:t>
       </w:r>
     </w:p>
     <w:p>
@@ -2098,6 +2356,7 @@
           <w:highlight w:val="yellow"/>
         </w:rPr>
       </w:pPr>
+      <w:proofErr w:type="gramStart"/>
       <w:r>
         <w:rPr>
           <w:color w:val="EE0000"/>
@@ -2109,7 +2368,14 @@
         <w:rPr>
           <w:highlight w:val="yellow"/>
         </w:rPr>
-        <w:t xml:space="preserve"> :  </w:t>
+        <w:t xml:space="preserve"> :</w:t>
+      </w:r>
+      <w:proofErr w:type="gramEnd"/>
+      <w:r>
+        <w:rPr>
+          <w:highlight w:val="yellow"/>
+        </w:rPr>
+        <w:t xml:space="preserve">  </w:t>
       </w:r>
     </w:p>
     <w:p>
@@ -2149,8 +2415,17 @@
           <w:color w:val="EE0000"/>
           <w:highlight w:val="yellow"/>
         </w:rPr>
-        <w:t>Validation rules are not triggered by certain automated process</w:t>
-      </w:r>
+        <w:t xml:space="preserve">Validation rules are not triggered by certain automated </w:t>
+      </w:r>
+      <w:proofErr w:type="gramStart"/>
+      <w:r>
+        <w:rPr>
+          <w:color w:val="EE0000"/>
+          <w:highlight w:val="yellow"/>
+        </w:rPr>
+        <w:t>process</w:t>
+      </w:r>
+      <w:proofErr w:type="gramEnd"/>
     </w:p>
     <w:p>
       <w:pPr>
@@ -2184,12 +2459,21 @@
           <w:highlight w:val="yellow"/>
         </w:rPr>
       </w:pPr>
+      <w:proofErr w:type="gramStart"/>
       <w:r>
         <w:rPr>
           <w:color w:val="EE0000"/>
           <w:highlight w:val="yellow"/>
         </w:rPr>
-        <w:t>Mass record updates</w:t>
+        <w:t>Mass record</w:t>
+      </w:r>
+      <w:proofErr w:type="gramEnd"/>
+      <w:r>
+        <w:rPr>
+          <w:color w:val="EE0000"/>
+          <w:highlight w:val="yellow"/>
+        </w:rPr>
+        <w:t xml:space="preserve"> updates</w:t>
       </w:r>
       <w:r>
         <w:rPr>
@@ -2311,7 +2595,15 @@
         <w:ind w:left="720"/>
       </w:pPr>
       <w:r>
-        <w:t xml:space="preserve"> Built-in functions like IF, CASE, and BR() enable complex string and logical manipulation.</w:t>
+        <w:t xml:space="preserve"> Built-in functions like IF, CASE, and </w:t>
+      </w:r>
+      <w:proofErr w:type="gramStart"/>
+      <w:r>
+        <w:t>BR(</w:t>
+      </w:r>
+      <w:proofErr w:type="gramEnd"/>
+      <w:r>
+        <w:t>) enable complex string and logical manipulation.</w:t>
       </w:r>
     </w:p>
     <w:p>
@@ -2544,7 +2836,15 @@
         <w:pStyle w:val="ListBullet"/>
       </w:pPr>
       <w:r>
-        <w:t>Allows developers to define specific criteria so only a subset of child records are included in the calculation; Does not support cross-object formula fields or certain dynamic date functions in filter criteria; Supports 'All records' or 'Records meeting certain criteria' modes.</w:t>
+        <w:t xml:space="preserve">Allows developers to define specific criteria so only a subset of child records </w:t>
+      </w:r>
+      <w:proofErr w:type="gramStart"/>
+      <w:r>
+        <w:t>are</w:t>
+      </w:r>
+      <w:proofErr w:type="gramEnd"/>
+      <w:r>
+        <w:t xml:space="preserve"> included in the calculation; Does not support cross-object formula fields or certain dynamic date functions in filter criteria; Supports 'All records' or 'Records meeting certain criteria' modes.</w:t>
       </w:r>
     </w:p>
     <w:p>
@@ -2559,8 +2859,13 @@
       <w:pPr>
         <w:pStyle w:val="ListBullet"/>
       </w:pPr>
-      <w:r>
-        <w:t>Prefer roll-up summary fields over Apex triggers for simple aggregations to reduce technical debt</w:t>
+      <w:proofErr w:type="gramStart"/>
+      <w:r>
+        <w:t>Prefer</w:t>
+      </w:r>
+      <w:proofErr w:type="gramEnd"/>
+      <w:r>
+        <w:t xml:space="preserve"> roll-up summary fields over Apex triggers for simple aggregations to reduce technical debt</w:t>
       </w:r>
     </w:p>
     <w:p>
@@ -2658,22 +2963,58 @@
         <w:rPr>
           <w:highlight w:val="yellow"/>
         </w:rPr>
-        <w:t>Values are not updated if the calculation involves a formula field that uses dynamic functions like TODAY() or LDAY()</w:t>
-      </w:r>
-    </w:p>
-    <w:p>
-      <w:pPr>
-        <w:pStyle w:val="ListBullet"/>
-        <w:rPr>
-          <w:highlight w:val="yellow"/>
-        </w:rPr>
-      </w:pPr>
-      <w:r>
-        <w:rPr>
-          <w:highlight w:val="yellow"/>
-        </w:rPr>
-        <w:t>The parent record's 'Last Modified Date' is not updated when a roll-up summary field changes</w:t>
-      </w:r>
+        <w:t xml:space="preserve">Values are not updated if the calculation involves a formula field that uses dynamic functions like </w:t>
+      </w:r>
+      <w:proofErr w:type="gramStart"/>
+      <w:r>
+        <w:rPr>
+          <w:highlight w:val="yellow"/>
+        </w:rPr>
+        <w:t>TODAY(</w:t>
+      </w:r>
+      <w:proofErr w:type="gramEnd"/>
+      <w:r>
+        <w:rPr>
+          <w:highlight w:val="yellow"/>
+        </w:rPr>
+        <w:t xml:space="preserve">) or </w:t>
+      </w:r>
+      <w:proofErr w:type="gramStart"/>
+      <w:r>
+        <w:rPr>
+          <w:highlight w:val="yellow"/>
+        </w:rPr>
+        <w:t>LDAY(</w:t>
+      </w:r>
+      <w:proofErr w:type="gramEnd"/>
+      <w:r>
+        <w:rPr>
+          <w:highlight w:val="yellow"/>
+        </w:rPr>
+        <w:t>)</w:t>
+      </w:r>
+    </w:p>
+    <w:p>
+      <w:pPr>
+        <w:pStyle w:val="ListBullet"/>
+        <w:rPr>
+          <w:highlight w:val="yellow"/>
+        </w:rPr>
+      </w:pPr>
+      <w:r>
+        <w:rPr>
+          <w:highlight w:val="yellow"/>
+        </w:rPr>
+        <w:t xml:space="preserve">The parent record's 'Last Modified Date' is not updated when a roll-up summary field </w:t>
+      </w:r>
+      <w:proofErr w:type="gramStart"/>
+      <w:r>
+        <w:rPr>
+          <w:highlight w:val="yellow"/>
+        </w:rPr>
+        <w:t>changes</w:t>
+      </w:r>
+      <w:proofErr w:type="gramEnd"/>
     </w:p>
     <w:p>
       <w:pPr>
@@ -3098,11 +3439,19 @@
       <w:pPr>
         <w:pStyle w:val="ListBullet"/>
       </w:pPr>
-      <w:r>
-        <w:rPr>
-          <w:highlight w:val="yellow"/>
-        </w:rPr>
-        <w:t xml:space="preserve">it overrides Object-level </w:t>
+      <w:proofErr w:type="gramStart"/>
+      <w:r>
+        <w:rPr>
+          <w:highlight w:val="yellow"/>
+        </w:rPr>
+        <w:t>it</w:t>
+      </w:r>
+      <w:proofErr w:type="gramEnd"/>
+      <w:r>
+        <w:rPr>
+          <w:highlight w:val="yellow"/>
+        </w:rPr>
+        <w:t xml:space="preserve"> overrides Object-level </w:t>
       </w:r>
       <w:r>
         <w:rPr>
@@ -3127,10 +3476,23 @@
         <w:rPr>
           <w:highlight w:val="yellow"/>
         </w:rPr>
-        <w:t>Hidden fields are not visible in reports, search results, or related lists.</w:t>
-      </w:r>
-      <w:r>
-        <w:t>Applied to both standard fields and custom fields (__c).</w:t>
+        <w:t xml:space="preserve">Hidden fields are not visible in reports, search results, or related </w:t>
+      </w:r>
+      <w:proofErr w:type="spellStart"/>
+      <w:proofErr w:type="gramStart"/>
+      <w:r>
+        <w:rPr>
+          <w:highlight w:val="yellow"/>
+        </w:rPr>
+        <w:t>lists.</w:t>
+      </w:r>
+      <w:r>
+        <w:t>Applied</w:t>
+      </w:r>
+      <w:proofErr w:type="spellEnd"/>
+      <w:proofErr w:type="gramEnd"/>
+      <w:r>
+        <w:t xml:space="preserve"> to both standard fields and custom fields (__c).</w:t>
       </w:r>
     </w:p>
     <w:p>
@@ -3213,10 +3575,18 @@
         <w:ind w:left="720"/>
       </w:pPr>
       <w:r>
-        <w:t xml:space="preserve">Role Hierarchy </w:t>
-      </w:r>
-      <w:r>
-        <w:t xml:space="preserve">: </w:t>
+        <w:t xml:space="preserve">Role </w:t>
+      </w:r>
+      <w:proofErr w:type="gramStart"/>
+      <w:r>
+        <w:t xml:space="preserve">Hierarchy </w:t>
+      </w:r>
+      <w:r>
+        <w:t>:</w:t>
+      </w:r>
+      <w:proofErr w:type="gramEnd"/>
+      <w:r>
+        <w:t xml:space="preserve"> </w:t>
       </w:r>
       <w:r>
         <w:t>grants access to records owned by subordinates to users higher in the tree.</w:t>
@@ -3233,10 +3603,18 @@
       </w:pPr>
       <w:r>
         <w:lastRenderedPageBreak/>
-        <w:t xml:space="preserve">Sharing Rules </w:t>
-      </w:r>
-      <w:r>
-        <w:t xml:space="preserve">: </w:t>
+        <w:t xml:space="preserve">Sharing </w:t>
+      </w:r>
+      <w:proofErr w:type="gramStart"/>
+      <w:r>
+        <w:t xml:space="preserve">Rules </w:t>
+      </w:r>
+      <w:r>
+        <w:t>:</w:t>
+      </w:r>
+      <w:proofErr w:type="gramEnd"/>
+      <w:r>
+        <w:t xml:space="preserve"> </w:t>
       </w:r>
       <w:r>
         <w:t xml:space="preserve"> </w:t>
@@ -3255,13 +3633,44 @@
         <w:ind w:left="720"/>
       </w:pPr>
       <w:r>
-        <w:t>Manual Sharing</w:t>
+        <w:t xml:space="preserve">Manual </w:t>
+      </w:r>
+      <w:proofErr w:type="gramStart"/>
+      <w:r>
+        <w:t>Sharing</w:t>
       </w:r>
       <w:r>
         <w:t xml:space="preserve"> :</w:t>
       </w:r>
-      <w:r>
-        <w:t xml:space="preserve"> allows record owners to share specific records with individual users or groups.Apex Managed Sharing utilizes the [Object_Name]__</w:t>
+      <w:proofErr w:type="gramEnd"/>
+      <w:r>
+        <w:t xml:space="preserve"> allows record owners to share specific records with individual users or </w:t>
+      </w:r>
+      <w:proofErr w:type="spellStart"/>
+      <w:proofErr w:type="gramStart"/>
+      <w:r>
+        <w:t>groups.Apex</w:t>
+      </w:r>
+      <w:proofErr w:type="spellEnd"/>
+      <w:proofErr w:type="gramEnd"/>
+      <w:r>
+        <w:t xml:space="preserve"> Managed Sharing utilizes the [</w:t>
+      </w:r>
+      <w:proofErr w:type="spellStart"/>
+      <w:r>
+        <w:t>Object_</w:t>
+      </w:r>
+      <w:proofErr w:type="gramStart"/>
+      <w:r>
+        <w:t>Name</w:t>
+      </w:r>
+      <w:proofErr w:type="spellEnd"/>
+      <w:r>
+        <w:t>]_</w:t>
+      </w:r>
+      <w:proofErr w:type="gramEnd"/>
+      <w:r>
+        <w:t>_</w:t>
       </w:r>
     </w:p>
     <w:p>
@@ -3290,7 +3699,15 @@
         <w:pStyle w:val="ListBullet"/>
       </w:pPr>
       <w:r>
-        <w:t>Implement the Principle of Least Privilege (PoLP) by default.</w:t>
+        <w:t>Implement the Principle of Least Privilege (</w:t>
+      </w:r>
+      <w:proofErr w:type="spellStart"/>
+      <w:r>
+        <w:t>PoLP</w:t>
+      </w:r>
+      <w:proofErr w:type="spellEnd"/>
+      <w:r>
+        <w:t>) by default.</w:t>
       </w:r>
     </w:p>
     <w:p>
@@ -3404,7 +3821,15 @@
         <w:pStyle w:val="ListBullet"/>
       </w:pPr>
       <w:r>
-        <w:t>Manual sharing is not supported for all standard objects in certain configurations.</w:t>
+        <w:t xml:space="preserve">Manual sharing is not supported </w:t>
+      </w:r>
+      <w:proofErr w:type="gramStart"/>
+      <w:r>
+        <w:t>for</w:t>
+      </w:r>
+      <w:proofErr w:type="gramEnd"/>
+      <w:r>
+        <w:t xml:space="preserve"> all standard objects in certain configurations.</w:t>
       </w:r>
     </w:p>
     <w:p>
@@ -3438,7 +3863,79 @@
               <w:jc w:val="center"/>
             </w:pPr>
             <w:r>
-              <w:t>[Access Request]  ➔  (1. ORG LEVEL: IP/MFA/Hours)  ➔  (2. OBJECT LEVEL: Profile/PermSet CRED)  ➔  (3. FIELD LEVEL: FLS)  ➔  (4. RECORD LEVEL: OWD  ➔  Hierarchy  ➔  Sharing Rules  ➔  Manual Sharing)  ➔  [Data Access Granted]</w:t>
+              <w:t xml:space="preserve">[Access </w:t>
+            </w:r>
+            <w:proofErr w:type="gramStart"/>
+            <w:r>
+              <w:t>Request]  ➔</w:t>
+            </w:r>
+            <w:proofErr w:type="gramEnd"/>
+            <w:r>
+              <w:t xml:space="preserve">  (1. ORG LEVEL: IP/MFA/</w:t>
+            </w:r>
+            <w:proofErr w:type="gramStart"/>
+            <w:r>
+              <w:t>Hours)  ➔</w:t>
+            </w:r>
+            <w:proofErr w:type="gramEnd"/>
+            <w:r>
+              <w:t xml:space="preserve">  (2. OBJECT LEVEL: Profile/</w:t>
+            </w:r>
+            <w:proofErr w:type="spellStart"/>
+            <w:r>
+              <w:t>PermSet</w:t>
+            </w:r>
+            <w:proofErr w:type="spellEnd"/>
+            <w:r>
+              <w:t xml:space="preserve"> </w:t>
+            </w:r>
+            <w:proofErr w:type="gramStart"/>
+            <w:r>
+              <w:t>CRED)  ➔</w:t>
+            </w:r>
+            <w:proofErr w:type="gramEnd"/>
+            <w:r>
+              <w:t xml:space="preserve">  (3. FIELD LEVEL: </w:t>
+            </w:r>
+            <w:proofErr w:type="gramStart"/>
+            <w:r>
+              <w:t>FLS)  ➔</w:t>
+            </w:r>
+            <w:proofErr w:type="gramEnd"/>
+            <w:r>
+              <w:t xml:space="preserve">  (4. RECORD LEVEL: </w:t>
+            </w:r>
+            <w:proofErr w:type="gramStart"/>
+            <w:r>
+              <w:t>OWD  ➔</w:t>
+            </w:r>
+            <w:proofErr w:type="gramEnd"/>
+            <w:r>
+              <w:t xml:space="preserve">  </w:t>
+            </w:r>
+            <w:proofErr w:type="gramStart"/>
+            <w:r>
+              <w:t>Hierarchy  ➔</w:t>
+            </w:r>
+            <w:proofErr w:type="gramEnd"/>
+            <w:r>
+              <w:t xml:space="preserve">  Sharing </w:t>
+            </w:r>
+            <w:proofErr w:type="gramStart"/>
+            <w:r>
+              <w:t>Rules  ➔</w:t>
+            </w:r>
+            <w:proofErr w:type="gramEnd"/>
+            <w:r>
+              <w:t xml:space="preserve">  Manual </w:t>
+            </w:r>
+            <w:proofErr w:type="gramStart"/>
+            <w:r>
+              <w:t>Sharing)  ➔</w:t>
+            </w:r>
+            <w:proofErr w:type="gramEnd"/>
+            <w:r>
+              <w:t xml:space="preserve">  [Data Access Granted]</w:t>
             </w:r>
           </w:p>
         </w:tc>
@@ -3523,13 +4020,24 @@
         <w:t>Profiles:</w:t>
       </w:r>
       <w:r>
-        <w:t xml:space="preserve"> Historically the primary container for permissions; now recommended to be used as a 'Minimum Access' baseline.Permission Sets: The modern architect's tool for additive permissions, enabling granular OLS/FLS assignments without profile bloat</w:t>
-      </w:r>
-    </w:p>
-    <w:p>
-      <w:pPr>
-        <w:pStyle w:val="ListBullet"/>
-      </w:pPr>
+        <w:t xml:space="preserve"> Historically the primary container for permissions; now recommended to be used as a 'Minimum Access' </w:t>
+      </w:r>
+      <w:proofErr w:type="spellStart"/>
+      <w:proofErr w:type="gramStart"/>
+      <w:r>
+        <w:t>baseline.Permission</w:t>
+      </w:r>
+      <w:proofErr w:type="spellEnd"/>
+      <w:proofErr w:type="gramEnd"/>
+      <w:r>
+        <w:t xml:space="preserve"> Sets: The modern architect's tool for additive permissions, enabling granular OLS/FLS assignments without profile bloat</w:t>
+      </w:r>
+    </w:p>
+    <w:p>
+      <w:pPr>
+        <w:pStyle w:val="ListBullet"/>
+      </w:pPr>
+      <w:proofErr w:type="gramStart"/>
       <w:r>
         <w:t>.</w:t>
       </w:r>
@@ -3537,7 +4045,14 @@
         <w:rPr>
           <w:highlight w:val="yellow"/>
         </w:rPr>
-        <w:t>Permission Set Groups (PSG):</w:t>
+        <w:t>Permission</w:t>
+      </w:r>
+      <w:proofErr w:type="gramEnd"/>
+      <w:r>
+        <w:rPr>
+          <w:highlight w:val="yellow"/>
+        </w:rPr>
+        <w:t xml:space="preserve"> Set Groups (PSG):</w:t>
       </w:r>
       <w:r>
         <w:t xml:space="preserve"> Logical bundles of Permission Sets representing a functional persona or job role.</w:t>
@@ -3568,7 +4083,44 @@
         <w:t>Metadata API:</w:t>
       </w:r>
       <w:r>
-        <w:t xml:space="preserve"> Permissions are represented as &lt;fieldPermissions&gt; and &lt;objectPermissions&gt; within .profile and .permissionset files.</w:t>
+        <w:t xml:space="preserve"> Permissions are represented as &lt;</w:t>
+      </w:r>
+      <w:proofErr w:type="spellStart"/>
+      <w:r>
+        <w:t>fieldPermissions</w:t>
+      </w:r>
+      <w:proofErr w:type="spellEnd"/>
+      <w:r>
+        <w:t>&gt; and &lt;</w:t>
+      </w:r>
+      <w:proofErr w:type="spellStart"/>
+      <w:r>
+        <w:t>objectPermissions</w:t>
+      </w:r>
+      <w:proofErr w:type="spellEnd"/>
+      <w:r>
+        <w:t xml:space="preserve">&gt; </w:t>
+      </w:r>
+      <w:proofErr w:type="gramStart"/>
+      <w:r>
+        <w:t>within .profile</w:t>
+      </w:r>
+      <w:proofErr w:type="gramEnd"/>
+      <w:r>
+        <w:t xml:space="preserve"> </w:t>
+      </w:r>
+      <w:proofErr w:type="gramStart"/>
+      <w:r>
+        <w:t>and .</w:t>
+      </w:r>
+      <w:proofErr w:type="spellStart"/>
+      <w:r>
+        <w:t>permissionset</w:t>
+      </w:r>
+      <w:proofErr w:type="spellEnd"/>
+      <w:proofErr w:type="gramEnd"/>
+      <w:r>
+        <w:t xml:space="preserve"> files.</w:t>
       </w:r>
     </w:p>
     <w:p>
@@ -3604,7 +4156,15 @@
         <w:t>Field-Level Visibility:</w:t>
       </w:r>
       <w:r>
-        <w:t xml:space="preserve"> Controls if a field is visible (Read) or editable (Edit) on Page Layouts, LWCs, and via API.Schema Methods: </w:t>
+        <w:t xml:space="preserve"> Controls if a field is visible (Read) or editable (Edit) on Page Layouts, LWCs, and via </w:t>
+      </w:r>
+      <w:proofErr w:type="spellStart"/>
+      <w:r>
+        <w:t>API.Schema</w:t>
+      </w:r>
+      <w:proofErr w:type="spellEnd"/>
+      <w:r>
+        <w:t xml:space="preserve"> Methods: </w:t>
       </w:r>
     </w:p>
     <w:p>
@@ -3620,7 +4180,23 @@
         <w:rPr>
           <w:highlight w:val="yellow"/>
         </w:rPr>
-        <w:t>Apex developers must use Schema.SObjectType.Account.isAccessible() or similar methods to manually verify permissions in legacy code</w:t>
+        <w:t xml:space="preserve">Apex developers must use </w:t>
+      </w:r>
+      <w:proofErr w:type="spellStart"/>
+      <w:proofErr w:type="gramStart"/>
+      <w:r>
+        <w:rPr>
+          <w:highlight w:val="yellow"/>
+        </w:rPr>
+        <w:t>Schema.SObjectType.Account.isAccessible</w:t>
+      </w:r>
+      <w:proofErr w:type="spellEnd"/>
+      <w:proofErr w:type="gramEnd"/>
+      <w:r>
+        <w:rPr>
+          <w:highlight w:val="yellow"/>
+        </w:rPr>
+        <w:t>() or similar methods to manually verify permissions in legacy code</w:t>
       </w:r>
     </w:p>
     <w:p>
@@ -3632,6 +4208,7 @@
         </w:tabs>
         <w:ind w:left="720"/>
       </w:pPr>
+      <w:proofErr w:type="gramStart"/>
       <w:r>
         <w:rPr>
           <w:highlight w:val="yellow"/>
@@ -3639,7 +4216,11 @@
         <w:t>.</w:t>
       </w:r>
       <w:r>
-        <w:t xml:space="preserve">User Mode Operations: Utilizing </w:t>
+        <w:t>User</w:t>
+      </w:r>
+      <w:proofErr w:type="gramEnd"/>
+      <w:r>
+        <w:t xml:space="preserve"> Mode Operations: Utilizing </w:t>
       </w:r>
       <w:r>
         <w:rPr>
@@ -3648,7 +4229,25 @@
         <w:t>'WITH USER_MODE'</w:t>
       </w:r>
       <w:r>
-        <w:t xml:space="preserve"> in SOQL and DML to automatically enforce OLS/FLS at runtime.Security.stripInaccessible(): A robust Apex method to strip fields from sObject lists that the current user context cannot access.</w:t>
+        <w:t xml:space="preserve"> in SOQL and DML to automatically enforce OLS/FLS at </w:t>
+      </w:r>
+      <w:proofErr w:type="spellStart"/>
+      <w:proofErr w:type="gramStart"/>
+      <w:r>
+        <w:t>runtime.Security.stripInaccessible</w:t>
+      </w:r>
+      <w:proofErr w:type="spellEnd"/>
+      <w:proofErr w:type="gramEnd"/>
+      <w:r>
+        <w:t xml:space="preserve">(): A robust Apex method to strip fields from </w:t>
+      </w:r>
+      <w:proofErr w:type="spellStart"/>
+      <w:r>
+        <w:t>sObject</w:t>
+      </w:r>
+      <w:proofErr w:type="spellEnd"/>
+      <w:r>
+        <w:t xml:space="preserve"> lists that the current user context cannot access.</w:t>
       </w:r>
     </w:p>
     <w:p>
@@ -3664,7 +4263,15 @@
         <w:pStyle w:val="ListBullet"/>
       </w:pPr>
       <w:r>
-        <w:t>System vs. User Context: Standard Apex runs in System Mode (ignoring OLS/FLS) unless specified; Lightning Web Components (LWC) and Flow generally respect FLS/OLS.Relationship Impact: Master-Detail relationships require specific OLS on the Master to affect the Detail, though Detail records inherit sharing from Master.</w:t>
+        <w:t>System vs. User Context: Standard Apex runs in System Mode (ignoring OLS/FLS) unless specified; Lightning Web Components (LWC) and Flow generally respect FLS/</w:t>
+      </w:r>
+      <w:proofErr w:type="spellStart"/>
+      <w:r>
+        <w:t>OLS.Relationship</w:t>
+      </w:r>
+      <w:proofErr w:type="spellEnd"/>
+      <w:r>
+        <w:t xml:space="preserve"> Impact: Master-Detail relationships require specific OLS on the Master to affect the Detail, though Detail records inherit sharing from Master.</w:t>
       </w:r>
     </w:p>
     <w:p>
@@ -3680,7 +4287,25 @@
         <w:pStyle w:val="ListBullet"/>
       </w:pPr>
       <w:r>
-        <w:t>Encrypted Fields: FLS interacts with the 'View Encrypted Data' permission to control visibility of Classic and Shield Platform Encryption fields.Package Security: Managed packages may include protected custom settings or metadata that bypass standard OLS/FLS unless explicitly checked.</w:t>
+        <w:t xml:space="preserve">Encrypted Fields: FLS interacts with the 'View Encrypted Data' permission to control visibility of Classic and Shield Platform Encryption </w:t>
+      </w:r>
+      <w:proofErr w:type="spellStart"/>
+      <w:proofErr w:type="gramStart"/>
+      <w:r>
+        <w:t>fields.Package</w:t>
+      </w:r>
+      <w:proofErr w:type="spellEnd"/>
+      <w:proofErr w:type="gramEnd"/>
+      <w:r>
+        <w:t xml:space="preserve"> Security: Managed packages may include protected custom settings or metadata that </w:t>
+      </w:r>
+      <w:proofErr w:type="gramStart"/>
+      <w:r>
+        <w:t>bypass</w:t>
+      </w:r>
+      <w:proofErr w:type="gramEnd"/>
+      <w:r>
+        <w:t xml:space="preserve"> standard OLS/FLS unless explicitly checked.</w:t>
       </w:r>
     </w:p>
     <w:p>
@@ -3797,7 +4422,35 @@
         <w:rPr>
           <w:highlight w:val="yellow"/>
         </w:rPr>
-        <w:t>FLS cannot be set on specific system fields like Id, CreatedDate, or LastModifiedDate.</w:t>
+        <w:t xml:space="preserve">FLS cannot be set on specific system fields like Id, </w:t>
+      </w:r>
+      <w:proofErr w:type="spellStart"/>
+      <w:r>
+        <w:rPr>
+          <w:highlight w:val="yellow"/>
+        </w:rPr>
+        <w:t>CreatedDate</w:t>
+      </w:r>
+      <w:proofErr w:type="spellEnd"/>
+      <w:r>
+        <w:rPr>
+          <w:highlight w:val="yellow"/>
+        </w:rPr>
+        <w:t xml:space="preserve">, or </w:t>
+      </w:r>
+      <w:proofErr w:type="spellStart"/>
+      <w:r>
+        <w:rPr>
+          <w:highlight w:val="yellow"/>
+        </w:rPr>
+        <w:t>LastModifiedDate</w:t>
+      </w:r>
+      <w:proofErr w:type="spellEnd"/>
+      <w:r>
+        <w:rPr>
+          <w:highlight w:val="yellow"/>
+        </w:rPr>
+        <w:t>.</w:t>
       </w:r>
     </w:p>
     <w:p>
@@ -3847,7 +4500,63 @@
               <w:jc w:val="center"/>
             </w:pPr>
             <w:r>
-              <w:t>Identity Verification  ➔  Profile (Base)  ➔  Permission Set (Additive)  ➔  Permission Set Group (Persona Bundle)  ➔  Object Level Security (CRUD Checks)  ➔  Field Level Security (Read/Write Checks)  ➔  Record Level Sharing (Owner/Rules/Manual)  ➔  Data Access Granted</w:t>
+              <w:t xml:space="preserve">Identity </w:t>
+            </w:r>
+            <w:proofErr w:type="gramStart"/>
+            <w:r>
+              <w:t>Verification  ➔</w:t>
+            </w:r>
+            <w:proofErr w:type="gramEnd"/>
+            <w:r>
+              <w:t xml:space="preserve">  Profile (</w:t>
+            </w:r>
+            <w:proofErr w:type="gramStart"/>
+            <w:r>
+              <w:t>Base)  ➔</w:t>
+            </w:r>
+            <w:proofErr w:type="gramEnd"/>
+            <w:r>
+              <w:t xml:space="preserve">  Permission Set (</w:t>
+            </w:r>
+            <w:proofErr w:type="gramStart"/>
+            <w:r>
+              <w:t>Additive)  ➔</w:t>
+            </w:r>
+            <w:proofErr w:type="gramEnd"/>
+            <w:r>
+              <w:t xml:space="preserve">  Permission Set Group (Persona </w:t>
+            </w:r>
+            <w:proofErr w:type="gramStart"/>
+            <w:r>
+              <w:t>Bundle)  ➔</w:t>
+            </w:r>
+            <w:proofErr w:type="gramEnd"/>
+            <w:r>
+              <w:t xml:space="preserve">  Object Level Security (CRUD </w:t>
+            </w:r>
+            <w:proofErr w:type="gramStart"/>
+            <w:r>
+              <w:t>Checks)  ➔</w:t>
+            </w:r>
+            <w:proofErr w:type="gramEnd"/>
+            <w:r>
+              <w:t xml:space="preserve">  Field Level Security (Read/Write </w:t>
+            </w:r>
+            <w:proofErr w:type="gramStart"/>
+            <w:r>
+              <w:t>Checks)  ➔</w:t>
+            </w:r>
+            <w:proofErr w:type="gramEnd"/>
+            <w:r>
+              <w:t xml:space="preserve">  Record Level Sharing (Owner/Rules/</w:t>
+            </w:r>
+            <w:proofErr w:type="gramStart"/>
+            <w:r>
+              <w:t>Manual)  ➔</w:t>
+            </w:r>
+            <w:proofErr w:type="gramEnd"/>
+            <w:r>
+              <w:t xml:space="preserve">  Data Access Granted</w:t>
             </w:r>
           </w:p>
         </w:tc>
@@ -4007,7 +4716,15 @@
         <w:pStyle w:val="ListBullet"/>
       </w:pPr>
       <w:r>
-        <w:t xml:space="preserve">Explicit grants are persisted in </w:t>
+        <w:t xml:space="preserve">Explicit grants </w:t>
+      </w:r>
+      <w:proofErr w:type="gramStart"/>
+      <w:r>
+        <w:t>are persisted</w:t>
+      </w:r>
+      <w:proofErr w:type="gramEnd"/>
+      <w:r>
+        <w:t xml:space="preserve"> in </w:t>
       </w:r>
       <w:r>
         <w:rPr>
@@ -4033,7 +4750,23 @@
         <w:pStyle w:val="ListBullet"/>
       </w:pPr>
       <w:r>
-        <w:t>Standard objects use a naming convention like AccountShare or CaseShare, while custom objects use the __Share suffix.</w:t>
+        <w:t xml:space="preserve">Standard objects use a naming convention like </w:t>
+      </w:r>
+      <w:proofErr w:type="spellStart"/>
+      <w:r>
+        <w:t>AccountShare</w:t>
+      </w:r>
+      <w:proofErr w:type="spellEnd"/>
+      <w:r>
+        <w:t xml:space="preserve"> or </w:t>
+      </w:r>
+      <w:proofErr w:type="spellStart"/>
+      <w:r>
+        <w:t>CaseShare</w:t>
+      </w:r>
+      <w:proofErr w:type="spellEnd"/>
+      <w:r>
+        <w:t>, while custom objects use the __Share suffix.</w:t>
       </w:r>
     </w:p>
     <w:p>
@@ -4053,8 +4786,13 @@
         </w:tabs>
         <w:ind w:left="720"/>
       </w:pPr>
-      <w:r>
-        <w:t>ParentId (ID of the record being shared),</w:t>
+      <w:proofErr w:type="spellStart"/>
+      <w:r>
+        <w:t>ParentId</w:t>
+      </w:r>
+      <w:proofErr w:type="spellEnd"/>
+      <w:r>
+        <w:t xml:space="preserve"> (ID of the record being shared),</w:t>
       </w:r>
     </w:p>
     <w:p>
@@ -4066,8 +4804,13 @@
         </w:tabs>
         <w:ind w:left="720"/>
       </w:pPr>
-      <w:r>
-        <w:t>UserOrGroupId (ID of the user, group, or role receiving access), and</w:t>
+      <w:proofErr w:type="spellStart"/>
+      <w:r>
+        <w:t>UserOrGroupId</w:t>
+      </w:r>
+      <w:proofErr w:type="spellEnd"/>
+      <w:r>
+        <w:t xml:space="preserve"> (ID of the user, group, or role receiving access), and</w:t>
       </w:r>
     </w:p>
     <w:p>
@@ -4079,8 +4822,13 @@
         </w:tabs>
         <w:ind w:left="720"/>
       </w:pPr>
-      <w:r>
-        <w:t>AccessLevel (Read, Edit, or All).</w:t>
+      <w:proofErr w:type="spellStart"/>
+      <w:r>
+        <w:t>AccessLevel</w:t>
+      </w:r>
+      <w:proofErr w:type="spellEnd"/>
+      <w:r>
+        <w:t xml:space="preserve"> (Read, Edit, or All).</w:t>
       </w:r>
     </w:p>
     <w:p>
@@ -4093,7 +4841,15 @@
         <w:ind w:left="720"/>
       </w:pPr>
       <w:r>
-        <w:t xml:space="preserve">The RowCause field is critical for identifying </w:t>
+        <w:t xml:space="preserve">The </w:t>
+      </w:r>
+      <w:proofErr w:type="spellStart"/>
+      <w:r>
+        <w:t>RowCause</w:t>
+      </w:r>
+      <w:proofErr w:type="spellEnd"/>
+      <w:r>
+        <w:t xml:space="preserve"> field is critical for identifying </w:t>
       </w:r>
     </w:p>
     <w:p>
@@ -4105,8 +4861,29 @@
         </w:tabs>
         <w:ind w:left="1080"/>
       </w:pPr>
-      <w:r>
-        <w:t>why a grant exists, distinguishing between Manual, Owner, Rule, and custom Apex sharing reasons.</w:t>
+      <w:proofErr w:type="gramStart"/>
+      <w:r>
+        <w:t>why</w:t>
+      </w:r>
+      <w:proofErr w:type="gramEnd"/>
+      <w:r>
+        <w:t xml:space="preserve"> </w:t>
+      </w:r>
+      <w:proofErr w:type="gramStart"/>
+      <w:r>
+        <w:t>a grant</w:t>
+      </w:r>
+      <w:proofErr w:type="gramEnd"/>
+      <w:r>
+        <w:t xml:space="preserve"> exists, </w:t>
+      </w:r>
+      <w:proofErr w:type="gramStart"/>
+      <w:r>
+        <w:t>distinguishing</w:t>
+      </w:r>
+      <w:proofErr w:type="gramEnd"/>
+      <w:r>
+        <w:t xml:space="preserve"> between Manual, Owner, Rule, and custom Apex sharing reasons.</w:t>
       </w:r>
     </w:p>
     <w:p>
@@ -4114,8 +4891,13 @@
         <w:pStyle w:val="Heading2"/>
       </w:pPr>
       <w:r>
-        <w:t>Sharing Rules and Group Maintenance</w:t>
-      </w:r>
+        <w:t xml:space="preserve">Sharing Rules and </w:t>
+      </w:r>
+      <w:proofErr w:type="gramStart"/>
+      <w:r>
+        <w:t>Group Maintenance</w:t>
+      </w:r>
+      <w:proofErr w:type="gramEnd"/>
     </w:p>
     <w:p>
       <w:pPr>
@@ -4152,7 +4934,35 @@
         <w:rPr>
           <w:highlight w:val="yellow"/>
         </w:rPr>
-        <w:t>sharing rules populate the Share table with a RowCause of 'Rule'</w:t>
+        <w:t xml:space="preserve">sharing rules </w:t>
+      </w:r>
+      <w:proofErr w:type="gramStart"/>
+      <w:r>
+        <w:rPr>
+          <w:highlight w:val="yellow"/>
+        </w:rPr>
+        <w:t>populate</w:t>
+      </w:r>
+      <w:proofErr w:type="gramEnd"/>
+      <w:r>
+        <w:rPr>
+          <w:highlight w:val="yellow"/>
+        </w:rPr>
+        <w:t xml:space="preserve"> the Share table with a </w:t>
+      </w:r>
+      <w:proofErr w:type="spellStart"/>
+      <w:r>
+        <w:rPr>
+          <w:highlight w:val="yellow"/>
+        </w:rPr>
+        <w:t>RowCause</w:t>
+      </w:r>
+      <w:proofErr w:type="spellEnd"/>
+      <w:r>
+        <w:rPr>
+          <w:highlight w:val="yellow"/>
+        </w:rPr>
+        <w:t xml:space="preserve"> of 'Rule'</w:t>
       </w:r>
       <w:r>
         <w:t>.</w:t>
@@ -4191,7 +5001,21 @@
         <w:rPr>
           <w:highlight w:val="yellow"/>
         </w:rPr>
-        <w:t>Only custom objects support 'Custom Sharing Reasons' (RowCause),</w:t>
+        <w:t>Only custom objects support 'Custom Sharing Reasons' (</w:t>
+      </w:r>
+      <w:proofErr w:type="spellStart"/>
+      <w:r>
+        <w:rPr>
+          <w:highlight w:val="yellow"/>
+        </w:rPr>
+        <w:t>RowCause</w:t>
+      </w:r>
+      <w:proofErr w:type="spellEnd"/>
+      <w:r>
+        <w:rPr>
+          <w:highlight w:val="yellow"/>
+        </w:rPr>
+        <w:t>),</w:t>
       </w:r>
       <w:r>
         <w:t xml:space="preserve"> which ensure that the share record is not deleted when the record owner changes.</w:t>
@@ -4212,11 +5036,33 @@
       <w:pPr>
         <w:pStyle w:val="ListBullet"/>
       </w:pPr>
-      <w:r>
-        <w:rPr>
-          <w:highlight w:val="yellow"/>
-        </w:rPr>
-        <w:t xml:space="preserve">.For standard objects, programmatic sharing must use the 'Manual' RowCause, </w:t>
+      <w:proofErr w:type="gramStart"/>
+      <w:r>
+        <w:rPr>
+          <w:highlight w:val="yellow"/>
+        </w:rPr>
+        <w:t>.For</w:t>
+      </w:r>
+      <w:proofErr w:type="gramEnd"/>
+      <w:r>
+        <w:rPr>
+          <w:highlight w:val="yellow"/>
+        </w:rPr>
+        <w:t xml:space="preserve"> standard objects, programmatic sharing must use the 'Manual' </w:t>
+      </w:r>
+      <w:proofErr w:type="spellStart"/>
+      <w:r>
+        <w:rPr>
+          <w:highlight w:val="yellow"/>
+        </w:rPr>
+        <w:t>RowCause</w:t>
+      </w:r>
+      <w:proofErr w:type="spellEnd"/>
+      <w:r>
+        <w:rPr>
+          <w:highlight w:val="yellow"/>
+        </w:rPr>
+        <w:t xml:space="preserve">, </w:t>
       </w:r>
     </w:p>
     <w:p>
@@ -4251,7 +5097,17 @@
         <w:pStyle w:val="ListBullet"/>
       </w:pPr>
       <w:r>
-        <w:t xml:space="preserve">Excessive explicit grants can lead to 'Share Table Bloat', significantly slowing down SOQL queries and DML operations.To optimize performance, </w:t>
+        <w:t xml:space="preserve">Excessive explicit grants can lead to 'Share Table Bloat', significantly slowing down SOQL queries and DML </w:t>
+      </w:r>
+      <w:proofErr w:type="spellStart"/>
+      <w:proofErr w:type="gramStart"/>
+      <w:r>
+        <w:t>operations.To</w:t>
+      </w:r>
+      <w:proofErr w:type="spellEnd"/>
+      <w:proofErr w:type="gramEnd"/>
+      <w:r>
+        <w:t xml:space="preserve"> optimize performance, </w:t>
       </w:r>
     </w:p>
     <w:p>
@@ -4312,7 +5168,15 @@
         <w:pStyle w:val="ListBullet"/>
       </w:pPr>
       <w:r>
-        <w:t>Favor Public Groups over individual User IDs in UserOrGroupId to minimize Share table rows.</w:t>
+        <w:t xml:space="preserve">Favor Public Groups over individual User IDs in </w:t>
+      </w:r>
+      <w:proofErr w:type="spellStart"/>
+      <w:r>
+        <w:t>UserOrGroupId</w:t>
+      </w:r>
+      <w:proofErr w:type="spellEnd"/>
+      <w:r>
+        <w:t xml:space="preserve"> to minimize Share table rows.</w:t>
       </w:r>
     </w:p>
     <w:p>
@@ -4383,7 +5247,21 @@
         <w:rPr>
           <w:highlight w:val="yellow"/>
         </w:rPr>
-        <w:t>Explicit grants (Manual Sharing) are automatically removed when a record owner changes, unless using Apex Managed Sharing with custom RowCauses.</w:t>
+        <w:t xml:space="preserve">Explicit grants (Manual Sharing) are automatically removed when a record owner changes, unless using Apex Managed Sharing with custom </w:t>
+      </w:r>
+      <w:proofErr w:type="spellStart"/>
+      <w:r>
+        <w:rPr>
+          <w:highlight w:val="yellow"/>
+        </w:rPr>
+        <w:t>RowCauses</w:t>
+      </w:r>
+      <w:proofErr w:type="spellEnd"/>
+      <w:r>
+        <w:rPr>
+          <w:highlight w:val="yellow"/>
+        </w:rPr>
+        <w:t>.</w:t>
       </w:r>
     </w:p>
     <w:p>
@@ -4425,7 +5303,21 @@
         <w:rPr>
           <w:highlight w:val="yellow"/>
         </w:rPr>
-        <w:t>The maximum number of explicit grants can impact the 'Group Maintenance' table and performance of the 'Sharing Table'.</w:t>
+        <w:t xml:space="preserve">The maximum number of explicit grants can </w:t>
+      </w:r>
+      <w:proofErr w:type="gramStart"/>
+      <w:r>
+        <w:rPr>
+          <w:highlight w:val="yellow"/>
+        </w:rPr>
+        <w:t>impact</w:t>
+      </w:r>
+      <w:proofErr w:type="gramEnd"/>
+      <w:r>
+        <w:rPr>
+          <w:highlight w:val="yellow"/>
+        </w:rPr>
+        <w:t xml:space="preserve"> the 'Group Maintenance' table and performance of the 'Sharing Table'.</w:t>
       </w:r>
     </w:p>
     <w:p>
@@ -4460,7 +5352,92 @@
               <w:jc w:val="center"/>
             </w:pPr>
             <w:r>
-              <w:t>Access Request  ➔  [Evaluate OWD: Private/Read-Only?]  ➔  [Trigger: Manual/Rule/Apex]  ➔  [Create Record in __Share Table]  ➔  [Set ParentId/UserOrGroupId/AccessLevel/RowCause]  ➔  [Salesforce Sharing Engine Process]  ➔  [Update Group Maintenance Table]  ➔  [Result: Record Visible to Grantee]</w:t>
+              <w:t xml:space="preserve">Access </w:t>
+            </w:r>
+            <w:proofErr w:type="gramStart"/>
+            <w:r>
+              <w:t>Request  ➔</w:t>
+            </w:r>
+            <w:proofErr w:type="gramEnd"/>
+            <w:r>
+              <w:t xml:space="preserve">  [Evaluate OWD: Private/Read-Only?]  </w:t>
+            </w:r>
+            <w:proofErr w:type="gramStart"/>
+            <w:r>
+              <w:t>➔  [</w:t>
+            </w:r>
+            <w:proofErr w:type="gramEnd"/>
+            <w:r>
+              <w:t>Trigger: Manual/Rule/</w:t>
+            </w:r>
+            <w:proofErr w:type="gramStart"/>
+            <w:r>
+              <w:t>Apex]  ➔</w:t>
+            </w:r>
+            <w:proofErr w:type="gramEnd"/>
+            <w:r>
+              <w:t xml:space="preserve">  [Create Record in __Share </w:t>
+            </w:r>
+            <w:proofErr w:type="gramStart"/>
+            <w:r>
+              <w:t>Table]  ➔</w:t>
+            </w:r>
+            <w:proofErr w:type="gramEnd"/>
+            <w:r>
+              <w:t xml:space="preserve">  [Set </w:t>
+            </w:r>
+            <w:proofErr w:type="spellStart"/>
+            <w:r>
+              <w:t>ParentId</w:t>
+            </w:r>
+            <w:proofErr w:type="spellEnd"/>
+            <w:r>
+              <w:t>/</w:t>
+            </w:r>
+            <w:proofErr w:type="spellStart"/>
+            <w:r>
+              <w:t>UserOrGroupId</w:t>
+            </w:r>
+            <w:proofErr w:type="spellEnd"/>
+            <w:r>
+              <w:t>/</w:t>
+            </w:r>
+            <w:proofErr w:type="spellStart"/>
+            <w:r>
+              <w:t>AccessLevel</w:t>
+            </w:r>
+            <w:proofErr w:type="spellEnd"/>
+            <w:r>
+              <w:t>/</w:t>
+            </w:r>
+            <w:proofErr w:type="spellStart"/>
+            <w:proofErr w:type="gramStart"/>
+            <w:r>
+              <w:t>RowCause</w:t>
+            </w:r>
+            <w:proofErr w:type="spellEnd"/>
+            <w:r>
+              <w:t>]  ➔</w:t>
+            </w:r>
+            <w:proofErr w:type="gramEnd"/>
+            <w:r>
+              <w:t xml:space="preserve">  [Salesforce Sharing Engine </w:t>
+            </w:r>
+            <w:proofErr w:type="gramStart"/>
+            <w:r>
+              <w:t>Process]  ➔</w:t>
+            </w:r>
+            <w:proofErr w:type="gramEnd"/>
+            <w:r>
+              <w:t xml:space="preserve">  [Update Group Maintenance </w:t>
+            </w:r>
+            <w:proofErr w:type="gramStart"/>
+            <w:r>
+              <w:t>Table]  ➔</w:t>
+            </w:r>
+            <w:proofErr w:type="gramEnd"/>
+            <w:r>
+              <w:t xml:space="preserve">  [Result: Record Visible to Grantee]</w:t>
             </w:r>
           </w:p>
         </w:tc>
@@ -5296,7 +6273,25 @@
           <w:bCs/>
           <w:lang w:val="en-IN"/>
         </w:rPr>
-        <w:t>3 Key Takeaways From This Table:</w:t>
+        <w:t xml:space="preserve">3 Key Takeaways </w:t>
+      </w:r>
+      <w:proofErr w:type="gramStart"/>
+      <w:r>
+        <w:rPr>
+          <w:b/>
+          <w:bCs/>
+          <w:lang w:val="en-IN"/>
+        </w:rPr>
+        <w:t>From</w:t>
+      </w:r>
+      <w:proofErr w:type="gramEnd"/>
+      <w:r>
+        <w:rPr>
+          <w:b/>
+          <w:bCs/>
+          <w:lang w:val="en-IN"/>
+        </w:rPr>
+        <w:t xml:space="preserve"> This Table:</w:t>
       </w:r>
     </w:p>
     <w:p>
@@ -5386,208 +6381,51 @@
         <w:rPr>
           <w:lang w:val="en-IN"/>
         </w:rPr>
-        <w:t xml:space="preserve"> This behavior is active by default for standard objects. For custom objects, it works exactly like this table as long as the "Grant Access Using Hierarchies" checkbox remains checked on the object settings.</w:t>
+        <w:t xml:space="preserve"> This </w:t>
+      </w:r>
+      <w:proofErr w:type="spellStart"/>
+      <w:r>
+        <w:rPr>
+          <w:lang w:val="en-IN"/>
+        </w:rPr>
+        <w:t>behavior</w:t>
+      </w:r>
+      <w:proofErr w:type="spellEnd"/>
+      <w:r>
+        <w:rPr>
+          <w:lang w:val="en-IN"/>
+        </w:rPr>
+        <w:t xml:space="preserve"> is active by default for standard objects. For custom objects, it works exactly like this table </w:t>
+      </w:r>
+      <w:proofErr w:type="gramStart"/>
+      <w:r>
+        <w:rPr>
+          <w:lang w:val="en-IN"/>
+        </w:rPr>
+        <w:t>as long as</w:t>
+      </w:r>
+      <w:proofErr w:type="gramEnd"/>
+      <w:r>
+        <w:rPr>
+          <w:lang w:val="en-IN"/>
+        </w:rPr>
+        <w:t xml:space="preserve"> the "Grant Access Using Hierarchies" checkbox remains checked on the object settings.</w:t>
       </w:r>
     </w:p>
     <w:p/>
     <w:p>
       <w:r>
         <w:br/>
-        <w:t>==============================</w:t>
-        <w:br/>
-      </w:r>
-    </w:p>
-    <w:p>
-      <w:pPr>
-        <w:pStyle w:val="Title"/>
-      </w:pPr>
-      <w:r>
-        <w:rPr>
-          <w:b/>
-          <w:sz w:val="36"/>
-        </w:rPr>
-        <w:t>Public Groups</w:t>
-      </w:r>
-    </w:p>
-    <w:p>
-      <w:pPr>
-        <w:pStyle w:val="Heading1"/>
-      </w:pPr>
-      <w:r>
-        <w:t>Summary</w:t>
-      </w:r>
-    </w:p>
-    <w:p>
-      <w:pPr>
-        <w:pStyle w:val="ListBullet"/>
-      </w:pPr>
-      <w:r>
-        <w:t>Public Groups are administrative containers in Salesforce used to group sets of users, roles, and other groups to simplify the management of record sharing, folder access, and permissions. They serve as a foundational element in the Salesforce Sharing Model, enabling efficient data visibility management without individual record-level assignments.</w:t>
-      </w:r>
-    </w:p>
-    <w:p>
-      <w:pPr>
-        <w:pStyle w:val="Heading2"/>
-      </w:pPr>
-      <w:r>
-        <w:t>Core Architecture and Data Model</w:t>
-      </w:r>
-    </w:p>
-    <w:p>
-      <w:pPr>
-        <w:pStyle w:val="ListBullet"/>
-      </w:pPr>
-      <w:r>
-        <w:t>Represented by the Group object in the SOAP API with Type='Regular'.GroupMember junction object links users, roles, or other groups to a specific Group.Supports nested structures where Groups can contain other Groups, facilitating inheritance of permissions.Does not grant permissions directly via Profiles or Permission Sets; instead, controls record-level visibility and folder access.Group IDs are prefixed with '00G' and are unique across the organization.</w:t>
-      </w:r>
-    </w:p>
-    <w:p>
-      <w:pPr>
-        <w:pStyle w:val="Heading2"/>
-      </w:pPr>
-      <w:r>
-        <w:t>Sharing and Visibility Mechanisms</w:t>
-      </w:r>
-    </w:p>
-    <w:p>
-      <w:pPr>
-        <w:pStyle w:val="ListBullet"/>
-      </w:pPr>
-      <w:r>
-        <w:t>Used as targets in Criteria-Based Sharing Rules and Owner-Based Sharing Rules.Facilitates Manual Sharing by allowing users to share records with a defined group of people at once.Controls access to Report and Dashboard folders, as well as Document and Library folders.Enables Apex Managed Sharing by using the Group ID in the UserOrGroupId field of Share objects (e.g., AccountShare, CustomObject__Share).Used in List View visibility settings to restrict access to specific subsets of users.</w:t>
-      </w:r>
-    </w:p>
-    <w:p>
-      <w:pPr>
-        <w:pStyle w:val="Heading2"/>
-      </w:pPr>
-      <w:r>
-        <w:t>Performance and Scalability Considerations</w:t>
-      </w:r>
-    </w:p>
-    <w:p>
-      <w:pPr>
-        <w:pStyle w:val="ListBullet"/>
-      </w:pPr>
-      <w:r>
-        <w:t>Group Membership changes trigger asynchronous Sharing Recalculation which can impact system performance in large data volumes (LDV).Avoid 'Granular Locking' issues by managing GroupMembership via the 'Defer Sharing Calculation' feature during bulk data loads.Deep nesting of groups (groups within groups within groups) can increase the complexity of the 'Group Maintenance Table' and slow down access checks.The Salesforce Sharing Engine calculates a flattened version of group membership to determine record access at runtime.</w:t>
-      </w:r>
-    </w:p>
-    <w:p>
-      <w:pPr>
-        <w:pStyle w:val="Heading2"/>
-      </w:pPr>
-      <w:r>
-        <w:t>Governance and Security Implications</w:t>
-      </w:r>
-    </w:p>
-    <w:p>
-      <w:pPr>
-        <w:pStyle w:val="ListBullet"/>
-      </w:pPr>
-      <w:r>
-        <w:t>Groups do not bypass the 'Grant Access Using Hierarchies' setting; if enabled, managers still see records shared with subordinates in a group.Public Groups can include 'Roles', 'Roles and Subordinates', or 'Roles and Internal Subordinates' to dynamically include users based on the hierarchy.Changes to Public Group membership are captured in the Setup Audit Trail for compliance monitoring.Unlike Queues, Public Groups cannot own records; they only provide access to them.</w:t>
-      </w:r>
-    </w:p>
-    <w:p>
-      <w:pPr>
-        <w:pStyle w:val="Heading3"/>
-      </w:pPr>
-      <w:r>
-        <w:t>Best Practices</w:t>
-      </w:r>
-    </w:p>
-    <w:p>
-      <w:pPr>
-        <w:pStyle w:val="ListBullet"/>
-      </w:pPr>
-      <w:r>
-        <w:t>Prefer Public Groups over individual User assignments in Sharing Rules to reduce administrative overhead and technical debt.</w:t>
-      </w:r>
-    </w:p>
-    <w:p>
-      <w:pPr>
-        <w:pStyle w:val="ListBullet"/>
-      </w:pPr>
-      <w:r>
-        <w:t>Use descriptive naming conventions that indicate the purpose of the group (e.g., 'PG_Sales_North_America_Read_Only').</w:t>
-      </w:r>
-    </w:p>
-    <w:p>
-      <w:pPr>
-        <w:pStyle w:val="ListBullet"/>
-      </w:pPr>
-      <w:r>
-        <w:t>Limit the depth of nested groups to 5 levels to maintain optimal sharing performance.</w:t>
-      </w:r>
-    </w:p>
-    <w:p>
-      <w:pPr>
-        <w:pStyle w:val="ListBullet"/>
-      </w:pPr>
-      <w:r>
-        <w:t>Utilize 'Roles and Internal Subordinates' to exclude Community/Portal users from internal record sharing visibility.</w:t>
-      </w:r>
-    </w:p>
-    <w:p>
-      <w:pPr>
-        <w:pStyle w:val="ListBullet"/>
-      </w:pPr>
-      <w:r>
-        <w:t>Audit group memberships quarterly using SOQL on the GroupMember object to ensure compliance with the Principle of Least Privilege.</w:t>
-      </w:r>
-    </w:p>
-    <w:p>
-      <w:pPr>
-        <w:pStyle w:val="Heading3"/>
-      </w:pPr>
-      <w:r>
-        <w:t>Limitations</w:t>
-      </w:r>
-    </w:p>
-    <w:p>
-      <w:pPr>
-        <w:pStyle w:val="ListBullet"/>
-      </w:pPr>
-      <w:r>
-        <w:t>Maximum number of members in a single group is generally recommended to be under 100,000 for performance stability.</w:t>
-      </w:r>
-    </w:p>
-    <w:p>
-      <w:pPr>
-        <w:pStyle w:val="ListBullet"/>
-      </w:pPr>
-      <w:r>
-        <w:t>Sharing rules using Public Groups may fail if the resulting sharing table exceeds 100 million rows.</w:t>
-      </w:r>
-    </w:p>
-    <w:p>
-      <w:pPr>
-        <w:pStyle w:val="ListBullet"/>
-      </w:pPr>
-      <w:r>
-        <w:t>Groups cannot be used as the 'Owner' of a record; only Users and Queues have ownership capabilities.</w:t>
-      </w:r>
-    </w:p>
-    <w:p>
-      <w:pPr>
-        <w:pStyle w:val="ListBullet"/>
-      </w:pPr>
-      <w:r>
-        <w:t>Dynamic inclusion in groups is limited to Role-based hierarchies; complex attribute-based membership requires custom Apex or Flow automation.</w:t>
-      </w:r>
-    </w:p>
-    <w:p>
-      <w:pPr>
-        <w:pStyle w:val="Heading1"/>
-      </w:pPr>
-      <w:r>
-        <w:t>Data Access Flow</w:t>
+      </w:r>
+    </w:p>
+    <w:p>
+      <w:r>
+        <w:br w:type="page"/>
       </w:r>
     </w:p>
     <w:tbl>
       <w:tblPr>
-        <w:tblStyle w:val="LightGrid-Accent1"/>
+        <w:tblStyle w:val="TableGrid"/>
         <w:tblW w:type="auto" w:w="0"/>
         <w:tblLook w:firstColumn="1" w:firstRow="1" w:lastColumn="0" w:lastRow="0" w:noHBand="0" w:noVBand="1" w:val="04A0"/>
       </w:tblPr>
@@ -5598,26 +6436,805 @@
         <w:tc>
           <w:tcPr>
             <w:tcW w:type="dxa" w:w="8640"/>
+            <w:shd w:val="clear" w:color="auto" w:fill="1F3864"/>
+            <w:tcBorders>
+              <w:top w:val="single" w:sz="4" w:space="0" w:color="1F3864"/>
+              <w:left w:val="single" w:sz="4" w:space="0" w:color="1F3864"/>
+              <w:bottom w:val="single" w:sz="4" w:space="0" w:color="1F3864"/>
+              <w:right w:val="single" w:sz="4" w:space="0" w:color="1F3864"/>
+            </w:tcBorders>
+            <w:tcMar>
+              <w:top w:w="100" w:type="dxa"/>
+              <w:left w:w="100" w:type="dxa"/>
+              <w:bottom w:w="100" w:type="dxa"/>
+              <w:right w:w="100" w:type="dxa"/>
+            </w:tcMar>
           </w:tcPr>
           <w:p>
             <w:pPr>
-              <w:jc w:val="center"/>
+              <w:jc w:val="left"/>
             </w:pPr>
             <w:r>
-              <w:t>[User/Role/Sub-Group]  ➔  [GroupMember Record]  ➔  [Public Group (Group Object)]  ➔  [Sharing Rule / Folder / Apex Share]  ➔  [Record Access / Visibility]</w:t>
+              <w:rPr>
+                <w:rFonts w:ascii="Calibri" w:hAnsi="Calibri"/>
+                <w:b/>
+                <w:color w:val="FFFFFF"/>
+                <w:sz w:val="32"/>
+              </w:rPr>
+              <w:t xml:space="preserve">  Salesforce Public Groups Architecture</w:t>
             </w:r>
           </w:p>
         </w:tc>
       </w:tr>
     </w:tbl>
-    <w:p>
-      <w:pPr>
-        <w:pStyle w:val="Heading4"/>
-      </w:pPr>
-      <w:r>
-        <w:t>Example</w:t>
-      </w:r>
-    </w:p>
+    <w:p/>
+    <w:tbl>
+      <w:tblPr>
+        <w:tblStyle w:val="TableGrid"/>
+        <w:tblW w:type="auto" w:w="0"/>
+        <w:tblLook w:firstColumn="1" w:firstRow="1" w:lastColumn="0" w:lastRow="0" w:noHBand="0" w:noVBand="1" w:val="04A0"/>
+      </w:tblPr>
+      <w:tblGrid>
+        <w:gridCol w:w="8640"/>
+      </w:tblGrid>
+      <w:tr>
+        <w:tc>
+          <w:tcPr>
+            <w:tcW w:type="dxa" w:w="8640"/>
+            <w:shd w:val="clear" w:color="auto" w:fill="2E75B6"/>
+            <w:tcBorders>
+              <w:top w:val="single" w:sz="4" w:space="0" w:color="2E75B6"/>
+              <w:left w:val="single" w:sz="4" w:space="0" w:color="2E75B6"/>
+              <w:bottom w:val="single" w:sz="4" w:space="0" w:color="2E75B6"/>
+              <w:right w:val="single" w:sz="4" w:space="0" w:color="2E75B6"/>
+            </w:tcBorders>
+            <w:tcMar>
+              <w:top w:w="100" w:type="dxa"/>
+              <w:left w:w="100" w:type="dxa"/>
+              <w:bottom w:w="100" w:type="dxa"/>
+              <w:right w:w="100" w:type="dxa"/>
+            </w:tcMar>
+          </w:tcPr>
+          <w:p>
+            <w:pPr>
+              <w:jc w:val="left"/>
+            </w:pPr>
+            <w:r>
+              <w:rPr>
+                <w:rFonts w:ascii="Calibri" w:hAnsi="Calibri"/>
+                <w:b/>
+                <w:color w:val="FFFFFF"/>
+                <w:sz w:val="24"/>
+              </w:rPr>
+              <w:t xml:space="preserve">  Summary</w:t>
+            </w:r>
+          </w:p>
+        </w:tc>
+      </w:tr>
+    </w:tbl>
+    <w:p/>
+    <w:p>
+      <w:pPr>
+        <w:pStyle w:val="ListBullet"/>
+      </w:pPr>
+      <w:r>
+        <w:rPr>
+          <w:rFonts w:ascii="Calibri" w:hAnsi="Calibri"/>
+          <w:color w:val="1F3864"/>
+          <w:sz w:val="21"/>
+        </w:rPr>
+        <w:t>Public Groups are administrative containers used to simplify record sharing and permissions management by grouping various entities like Users, Roles, and Territories. They serve as a foundational element in Salesforce's 'Sharing and Visibility' layer, allowing for flexible data access models that extend beyond the rigid Role Hierarchy.</w:t>
+      </w:r>
+    </w:p>
+    <w:p/>
+    <w:tbl>
+      <w:tblPr>
+        <w:tblStyle w:val="TableGrid"/>
+        <w:tblW w:type="auto" w:w="0"/>
+        <w:tblLook w:firstColumn="1" w:firstRow="1" w:lastColumn="0" w:lastRow="0" w:noHBand="0" w:noVBand="1" w:val="04A0"/>
+      </w:tblPr>
+      <w:tblGrid>
+        <w:gridCol w:w="8640"/>
+      </w:tblGrid>
+      <w:tr>
+        <w:tc>
+          <w:tcPr>
+            <w:tcW w:type="dxa" w:w="8640"/>
+            <w:shd w:val="clear" w:color="auto" w:fill="D6E4F0"/>
+            <w:tcBorders>
+              <w:top w:val="single" w:sz="4" w:space="0" w:color="D6E4F0"/>
+              <w:left w:val="single" w:sz="4" w:space="0" w:color="D6E4F0"/>
+              <w:bottom w:val="single" w:sz="4" w:space="0" w:color="D6E4F0"/>
+              <w:right w:val="single" w:sz="4" w:space="0" w:color="D6E4F0"/>
+            </w:tcBorders>
+            <w:tcMar>
+              <w:top w:w="100" w:type="dxa"/>
+              <w:left w:w="100" w:type="dxa"/>
+              <w:bottom w:w="100" w:type="dxa"/>
+              <w:right w:w="100" w:type="dxa"/>
+            </w:tcMar>
+          </w:tcPr>
+          <w:p>
+            <w:pPr>
+              <w:jc w:val="left"/>
+            </w:pPr>
+            <w:r>
+              <w:rPr>
+                <w:rFonts w:ascii="Calibri" w:hAnsi="Calibri"/>
+                <w:b/>
+                <w:color w:val="1F3864"/>
+                <w:sz w:val="22"/>
+              </w:rPr>
+              <w:t xml:space="preserve">  Membership Composition and Entity Types</w:t>
+            </w:r>
+          </w:p>
+        </w:tc>
+      </w:tr>
+    </w:tbl>
+    <w:p/>
+    <w:p>
+      <w:pPr>
+        <w:pStyle w:val="ListBullet"/>
+      </w:pPr>
+      <w:r>
+        <w:rPr>
+          <w:rFonts w:ascii="Calibri" w:hAnsi="Calibri"/>
+          <w:color w:val="1F3864"/>
+          <w:sz w:val="21"/>
+        </w:rPr>
+        <w:t>Public Groups can contain individual Users, Customer Portal Users, and Partner Users.</w:t>
+      </w:r>
+    </w:p>
+    <w:p>
+      <w:pPr>
+        <w:pStyle w:val="ListBullet"/>
+      </w:pPr>
+      <w:r>
+        <w:rPr>
+          <w:rFonts w:ascii="Calibri" w:hAnsi="Calibri"/>
+          <w:color w:val="1F3864"/>
+          <w:sz w:val="21"/>
+        </w:rPr>
+        <w:t>Hierarchical entities can be added: Roles, Roles and Internal Subordinates, or Roles, Internal, and Portal Subordinates.</w:t>
+      </w:r>
+    </w:p>
+    <w:p>
+      <w:pPr>
+        <w:pStyle w:val="ListBullet"/>
+      </w:pPr>
+      <w:r>
+        <w:rPr>
+          <w:rFonts w:ascii="Calibri" w:hAnsi="Calibri"/>
+          <w:color w:val="1F3864"/>
+          <w:sz w:val="21"/>
+        </w:rPr>
+        <w:t>Territory-based inclusion: Supports both individual Territories and Territories with Subordinates.</w:t>
+      </w:r>
+    </w:p>
+    <w:p>
+      <w:pPr>
+        <w:pStyle w:val="ListBullet"/>
+      </w:pPr>
+      <w:r>
+        <w:rPr>
+          <w:rFonts w:ascii="Calibri" w:hAnsi="Calibri"/>
+          <w:color w:val="1F3864"/>
+          <w:sz w:val="21"/>
+        </w:rPr>
+        <w:t>Nesting Capabilities: Groups can contain other Public Groups (Sub-groups) to create modular sharing sets.</w:t>
+      </w:r>
+    </w:p>
+    <w:p>
+      <w:pPr>
+        <w:pStyle w:val="ListBullet"/>
+      </w:pPr>
+      <w:r>
+        <w:rPr>
+          <w:rFonts w:ascii="Calibri" w:hAnsi="Calibri"/>
+          <w:color w:val="1F3864"/>
+          <w:sz w:val="21"/>
+        </w:rPr>
+        <w:t>Object Model: Represented by the 'Group' object (Type='Regular') and memberships stored in 'GroupMember' records.</w:t>
+      </w:r>
+    </w:p>
+    <w:p>
+      <w:pPr>
+        <w:pStyle w:val="ListBullet"/>
+      </w:pPr>
+      <w:r>
+        <w:rPr>
+          <w:rFonts w:ascii="Calibri" w:hAnsi="Calibri"/>
+          <w:color w:val="1F3864"/>
+          <w:sz w:val="21"/>
+        </w:rPr>
+        <w:t>Metadata API: Accessible via the 'Group' metadata type for deployments and CI/CD pipelines.</w:t>
+      </w:r>
+    </w:p>
+    <w:p/>
+    <w:tbl>
+      <w:tblPr>
+        <w:tblStyle w:val="TableGrid"/>
+        <w:tblW w:type="auto" w:w="0"/>
+        <w:tblLook w:firstColumn="1" w:firstRow="1" w:lastColumn="0" w:lastRow="0" w:noHBand="0" w:noVBand="1" w:val="04A0"/>
+      </w:tblPr>
+      <w:tblGrid>
+        <w:gridCol w:w="8640"/>
+      </w:tblGrid>
+      <w:tr>
+        <w:tc>
+          <w:tcPr>
+            <w:tcW w:type="dxa" w:w="8640"/>
+            <w:shd w:val="clear" w:color="auto" w:fill="D6E4F0"/>
+            <w:tcBorders>
+              <w:top w:val="single" w:sz="4" w:space="0" w:color="D6E4F0"/>
+              <w:left w:val="single" w:sz="4" w:space="0" w:color="D6E4F0"/>
+              <w:bottom w:val="single" w:sz="4" w:space="0" w:color="D6E4F0"/>
+              <w:right w:val="single" w:sz="4" w:space="0" w:color="D6E4F0"/>
+            </w:tcBorders>
+            <w:tcMar>
+              <w:top w:w="100" w:type="dxa"/>
+              <w:left w:w="100" w:type="dxa"/>
+              <w:bottom w:w="100" w:type="dxa"/>
+              <w:right w:w="100" w:type="dxa"/>
+            </w:tcMar>
+          </w:tcPr>
+          <w:p>
+            <w:pPr>
+              <w:jc w:val="left"/>
+            </w:pPr>
+            <w:r>
+              <w:rPr>
+                <w:rFonts w:ascii="Calibri" w:hAnsi="Calibri"/>
+                <w:b/>
+                <w:color w:val="1F3864"/>
+                <w:sz w:val="22"/>
+              </w:rPr>
+              <w:t xml:space="preserve">  Sharing and Access Logic</w:t>
+            </w:r>
+          </w:p>
+        </w:tc>
+      </w:tr>
+    </w:tbl>
+    <w:p/>
+    <w:p>
+      <w:pPr>
+        <w:pStyle w:val="ListBullet"/>
+      </w:pPr>
+      <w:r>
+        <w:rPr>
+          <w:rFonts w:ascii="Calibri" w:hAnsi="Calibri"/>
+          <w:color w:val="1F3864"/>
+          <w:sz w:val="21"/>
+        </w:rPr>
+        <w:t>Indirect Access: Group membership does not grant access on its own; it serves as a target for Sharing Rules, Manual Sharing, and Apex Managed Sharing.</w:t>
+      </w:r>
+    </w:p>
+    <w:p>
+      <w:pPr>
+        <w:pStyle w:val="ListBullet"/>
+      </w:pPr>
+      <w:r>
+        <w:rPr>
+          <w:rFonts w:ascii="Calibri" w:hAnsi="Calibri"/>
+          <w:color w:val="1F3864"/>
+          <w:sz w:val="21"/>
+        </w:rPr>
+        <w:t>Inherited Access: If Group A is nested within Group B, members of Group A inherit all record access granted to Group B.</w:t>
+      </w:r>
+    </w:p>
+    <w:p>
+      <w:pPr>
+        <w:pStyle w:val="ListBullet"/>
+      </w:pPr>
+      <w:r>
+        <w:rPr>
+          <w:rFonts w:ascii="Calibri" w:hAnsi="Calibri"/>
+          <w:color w:val="1F3864"/>
+          <w:sz w:val="21"/>
+        </w:rPr>
+        <w:t>Non-Hierarchical Groups: By unchecking 'Grant Access Using Hierarchies' on the Group, access is restricted strictly to members, bypassing the manager/executive hierarchy.</w:t>
+      </w:r>
+    </w:p>
+    <w:p>
+      <w:pPr>
+        <w:pStyle w:val="ListBullet"/>
+      </w:pPr>
+      <w:r>
+        <w:rPr>
+          <w:rFonts w:ascii="Calibri" w:hAnsi="Calibri"/>
+          <w:color w:val="1F3864"/>
+          <w:sz w:val="21"/>
+        </w:rPr>
+        <w:t>Folder and Library Security: Used to manage access to Report Folders, Dashboard Folders, and Salesforce Files (Libraries).</w:t>
+      </w:r>
+    </w:p>
+    <w:p>
+      <w:pPr>
+        <w:pStyle w:val="ListBullet"/>
+      </w:pPr>
+      <w:r>
+        <w:rPr>
+          <w:rFonts w:ascii="Calibri" w:hAnsi="Calibri"/>
+          <w:color w:val="1F3864"/>
+          <w:sz w:val="21"/>
+        </w:rPr>
+        <w:t>Apex Sharing: Use the 'UserOrGroupId' field on Share objects (e.g., AccountShare, CustomObject__Share) to programmatically grant access to a group.</w:t>
+      </w:r>
+    </w:p>
+    <w:p/>
+    <w:tbl>
+      <w:tblPr>
+        <w:tblStyle w:val="TableGrid"/>
+        <w:tblW w:type="auto" w:w="0"/>
+        <w:tblLook w:firstColumn="1" w:firstRow="1" w:lastColumn="0" w:lastRow="0" w:noHBand="0" w:noVBand="1" w:val="04A0"/>
+      </w:tblPr>
+      <w:tblGrid>
+        <w:gridCol w:w="8640"/>
+      </w:tblGrid>
+      <w:tr>
+        <w:tc>
+          <w:tcPr>
+            <w:tcW w:type="dxa" w:w="8640"/>
+            <w:shd w:val="clear" w:color="auto" w:fill="D6E4F0"/>
+            <w:tcBorders>
+              <w:top w:val="single" w:sz="4" w:space="0" w:color="D6E4F0"/>
+              <w:left w:val="single" w:sz="4" w:space="0" w:color="D6E4F0"/>
+              <w:bottom w:val="single" w:sz="4" w:space="0" w:color="D6E4F0"/>
+              <w:right w:val="single" w:sz="4" w:space="0" w:color="D6E4F0"/>
+            </w:tcBorders>
+            <w:tcMar>
+              <w:top w:w="100" w:type="dxa"/>
+              <w:left w:w="100" w:type="dxa"/>
+              <w:bottom w:w="100" w:type="dxa"/>
+              <w:right w:w="100" w:type="dxa"/>
+            </w:tcMar>
+          </w:tcPr>
+          <w:p>
+            <w:pPr>
+              <w:jc w:val="left"/>
+            </w:pPr>
+            <w:r>
+              <w:rPr>
+                <w:rFonts w:ascii="Calibri" w:hAnsi="Calibri"/>
+                <w:b/>
+                <w:color w:val="1F3864"/>
+                <w:sz w:val="22"/>
+              </w:rPr>
+              <w:t xml:space="preserve">  Architectural Performance and Scalability</w:t>
+            </w:r>
+          </w:p>
+        </w:tc>
+      </w:tr>
+    </w:tbl>
+    <w:p/>
+    <w:p>
+      <w:pPr>
+        <w:pStyle w:val="ListBullet"/>
+      </w:pPr>
+      <w:r>
+        <w:rPr>
+          <w:rFonts w:ascii="Calibri" w:hAnsi="Calibri"/>
+          <w:color w:val="1F3864"/>
+          <w:sz w:val="21"/>
+        </w:rPr>
+        <w:t>Membership Calculation: Salesforce performs complex calculations (the 'Sharing Griddle') to determine access when groups change; large-scale changes can trigger long-running background jobs.</w:t>
+      </w:r>
+    </w:p>
+    <w:p>
+      <w:pPr>
+        <w:pStyle w:val="ListBullet"/>
+      </w:pPr>
+      <w:r>
+        <w:rPr>
+          <w:rFonts w:ascii="Calibri" w:hAnsi="Calibri"/>
+          <w:color w:val="1F3864"/>
+          <w:sz w:val="21"/>
+        </w:rPr>
+        <w:t>Nesting Limits: Technical recommendation is to avoid nesting more than 5 levels deep to prevent performance degradation during access evaluation.</w:t>
+      </w:r>
+    </w:p>
+    <w:p>
+      <w:pPr>
+        <w:pStyle w:val="ListBullet"/>
+      </w:pPr>
+      <w:r>
+        <w:rPr>
+          <w:rFonts w:ascii="Calibri" w:hAnsi="Calibri"/>
+          <w:color w:val="1F3864"/>
+          <w:sz w:val="21"/>
+        </w:rPr>
+        <w:t>Organization Limits: Salesforce recommends a maximum of 100,000 Public Groups per organization for optimal maintenance.</w:t>
+      </w:r>
+    </w:p>
+    <w:p>
+      <w:pPr>
+        <w:pStyle w:val="ListBullet"/>
+      </w:pPr>
+      <w:r>
+        <w:rPr>
+          <w:rFonts w:ascii="Calibri" w:hAnsi="Calibri"/>
+          <w:color w:val="1F3864"/>
+          <w:sz w:val="21"/>
+        </w:rPr>
+        <w:t>Deferred Sharing: In Large Data Volume (LDV) environments, administrators can use 'Deferred Sharing Calculation' to pause group membership processing during bulk data loads.</w:t>
+      </w:r>
+    </w:p>
+    <w:p/>
+    <w:tbl>
+      <w:tblPr>
+        <w:tblStyle w:val="TableGrid"/>
+        <w:tblW w:type="auto" w:w="0"/>
+        <w:tblLook w:firstColumn="1" w:firstRow="1" w:lastColumn="0" w:lastRow="0" w:noHBand="0" w:noVBand="1" w:val="04A0"/>
+      </w:tblPr>
+      <w:tblGrid>
+        <w:gridCol w:w="8640"/>
+      </w:tblGrid>
+      <w:tr>
+        <w:tc>
+          <w:tcPr>
+            <w:tcW w:type="dxa" w:w="8640"/>
+            <w:shd w:val="clear" w:color="auto" w:fill="E2EFDA"/>
+            <w:tcBorders>
+              <w:top w:val="single" w:sz="4" w:space="0" w:color="E2EFDA"/>
+              <w:left w:val="single" w:sz="4" w:space="0" w:color="E2EFDA"/>
+              <w:bottom w:val="single" w:sz="4" w:space="0" w:color="E2EFDA"/>
+              <w:right w:val="single" w:sz="4" w:space="0" w:color="E2EFDA"/>
+            </w:tcBorders>
+            <w:tcMar>
+              <w:top w:w="100" w:type="dxa"/>
+              <w:left w:w="100" w:type="dxa"/>
+              <w:bottom w:w="100" w:type="dxa"/>
+              <w:right w:w="100" w:type="dxa"/>
+            </w:tcMar>
+          </w:tcPr>
+          <w:p>
+            <w:pPr>
+              <w:jc w:val="left"/>
+            </w:pPr>
+            <w:r>
+              <w:rPr>
+                <w:rFonts w:ascii="Calibri" w:hAnsi="Calibri"/>
+                <w:b/>
+                <w:color w:val="375623"/>
+                <w:sz w:val="22"/>
+              </w:rPr>
+              <w:t xml:space="preserve">  ✔  Best Practices</w:t>
+            </w:r>
+          </w:p>
+        </w:tc>
+      </w:tr>
+    </w:tbl>
+    <w:p/>
+    <w:p>
+      <w:pPr>
+        <w:pStyle w:val="ListBullet"/>
+      </w:pPr>
+      <w:r>
+        <w:rPr>
+          <w:rFonts w:ascii="Calibri" w:hAnsi="Calibri"/>
+          <w:color w:val="375623"/>
+          <w:sz w:val="21"/>
+        </w:rPr>
+        <w:t>Prefer adding Roles or Roles and Subordinates to Groups instead of individual Users to reduce administrative overhead.</w:t>
+      </w:r>
+    </w:p>
+    <w:p>
+      <w:pPr>
+        <w:pStyle w:val="ListBullet"/>
+      </w:pPr>
+      <w:r>
+        <w:rPr>
+          <w:rFonts w:ascii="Calibri" w:hAnsi="Calibri"/>
+          <w:color w:val="375623"/>
+          <w:sz w:val="21"/>
+        </w:rPr>
+        <w:t>Limit group nesting to 5 levels to avoid 'Skimmer' process performance issues and complex troubleshooting.</w:t>
+      </w:r>
+    </w:p>
+    <w:p>
+      <w:pPr>
+        <w:pStyle w:val="ListBullet"/>
+      </w:pPr>
+      <w:r>
+        <w:rPr>
+          <w:rFonts w:ascii="Calibri" w:hAnsi="Calibri"/>
+          <w:color w:val="375623"/>
+          <w:sz w:val="21"/>
+        </w:rPr>
+        <w:t>Use descriptive naming conventions to distinguish between 'Functional Groups' (e.g., HR_Admins) and 'Access Groups' (e.g., Record_Viewers).</w:t>
+      </w:r>
+    </w:p>
+    <w:p>
+      <w:pPr>
+        <w:pStyle w:val="ListBullet"/>
+      </w:pPr>
+      <w:r>
+        <w:rPr>
+          <w:rFonts w:ascii="Calibri" w:hAnsi="Calibri"/>
+          <w:color w:val="375623"/>
+          <w:sz w:val="21"/>
+        </w:rPr>
+        <w:t>Disable 'Grant Access Using Hierarchies' for highly sensitive data groups to ensure true data isolation.</w:t>
+      </w:r>
+    </w:p>
+    <w:p>
+      <w:pPr>
+        <w:pStyle w:val="ListBullet"/>
+      </w:pPr>
+      <w:r>
+        <w:rPr>
+          <w:rFonts w:ascii="Calibri" w:hAnsi="Calibri"/>
+          <w:color w:val="375623"/>
+          <w:sz w:val="21"/>
+        </w:rPr>
+        <w:t>Regularly audit the 'GroupMember' object to identify and remove redundant or orphaned memberships.</w:t>
+      </w:r>
+    </w:p>
+    <w:p/>
+    <w:tbl>
+      <w:tblPr>
+        <w:tblStyle w:val="TableGrid"/>
+        <w:tblW w:type="auto" w:w="0"/>
+        <w:tblLook w:firstColumn="1" w:firstRow="1" w:lastColumn="0" w:lastRow="0" w:noHBand="0" w:noVBand="1" w:val="04A0"/>
+      </w:tblPr>
+      <w:tblGrid>
+        <w:gridCol w:w="8640"/>
+      </w:tblGrid>
+      <w:tr>
+        <w:tc>
+          <w:tcPr>
+            <w:tcW w:type="dxa" w:w="8640"/>
+            <w:shd w:val="clear" w:color="auto" w:fill="FCE4D6"/>
+            <w:tcBorders>
+              <w:top w:val="single" w:sz="4" w:space="0" w:color="FCE4D6"/>
+              <w:left w:val="single" w:sz="4" w:space="0" w:color="FCE4D6"/>
+              <w:bottom w:val="single" w:sz="4" w:space="0" w:color="FCE4D6"/>
+              <w:right w:val="single" w:sz="4" w:space="0" w:color="FCE4D6"/>
+            </w:tcBorders>
+            <w:tcMar>
+              <w:top w:w="100" w:type="dxa"/>
+              <w:left w:w="100" w:type="dxa"/>
+              <w:bottom w:w="100" w:type="dxa"/>
+              <w:right w:w="100" w:type="dxa"/>
+            </w:tcMar>
+          </w:tcPr>
+          <w:p>
+            <w:pPr>
+              <w:jc w:val="left"/>
+            </w:pPr>
+            <w:r>
+              <w:rPr>
+                <w:rFonts w:ascii="Calibri" w:hAnsi="Calibri"/>
+                <w:b/>
+                <w:color w:val="833C00"/>
+                <w:sz w:val="22"/>
+              </w:rPr>
+              <w:t xml:space="preserve">  ⚠  Limitations</w:t>
+            </w:r>
+          </w:p>
+        </w:tc>
+      </w:tr>
+    </w:tbl>
+    <w:p/>
+    <w:p>
+      <w:pPr>
+        <w:pStyle w:val="ListBullet"/>
+      </w:pPr>
+      <w:r>
+        <w:rPr>
+          <w:rFonts w:ascii="Calibri" w:hAnsi="Calibri"/>
+          <w:color w:val="833C00"/>
+          <w:sz w:val="21"/>
+        </w:rPr>
+        <w:t>Public Groups cannot be used to grant Object-Level permissions (CRUD); they only influence Record-Level access (Sharing).</w:t>
+      </w:r>
+    </w:p>
+    <w:p>
+      <w:pPr>
+        <w:pStyle w:val="ListBullet"/>
+      </w:pPr>
+      <w:r>
+        <w:rPr>
+          <w:rFonts w:ascii="Calibri" w:hAnsi="Calibri"/>
+          <w:color w:val="833C00"/>
+          <w:sz w:val="21"/>
+        </w:rPr>
+        <w:t>Excessive nesting and large group counts can lead to significant delays in record access recalculation.</w:t>
+      </w:r>
+    </w:p>
+    <w:p>
+      <w:pPr>
+        <w:pStyle w:val="ListBullet"/>
+      </w:pPr>
+      <w:r>
+        <w:rPr>
+          <w:rFonts w:ascii="Calibri" w:hAnsi="Calibri"/>
+          <w:color w:val="833C00"/>
+          <w:sz w:val="21"/>
+        </w:rPr>
+        <w:t>Membership changes for large groups may cause row-lock contention on the 'Group' and 'GroupMember' objects.</w:t>
+      </w:r>
+    </w:p>
+    <w:p>
+      <w:pPr>
+        <w:pStyle w:val="ListBullet"/>
+      </w:pPr>
+      <w:r>
+        <w:rPr>
+          <w:rFonts w:ascii="Calibri" w:hAnsi="Calibri"/>
+          <w:color w:val="833C00"/>
+          <w:sz w:val="21"/>
+        </w:rPr>
+        <w:t>Personal Groups are distinct from Public Groups and cannot be shared or managed by administrators.</w:t>
+      </w:r>
+    </w:p>
+    <w:p/>
+    <w:tbl>
+      <w:tblPr>
+        <w:tblStyle w:val="TableGrid"/>
+        <w:tblW w:type="auto" w:w="0"/>
+        <w:tblLook w:firstColumn="1" w:firstRow="1" w:lastColumn="0" w:lastRow="0" w:noHBand="0" w:noVBand="1" w:val="04A0"/>
+      </w:tblPr>
+      <w:tblGrid>
+        <w:gridCol w:w="8640"/>
+      </w:tblGrid>
+      <w:tr>
+        <w:tc>
+          <w:tcPr>
+            <w:tcW w:type="dxa" w:w="8640"/>
+            <w:shd w:val="clear" w:color="auto" w:fill="2E75B6"/>
+            <w:tcBorders>
+              <w:top w:val="single" w:sz="4" w:space="0" w:color="2E75B6"/>
+              <w:left w:val="single" w:sz="4" w:space="0" w:color="2E75B6"/>
+              <w:bottom w:val="single" w:sz="4" w:space="0" w:color="2E75B6"/>
+              <w:right w:val="single" w:sz="4" w:space="0" w:color="2E75B6"/>
+            </w:tcBorders>
+            <w:tcMar>
+              <w:top w:w="100" w:type="dxa"/>
+              <w:left w:w="100" w:type="dxa"/>
+              <w:bottom w:w="100" w:type="dxa"/>
+              <w:right w:w="100" w:type="dxa"/>
+            </w:tcMar>
+          </w:tcPr>
+          <w:p>
+            <w:pPr>
+              <w:jc w:val="left"/>
+            </w:pPr>
+            <w:r>
+              <w:rPr>
+                <w:rFonts w:ascii="Calibri" w:hAnsi="Calibri"/>
+                <w:b/>
+                <w:color w:val="FFFFFF"/>
+                <w:sz w:val="24"/>
+              </w:rPr>
+              <w:t xml:space="preserve">  Data Access Flow</w:t>
+            </w:r>
+          </w:p>
+        </w:tc>
+      </w:tr>
+    </w:tbl>
+    <w:p/>
+    <w:tbl>
+      <w:tblPr>
+        <w:tblStyle w:val="TableGrid"/>
+        <w:tblW w:type="auto" w:w="0"/>
+        <w:tblLook w:firstColumn="1" w:firstRow="1" w:lastColumn="0" w:lastRow="0" w:noHBand="0" w:noVBand="1" w:val="04A0"/>
+      </w:tblPr>
+      <w:tblGrid>
+        <w:gridCol w:w="8640"/>
+      </w:tblGrid>
+      <w:tr>
+        <w:tc>
+          <w:tcPr>
+            <w:tcW w:type="dxa" w:w="8640"/>
+            <w:shd w:val="clear" w:color="auto" w:fill="EBF3FB"/>
+            <w:tcBorders>
+              <w:top w:val="single" w:sz="18" w:space="0" w:color="2E75B6"/>
+              <w:left w:val="single" w:sz="18" w:space="0" w:color="2E75B6"/>
+              <w:bottom w:val="single" w:sz="18" w:space="0" w:color="2E75B6"/>
+              <w:right w:val="single" w:sz="18" w:space="0" w:color="2E75B6"/>
+            </w:tcBorders>
+          </w:tcPr>
+          <w:p>
+            <w:pPr>
+              <w:jc w:val="left"/>
+            </w:pPr>
+            <w:r>
+              <w:rPr>
+                <w:rFonts w:ascii="Consolas" w:hAnsi="Consolas"/>
+                <w:color w:val="1F3864"/>
+                <w:sz w:val="20"/>
+              </w:rPr>
+              <w:t>[User / Role / Territory]  →  [GroupMember Record]  →  [Public Group] &lt;- [Sharing Tool: Sharing Rule / Apex / Manual] &lt;- [Target Record (e.g., AccountShare)]</w:t>
+            </w:r>
+          </w:p>
+        </w:tc>
+      </w:tr>
+    </w:tbl>
+    <w:p/>
+    <w:tbl>
+      <w:tblPr>
+        <w:tblStyle w:val="TableGrid"/>
+        <w:tblW w:type="auto" w:w="0"/>
+        <w:tblLook w:firstColumn="1" w:firstRow="1" w:lastColumn="0" w:lastRow="0" w:noHBand="0" w:noVBand="1" w:val="04A0"/>
+      </w:tblPr>
+      <w:tblGrid>
+        <w:gridCol w:w="8640"/>
+      </w:tblGrid>
+      <w:tr>
+        <w:tc>
+          <w:tcPr>
+            <w:tcW w:type="dxa" w:w="8640"/>
+            <w:shd w:val="clear" w:color="auto" w:fill="FFF2CC"/>
+            <w:tcBorders>
+              <w:top w:val="single" w:sz="4" w:space="0" w:color="FFF2CC"/>
+              <w:left w:val="single" w:sz="4" w:space="0" w:color="FFF2CC"/>
+              <w:bottom w:val="single" w:sz="4" w:space="0" w:color="FFF2CC"/>
+              <w:right w:val="single" w:sz="4" w:space="0" w:color="FFF2CC"/>
+            </w:tcBorders>
+            <w:tcMar>
+              <w:top w:w="100" w:type="dxa"/>
+              <w:left w:w="100" w:type="dxa"/>
+              <w:bottom w:w="100" w:type="dxa"/>
+              <w:right w:w="100" w:type="dxa"/>
+            </w:tcMar>
+          </w:tcPr>
+          <w:p>
+            <w:pPr>
+              <w:jc w:val="left"/>
+            </w:pPr>
+            <w:r>
+              <w:rPr>
+                <w:rFonts w:ascii="Calibri" w:hAnsi="Calibri"/>
+                <w:b/>
+                <w:color w:val="7F6000"/>
+                <w:sz w:val="22"/>
+              </w:rPr>
+              <w:t xml:space="preserve">  Example</w:t>
+            </w:r>
+          </w:p>
+        </w:tc>
+      </w:tr>
+    </w:tbl>
+    <w:p/>
+    <w:tbl>
+      <w:tblPr>
+        <w:tblStyle w:val="TableGrid"/>
+        <w:tblW w:type="auto" w:w="0"/>
+        <w:tblLook w:firstColumn="1" w:firstRow="1" w:lastColumn="0" w:lastRow="0" w:noHBand="0" w:noVBand="1" w:val="04A0"/>
+      </w:tblPr>
+      <w:tblGrid>
+        <w:gridCol w:w="8640"/>
+      </w:tblGrid>
+      <w:tr>
+        <w:tc>
+          <w:tcPr>
+            <w:tcW w:type="dxa" w:w="8640"/>
+            <w:shd w:val="clear" w:color="auto" w:fill="FFF2CC"/>
+            <w:tcBorders>
+              <w:top w:val="single" w:sz="18" w:space="0" w:color="F4B942"/>
+              <w:left w:val="single" w:sz="18" w:space="0" w:color="F4B942"/>
+              <w:bottom w:val="single" w:sz="18" w:space="0" w:color="F4B942"/>
+              <w:right w:val="single" w:sz="18" w:space="0" w:color="F4B942"/>
+            </w:tcBorders>
+          </w:tcPr>
+          <w:p>
+            <w:pPr>
+              <w:jc w:val="left"/>
+            </w:pPr>
+            <w:r>
+              <w:rPr>
+                <w:rFonts w:ascii="Consolas" w:hAnsi="Consolas"/>
+                <w:color w:val="7F6000"/>
+                <w:sz w:val="20"/>
+              </w:rPr>
+              <w:t>A 'Global Sales Support' Public Group contains the 'EMEA Sales' and 'APAC Sales' Roles. A Sharing Rule is created on the Opportunity object that shares all 'Closed Won' deals with this Public Group. Consequently, any user assigned to EMEA or APAC sales roles automatically gains Read/Write access to those specific records without manual intervention.</w:t>
+            </w:r>
+          </w:p>
+        </w:tc>
+      </w:tr>
+    </w:tbl>
+    <w:p/>
     <w:sectPr>
       <w:pgSz w:w="12240" w:h="15840"/>
       <w:pgMar w:top="1440" w:right="1800" w:bottom="1440" w:left="1800" w:header="720" w:footer="720" w:gutter="0"/>
@@ -5783,7 +7400,7 @@
   <w:abstractNum w:abstractNumId="8" w15:restartNumberingAfterBreak="0">
     <w:nsid w:val="FFFFFF89"/>
     <w:multiLevelType w:val="singleLevel"/>
-    <w:tmpl w:val="1DCC8170"/>
+    <w:tmpl w:val="5210A160"/>
     <w:lvl w:ilvl="0">
       <w:start w:val="1"/>
       <w:numFmt w:val="bullet"/>
@@ -6552,6 +8169,7 @@
   <w:style w:type="character" w:default="1" w:styleId="DefaultParagraphFont">
     <w:name w:val="Default Paragraph Font"/>
     <w:uiPriority w:val="1"/>
+    <w:semiHidden/>
     <w:unhideWhenUsed/>
   </w:style>
   <w:style w:type="table" w:default="1" w:styleId="TableNormal">

</xml_diff>

<commit_message>
add the new gemini-2.0-flash model.
</commit_message>
<xml_diff>
--- a/Salesforce_Notes.docx
+++ b/Salesforce_Notes.docx
@@ -6413,21 +6413,11 @@
       </w:r>
     </w:p>
     <w:p/>
-    <w:p>
-      <w:r>
-        <w:br/>
-      </w:r>
-    </w:p>
-    <w:p>
-      <w:r>
-        <w:br w:type="page"/>
-      </w:r>
-    </w:p>
     <w:tbl>
       <w:tblPr>
         <w:tblStyle w:val="TableGrid"/>
-        <w:tblW w:type="auto" w:w="0"/>
-        <w:tblLook w:firstColumn="1" w:firstRow="1" w:lastColumn="0" w:lastRow="0" w:noHBand="0" w:noVBand="1" w:val="04A0"/>
+        <w:tblW w:w="0" w:type="auto"/>
+        <w:tblLook w:val="04A0" w:firstRow="1" w:lastRow="0" w:firstColumn="1" w:lastColumn="0" w:noHBand="0" w:noVBand="1"/>
       </w:tblPr>
       <w:tblGrid>
         <w:gridCol w:w="8640"/>
@@ -6435,14 +6425,14 @@
       <w:tr>
         <w:tc>
           <w:tcPr>
-            <w:tcW w:type="dxa" w:w="8640"/>
-            <w:shd w:val="clear" w:color="auto" w:fill="1F3864"/>
+            <w:tcW w:w="8640" w:type="dxa"/>
             <w:tcBorders>
               <w:top w:val="single" w:sz="4" w:space="0" w:color="1F3864"/>
               <w:left w:val="single" w:sz="4" w:space="0" w:color="1F3864"/>
               <w:bottom w:val="single" w:sz="4" w:space="0" w:color="1F3864"/>
               <w:right w:val="single" w:sz="4" w:space="0" w:color="1F3864"/>
             </w:tcBorders>
+            <w:shd w:val="clear" w:color="auto" w:fill="1F3864"/>
             <w:tcMar>
               <w:top w:w="100" w:type="dxa"/>
               <w:left w:w="100" w:type="dxa"/>
@@ -6451,9 +6441,6 @@
             </w:tcMar>
           </w:tcPr>
           <w:p>
-            <w:pPr>
-              <w:jc w:val="left"/>
-            </w:pPr>
             <w:r>
               <w:rPr>
                 <w:rFonts w:ascii="Calibri" w:hAnsi="Calibri"/>
@@ -6471,8 +6458,8 @@
     <w:tbl>
       <w:tblPr>
         <w:tblStyle w:val="TableGrid"/>
-        <w:tblW w:type="auto" w:w="0"/>
-        <w:tblLook w:firstColumn="1" w:firstRow="1" w:lastColumn="0" w:lastRow="0" w:noHBand="0" w:noVBand="1" w:val="04A0"/>
+        <w:tblW w:w="0" w:type="auto"/>
+        <w:tblLook w:val="04A0" w:firstRow="1" w:lastRow="0" w:firstColumn="1" w:lastColumn="0" w:noHBand="0" w:noVBand="1"/>
       </w:tblPr>
       <w:tblGrid>
         <w:gridCol w:w="8640"/>
@@ -6480,14 +6467,14 @@
       <w:tr>
         <w:tc>
           <w:tcPr>
-            <w:tcW w:type="dxa" w:w="8640"/>
-            <w:shd w:val="clear" w:color="auto" w:fill="2E75B6"/>
+            <w:tcW w:w="8640" w:type="dxa"/>
             <w:tcBorders>
               <w:top w:val="single" w:sz="4" w:space="0" w:color="2E75B6"/>
               <w:left w:val="single" w:sz="4" w:space="0" w:color="2E75B6"/>
               <w:bottom w:val="single" w:sz="4" w:space="0" w:color="2E75B6"/>
               <w:right w:val="single" w:sz="4" w:space="0" w:color="2E75B6"/>
             </w:tcBorders>
+            <w:shd w:val="clear" w:color="auto" w:fill="2E75B6"/>
             <w:tcMar>
               <w:top w:w="100" w:type="dxa"/>
               <w:left w:w="100" w:type="dxa"/>
@@ -6496,9 +6483,6 @@
             </w:tcMar>
           </w:tcPr>
           <w:p>
-            <w:pPr>
-              <w:jc w:val="left"/>
-            </w:pPr>
             <w:r>
               <w:rPr>
                 <w:rFonts w:ascii="Calibri" w:hAnsi="Calibri"/>
@@ -6523,15 +6507,85 @@
           <w:color w:val="1F3864"/>
           <w:sz w:val="21"/>
         </w:rPr>
-        <w:t>Public Groups are administrative containers used to simplify record sharing and permissions management by grouping various entities like Users, Roles, and Territories. They serve as a foundational element in Salesforce's 'Sharing and Visibility' layer, allowing for flexible data access models that extend beyond the rigid Role Hierarchy.</w:t>
+        <w:t xml:space="preserve">Public Groups are administrative containers </w:t>
+      </w:r>
+      <w:r>
+        <w:rPr>
+          <w:rFonts w:ascii="Calibri" w:hAnsi="Calibri"/>
+          <w:color w:val="1F3864"/>
+          <w:sz w:val="21"/>
+          <w:highlight w:val="yellow"/>
+        </w:rPr>
+        <w:t xml:space="preserve">used to </w:t>
+      </w:r>
+      <w:r>
+        <w:rPr>
+          <w:rFonts w:ascii="Calibri" w:hAnsi="Calibri"/>
+          <w:color w:val="1F3864"/>
+          <w:sz w:val="21"/>
+          <w:highlight w:val="yellow"/>
+        </w:rPr>
+        <w:t xml:space="preserve">grant access to </w:t>
+      </w:r>
+      <w:r>
+        <w:rPr>
+          <w:rFonts w:ascii="Calibri" w:hAnsi="Calibri"/>
+          <w:color w:val="1F3864"/>
+          <w:sz w:val="21"/>
+          <w:highlight w:val="yellow"/>
+        </w:rPr>
+        <w:t>users, roles, and territories to simplify record sharing and permissioning.</w:t>
+      </w:r>
+      <w:r>
+        <w:rPr>
+          <w:rFonts w:ascii="Calibri" w:hAnsi="Calibri"/>
+          <w:color w:val="1F3864"/>
+          <w:sz w:val="21"/>
+        </w:rPr>
+        <w:t xml:space="preserve"> </w:t>
+      </w:r>
+    </w:p>
+    <w:p>
+      <w:pPr>
+        <w:pStyle w:val="ListBullet"/>
+      </w:pPr>
+      <w:r>
+        <w:rPr>
+          <w:rFonts w:ascii="Calibri" w:hAnsi="Calibri"/>
+          <w:color w:val="1F3864"/>
+          <w:sz w:val="21"/>
+          <w:highlight w:val="yellow"/>
+        </w:rPr>
+        <w:t>They serve as a foundational element in Salesforce's Record-Level Security model</w:t>
+      </w:r>
+      <w:r>
+        <w:rPr>
+          <w:rFonts w:ascii="Calibri" w:hAnsi="Calibri"/>
+          <w:color w:val="1F3864"/>
+          <w:sz w:val="21"/>
+        </w:rPr>
+        <w:t xml:space="preserve">, </w:t>
+      </w:r>
+    </w:p>
+    <w:p>
+      <w:pPr>
+        <w:pStyle w:val="ListBullet"/>
+      </w:pPr>
+      <w:r>
+        <w:rPr>
+          <w:rFonts w:ascii="Calibri" w:hAnsi="Calibri"/>
+          <w:color w:val="1F3864"/>
+          <w:sz w:val="21"/>
+        </w:rPr>
+        <w:t>enabling horizontal and ad-hoc sharing that transcends the standard Role Hierarchy.</w:t>
       </w:r>
     </w:p>
     <w:p/>
     <w:tbl>
       <w:tblPr>
         <w:tblStyle w:val="TableGrid"/>
-        <w:tblW w:type="auto" w:w="0"/>
-        <w:tblLook w:firstColumn="1" w:firstRow="1" w:lastColumn="0" w:lastRow="0" w:noHBand="0" w:noVBand="1" w:val="04A0"/>
+        <w:tblW w:w="0" w:type="auto"/>
+        <w:tblLook w:val="04A0" w:firstRow="1" w:lastRow="0" w:firstColumn="1" w:lastColumn="0" w:noHBand="0" w:noVBand="1"/>
       </w:tblPr>
       <w:tblGrid>
         <w:gridCol w:w="8640"/>
@@ -6539,14 +6593,14 @@
       <w:tr>
         <w:tc>
           <w:tcPr>
-            <w:tcW w:type="dxa" w:w="8640"/>
-            <w:shd w:val="clear" w:color="auto" w:fill="D6E4F0"/>
+            <w:tcW w:w="8640" w:type="dxa"/>
             <w:tcBorders>
               <w:top w:val="single" w:sz="4" w:space="0" w:color="D6E4F0"/>
               <w:left w:val="single" w:sz="4" w:space="0" w:color="D6E4F0"/>
               <w:bottom w:val="single" w:sz="4" w:space="0" w:color="D6E4F0"/>
               <w:right w:val="single" w:sz="4" w:space="0" w:color="D6E4F0"/>
             </w:tcBorders>
+            <w:shd w:val="clear" w:color="auto" w:fill="D6E4F0"/>
             <w:tcMar>
               <w:top w:w="100" w:type="dxa"/>
               <w:left w:w="100" w:type="dxa"/>
@@ -6555,17 +6609,13 @@
             </w:tcMar>
           </w:tcPr>
           <w:p>
-            <w:pPr>
-              <w:jc w:val="left"/>
-            </w:pPr>
             <w:r>
               <w:rPr>
                 <w:rFonts w:ascii="Calibri" w:hAnsi="Calibri"/>
                 <w:b/>
                 <w:color w:val="1F3864"/>
-                <w:sz w:val="22"/>
               </w:rPr>
-              <w:t xml:space="preserve">  Membership Composition and Entity Types</w:t>
+              <w:t xml:space="preserve">  Membership Composition &amp; Entity Types</w:t>
             </w:r>
           </w:p>
         </w:tc>
@@ -6582,25 +6632,24 @@
           <w:color w:val="1F3864"/>
           <w:sz w:val="21"/>
         </w:rPr>
-        <w:t>Public Groups can contain individual Users, Customer Portal Users, and Partner Users.</w:t>
-      </w:r>
-    </w:p>
-    <w:p>
-      <w:pPr>
-        <w:pStyle w:val="ListBullet"/>
-      </w:pPr>
+        <w:t xml:space="preserve">Public Groups can </w:t>
+      </w:r>
       <w:r>
         <w:rPr>
           <w:rFonts w:ascii="Calibri" w:hAnsi="Calibri"/>
           <w:color w:val="1F3864"/>
           <w:sz w:val="21"/>
-        </w:rPr>
-        <w:t>Hierarchical entities can be added: Roles, Roles and Internal Subordinates, or Roles, Internal, and Portal Subordinates.</w:t>
-      </w:r>
-    </w:p>
-    <w:p>
-      <w:pPr>
-        <w:pStyle w:val="ListBullet"/>
+          <w:highlight w:val="yellow"/>
+        </w:rPr>
+        <w:t>contain individual Users, Customer Portal Users, and Partner Users.</w:t>
+      </w:r>
+    </w:p>
+    <w:p>
+      <w:pPr>
+        <w:pStyle w:val="ListBullet"/>
+        <w:rPr>
+          <w:highlight w:val="yellow"/>
+        </w:rPr>
       </w:pPr>
       <w:r>
         <w:rPr>
@@ -6608,54 +6657,105 @@
           <w:color w:val="1F3864"/>
           <w:sz w:val="21"/>
         </w:rPr>
-        <w:t>Territory-based inclusion: Supports both individual Territories and Territories with Subordinates.</w:t>
-      </w:r>
-    </w:p>
-    <w:p>
-      <w:pPr>
-        <w:pStyle w:val="ListBullet"/>
-      </w:pPr>
+        <w:t xml:space="preserve">Groups can </w:t>
+      </w:r>
       <w:r>
         <w:rPr>
           <w:rFonts w:ascii="Calibri" w:hAnsi="Calibri"/>
           <w:color w:val="1F3864"/>
           <w:sz w:val="21"/>
-        </w:rPr>
-        <w:t>Nesting Capabilities: Groups can contain other Public Groups (Sub-groups) to create modular sharing sets.</w:t>
-      </w:r>
-    </w:p>
-    <w:p>
-      <w:pPr>
-        <w:pStyle w:val="ListBullet"/>
+          <w:highlight w:val="yellow"/>
+        </w:rPr>
+        <w:t>include Role-based memberships: 'Roles', 'Roles and Internal Subordinates', and 'Roles, Internal, and Portal Subordinates'.</w:t>
+      </w:r>
+    </w:p>
+    <w:p>
+      <w:pPr>
+        <w:pStyle w:val="ListBullet"/>
+        <w:rPr>
+          <w:highlight w:val="yellow"/>
+        </w:rPr>
       </w:pPr>
       <w:r>
         <w:rPr>
           <w:rFonts w:ascii="Calibri" w:hAnsi="Calibri"/>
           <w:color w:val="1F3864"/>
           <w:sz w:val="21"/>
-        </w:rPr>
-        <w:t>Object Model: Represented by the 'Group' object (Type='Regular') and memberships stored in 'GroupMember' records.</w:t>
-      </w:r>
-    </w:p>
-    <w:p>
-      <w:pPr>
-        <w:pStyle w:val="ListBullet"/>
-      </w:pPr>
+          <w:highlight w:val="yellow"/>
+        </w:rPr>
+        <w:t>Territory-based inclusion</w:t>
+      </w:r>
       <w:r>
         <w:rPr>
           <w:rFonts w:ascii="Calibri" w:hAnsi="Calibri"/>
           <w:color w:val="1F3864"/>
           <w:sz w:val="21"/>
         </w:rPr>
-        <w:t>Metadata API: Accessible via the 'Group' metadata type for deployments and CI/CD pipelines.</w:t>
+        <w:t xml:space="preserve"> allows for </w:t>
+      </w:r>
+      <w:r>
+        <w:rPr>
+          <w:rFonts w:ascii="Calibri" w:hAnsi="Calibri"/>
+          <w:color w:val="1F3864"/>
+          <w:sz w:val="21"/>
+          <w:highlight w:val="yellow"/>
+        </w:rPr>
+        <w:t>'Territories' and 'Territories and Subordinates' to be added as members.</w:t>
+      </w:r>
+    </w:p>
+    <w:p>
+      <w:pPr>
+        <w:pStyle w:val="ListBullet"/>
+      </w:pPr>
+      <w:r>
+        <w:rPr>
+          <w:rFonts w:ascii="Calibri" w:hAnsi="Calibri"/>
+          <w:color w:val="1F3864"/>
+          <w:sz w:val="21"/>
+          <w:highlight w:val="yellow"/>
+        </w:rPr>
+        <w:t>Nesting capability</w:t>
+      </w:r>
+      <w:r>
+        <w:rPr>
+          <w:rFonts w:ascii="Calibri" w:hAnsi="Calibri"/>
+          <w:color w:val="1F3864"/>
+          <w:sz w:val="21"/>
+        </w:rPr>
+        <w:t>: Public Groups can be added to other Public Groups, creating a sub-hierarchy for access inheritance.</w:t>
+      </w:r>
+    </w:p>
+    <w:p>
+      <w:pPr>
+        <w:pStyle w:val="ListBullet"/>
+        <w:rPr>
+          <w:highlight w:val="yellow"/>
+        </w:rPr>
+      </w:pPr>
+      <w:r>
+        <w:rPr>
+          <w:rFonts w:ascii="Calibri" w:hAnsi="Calibri"/>
+          <w:color w:val="1F3864"/>
+          <w:sz w:val="21"/>
+        </w:rPr>
+        <w:t xml:space="preserve">Back-end storage: Group membership is primarily managed via the </w:t>
+      </w:r>
+      <w:r>
+        <w:rPr>
+          <w:rFonts w:ascii="Calibri" w:hAnsi="Calibri"/>
+          <w:color w:val="1F3864"/>
+          <w:sz w:val="21"/>
+          <w:highlight w:val="yellow"/>
+        </w:rPr>
+        <w:t>Group and GroupMember standard objects.</w:t>
       </w:r>
     </w:p>
     <w:p/>
     <w:tbl>
       <w:tblPr>
         <w:tblStyle w:val="TableGrid"/>
-        <w:tblW w:type="auto" w:w="0"/>
-        <w:tblLook w:firstColumn="1" w:firstRow="1" w:lastColumn="0" w:lastRow="0" w:noHBand="0" w:noVBand="1" w:val="04A0"/>
+        <w:tblW w:w="0" w:type="auto"/>
+        <w:tblLook w:val="04A0" w:firstRow="1" w:lastRow="0" w:firstColumn="1" w:lastColumn="0" w:noHBand="0" w:noVBand="1"/>
       </w:tblPr>
       <w:tblGrid>
         <w:gridCol w:w="8640"/>
@@ -6663,14 +6763,14 @@
       <w:tr>
         <w:tc>
           <w:tcPr>
-            <w:tcW w:type="dxa" w:w="8640"/>
-            <w:shd w:val="clear" w:color="auto" w:fill="D6E4F0"/>
+            <w:tcW w:w="8640" w:type="dxa"/>
             <w:tcBorders>
               <w:top w:val="single" w:sz="4" w:space="0" w:color="D6E4F0"/>
               <w:left w:val="single" w:sz="4" w:space="0" w:color="D6E4F0"/>
               <w:bottom w:val="single" w:sz="4" w:space="0" w:color="D6E4F0"/>
               <w:right w:val="single" w:sz="4" w:space="0" w:color="D6E4F0"/>
             </w:tcBorders>
+            <w:shd w:val="clear" w:color="auto" w:fill="D6E4F0"/>
             <w:tcMar>
               <w:top w:w="100" w:type="dxa"/>
               <w:left w:w="100" w:type="dxa"/>
@@ -6679,17 +6779,13 @@
             </w:tcMar>
           </w:tcPr>
           <w:p>
-            <w:pPr>
-              <w:jc w:val="left"/>
-            </w:pPr>
             <w:r>
               <w:rPr>
                 <w:rFonts w:ascii="Calibri" w:hAnsi="Calibri"/>
                 <w:b/>
                 <w:color w:val="1F3864"/>
-                <w:sz w:val="22"/>
               </w:rPr>
-              <w:t xml:space="preserve">  Sharing and Access Logic</w:t>
+              <w:t xml:space="preserve">  Access Control &amp; Sharing Mechanics</w:t>
             </w:r>
           </w:p>
         </w:tc>
@@ -6701,38 +6797,286 @@
         <w:pStyle w:val="ListBullet"/>
       </w:pPr>
       <w:r>
+        <w:lastRenderedPageBreak/>
+        <w:t xml:space="preserve">Group membership is the object in the backend same kind share object </w:t>
+      </w:r>
+      <w:r>
+        <w:sym w:font="Wingdings" w:char="F0E0"/>
+      </w:r>
+      <w:r>
+        <w:t xml:space="preserve"> it stores the record of the group membershi</w:t>
+      </w:r>
+      <w:r>
+        <w:t>p</w:t>
+      </w:r>
+    </w:p>
+    <w:p>
+      <w:pPr>
+        <w:pStyle w:val="ListBullet"/>
+      </w:pPr>
+      <w:r>
         <w:rPr>
           <w:rFonts w:ascii="Calibri" w:hAnsi="Calibri"/>
           <w:color w:val="1F3864"/>
           <w:sz w:val="21"/>
-        </w:rPr>
-        <w:t>Indirect Access: Group membership does not grant access on its own; it serves as a target for Sharing Rules, Manual Sharing, and Apex Managed Sharing.</w:t>
-      </w:r>
-    </w:p>
-    <w:p>
-      <w:pPr>
-        <w:pStyle w:val="ListBullet"/>
-      </w:pPr>
+          <w:highlight w:val="yellow"/>
+        </w:rPr>
+        <w:t>Group membership does not grant access inherently;</w:t>
+      </w:r>
       <w:r>
         <w:rPr>
           <w:rFonts w:ascii="Calibri" w:hAnsi="Calibri"/>
           <w:color w:val="1F3864"/>
           <w:sz w:val="21"/>
         </w:rPr>
-        <w:t>Inherited Access: If Group A is nested within Group B, members of Group A inherit all record access granted to Group B.</w:t>
-      </w:r>
-    </w:p>
-    <w:p>
-      <w:pPr>
-        <w:pStyle w:val="ListBullet"/>
-      </w:pPr>
+        <w:t xml:space="preserve"> it serves as the 'Grantee' in Sharing Rules, Manual Sharing, or Apex Managed Sharing.</w:t>
+      </w:r>
+    </w:p>
+    <w:p>
+      <w:pPr>
+        <w:pStyle w:val="ListBullet"/>
+        <w:rPr>
+          <w:b/>
+          <w:bCs/>
+        </w:rPr>
+      </w:pPr>
+      <w:r>
+        <w:rPr>
+          <w:rFonts w:ascii="Calibri" w:hAnsi="Calibri"/>
+          <w:b/>
+          <w:bCs/>
+          <w:color w:val="1F3864"/>
+          <w:sz w:val="21"/>
+          <w:highlight w:val="yellow"/>
+        </w:rPr>
+        <w:t>Grant Access Using Hierarchies</w:t>
+      </w:r>
+      <w:r>
+        <w:rPr>
+          <w:rFonts w:ascii="Calibri" w:hAnsi="Calibri"/>
+          <w:b/>
+          <w:bCs/>
+          <w:color w:val="1F3864"/>
+          <w:sz w:val="21"/>
+        </w:rPr>
+        <w:t xml:space="preserve"> in public </w:t>
+      </w:r>
+      <w:proofErr w:type="gramStart"/>
+      <w:r>
+        <w:rPr>
+          <w:rFonts w:ascii="Calibri" w:hAnsi="Calibri"/>
+          <w:b/>
+          <w:bCs/>
+          <w:color w:val="1F3864"/>
+          <w:sz w:val="21"/>
+        </w:rPr>
+        <w:t>g</w:t>
+      </w:r>
+      <w:r>
+        <w:rPr>
+          <w:rFonts w:ascii="Calibri" w:hAnsi="Calibri"/>
+          <w:b/>
+          <w:bCs/>
+          <w:color w:val="1F3864"/>
+          <w:sz w:val="21"/>
+        </w:rPr>
+        <w:t xml:space="preserve">roup </w:t>
+      </w:r>
+      <w:r>
+        <w:rPr>
+          <w:rFonts w:ascii="Calibri" w:hAnsi="Calibri"/>
+          <w:b/>
+          <w:bCs/>
+          <w:color w:val="1F3864"/>
+          <w:sz w:val="21"/>
+          <w:highlight w:val="yellow"/>
+        </w:rPr>
+        <w:t>:</w:t>
+      </w:r>
+      <w:proofErr w:type="gramEnd"/>
+      <w:r>
+        <w:rPr>
+          <w:rFonts w:ascii="Calibri" w:hAnsi="Calibri"/>
+          <w:b/>
+          <w:bCs/>
+          <w:color w:val="1F3864"/>
+          <w:sz w:val="21"/>
+          <w:highlight w:val="yellow"/>
+        </w:rPr>
+        <w:t xml:space="preserve"> </w:t>
+      </w:r>
+    </w:p>
+    <w:p>
+      <w:pPr>
+        <w:pStyle w:val="ListBullet"/>
+        <w:tabs>
+          <w:tab w:val="clear" w:pos="360"/>
+          <w:tab w:val="num" w:pos="720"/>
+        </w:tabs>
+        <w:ind w:left="720"/>
+        <w:rPr>
+          <w:b/>
+          <w:bCs/>
+        </w:rPr>
+      </w:pPr>
+      <w:r>
+        <w:rPr>
+          <w:rFonts w:ascii="Calibri" w:hAnsi="Calibri"/>
+          <w:b/>
+          <w:bCs/>
+          <w:color w:val="1F3864"/>
+          <w:sz w:val="21"/>
+          <w:highlight w:val="yellow"/>
+        </w:rPr>
+        <w:t>When disabled for a Public Group</w:t>
+      </w:r>
+      <w:r>
+        <w:rPr>
+          <w:rFonts w:ascii="Calibri" w:hAnsi="Calibri"/>
+          <w:b/>
+          <w:bCs/>
+          <w:color w:val="1F3864"/>
+          <w:sz w:val="21"/>
+        </w:rPr>
+        <w:t xml:space="preserve">, </w:t>
+      </w:r>
+      <w:r>
+        <w:rPr>
+          <w:rFonts w:ascii="Calibri" w:hAnsi="Calibri"/>
+          <w:b/>
+          <w:bCs/>
+          <w:color w:val="1F3864"/>
+          <w:sz w:val="21"/>
+          <w:highlight w:val="yellow"/>
+        </w:rPr>
+        <w:t>record access shared with that group remains exclusive to the members,</w:t>
+      </w:r>
+      <w:r>
+        <w:rPr>
+          <w:rFonts w:ascii="Calibri" w:hAnsi="Calibri"/>
+          <w:b/>
+          <w:bCs/>
+          <w:color w:val="1F3864"/>
+          <w:sz w:val="21"/>
+        </w:rPr>
+        <w:t xml:space="preserve"> </w:t>
+      </w:r>
+    </w:p>
+    <w:p>
+      <w:pPr>
+        <w:pStyle w:val="ListBullet"/>
+        <w:tabs>
+          <w:tab w:val="clear" w:pos="360"/>
+          <w:tab w:val="num" w:pos="1080"/>
+        </w:tabs>
+        <w:ind w:left="1080"/>
+        <w:rPr>
+          <w:b/>
+          <w:bCs/>
+        </w:rPr>
+      </w:pPr>
+      <w:r>
+        <w:rPr>
+          <w:rFonts w:ascii="Calibri" w:hAnsi="Calibri"/>
+          <w:b/>
+          <w:bCs/>
+          <w:color w:val="1F3864"/>
+          <w:sz w:val="21"/>
+        </w:rPr>
+        <w:t xml:space="preserve">Note </w:t>
+      </w:r>
+      <w:r>
+        <w:rPr>
+          <w:rFonts w:ascii="Calibri" w:hAnsi="Calibri"/>
+          <w:b/>
+          <w:bCs/>
+          <w:color w:val="1F3864"/>
+          <w:sz w:val="21"/>
+        </w:rPr>
+        <w:sym w:font="Wingdings" w:char="F0E0"/>
+      </w:r>
+      <w:r>
+        <w:rPr>
+          <w:rFonts w:ascii="Calibri" w:hAnsi="Calibri"/>
+          <w:b/>
+          <w:bCs/>
+          <w:color w:val="1F3864"/>
+          <w:sz w:val="21"/>
+        </w:rPr>
+        <w:t xml:space="preserve"> preventing upward inheritance via the Role Hierarchy.</w:t>
+      </w:r>
+    </w:p>
+    <w:p>
+      <w:pPr>
+        <w:pStyle w:val="ListBullet"/>
+      </w:pPr>
+      <w:r>
+        <w:rPr>
+          <w:rFonts w:ascii="Calibri" w:hAnsi="Calibri"/>
+          <w:b/>
+          <w:bCs/>
+          <w:color w:val="0070C0"/>
+          <w:sz w:val="21"/>
+        </w:rPr>
+        <w:t>Groups facilitate 'Arbitrary Sharing'</w:t>
+      </w:r>
+      <w:r>
+        <w:rPr>
+          <w:rFonts w:ascii="Calibri" w:hAnsi="Calibri"/>
+          <w:color w:val="0070C0"/>
+          <w:sz w:val="21"/>
+        </w:rPr>
+        <w:t xml:space="preserve"> </w:t>
+      </w:r>
+      <w:r>
+        <w:rPr>
+          <w:rFonts w:ascii="Calibri" w:hAnsi="Calibri"/>
+          <w:color w:val="0070C0"/>
+          <w:sz w:val="21"/>
+        </w:rPr>
+        <w:sym w:font="Wingdings" w:char="F0E0"/>
+      </w:r>
+      <w:r>
+        <w:rPr>
+          <w:rFonts w:ascii="Calibri" w:hAnsi="Calibri"/>
+          <w:color w:val="0070C0"/>
+          <w:sz w:val="21"/>
+        </w:rPr>
+        <w:t xml:space="preserve"> sharing the records </w:t>
+      </w:r>
+      <w:r>
+        <w:rPr>
+          <w:rFonts w:ascii="Calibri" w:hAnsi="Calibri"/>
+          <w:color w:val="0070C0"/>
+          <w:sz w:val="21"/>
+        </w:rPr>
+        <w:t xml:space="preserve">by using manual sharing or </w:t>
+      </w:r>
+      <w:proofErr w:type="spellStart"/>
+      <w:r>
+        <w:rPr>
+          <w:rFonts w:ascii="Calibri" w:hAnsi="Calibri"/>
+          <w:color w:val="0070C0"/>
+          <w:sz w:val="21"/>
+        </w:rPr>
+        <w:t>adhoc</w:t>
+      </w:r>
+      <w:proofErr w:type="spellEnd"/>
+      <w:r>
+        <w:rPr>
+          <w:rFonts w:ascii="Calibri" w:hAnsi="Calibri"/>
+          <w:color w:val="0070C0"/>
+          <w:sz w:val="21"/>
+        </w:rPr>
+        <w:t xml:space="preserve"> sharing</w:t>
+      </w:r>
       <w:r>
         <w:rPr>
           <w:rFonts w:ascii="Calibri" w:hAnsi="Calibri"/>
           <w:color w:val="1F3864"/>
           <w:sz w:val="21"/>
         </w:rPr>
-        <w:t>Non-Hierarchical Groups: By unchecking 'Grant Access Using Hierarchies' on the Group, access is restricted strictly to members, bypassing the manager/executive hierarchy.</w:t>
+        <w:t>, allowing architects to grant access to cross-functional teams that do not share a common manager or branch in the Role Hierarchy.</w:t>
       </w:r>
     </w:p>
     <w:p>
@@ -6745,28 +7089,41 @@
           <w:color w:val="1F3864"/>
           <w:sz w:val="21"/>
         </w:rPr>
-        <w:t>Folder and Library Security: Used to manage access to Report Folders, Dashboard Folders, and Salesforce Files (Libraries).</w:t>
-      </w:r>
-    </w:p>
-    <w:p>
-      <w:pPr>
-        <w:pStyle w:val="ListBullet"/>
-      </w:pPr>
+        <w:t xml:space="preserve">Apex Sharing: </w:t>
+      </w:r>
+      <w:r>
+        <w:rPr>
+          <w:rFonts w:ascii="Calibri" w:hAnsi="Calibri"/>
+          <w:b/>
+          <w:bCs/>
+          <w:color w:val="0070C0"/>
+          <w:sz w:val="21"/>
+        </w:rPr>
+        <w:t>Group IDs</w:t>
+      </w:r>
+      <w:r>
+        <w:rPr>
+          <w:rFonts w:ascii="Calibri" w:hAnsi="Calibri"/>
+          <w:color w:val="0070C0"/>
+          <w:sz w:val="21"/>
+        </w:rPr>
+        <w:t xml:space="preserve"> </w:t>
+      </w:r>
       <w:r>
         <w:rPr>
           <w:rFonts w:ascii="Calibri" w:hAnsi="Calibri"/>
           <w:color w:val="1F3864"/>
           <w:sz w:val="21"/>
         </w:rPr>
-        <w:t>Apex Sharing: Use the 'UserOrGroupId' field on Share objects (e.g., AccountShare, CustomObject__Share) to programmatically grant access to a group.</w:t>
+        <w:t>are utilized as the 'UserOrGroupId' field in Share objects (e.g., AccountShare, CustomObject__Share).</w:t>
       </w:r>
     </w:p>
     <w:p/>
     <w:tbl>
       <w:tblPr>
         <w:tblStyle w:val="TableGrid"/>
-        <w:tblW w:type="auto" w:w="0"/>
-        <w:tblLook w:firstColumn="1" w:firstRow="1" w:lastColumn="0" w:lastRow="0" w:noHBand="0" w:noVBand="1" w:val="04A0"/>
+        <w:tblW w:w="0" w:type="auto"/>
+        <w:tblLook w:val="04A0" w:firstRow="1" w:lastRow="0" w:firstColumn="1" w:lastColumn="0" w:noHBand="0" w:noVBand="1"/>
       </w:tblPr>
       <w:tblGrid>
         <w:gridCol w:w="8640"/>
@@ -6774,14 +7131,14 @@
       <w:tr>
         <w:tc>
           <w:tcPr>
-            <w:tcW w:type="dxa" w:w="8640"/>
-            <w:shd w:val="clear" w:color="auto" w:fill="D6E4F0"/>
+            <w:tcW w:w="8640" w:type="dxa"/>
             <w:tcBorders>
               <w:top w:val="single" w:sz="4" w:space="0" w:color="D6E4F0"/>
               <w:left w:val="single" w:sz="4" w:space="0" w:color="D6E4F0"/>
               <w:bottom w:val="single" w:sz="4" w:space="0" w:color="D6E4F0"/>
               <w:right w:val="single" w:sz="4" w:space="0" w:color="D6E4F0"/>
             </w:tcBorders>
+            <w:shd w:val="clear" w:color="auto" w:fill="D6E4F0"/>
             <w:tcMar>
               <w:top w:w="100" w:type="dxa"/>
               <w:left w:w="100" w:type="dxa"/>
@@ -6790,17 +7147,13 @@
             </w:tcMar>
           </w:tcPr>
           <w:p>
-            <w:pPr>
-              <w:jc w:val="left"/>
-            </w:pPr>
             <w:r>
               <w:rPr>
                 <w:rFonts w:ascii="Calibri" w:hAnsi="Calibri"/>
                 <w:b/>
                 <w:color w:val="1F3864"/>
-                <w:sz w:val="22"/>
               </w:rPr>
-              <w:t xml:space="preserve">  Architectural Performance and Scalability</w:t>
+              <w:t xml:space="preserve">  Performance &amp; Calculation Engine</w:t>
             </w:r>
           </w:p>
         </w:tc>
@@ -6814,23 +7167,20 @@
       <w:r>
         <w:rPr>
           <w:rFonts w:ascii="Calibri" w:hAnsi="Calibri"/>
+          <w:b/>
+          <w:bCs/>
           <w:color w:val="1F3864"/>
           <w:sz w:val="21"/>
         </w:rPr>
-        <w:t>Membership Calculation: Salesforce performs complex calculations (the 'Sharing Griddle') to determine access when groups change; large-scale changes can trigger long-running background jobs.</w:t>
-      </w:r>
-    </w:p>
-    <w:p>
-      <w:pPr>
-        <w:pStyle w:val="ListBullet"/>
-      </w:pPr>
+        <w:t>Membership Recalculation:</w:t>
+      </w:r>
       <w:r>
         <w:rPr>
           <w:rFonts w:ascii="Calibri" w:hAnsi="Calibri"/>
           <w:color w:val="1F3864"/>
           <w:sz w:val="21"/>
         </w:rPr>
-        <w:t>Nesting Limits: Technical recommendation is to avoid nesting more than 5 levels deep to prevent performance degradation during access evaluation.</w:t>
+        <w:t xml:space="preserve"> Adding or removing members triggers a background process to recalculate the Group Maintenance tables and Sharing rows.</w:t>
       </w:r>
     </w:p>
     <w:p>
@@ -6842,29 +7192,110 @@
           <w:rFonts w:ascii="Calibri" w:hAnsi="Calibri"/>
           <w:color w:val="1F3864"/>
           <w:sz w:val="21"/>
-        </w:rPr>
-        <w:t>Organization Limits: Salesforce recommends a maximum of 100,000 Public Groups per organization for optimal maintenance.</w:t>
-      </w:r>
-    </w:p>
-    <w:p>
-      <w:pPr>
-        <w:pStyle w:val="ListBullet"/>
-      </w:pPr>
+          <w:highlight w:val="yellow"/>
+        </w:rPr>
+        <w:t>Nesting Depth</w:t>
+      </w:r>
       <w:r>
         <w:rPr>
           <w:rFonts w:ascii="Calibri" w:hAnsi="Calibri"/>
           <w:color w:val="1F3864"/>
           <w:sz w:val="21"/>
         </w:rPr>
-        <w:t>Deferred Sharing: In Large Data Volume (LDV) environments, administrators can use 'Deferred Sharing Calculation' to pause group membership processing during bulk data loads.</w:t>
-      </w:r>
-    </w:p>
-    <w:p/>
+        <w:t xml:space="preserve">: Salesforce recommends a </w:t>
+      </w:r>
+      <w:r>
+        <w:rPr>
+          <w:rFonts w:ascii="Calibri" w:hAnsi="Calibri"/>
+          <w:color w:val="1F3864"/>
+          <w:sz w:val="21"/>
+          <w:highlight w:val="yellow"/>
+        </w:rPr>
+        <w:t>maximum nesting depth of five levels</w:t>
+      </w:r>
+      <w:r>
+        <w:rPr>
+          <w:rFonts w:ascii="Calibri" w:hAnsi="Calibri"/>
+          <w:color w:val="1F3864"/>
+          <w:sz w:val="21"/>
+        </w:rPr>
+        <w:t xml:space="preserve"> to prevent performance degradation during membership resolution.</w:t>
+      </w:r>
+    </w:p>
+    <w:p>
+      <w:pPr>
+        <w:pStyle w:val="ListBullet"/>
+      </w:pPr>
+      <w:r>
+        <w:rPr>
+          <w:rFonts w:ascii="Calibri" w:hAnsi="Calibri"/>
+          <w:color w:val="1F3864"/>
+          <w:sz w:val="21"/>
+          <w:highlight w:val="yellow"/>
+        </w:rPr>
+        <w:t>Scalability Limits</w:t>
+      </w:r>
+      <w:r>
+        <w:rPr>
+          <w:rFonts w:ascii="Calibri" w:hAnsi="Calibri"/>
+          <w:color w:val="1F3864"/>
+          <w:sz w:val="21"/>
+        </w:rPr>
+        <w:t xml:space="preserve">: Organizations should aim to </w:t>
+      </w:r>
+      <w:r>
+        <w:rPr>
+          <w:rFonts w:ascii="Calibri" w:hAnsi="Calibri"/>
+          <w:color w:val="1F3864"/>
+          <w:sz w:val="21"/>
+          <w:highlight w:val="yellow"/>
+        </w:rPr>
+        <w:t>stay under 100,000 Public Groups</w:t>
+      </w:r>
+      <w:r>
+        <w:rPr>
+          <w:rFonts w:ascii="Calibri" w:hAnsi="Calibri"/>
+          <w:color w:val="1F3864"/>
+          <w:sz w:val="21"/>
+        </w:rPr>
+        <w:t xml:space="preserve"> to maintain optimal system performance.</w:t>
+      </w:r>
+    </w:p>
+    <w:p>
+      <w:pPr>
+        <w:pStyle w:val="ListBullet"/>
+      </w:pPr>
+      <w:r>
+        <w:rPr>
+          <w:rFonts w:ascii="Calibri" w:hAnsi="Calibri"/>
+          <w:color w:val="1F3864"/>
+          <w:sz w:val="21"/>
+        </w:rPr>
+        <w:t xml:space="preserve">Deferred Sharing: In high-volume environments, </w:t>
+      </w:r>
+      <w:r>
+        <w:rPr>
+          <w:rFonts w:ascii="Calibri" w:hAnsi="Calibri"/>
+          <w:color w:val="1F3864"/>
+          <w:sz w:val="21"/>
+          <w:highlight w:val="yellow"/>
+        </w:rPr>
+        <w:t>frequent changes to large groups can lead to row-locking or long-running recalculations;</w:t>
+      </w:r>
+      <w:r>
+        <w:rPr>
+          <w:rFonts w:ascii="Calibri" w:hAnsi="Calibri"/>
+          <w:color w:val="1F3864"/>
+          <w:sz w:val="21"/>
+        </w:rPr>
+        <w:t xml:space="preserve"> architects should consider 'Defer Sharing Calculations' during bulk updates.</w:t>
+      </w:r>
+    </w:p>
     <w:tbl>
       <w:tblPr>
         <w:tblStyle w:val="TableGrid"/>
-        <w:tblW w:type="auto" w:w="0"/>
-        <w:tblLook w:firstColumn="1" w:firstRow="1" w:lastColumn="0" w:lastRow="0" w:noHBand="0" w:noVBand="1" w:val="04A0"/>
+        <w:tblW w:w="0" w:type="auto"/>
+        <w:tblLook w:val="04A0" w:firstRow="1" w:lastRow="0" w:firstColumn="1" w:lastColumn="0" w:noHBand="0" w:noVBand="1"/>
       </w:tblPr>
       <w:tblGrid>
         <w:gridCol w:w="8640"/>
@@ -6872,14 +7303,14 @@
       <w:tr>
         <w:tc>
           <w:tcPr>
-            <w:tcW w:type="dxa" w:w="8640"/>
-            <w:shd w:val="clear" w:color="auto" w:fill="E2EFDA"/>
+            <w:tcW w:w="8640" w:type="dxa"/>
             <w:tcBorders>
               <w:top w:val="single" w:sz="4" w:space="0" w:color="E2EFDA"/>
               <w:left w:val="single" w:sz="4" w:space="0" w:color="E2EFDA"/>
               <w:bottom w:val="single" w:sz="4" w:space="0" w:color="E2EFDA"/>
               <w:right w:val="single" w:sz="4" w:space="0" w:color="E2EFDA"/>
             </w:tcBorders>
+            <w:shd w:val="clear" w:color="auto" w:fill="E2EFDA"/>
             <w:tcMar>
               <w:top w:w="100" w:type="dxa"/>
               <w:left w:w="100" w:type="dxa"/>
@@ -6888,17 +7319,31 @@
             </w:tcMar>
           </w:tcPr>
           <w:p>
-            <w:pPr>
-              <w:jc w:val="left"/>
-            </w:pPr>
             <w:r>
               <w:rPr>
                 <w:rFonts w:ascii="Calibri" w:hAnsi="Calibri"/>
                 <w:b/>
                 <w:color w:val="375623"/>
-                <w:sz w:val="22"/>
               </w:rPr>
-              <w:t xml:space="preserve">  ✔  Best Practices</w:t>
+              <w:t xml:space="preserve">  </w:t>
+            </w:r>
+            <w:proofErr w:type="gramStart"/>
+            <w:r>
+              <w:rPr>
+                <w:rFonts w:ascii="Calibri" w:hAnsi="Calibri"/>
+                <w:b/>
+                <w:color w:val="375623"/>
+              </w:rPr>
+              <w:t>✔  Best</w:t>
+            </w:r>
+            <w:proofErr w:type="gramEnd"/>
+            <w:r>
+              <w:rPr>
+                <w:rFonts w:ascii="Calibri" w:hAnsi="Calibri"/>
+                <w:b/>
+                <w:color w:val="375623"/>
+              </w:rPr>
+              <w:t xml:space="preserve"> Practices</w:t>
             </w:r>
           </w:p>
         </w:tc>
@@ -6908,6 +7353,9 @@
     <w:p>
       <w:pPr>
         <w:pStyle w:val="ListBullet"/>
+        <w:rPr>
+          <w:highlight w:val="yellow"/>
+        </w:rPr>
       </w:pPr>
       <w:r>
         <w:rPr>
@@ -6915,20 +7363,16 @@
           <w:color w:val="375623"/>
           <w:sz w:val="21"/>
         </w:rPr>
-        <w:t>Prefer adding Roles or Roles and Subordinates to Groups instead of individual Users to reduce administrative overhead.</w:t>
-      </w:r>
-    </w:p>
-    <w:p>
-      <w:pPr>
-        <w:pStyle w:val="ListBullet"/>
-      </w:pPr>
+        <w:t xml:space="preserve">Use Public Groups for shared access needs </w:t>
+      </w:r>
       <w:r>
         <w:rPr>
           <w:rFonts w:ascii="Calibri" w:hAnsi="Calibri"/>
           <w:color w:val="375623"/>
           <w:sz w:val="21"/>
-        </w:rPr>
-        <w:t>Limit group nesting to 5 levels to avoid 'Skimmer' process performance issues and complex troubleshooting.</w:t>
+          <w:highlight w:val="yellow"/>
+        </w:rPr>
+        <w:t>involving 5 or more users to reduce the overhead of individual manual sharing.</w:t>
       </w:r>
     </w:p>
     <w:p>
@@ -6940,42 +7384,110 @@
           <w:rFonts w:ascii="Calibri" w:hAnsi="Calibri"/>
           <w:color w:val="375623"/>
           <w:sz w:val="21"/>
-        </w:rPr>
-        <w:t>Use descriptive naming conventions to distinguish between 'Functional Groups' (e.g., HR_Admins) and 'Access Groups' (e.g., Record_Viewers).</w:t>
-      </w:r>
-    </w:p>
-    <w:p>
-      <w:pPr>
-        <w:pStyle w:val="ListBullet"/>
-      </w:pPr>
+          <w:highlight w:val="yellow"/>
+        </w:rPr>
+        <w:t>Minimize nesting depth</w:t>
+      </w:r>
       <w:r>
         <w:rPr>
           <w:rFonts w:ascii="Calibri" w:hAnsi="Calibri"/>
           <w:color w:val="375623"/>
           <w:sz w:val="21"/>
         </w:rPr>
-        <w:t>Disable 'Grant Access Using Hierarchies' for highly sensitive data groups to ensure true data isolation.</w:t>
-      </w:r>
-    </w:p>
-    <w:p>
-      <w:pPr>
-        <w:pStyle w:val="ListBullet"/>
-      </w:pPr>
+        <w:t xml:space="preserve"> </w:t>
+      </w:r>
       <w:r>
         <w:rPr>
           <w:rFonts w:ascii="Calibri" w:hAnsi="Calibri"/>
           <w:color w:val="375623"/>
           <w:sz w:val="21"/>
-        </w:rPr>
-        <w:t>Regularly audit the 'GroupMember' object to identify and remove redundant or orphaned memberships.</w:t>
-      </w:r>
-    </w:p>
-    <w:p/>
+          <w:highlight w:val="yellow"/>
+        </w:rPr>
+        <w:t>to 2 or 3 levels</w:t>
+      </w:r>
+      <w:r>
+        <w:rPr>
+          <w:rFonts w:ascii="Calibri" w:hAnsi="Calibri"/>
+          <w:color w:val="375623"/>
+          <w:sz w:val="21"/>
+        </w:rPr>
+        <w:t xml:space="preserve"> where possible to ensure faster sharing recalculation times.</w:t>
+      </w:r>
+    </w:p>
+    <w:p>
+      <w:pPr>
+        <w:pStyle w:val="ListBullet"/>
+      </w:pPr>
+      <w:r>
+        <w:rPr>
+          <w:rFonts w:ascii="Calibri" w:hAnsi="Calibri"/>
+          <w:color w:val="375623"/>
+          <w:sz w:val="21"/>
+          <w:highlight w:val="yellow"/>
+        </w:rPr>
+        <w:t>Disable 'Grant Access Using Hierarchies' for groups handling sensitive data to isolate visibility from upper management</w:t>
+      </w:r>
+      <w:r>
+        <w:rPr>
+          <w:rFonts w:ascii="Calibri" w:hAnsi="Calibri"/>
+          <w:color w:val="375623"/>
+          <w:sz w:val="21"/>
+        </w:rPr>
+        <w:t xml:space="preserve"> if required.</w:t>
+      </w:r>
+    </w:p>
+    <w:p>
+      <w:pPr>
+        <w:pStyle w:val="ListBullet"/>
+        <w:rPr>
+          <w:highlight w:val="yellow"/>
+        </w:rPr>
+      </w:pPr>
+      <w:r>
+        <w:rPr>
+          <w:rFonts w:ascii="Calibri" w:hAnsi="Calibri"/>
+          <w:color w:val="375623"/>
+          <w:sz w:val="21"/>
+          <w:highlight w:val="yellow"/>
+        </w:rPr>
+        <w:t>Standardize naming conventions</w:t>
+      </w:r>
+      <w:r>
+        <w:rPr>
+          <w:rFonts w:ascii="Calibri" w:hAnsi="Calibri"/>
+          <w:color w:val="375623"/>
+          <w:sz w:val="21"/>
+        </w:rPr>
+        <w:t xml:space="preserve"> for Public Groups to distinguish between those </w:t>
+      </w:r>
+      <w:r>
+        <w:rPr>
+          <w:rFonts w:ascii="Calibri" w:hAnsi="Calibri"/>
+          <w:color w:val="375623"/>
+          <w:sz w:val="21"/>
+          <w:highlight w:val="yellow"/>
+        </w:rPr>
+        <w:t>used for Sharing Rules, Folder Access, and Approval Processes.</w:t>
+      </w:r>
+    </w:p>
+    <w:p>
+      <w:pPr>
+        <w:pStyle w:val="ListBullet"/>
+      </w:pPr>
+      <w:r>
+        <w:rPr>
+          <w:rFonts w:ascii="Calibri" w:hAnsi="Calibri"/>
+          <w:color w:val="375623"/>
+          <w:sz w:val="21"/>
+        </w:rPr>
+        <w:t>Prioritize adding 'Roles' or 'Territories' to groups instead of individual users to reduce administrative maintenance as personnel change.</w:t>
+      </w:r>
+    </w:p>
     <w:tbl>
       <w:tblPr>
         <w:tblStyle w:val="TableGrid"/>
-        <w:tblW w:type="auto" w:w="0"/>
-        <w:tblLook w:firstColumn="1" w:firstRow="1" w:lastColumn="0" w:lastRow="0" w:noHBand="0" w:noVBand="1" w:val="04A0"/>
+        <w:tblW w:w="0" w:type="auto"/>
+        <w:tblLook w:val="04A0" w:firstRow="1" w:lastRow="0" w:firstColumn="1" w:lastColumn="0" w:noHBand="0" w:noVBand="1"/>
       </w:tblPr>
       <w:tblGrid>
         <w:gridCol w:w="8640"/>
@@ -6983,14 +7495,14 @@
       <w:tr>
         <w:tc>
           <w:tcPr>
-            <w:tcW w:type="dxa" w:w="8640"/>
-            <w:shd w:val="clear" w:color="auto" w:fill="FCE4D6"/>
+            <w:tcW w:w="8640" w:type="dxa"/>
             <w:tcBorders>
               <w:top w:val="single" w:sz="4" w:space="0" w:color="FCE4D6"/>
               <w:left w:val="single" w:sz="4" w:space="0" w:color="FCE4D6"/>
               <w:bottom w:val="single" w:sz="4" w:space="0" w:color="FCE4D6"/>
               <w:right w:val="single" w:sz="4" w:space="0" w:color="FCE4D6"/>
             </w:tcBorders>
+            <w:shd w:val="clear" w:color="auto" w:fill="FCE4D6"/>
             <w:tcMar>
               <w:top w:w="100" w:type="dxa"/>
               <w:left w:w="100" w:type="dxa"/>
@@ -6999,18 +7511,25 @@
             </w:tcMar>
           </w:tcPr>
           <w:p>
-            <w:pPr>
-              <w:jc w:val="left"/>
-            </w:pPr>
             <w:r>
               <w:rPr>
                 <w:rFonts w:ascii="Calibri" w:hAnsi="Calibri"/>
                 <w:b/>
                 <w:color w:val="833C00"/>
-                <w:sz w:val="22"/>
               </w:rPr>
-              <w:t xml:space="preserve">  ⚠  Limitations</w:t>
+              <w:lastRenderedPageBreak/>
+              <w:t xml:space="preserve">  </w:t>
             </w:r>
+            <w:proofErr w:type="gramStart"/>
+            <w:r>
+              <w:rPr>
+                <w:rFonts w:ascii="Calibri" w:hAnsi="Calibri"/>
+                <w:b/>
+                <w:color w:val="833C00"/>
+              </w:rPr>
+              <w:t>⚠  Limitations</w:t>
+            </w:r>
+            <w:proofErr w:type="gramEnd"/>
           </w:p>
         </w:tc>
       </w:tr>
@@ -7026,7 +7545,7 @@
           <w:color w:val="833C00"/>
           <w:sz w:val="21"/>
         </w:rPr>
-        <w:t>Public Groups cannot be used to grant Object-Level permissions (CRUD); they only influence Record-Level access (Sharing).</w:t>
+        <w:t>Maximum recommended nesting level is 5.</w:t>
       </w:r>
     </w:p>
     <w:p>
@@ -7039,7 +7558,7 @@
           <w:color w:val="833C00"/>
           <w:sz w:val="21"/>
         </w:rPr>
-        <w:t>Excessive nesting and large group counts can lead to significant delays in record access recalculation.</w:t>
+        <w:t>Hard limit of 100,000 public groups per organization.</w:t>
       </w:r>
     </w:p>
     <w:p>
@@ -7052,7 +7571,7 @@
           <w:color w:val="833C00"/>
           <w:sz w:val="21"/>
         </w:rPr>
-        <w:t>Membership changes for large groups may cause row-lock contention on the 'Group' and 'GroupMember' objects.</w:t>
+        <w:t>Excessive group membership changes in large orgs can cause 'Sharing Lead' lock contention.</w:t>
       </w:r>
     </w:p>
     <w:p>
@@ -7065,15 +7584,15 @@
           <w:color w:val="833C00"/>
           <w:sz w:val="21"/>
         </w:rPr>
-        <w:t>Personal Groups are distinct from Public Groups and cannot be shared or managed by administrators.</w:t>
+        <w:t>Directly sharing records with very large public groups (containing most of the org) can impact UI performance for record access checks.</w:t>
       </w:r>
     </w:p>
     <w:p/>
     <w:tbl>
       <w:tblPr>
         <w:tblStyle w:val="TableGrid"/>
-        <w:tblW w:type="auto" w:w="0"/>
-        <w:tblLook w:firstColumn="1" w:firstRow="1" w:lastColumn="0" w:lastRow="0" w:noHBand="0" w:noVBand="1" w:val="04A0"/>
+        <w:tblW w:w="0" w:type="auto"/>
+        <w:tblLook w:val="04A0" w:firstRow="1" w:lastRow="0" w:firstColumn="1" w:lastColumn="0" w:noHBand="0" w:noVBand="1"/>
       </w:tblPr>
       <w:tblGrid>
         <w:gridCol w:w="8640"/>
@@ -7081,14 +7600,14 @@
       <w:tr>
         <w:tc>
           <w:tcPr>
-            <w:tcW w:type="dxa" w:w="8640"/>
-            <w:shd w:val="clear" w:color="auto" w:fill="2E75B6"/>
+            <w:tcW w:w="8640" w:type="dxa"/>
             <w:tcBorders>
               <w:top w:val="single" w:sz="4" w:space="0" w:color="2E75B6"/>
               <w:left w:val="single" w:sz="4" w:space="0" w:color="2E75B6"/>
               <w:bottom w:val="single" w:sz="4" w:space="0" w:color="2E75B6"/>
               <w:right w:val="single" w:sz="4" w:space="0" w:color="2E75B6"/>
             </w:tcBorders>
+            <w:shd w:val="clear" w:color="auto" w:fill="2E75B6"/>
             <w:tcMar>
               <w:top w:w="100" w:type="dxa"/>
               <w:left w:w="100" w:type="dxa"/>
@@ -7097,9 +7616,6 @@
             </w:tcMar>
           </w:tcPr>
           <w:p>
-            <w:pPr>
-              <w:jc w:val="left"/>
-            </w:pPr>
             <w:r>
               <w:rPr>
                 <w:rFonts w:ascii="Calibri" w:hAnsi="Calibri"/>
@@ -7117,8 +7633,8 @@
     <w:tbl>
       <w:tblPr>
         <w:tblStyle w:val="TableGrid"/>
-        <w:tblW w:type="auto" w:w="0"/>
-        <w:tblLook w:firstColumn="1" w:firstRow="1" w:lastColumn="0" w:lastRow="0" w:noHBand="0" w:noVBand="1" w:val="04A0"/>
+        <w:tblW w:w="0" w:type="auto"/>
+        <w:tblLook w:val="04A0" w:firstRow="1" w:lastRow="0" w:firstColumn="1" w:lastColumn="0" w:noHBand="0" w:noVBand="1"/>
       </w:tblPr>
       <w:tblGrid>
         <w:gridCol w:w="8640"/>
@@ -7126,26 +7642,23 @@
       <w:tr>
         <w:tc>
           <w:tcPr>
-            <w:tcW w:type="dxa" w:w="8640"/>
-            <w:shd w:val="clear" w:color="auto" w:fill="EBF3FB"/>
+            <w:tcW w:w="8640" w:type="dxa"/>
             <w:tcBorders>
               <w:top w:val="single" w:sz="18" w:space="0" w:color="2E75B6"/>
               <w:left w:val="single" w:sz="18" w:space="0" w:color="2E75B6"/>
               <w:bottom w:val="single" w:sz="18" w:space="0" w:color="2E75B6"/>
               <w:right w:val="single" w:sz="18" w:space="0" w:color="2E75B6"/>
             </w:tcBorders>
+            <w:shd w:val="clear" w:color="auto" w:fill="EBF3FB"/>
           </w:tcPr>
           <w:p>
-            <w:pPr>
-              <w:jc w:val="left"/>
-            </w:pPr>
             <w:r>
               <w:rPr>
                 <w:rFonts w:ascii="Consolas" w:hAnsi="Consolas"/>
                 <w:color w:val="1F3864"/>
                 <w:sz w:val="20"/>
               </w:rPr>
-              <w:t>[User / Role / Territory]  →  [GroupMember Record]  →  [Public Group] &lt;- [Sharing Tool: Sharing Rule / Apex / Manual] &lt;- [Target Record (e.g., AccountShare)]</w:t>
+              <w:t>Public Group [Container] --&gt; (Contains: Users, Roles, Territories, Nested Groups) --&gt; (Used By: Sharing Rules, Manual Sharing, Folder Access, Apex Sharing) --&gt; (Controls: Access to Records [Account, Case, Custom Objects])</w:t>
             </w:r>
           </w:p>
         </w:tc>
@@ -7155,8 +7668,8 @@
     <w:tbl>
       <w:tblPr>
         <w:tblStyle w:val="TableGrid"/>
-        <w:tblW w:type="auto" w:w="0"/>
-        <w:tblLook w:firstColumn="1" w:firstRow="1" w:lastColumn="0" w:lastRow="0" w:noHBand="0" w:noVBand="1" w:val="04A0"/>
+        <w:tblW w:w="0" w:type="auto"/>
+        <w:tblLook w:val="04A0" w:firstRow="1" w:lastRow="0" w:firstColumn="1" w:lastColumn="0" w:noHBand="0" w:noVBand="1"/>
       </w:tblPr>
       <w:tblGrid>
         <w:gridCol w:w="8640"/>
@@ -7164,14 +7677,14 @@
       <w:tr>
         <w:tc>
           <w:tcPr>
-            <w:tcW w:type="dxa" w:w="8640"/>
-            <w:shd w:val="clear" w:color="auto" w:fill="FFF2CC"/>
+            <w:tcW w:w="8640" w:type="dxa"/>
             <w:tcBorders>
               <w:top w:val="single" w:sz="4" w:space="0" w:color="FFF2CC"/>
               <w:left w:val="single" w:sz="4" w:space="0" w:color="FFF2CC"/>
               <w:bottom w:val="single" w:sz="4" w:space="0" w:color="FFF2CC"/>
               <w:right w:val="single" w:sz="4" w:space="0" w:color="FFF2CC"/>
             </w:tcBorders>
+            <w:shd w:val="clear" w:color="auto" w:fill="FFF2CC"/>
             <w:tcMar>
               <w:top w:w="100" w:type="dxa"/>
               <w:left w:w="100" w:type="dxa"/>
@@ -7180,15 +7693,11 @@
             </w:tcMar>
           </w:tcPr>
           <w:p>
-            <w:pPr>
-              <w:jc w:val="left"/>
-            </w:pPr>
             <w:r>
               <w:rPr>
                 <w:rFonts w:ascii="Calibri" w:hAnsi="Calibri"/>
                 <w:b/>
                 <w:color w:val="7F6000"/>
-                <w:sz w:val="22"/>
               </w:rPr>
               <w:t xml:space="preserve">  Example</w:t>
             </w:r>
@@ -7200,8 +7709,8 @@
     <w:tbl>
       <w:tblPr>
         <w:tblStyle w:val="TableGrid"/>
-        <w:tblW w:type="auto" w:w="0"/>
-        <w:tblLook w:firstColumn="1" w:firstRow="1" w:lastColumn="0" w:lastRow="0" w:noHBand="0" w:noVBand="1" w:val="04A0"/>
+        <w:tblW w:w="0" w:type="auto"/>
+        <w:tblLook w:val="04A0" w:firstRow="1" w:lastRow="0" w:firstColumn="1" w:lastColumn="0" w:noHBand="0" w:noVBand="1"/>
       </w:tblPr>
       <w:tblGrid>
         <w:gridCol w:w="8640"/>
@@ -7209,26 +7718,3103 @@
       <w:tr>
         <w:tc>
           <w:tcPr>
-            <w:tcW w:type="dxa" w:w="8640"/>
-            <w:shd w:val="clear" w:color="auto" w:fill="FFF2CC"/>
+            <w:tcW w:w="8640" w:type="dxa"/>
             <w:tcBorders>
               <w:top w:val="single" w:sz="18" w:space="0" w:color="F4B942"/>
               <w:left w:val="single" w:sz="18" w:space="0" w:color="F4B942"/>
               <w:bottom w:val="single" w:sz="18" w:space="0" w:color="F4B942"/>
               <w:right w:val="single" w:sz="18" w:space="0" w:color="F4B942"/>
             </w:tcBorders>
+            <w:shd w:val="clear" w:color="auto" w:fill="FFF2CC"/>
           </w:tcPr>
           <w:p>
-            <w:pPr>
-              <w:jc w:val="left"/>
-            </w:pPr>
             <w:r>
               <w:rPr>
                 <w:rFonts w:ascii="Consolas" w:hAnsi="Consolas"/>
                 <w:color w:val="7F6000"/>
                 <w:sz w:val="20"/>
               </w:rPr>
-              <w:t>A 'Global Sales Support' Public Group contains the 'EMEA Sales' and 'APAC Sales' Roles. A Sharing Rule is created on the Opportunity object that shares all 'Closed Won' deals with this Public Group. Consequently, any user assigned to EMEA or APAC sales roles automatically gains Read/Write access to those specific records without manual intervention.</w:t>
+              <w:t>A 'Sensitive Project Alpha' Public Group is created with 'Grant Access Using Hierarchies' unchecked. Users from various departments (Engineering, Legal, Finance) are added. A Sharing Rule is created to share 'Project__c' records with this group. Despite the Legal VP being higher in the Role Hierarchy than the Legal representative in the group, the VP cannot see the records unless specifically added to the group.</w:t>
+            </w:r>
+          </w:p>
+        </w:tc>
+      </w:tr>
+    </w:tbl>
+    <w:p/>
+    <w:tbl>
+      <w:tblPr>
+        <w:tblStyle w:val="TableGrid"/>
+        <w:tblW w:w="0" w:type="auto"/>
+        <w:tblLook w:val="04A0" w:firstRow="1" w:lastRow="0" w:firstColumn="1" w:lastColumn="0" w:noHBand="0" w:noVBand="1"/>
+      </w:tblPr>
+      <w:tblGrid>
+        <w:gridCol w:w="8640"/>
+      </w:tblGrid>
+      <w:tr>
+        <w:tc>
+          <w:tcPr>
+            <w:tcW w:w="8640" w:type="dxa"/>
+            <w:tcBorders>
+              <w:top w:val="single" w:sz="4" w:space="0" w:color="1F3864"/>
+              <w:left w:val="single" w:sz="4" w:space="0" w:color="1F3864"/>
+              <w:bottom w:val="single" w:sz="4" w:space="0" w:color="1F3864"/>
+              <w:right w:val="single" w:sz="4" w:space="0" w:color="1F3864"/>
+            </w:tcBorders>
+            <w:shd w:val="clear" w:color="auto" w:fill="1F3864"/>
+            <w:tcMar>
+              <w:top w:w="100" w:type="dxa"/>
+              <w:left w:w="100" w:type="dxa"/>
+              <w:bottom w:w="100" w:type="dxa"/>
+              <w:right w:w="100" w:type="dxa"/>
+            </w:tcMar>
+          </w:tcPr>
+          <w:p>
+            <w:r>
+              <w:rPr>
+                <w:rFonts w:ascii="Calibri" w:hAnsi="Calibri"/>
+                <w:b/>
+                <w:color w:val="FFFFFF"/>
+                <w:sz w:val="32"/>
+              </w:rPr>
+              <w:t xml:space="preserve">  Salesforce Sharing Rules Architecture</w:t>
+            </w:r>
+          </w:p>
+        </w:tc>
+      </w:tr>
+    </w:tbl>
+    <w:p/>
+    <w:tbl>
+      <w:tblPr>
+        <w:tblStyle w:val="TableGrid"/>
+        <w:tblW w:w="0" w:type="auto"/>
+        <w:tblLook w:val="04A0" w:firstRow="1" w:lastRow="0" w:firstColumn="1" w:lastColumn="0" w:noHBand="0" w:noVBand="1"/>
+      </w:tblPr>
+      <w:tblGrid>
+        <w:gridCol w:w="8640"/>
+      </w:tblGrid>
+      <w:tr>
+        <w:tc>
+          <w:tcPr>
+            <w:tcW w:w="8640" w:type="dxa"/>
+            <w:tcBorders>
+              <w:top w:val="single" w:sz="4" w:space="0" w:color="2E75B6"/>
+              <w:left w:val="single" w:sz="4" w:space="0" w:color="2E75B6"/>
+              <w:bottom w:val="single" w:sz="4" w:space="0" w:color="2E75B6"/>
+              <w:right w:val="single" w:sz="4" w:space="0" w:color="2E75B6"/>
+            </w:tcBorders>
+            <w:shd w:val="clear" w:color="auto" w:fill="2E75B6"/>
+            <w:tcMar>
+              <w:top w:w="100" w:type="dxa"/>
+              <w:left w:w="100" w:type="dxa"/>
+              <w:bottom w:w="100" w:type="dxa"/>
+              <w:right w:w="100" w:type="dxa"/>
+            </w:tcMar>
+          </w:tcPr>
+          <w:p>
+            <w:r>
+              <w:rPr>
+                <w:rFonts w:ascii="Calibri" w:hAnsi="Calibri"/>
+                <w:b/>
+                <w:color w:val="FFFFFF"/>
+                <w:sz w:val="24"/>
+              </w:rPr>
+              <w:t xml:space="preserve">  Summary</w:t>
+            </w:r>
+          </w:p>
+        </w:tc>
+      </w:tr>
+    </w:tbl>
+    <w:p/>
+    <w:p>
+      <w:pPr>
+        <w:pStyle w:val="ListBullet"/>
+      </w:pPr>
+      <w:r>
+        <w:rPr>
+          <w:rFonts w:ascii="Calibri" w:hAnsi="Calibri"/>
+          <w:color w:val="1F3864"/>
+          <w:sz w:val="21"/>
+        </w:rPr>
+        <w:t xml:space="preserve">Sharing rules represent the </w:t>
+      </w:r>
+      <w:r>
+        <w:rPr>
+          <w:rFonts w:ascii="Calibri" w:hAnsi="Calibri"/>
+          <w:color w:val="1F3864"/>
+          <w:sz w:val="21"/>
+          <w:highlight w:val="yellow"/>
+        </w:rPr>
+        <w:t>automated mechanism for extending record access to users who fall outside the scope of Organization-Wide Defaults (OWD) and the Role Hierarchy.</w:t>
+      </w:r>
+      <w:r>
+        <w:rPr>
+          <w:rFonts w:ascii="Calibri" w:hAnsi="Calibri"/>
+          <w:color w:val="1F3864"/>
+          <w:sz w:val="21"/>
+        </w:rPr>
+        <w:t xml:space="preserve"> </w:t>
+      </w:r>
+    </w:p>
+    <w:p>
+      <w:pPr>
+        <w:pStyle w:val="ListBullet"/>
+      </w:pPr>
+      <w:r>
+        <w:rPr>
+          <w:rFonts w:ascii="Calibri" w:hAnsi="Calibri"/>
+          <w:color w:val="1F3864"/>
+          <w:sz w:val="21"/>
+        </w:rPr>
+        <w:t>They function as persistent exceptions to the 'Most Restrictive' security model, enabling horizontal and cross-functional data visibility based on ownership, field-level criteria, or guest user status.</w:t>
+      </w:r>
+    </w:p>
+    <w:p/>
+    <w:tbl>
+      <w:tblPr>
+        <w:tblStyle w:val="TableGrid"/>
+        <w:tblW w:w="0" w:type="auto"/>
+        <w:tblLook w:val="04A0" w:firstRow="1" w:lastRow="0" w:firstColumn="1" w:lastColumn="0" w:noHBand="0" w:noVBand="1"/>
+      </w:tblPr>
+      <w:tblGrid>
+        <w:gridCol w:w="8640"/>
+      </w:tblGrid>
+      <w:tr>
+        <w:tc>
+          <w:tcPr>
+            <w:tcW w:w="8640" w:type="dxa"/>
+            <w:tcBorders>
+              <w:top w:val="single" w:sz="4" w:space="0" w:color="D6E4F0"/>
+              <w:left w:val="single" w:sz="4" w:space="0" w:color="D6E4F0"/>
+              <w:bottom w:val="single" w:sz="4" w:space="0" w:color="D6E4F0"/>
+              <w:right w:val="single" w:sz="4" w:space="0" w:color="D6E4F0"/>
+            </w:tcBorders>
+            <w:shd w:val="clear" w:color="auto" w:fill="D6E4F0"/>
+            <w:tcMar>
+              <w:top w:w="100" w:type="dxa"/>
+              <w:left w:w="100" w:type="dxa"/>
+              <w:bottom w:w="100" w:type="dxa"/>
+              <w:right w:w="100" w:type="dxa"/>
+            </w:tcMar>
+          </w:tcPr>
+          <w:p>
+            <w:r>
+              <w:rPr>
+                <w:rFonts w:ascii="Calibri" w:hAnsi="Calibri"/>
+                <w:b/>
+                <w:color w:val="1F3864"/>
+              </w:rPr>
+              <w:lastRenderedPageBreak/>
+              <w:t xml:space="preserve">  Owner-Based Sharing Rules</w:t>
+            </w:r>
+          </w:p>
+        </w:tc>
+      </w:tr>
+    </w:tbl>
+    <w:p/>
+    <w:p>
+      <w:pPr>
+        <w:pStyle w:val="ListBullet"/>
+        <w:rPr>
+          <w:b/>
+          <w:bCs/>
+        </w:rPr>
+      </w:pPr>
+      <w:r>
+        <w:rPr>
+          <w:rFonts w:ascii="Calibri" w:hAnsi="Calibri"/>
+          <w:color w:val="1F3864"/>
+          <w:sz w:val="21"/>
+        </w:rPr>
+        <w:t xml:space="preserve">Core Logic: </w:t>
+      </w:r>
+      <w:r>
+        <w:rPr>
+          <w:rFonts w:ascii="Calibri" w:hAnsi="Calibri"/>
+          <w:b/>
+          <w:bCs/>
+          <w:color w:val="1F3864"/>
+          <w:sz w:val="21"/>
+        </w:rPr>
+        <w:t>Grants access based on the record owner's Role, Role and Subordinates, Territory, or Public Group membership.</w:t>
+      </w:r>
+    </w:p>
+    <w:p>
+      <w:pPr>
+        <w:pStyle w:val="ListBullet"/>
+      </w:pPr>
+      <w:r>
+        <w:rPr>
+          <w:rFonts w:ascii="Calibri" w:hAnsi="Calibri"/>
+          <w:color w:val="1F3864"/>
+          <w:sz w:val="21"/>
+        </w:rPr>
+        <w:t>Lateral Access: Primary tool for 'Matrix Management' where users in different branches of the hierarchy require mutual visibility.</w:t>
+      </w:r>
+    </w:p>
+    <w:p>
+      <w:pPr>
+        <w:pStyle w:val="ListBullet"/>
+        <w:rPr>
+          <w:highlight w:val="yellow"/>
+        </w:rPr>
+      </w:pPr>
+      <w:r>
+        <w:rPr>
+          <w:rFonts w:ascii="Calibri" w:hAnsi="Calibri"/>
+          <w:color w:val="1F3864"/>
+          <w:sz w:val="21"/>
+          <w:highlight w:val="yellow"/>
+        </w:rPr>
+        <w:t>Exclusions: Does not apply to 'Private' contacts or contacts not linked to an Account, as these lack standard sharing inherited logic.</w:t>
+      </w:r>
+    </w:p>
+    <w:p>
+      <w:pPr>
+        <w:pStyle w:val="ListBullet"/>
+        <w:tabs>
+          <w:tab w:val="clear" w:pos="360"/>
+          <w:tab w:val="num" w:pos="720"/>
+        </w:tabs>
+        <w:ind w:left="720"/>
+        <w:rPr>
+          <w:highlight w:val="yellow"/>
+        </w:rPr>
+      </w:pPr>
+      <w:proofErr w:type="gramStart"/>
+      <w:r>
+        <w:rPr>
+          <w:rFonts w:ascii="Calibri" w:hAnsi="Calibri"/>
+          <w:color w:val="1F3864"/>
+          <w:sz w:val="21"/>
+          <w:highlight w:val="yellow"/>
+        </w:rPr>
+        <w:t>Note :</w:t>
+      </w:r>
+      <w:proofErr w:type="gramEnd"/>
+      <w:r>
+        <w:rPr>
+          <w:rFonts w:ascii="Calibri" w:hAnsi="Calibri"/>
+          <w:color w:val="1F3864"/>
+          <w:sz w:val="21"/>
+          <w:highlight w:val="yellow"/>
+        </w:rPr>
+        <w:t xml:space="preserve"> contact set to private or not linked to Account </w:t>
+      </w:r>
+      <w:r>
+        <w:rPr>
+          <w:rFonts w:ascii="Calibri" w:hAnsi="Calibri"/>
+          <w:color w:val="1F3864"/>
+          <w:sz w:val="21"/>
+          <w:highlight w:val="yellow"/>
+        </w:rPr>
+        <w:sym w:font="Wingdings" w:char="F0E0"/>
+      </w:r>
+      <w:r>
+        <w:rPr>
+          <w:rFonts w:ascii="Calibri" w:hAnsi="Calibri"/>
+          <w:color w:val="1F3864"/>
+          <w:sz w:val="21"/>
+          <w:highlight w:val="yellow"/>
+        </w:rPr>
+        <w:t xml:space="preserve"> </w:t>
+      </w:r>
+      <w:proofErr w:type="gramStart"/>
+      <w:r>
+        <w:rPr>
+          <w:rFonts w:ascii="Calibri" w:hAnsi="Calibri"/>
+          <w:color w:val="1F3864"/>
+          <w:sz w:val="21"/>
+          <w:highlight w:val="yellow"/>
+        </w:rPr>
+        <w:t>its</w:t>
+      </w:r>
+      <w:proofErr w:type="gramEnd"/>
+      <w:r>
+        <w:rPr>
+          <w:rFonts w:ascii="Calibri" w:hAnsi="Calibri"/>
+          <w:color w:val="1F3864"/>
+          <w:sz w:val="21"/>
+          <w:highlight w:val="yellow"/>
+        </w:rPr>
+        <w:t xml:space="preserve"> considered as orphan </w:t>
+      </w:r>
+      <w:r>
+        <w:rPr>
+          <w:rFonts w:ascii="Calibri" w:hAnsi="Calibri"/>
+          <w:color w:val="1F3864"/>
+          <w:sz w:val="21"/>
+          <w:highlight w:val="yellow"/>
+        </w:rPr>
+        <w:sym w:font="Wingdings" w:char="F0E0"/>
+      </w:r>
+      <w:r>
+        <w:rPr>
+          <w:rFonts w:ascii="Calibri" w:hAnsi="Calibri"/>
+          <w:color w:val="1F3864"/>
+          <w:sz w:val="21"/>
+          <w:highlight w:val="yellow"/>
+        </w:rPr>
+        <w:t xml:space="preserve"> then records are set be </w:t>
+      </w:r>
+      <w:proofErr w:type="gramStart"/>
+      <w:r>
+        <w:rPr>
+          <w:rFonts w:ascii="Calibri" w:hAnsi="Calibri"/>
+          <w:color w:val="1F3864"/>
+          <w:sz w:val="21"/>
+          <w:highlight w:val="yellow"/>
+        </w:rPr>
+        <w:t>out side</w:t>
+      </w:r>
+      <w:proofErr w:type="gramEnd"/>
+      <w:r>
+        <w:rPr>
+          <w:rFonts w:ascii="Calibri" w:hAnsi="Calibri"/>
+          <w:color w:val="1F3864"/>
+          <w:sz w:val="21"/>
+          <w:highlight w:val="yellow"/>
+        </w:rPr>
+        <w:t xml:space="preserve"> the sharing rule </w:t>
+      </w:r>
+      <w:r>
+        <w:rPr>
+          <w:rFonts w:ascii="Calibri" w:hAnsi="Calibri"/>
+          <w:color w:val="1F3864"/>
+          <w:sz w:val="21"/>
+          <w:highlight w:val="yellow"/>
+        </w:rPr>
+        <w:sym w:font="Wingdings" w:char="F0E0"/>
+      </w:r>
+      <w:r>
+        <w:rPr>
+          <w:rFonts w:ascii="Calibri" w:hAnsi="Calibri"/>
+          <w:color w:val="1F3864"/>
+          <w:sz w:val="21"/>
+          <w:highlight w:val="yellow"/>
+        </w:rPr>
+        <w:t xml:space="preserve"> here the sharing rule is not applicable to this</w:t>
+      </w:r>
+    </w:p>
+    <w:p>
+      <w:pPr>
+        <w:pStyle w:val="ListBullet"/>
+        <w:tabs>
+          <w:tab w:val="clear" w:pos="360"/>
+          <w:tab w:val="num" w:pos="720"/>
+        </w:tabs>
+        <w:ind w:left="720"/>
+        <w:rPr>
+          <w:highlight w:val="yellow"/>
+        </w:rPr>
+      </w:pPr>
+      <w:r>
+        <w:rPr>
+          <w:rFonts w:ascii="Calibri" w:hAnsi="Calibri"/>
+          <w:color w:val="1F3864"/>
+          <w:sz w:val="21"/>
+          <w:highlight w:val="yellow"/>
+        </w:rPr>
+        <w:t xml:space="preserve">Who can see </w:t>
+      </w:r>
+      <w:proofErr w:type="gramStart"/>
+      <w:r>
+        <w:rPr>
+          <w:rFonts w:ascii="Calibri" w:hAnsi="Calibri"/>
+          <w:color w:val="1F3864"/>
+          <w:sz w:val="21"/>
+          <w:highlight w:val="yellow"/>
+        </w:rPr>
+        <w:t>this records</w:t>
+      </w:r>
+      <w:proofErr w:type="gramEnd"/>
+      <w:r>
+        <w:rPr>
+          <w:rFonts w:ascii="Calibri" w:hAnsi="Calibri"/>
+          <w:color w:val="1F3864"/>
+          <w:sz w:val="21"/>
+          <w:highlight w:val="yellow"/>
+        </w:rPr>
+        <w:t xml:space="preserve"> </w:t>
+      </w:r>
+      <w:r>
+        <w:rPr>
+          <w:rFonts w:ascii="Calibri" w:hAnsi="Calibri"/>
+          <w:color w:val="1F3864"/>
+          <w:sz w:val="21"/>
+          <w:highlight w:val="yellow"/>
+        </w:rPr>
+        <w:sym w:font="Wingdings" w:char="F0E0"/>
+      </w:r>
+      <w:r>
+        <w:rPr>
+          <w:rFonts w:ascii="Calibri" w:hAnsi="Calibri"/>
+          <w:color w:val="1F3864"/>
+          <w:sz w:val="21"/>
+          <w:highlight w:val="yellow"/>
+        </w:rPr>
+        <w:t xml:space="preserve"> Owner or System admi</w:t>
+      </w:r>
+      <w:r>
+        <w:rPr>
+          <w:rFonts w:ascii="Calibri" w:hAnsi="Calibri"/>
+          <w:color w:val="1F3864"/>
+          <w:sz w:val="21"/>
+          <w:highlight w:val="yellow"/>
+        </w:rPr>
+        <w:t>nistrator</w:t>
+      </w:r>
+      <w:r>
+        <w:rPr>
+          <w:rFonts w:ascii="Calibri" w:hAnsi="Calibri"/>
+          <w:color w:val="1F3864"/>
+          <w:sz w:val="21"/>
+          <w:highlight w:val="yellow"/>
+        </w:rPr>
+        <w:t>.</w:t>
+      </w:r>
+    </w:p>
+    <w:p>
+      <w:pPr>
+        <w:pStyle w:val="ListBullet"/>
+        <w:numPr>
+          <w:ilvl w:val="0"/>
+          <w:numId w:val="0"/>
+        </w:numPr>
+        <w:ind w:left="360" w:hanging="360"/>
+        <w:rPr>
+          <w:highlight w:val="yellow"/>
+        </w:rPr>
+      </w:pPr>
+      <w:r>
+        <w:rPr>
+          <w:noProof/>
+        </w:rPr>
+        <w:drawing>
+          <wp:inline distT="0" distB="0" distL="0" distR="0" wp14:anchorId="63088857" wp14:editId="6D6B5E2F">
+            <wp:extent cx="6088380" cy="2780199"/>
+            <wp:effectExtent l="0" t="0" r="7620" b="1270"/>
+            <wp:docPr id="311767179" name="Picture 1"/>
+            <wp:cNvGraphicFramePr>
+              <a:graphicFrameLocks xmlns:a="http://schemas.openxmlformats.org/drawingml/2006/main" noChangeAspect="1"/>
+            </wp:cNvGraphicFramePr>
+            <a:graphic xmlns:a="http://schemas.openxmlformats.org/drawingml/2006/main">
+              <a:graphicData uri="http://schemas.openxmlformats.org/drawingml/2006/picture">
+                <pic:pic xmlns:pic="http://schemas.openxmlformats.org/drawingml/2006/picture">
+                  <pic:nvPicPr>
+                    <pic:cNvPr id="311767179" name=""/>
+                    <pic:cNvPicPr/>
+                  </pic:nvPicPr>
+                  <pic:blipFill>
+                    <a:blip r:embed="rId6"/>
+                    <a:stretch>
+                      <a:fillRect/>
+                    </a:stretch>
+                  </pic:blipFill>
+                  <pic:spPr>
+                    <a:xfrm>
+                      <a:off x="0" y="0"/>
+                      <a:ext cx="6111619" cy="2790811"/>
+                    </a:xfrm>
+                    <a:prstGeom prst="rect">
+                      <a:avLst/>
+                    </a:prstGeom>
+                  </pic:spPr>
+                </pic:pic>
+              </a:graphicData>
+            </a:graphic>
+          </wp:inline>
+        </w:drawing>
+      </w:r>
+    </w:p>
+    <w:p>
+      <w:pPr>
+        <w:pStyle w:val="ListBullet"/>
+        <w:numPr>
+          <w:ilvl w:val="0"/>
+          <w:numId w:val="0"/>
+        </w:numPr>
+        <w:ind w:left="360" w:hanging="360"/>
+        <w:rPr>
+          <w:highlight w:val="yellow"/>
+        </w:rPr>
+      </w:pPr>
+      <w:proofErr w:type="gramStart"/>
+      <w:r>
+        <w:rPr>
+          <w:highlight w:val="yellow"/>
+        </w:rPr>
+        <w:t>Note :</w:t>
+      </w:r>
+      <w:proofErr w:type="gramEnd"/>
+      <w:r>
+        <w:rPr>
+          <w:highlight w:val="yellow"/>
+        </w:rPr>
+        <w:t xml:space="preserve">  If contact is </w:t>
+      </w:r>
+      <w:proofErr w:type="gramStart"/>
+      <w:r>
+        <w:rPr>
+          <w:highlight w:val="yellow"/>
+        </w:rPr>
+        <w:t>made it</w:t>
+      </w:r>
+      <w:proofErr w:type="gramEnd"/>
+      <w:r>
+        <w:rPr>
+          <w:highlight w:val="yellow"/>
+        </w:rPr>
+        <w:t xml:space="preserve"> private and still tagged to account </w:t>
+      </w:r>
+      <w:r>
+        <w:rPr>
+          <w:highlight w:val="yellow"/>
+        </w:rPr>
+        <w:sym w:font="Wingdings" w:char="F0E0"/>
+      </w:r>
+      <w:r>
+        <w:rPr>
+          <w:highlight w:val="yellow"/>
+        </w:rPr>
+        <w:t xml:space="preserve"> then to its away from the sharing model</w:t>
+      </w:r>
+    </w:p>
+    <w:p>
+      <w:pPr>
+        <w:pStyle w:val="ListBullet"/>
+        <w:tabs>
+          <w:tab w:val="clear" w:pos="360"/>
+          <w:tab w:val="num" w:pos="1800"/>
+        </w:tabs>
+        <w:ind w:left="1800"/>
+        <w:rPr>
+          <w:highlight w:val="yellow"/>
+        </w:rPr>
+      </w:pPr>
+      <w:r>
+        <w:rPr>
+          <w:highlight w:val="yellow"/>
+        </w:rPr>
+        <w:t xml:space="preserve">Who can see </w:t>
+      </w:r>
+      <w:r>
+        <w:rPr>
+          <w:highlight w:val="yellow"/>
+        </w:rPr>
+        <w:sym w:font="Wingdings" w:char="F0E0"/>
+      </w:r>
+      <w:r>
+        <w:rPr>
+          <w:highlight w:val="yellow"/>
+        </w:rPr>
+        <w:t xml:space="preserve"> System administrator or Owner</w:t>
+      </w:r>
+      <w:r>
+        <w:rPr>
+          <w:highlight w:val="yellow"/>
+        </w:rPr>
+        <w:t xml:space="preserve"> </w:t>
+      </w:r>
+      <w:r>
+        <w:rPr>
+          <w:highlight w:val="yellow"/>
+        </w:rPr>
+        <w:sym w:font="Wingdings" w:char="F0E0"/>
+      </w:r>
+      <w:r>
+        <w:rPr>
+          <w:highlight w:val="yellow"/>
+        </w:rPr>
+        <w:t xml:space="preserve"> because he has view all and </w:t>
+      </w:r>
+      <w:proofErr w:type="gramStart"/>
+      <w:r>
+        <w:rPr>
+          <w:highlight w:val="yellow"/>
+        </w:rPr>
+        <w:t>modify</w:t>
+      </w:r>
+      <w:proofErr w:type="gramEnd"/>
+      <w:r>
+        <w:rPr>
+          <w:highlight w:val="yellow"/>
+        </w:rPr>
+        <w:t xml:space="preserve"> all permissions</w:t>
+      </w:r>
+    </w:p>
+    <w:p>
+      <w:pPr>
+        <w:pStyle w:val="ListBullet"/>
+        <w:rPr>
+          <w:highlight w:val="yellow"/>
+        </w:rPr>
+      </w:pPr>
+      <w:r>
+        <w:rPr>
+          <w:rFonts w:ascii="Calibri" w:hAnsi="Calibri"/>
+          <w:color w:val="1F3864"/>
+          <w:sz w:val="21"/>
+        </w:rPr>
+        <w:t xml:space="preserve">Scalability: </w:t>
+      </w:r>
+      <w:r>
+        <w:rPr>
+          <w:rFonts w:ascii="Calibri" w:hAnsi="Calibri"/>
+          <w:color w:val="1F3864"/>
+          <w:sz w:val="21"/>
+          <w:highlight w:val="yellow"/>
+        </w:rPr>
+        <w:t>Counted towards the 300 total sharing rules per object limit.</w:t>
+      </w:r>
+    </w:p>
+    <w:p>
+      <w:pPr>
+        <w:pStyle w:val="ListBullet"/>
+      </w:pPr>
+      <w:r>
+        <w:rPr>
+          <w:rFonts w:ascii="Calibri" w:hAnsi="Calibri"/>
+          <w:color w:val="1F3864"/>
+          <w:sz w:val="21"/>
+        </w:rPr>
+        <w:t xml:space="preserve">Common Suffix: Underlying data resides in the 'Share' objects (e.g., AccountShare, </w:t>
+      </w:r>
+      <w:proofErr w:type="gramStart"/>
+      <w:r>
+        <w:rPr>
+          <w:rFonts w:ascii="Calibri" w:hAnsi="Calibri"/>
+          <w:color w:val="1F3864"/>
+          <w:sz w:val="21"/>
+        </w:rPr>
+        <w:t>CustomObject__</w:t>
+      </w:r>
+      <w:proofErr w:type="gramEnd"/>
+      <w:r>
+        <w:rPr>
+          <w:rFonts w:ascii="Calibri" w:hAnsi="Calibri"/>
+          <w:color w:val="1F3864"/>
+          <w:sz w:val="21"/>
+        </w:rPr>
+        <w:t>Share).</w:t>
+      </w:r>
+    </w:p>
+    <w:p/>
+    <w:tbl>
+      <w:tblPr>
+        <w:tblStyle w:val="TableGrid"/>
+        <w:tblW w:w="0" w:type="auto"/>
+        <w:tblLook w:val="04A0" w:firstRow="1" w:lastRow="0" w:firstColumn="1" w:lastColumn="0" w:noHBand="0" w:noVBand="1"/>
+      </w:tblPr>
+      <w:tblGrid>
+        <w:gridCol w:w="8640"/>
+      </w:tblGrid>
+      <w:tr>
+        <w:tc>
+          <w:tcPr>
+            <w:tcW w:w="8640" w:type="dxa"/>
+            <w:tcBorders>
+              <w:top w:val="single" w:sz="4" w:space="0" w:color="D6E4F0"/>
+              <w:left w:val="single" w:sz="4" w:space="0" w:color="D6E4F0"/>
+              <w:bottom w:val="single" w:sz="4" w:space="0" w:color="D6E4F0"/>
+              <w:right w:val="single" w:sz="4" w:space="0" w:color="D6E4F0"/>
+            </w:tcBorders>
+            <w:shd w:val="clear" w:color="auto" w:fill="D6E4F0"/>
+            <w:tcMar>
+              <w:top w:w="100" w:type="dxa"/>
+              <w:left w:w="100" w:type="dxa"/>
+              <w:bottom w:w="100" w:type="dxa"/>
+              <w:right w:w="100" w:type="dxa"/>
+            </w:tcMar>
+          </w:tcPr>
+          <w:p>
+            <w:r>
+              <w:rPr>
+                <w:rFonts w:ascii="Calibri" w:hAnsi="Calibri"/>
+                <w:b/>
+                <w:color w:val="1F3864"/>
+              </w:rPr>
+              <w:t xml:space="preserve">  Criteria-Based Sharing Rules</w:t>
+            </w:r>
+          </w:p>
+        </w:tc>
+      </w:tr>
+    </w:tbl>
+    <w:p/>
+    <w:p>
+      <w:pPr>
+        <w:pStyle w:val="ListBullet"/>
+      </w:pPr>
+      <w:r>
+        <w:rPr>
+          <w:rFonts w:ascii="Calibri" w:hAnsi="Calibri"/>
+          <w:color w:val="1F3864"/>
+          <w:sz w:val="21"/>
+        </w:rPr>
+        <w:t>Attribute-Driven: Evaluates record field values rather than owner identity to determine visibility.</w:t>
+      </w:r>
+    </w:p>
+    <w:p>
+      <w:pPr>
+        <w:pStyle w:val="ListBullet"/>
+        <w:rPr>
+          <w:highlight w:val="yellow"/>
+        </w:rPr>
+      </w:pPr>
+      <w:r>
+        <w:rPr>
+          <w:rFonts w:ascii="Calibri" w:hAnsi="Calibri"/>
+          <w:color w:val="1F3864"/>
+          <w:sz w:val="21"/>
+          <w:highlight w:val="yellow"/>
+        </w:rPr>
+        <w:t>Operational Limit: Strictly limited to 50 rules per object, including Guest User rules.</w:t>
+      </w:r>
+    </w:p>
+    <w:p>
+      <w:pPr>
+        <w:pStyle w:val="ListBullet"/>
+        <w:rPr>
+          <w:highlight w:val="yellow"/>
+        </w:rPr>
+      </w:pPr>
+      <w:r>
+        <w:rPr>
+          <w:rFonts w:ascii="Calibri" w:hAnsi="Calibri"/>
+          <w:color w:val="1F3864"/>
+          <w:sz w:val="21"/>
+        </w:rPr>
+        <w:lastRenderedPageBreak/>
+        <w:t xml:space="preserve">Supported Fields: Can utilize most standard and custom fields, </w:t>
+      </w:r>
+      <w:r>
+        <w:rPr>
+          <w:rFonts w:ascii="Calibri" w:hAnsi="Calibri"/>
+          <w:color w:val="1F3864"/>
+          <w:sz w:val="21"/>
+          <w:highlight w:val="yellow"/>
+        </w:rPr>
+        <w:t>excluding long text area and encrypted fields.</w:t>
+      </w:r>
+    </w:p>
+    <w:p>
+      <w:pPr>
+        <w:pStyle w:val="ListBullet"/>
+      </w:pPr>
+      <w:r>
+        <w:rPr>
+          <w:rFonts w:ascii="Calibri" w:hAnsi="Calibri"/>
+          <w:color w:val="1F3864"/>
+          <w:sz w:val="21"/>
+        </w:rPr>
+        <w:t>Recalculation: Triggered automatically upon record creation or field updates that change the outcome of the criteria logic.</w:t>
+      </w:r>
+    </w:p>
+    <w:p/>
+    <w:tbl>
+      <w:tblPr>
+        <w:tblStyle w:val="TableGrid"/>
+        <w:tblW w:w="0" w:type="auto"/>
+        <w:tblLook w:val="04A0" w:firstRow="1" w:lastRow="0" w:firstColumn="1" w:lastColumn="0" w:noHBand="0" w:noVBand="1"/>
+      </w:tblPr>
+      <w:tblGrid>
+        <w:gridCol w:w="8640"/>
+      </w:tblGrid>
+      <w:tr>
+        <w:tc>
+          <w:tcPr>
+            <w:tcW w:w="8640" w:type="dxa"/>
+            <w:tcBorders>
+              <w:top w:val="single" w:sz="4" w:space="0" w:color="D6E4F0"/>
+              <w:left w:val="single" w:sz="4" w:space="0" w:color="D6E4F0"/>
+              <w:bottom w:val="single" w:sz="4" w:space="0" w:color="D6E4F0"/>
+              <w:right w:val="single" w:sz="4" w:space="0" w:color="D6E4F0"/>
+            </w:tcBorders>
+            <w:shd w:val="clear" w:color="auto" w:fill="D6E4F0"/>
+            <w:tcMar>
+              <w:top w:w="100" w:type="dxa"/>
+              <w:left w:w="100" w:type="dxa"/>
+              <w:bottom w:w="100" w:type="dxa"/>
+              <w:right w:w="100" w:type="dxa"/>
+            </w:tcMar>
+          </w:tcPr>
+          <w:p>
+            <w:r>
+              <w:rPr>
+                <w:rFonts w:ascii="Calibri" w:hAnsi="Calibri"/>
+                <w:b/>
+                <w:color w:val="1F3864"/>
+              </w:rPr>
+              <w:t xml:space="preserve">  Guest User Sharing Rules</w:t>
+            </w:r>
+          </w:p>
+        </w:tc>
+      </w:tr>
+    </w:tbl>
+    <w:p>
+      <w:r>
+        <w:t xml:space="preserve"> It is provided to unauthenticated access user </w:t>
+      </w:r>
+      <w:r>
+        <w:sym w:font="Wingdings" w:char="F0E0"/>
+      </w:r>
+      <w:r>
+        <w:t xml:space="preserve"> they can see or edit the records</w:t>
+      </w:r>
+    </w:p>
+    <w:p>
+      <w:pPr>
+        <w:pStyle w:val="ListBullet"/>
+      </w:pPr>
+      <w:r>
+        <w:rPr>
+          <w:rFonts w:ascii="Calibri" w:hAnsi="Calibri"/>
+          <w:color w:val="1F3864"/>
+          <w:sz w:val="21"/>
+          <w:highlight w:val="yellow"/>
+        </w:rPr>
+        <w:t>Unauthenticated Access:</w:t>
+      </w:r>
+      <w:r>
+        <w:rPr>
+          <w:rFonts w:ascii="Calibri" w:hAnsi="Calibri"/>
+          <w:color w:val="1F3864"/>
+          <w:sz w:val="21"/>
+        </w:rPr>
+        <w:t xml:space="preserve"> Specifically designed to grant Read-Only access to users viewing Salesforce Sites or Communities without logging in.</w:t>
+      </w:r>
+    </w:p>
+    <w:p>
+      <w:pPr>
+        <w:pStyle w:val="ListBullet"/>
+      </w:pPr>
+      <w:r>
+        <w:rPr>
+          <w:rFonts w:ascii="Calibri" w:hAnsi="Calibri"/>
+          <w:color w:val="1F3864"/>
+          <w:sz w:val="21"/>
+        </w:rPr>
+        <w:t>Security Mandate: Replaces the deprecated 'Everything' access for guest users, enforcing a restrictive 'Criteria-Based' approach.</w:t>
+      </w:r>
+    </w:p>
+    <w:p>
+      <w:pPr>
+        <w:pStyle w:val="ListBullet"/>
+      </w:pPr>
+      <w:r>
+        <w:rPr>
+          <w:rFonts w:ascii="Calibri" w:hAnsi="Calibri"/>
+          <w:color w:val="1F3864"/>
+          <w:sz w:val="21"/>
+        </w:rPr>
+        <w:t>Risk Profile: Since these grant access to the public internet, they must be audited regularly to ensure sensitive data is not exposed.</w:t>
+      </w:r>
+    </w:p>
+    <w:p>
+      <w:pPr>
+        <w:pStyle w:val="ListBullet"/>
+        <w:rPr>
+          <w:highlight w:val="yellow"/>
+        </w:rPr>
+      </w:pPr>
+      <w:r>
+        <w:rPr>
+          <w:rFonts w:ascii="Calibri" w:hAnsi="Calibri"/>
+          <w:color w:val="1F3864"/>
+          <w:sz w:val="21"/>
+        </w:rPr>
+        <w:t xml:space="preserve">Governance: </w:t>
+      </w:r>
+      <w:r>
+        <w:rPr>
+          <w:rFonts w:ascii="Calibri" w:hAnsi="Calibri"/>
+          <w:color w:val="1F3864"/>
+          <w:sz w:val="21"/>
+          <w:highlight w:val="yellow"/>
+        </w:rPr>
+        <w:t>Shares the 50-rule limit with standard Criteria-Based sharing rules.</w:t>
+      </w:r>
+    </w:p>
+    <w:p/>
+    <w:tbl>
+      <w:tblPr>
+        <w:tblStyle w:val="TableGrid"/>
+        <w:tblW w:w="0" w:type="auto"/>
+        <w:tblLook w:val="04A0" w:firstRow="1" w:lastRow="0" w:firstColumn="1" w:lastColumn="0" w:noHBand="0" w:noVBand="1"/>
+      </w:tblPr>
+      <w:tblGrid>
+        <w:gridCol w:w="8640"/>
+      </w:tblGrid>
+      <w:tr>
+        <w:tc>
+          <w:tcPr>
+            <w:tcW w:w="8640" w:type="dxa"/>
+            <w:tcBorders>
+              <w:top w:val="single" w:sz="4" w:space="0" w:color="D6E4F0"/>
+              <w:left w:val="single" w:sz="4" w:space="0" w:color="D6E4F0"/>
+              <w:bottom w:val="single" w:sz="4" w:space="0" w:color="D6E4F0"/>
+              <w:right w:val="single" w:sz="4" w:space="0" w:color="D6E4F0"/>
+            </w:tcBorders>
+            <w:shd w:val="clear" w:color="auto" w:fill="D6E4F0"/>
+            <w:tcMar>
+              <w:top w:w="100" w:type="dxa"/>
+              <w:left w:w="100" w:type="dxa"/>
+              <w:bottom w:w="100" w:type="dxa"/>
+              <w:right w:w="100" w:type="dxa"/>
+            </w:tcMar>
+          </w:tcPr>
+          <w:p>
+            <w:r>
+              <w:rPr>
+                <w:rFonts w:ascii="Calibri" w:hAnsi="Calibri"/>
+                <w:b/>
+                <w:color w:val="1F3864"/>
+              </w:rPr>
+              <w:t xml:space="preserve">  Architectural Considerations for Large Data Volumes (LDV)</w:t>
+            </w:r>
+          </w:p>
+        </w:tc>
+      </w:tr>
+    </w:tbl>
+    <w:p/>
+    <w:p>
+      <w:pPr>
+        <w:pStyle w:val="ListBullet"/>
+      </w:pPr>
+      <w:r>
+        <w:rPr>
+          <w:rFonts w:ascii="Calibri" w:hAnsi="Calibri"/>
+          <w:color w:val="1F3864"/>
+          <w:sz w:val="21"/>
+        </w:rPr>
+        <w:t>Sharing Table Growth: Every sharing rule generates entries in the object's Share table; excessive rules on high-volume objects can degrade performance.</w:t>
+      </w:r>
+    </w:p>
+    <w:p>
+      <w:pPr>
+        <w:pStyle w:val="ListBullet"/>
+      </w:pPr>
+      <w:r>
+        <w:rPr>
+          <w:rFonts w:ascii="Calibri" w:hAnsi="Calibri"/>
+          <w:color w:val="1F3864"/>
+          <w:sz w:val="21"/>
+        </w:rPr>
+        <w:t>Deferred Sharing: For massive ownership changes or hierarchy restructuring, architects should use 'Deferred Sharing Calculation' to prevent row-locking and timeouts.</w:t>
+      </w:r>
+    </w:p>
+    <w:p>
+      <w:pPr>
+        <w:pStyle w:val="ListBullet"/>
+        <w:tabs>
+          <w:tab w:val="clear" w:pos="360"/>
+          <w:tab w:val="num" w:pos="720"/>
+        </w:tabs>
+        <w:ind w:left="720"/>
+      </w:pPr>
+      <w:r>
+        <w:rPr>
+          <w:rFonts w:ascii="Calibri" w:hAnsi="Calibri"/>
+          <w:color w:val="1F3864"/>
+          <w:sz w:val="21"/>
+        </w:rPr>
+        <w:t xml:space="preserve">When there is </w:t>
+      </w:r>
+      <w:r>
+        <w:rPr>
+          <w:rFonts w:ascii="Calibri" w:hAnsi="Calibri"/>
+          <w:color w:val="1F3864"/>
+          <w:sz w:val="21"/>
+        </w:rPr>
+        <w:t>any</w:t>
+      </w:r>
+      <w:r>
+        <w:rPr>
+          <w:rFonts w:ascii="Calibri" w:hAnsi="Calibri"/>
+          <w:color w:val="1F3864"/>
+          <w:sz w:val="21"/>
+        </w:rPr>
+        <w:t xml:space="preserve"> change in the role </w:t>
+      </w:r>
+      <w:r>
+        <w:rPr>
+          <w:rFonts w:ascii="Calibri" w:hAnsi="Calibri"/>
+          <w:color w:val="1F3864"/>
+          <w:sz w:val="21"/>
+        </w:rPr>
+        <w:t>hierarchy, raise</w:t>
+      </w:r>
+      <w:r>
+        <w:rPr>
+          <w:rFonts w:ascii="Calibri" w:hAnsi="Calibri"/>
+          <w:color w:val="1F3864"/>
+          <w:sz w:val="21"/>
+        </w:rPr>
+        <w:t xml:space="preserve"> the ticket with </w:t>
+      </w:r>
+      <w:proofErr w:type="gramStart"/>
+      <w:r>
+        <w:rPr>
+          <w:rFonts w:ascii="Calibri" w:hAnsi="Calibri"/>
+          <w:color w:val="1F3864"/>
+          <w:sz w:val="21"/>
+        </w:rPr>
+        <w:t>salesforce them</w:t>
+      </w:r>
+      <w:proofErr w:type="gramEnd"/>
+      <w:r>
+        <w:rPr>
+          <w:rFonts w:ascii="Calibri" w:hAnsi="Calibri"/>
+          <w:color w:val="1F3864"/>
+          <w:sz w:val="21"/>
+        </w:rPr>
+        <w:t xml:space="preserve"> to turn off the salesforce sharing rule</w:t>
+      </w:r>
+      <w:r>
+        <w:rPr>
+          <w:rFonts w:ascii="Calibri" w:hAnsi="Calibri"/>
+          <w:color w:val="1F3864"/>
+          <w:sz w:val="21"/>
+        </w:rPr>
+        <w:t>.</w:t>
+      </w:r>
+    </w:p>
+    <w:p>
+      <w:pPr>
+        <w:pStyle w:val="ListBullet"/>
+        <w:tabs>
+          <w:tab w:val="clear" w:pos="360"/>
+          <w:tab w:val="num" w:pos="720"/>
+        </w:tabs>
+        <w:ind w:left="720"/>
+      </w:pPr>
+      <w:r>
+        <w:t xml:space="preserve">Try to do the that </w:t>
+      </w:r>
+      <w:proofErr w:type="gramStart"/>
+      <w:r>
+        <w:t>less</w:t>
+      </w:r>
+      <w:proofErr w:type="gramEnd"/>
+      <w:r>
+        <w:t xml:space="preserve"> peak hours </w:t>
+      </w:r>
+      <w:r>
+        <w:sym w:font="Wingdings" w:char="F0E0"/>
+      </w:r>
+      <w:r>
+        <w:t xml:space="preserve"> when there </w:t>
+      </w:r>
+      <w:proofErr w:type="gramStart"/>
+      <w:r>
+        <w:t>change</w:t>
+      </w:r>
+      <w:proofErr w:type="gramEnd"/>
+      <w:r>
+        <w:t xml:space="preserve"> in owner or role </w:t>
+      </w:r>
+      <w:r>
+        <w:sym w:font="Wingdings" w:char="F0E0"/>
+      </w:r>
+      <w:r>
+        <w:t xml:space="preserve"> it calculates the </w:t>
+      </w:r>
+      <w:proofErr w:type="gramStart"/>
+      <w:r>
+        <w:t>sharing</w:t>
+      </w:r>
+      <w:proofErr w:type="gramEnd"/>
+      <w:r>
+        <w:t xml:space="preserve"> so record locking happens.</w:t>
+      </w:r>
+    </w:p>
+    <w:p>
+      <w:pPr>
+        <w:pStyle w:val="ListBullet"/>
+      </w:pPr>
+      <w:r>
+        <w:rPr>
+          <w:rFonts w:ascii="Calibri" w:hAnsi="Calibri"/>
+          <w:color w:val="1F3864"/>
+          <w:sz w:val="21"/>
+        </w:rPr>
+        <w:t>Group Membership: Prefer sharing to Public Groups rather than individual Roles to reduce the number of Share table rows created.</w:t>
+      </w:r>
+    </w:p>
+    <w:p>
+      <w:pPr>
+        <w:pStyle w:val="ListBullet"/>
+        <w:tabs>
+          <w:tab w:val="clear" w:pos="360"/>
+          <w:tab w:val="num" w:pos="720"/>
+        </w:tabs>
+        <w:ind w:left="720"/>
+      </w:pPr>
+      <w:r>
+        <w:rPr>
+          <w:rFonts w:ascii="Calibri" w:hAnsi="Calibri"/>
+          <w:color w:val="1F3864"/>
+          <w:sz w:val="21"/>
+        </w:rPr>
+        <w:t xml:space="preserve">Create the group </w:t>
+      </w:r>
+      <w:r>
+        <w:rPr>
+          <w:rFonts w:ascii="Calibri" w:hAnsi="Calibri"/>
+          <w:color w:val="1F3864"/>
+          <w:sz w:val="21"/>
+        </w:rPr>
+        <w:sym w:font="Wingdings" w:char="F0E0"/>
+      </w:r>
+      <w:r>
+        <w:rPr>
+          <w:rFonts w:ascii="Calibri" w:hAnsi="Calibri"/>
+          <w:color w:val="1F3864"/>
+          <w:sz w:val="21"/>
+        </w:rPr>
+        <w:t xml:space="preserve"> when you want to share </w:t>
+      </w:r>
+      <w:proofErr w:type="gramStart"/>
+      <w:r>
+        <w:rPr>
+          <w:rFonts w:ascii="Calibri" w:hAnsi="Calibri"/>
+          <w:color w:val="1F3864"/>
+          <w:sz w:val="21"/>
+        </w:rPr>
+        <w:t>them</w:t>
+      </w:r>
+      <w:proofErr w:type="gramEnd"/>
+      <w:r>
+        <w:rPr>
+          <w:rFonts w:ascii="Calibri" w:hAnsi="Calibri"/>
+          <w:color w:val="1F3864"/>
+          <w:sz w:val="21"/>
+        </w:rPr>
+        <w:t xml:space="preserve"> </w:t>
+      </w:r>
+      <w:r>
+        <w:rPr>
+          <w:rFonts w:ascii="Calibri" w:hAnsi="Calibri"/>
+          <w:color w:val="1F3864"/>
+          <w:sz w:val="21"/>
+        </w:rPr>
+        <w:t xml:space="preserve">5 or </w:t>
+      </w:r>
+      <w:proofErr w:type="gramStart"/>
+      <w:r>
+        <w:rPr>
+          <w:rFonts w:ascii="Calibri" w:hAnsi="Calibri"/>
+          <w:color w:val="1F3864"/>
+          <w:sz w:val="21"/>
+        </w:rPr>
+        <w:t>more than</w:t>
+      </w:r>
+      <w:proofErr w:type="gramEnd"/>
+      <w:r>
+        <w:rPr>
+          <w:rFonts w:ascii="Calibri" w:hAnsi="Calibri"/>
+          <w:color w:val="1F3864"/>
+          <w:sz w:val="21"/>
+        </w:rPr>
+        <w:t xml:space="preserve"> 5 users</w:t>
+      </w:r>
+    </w:p>
+    <w:p>
+      <w:pPr>
+        <w:pStyle w:val="ListBullet"/>
+      </w:pPr>
+      <w:r>
+        <w:rPr>
+          <w:rFonts w:ascii="Calibri" w:hAnsi="Calibri"/>
+          <w:color w:val="1F3864"/>
+          <w:sz w:val="21"/>
+        </w:rPr>
+        <w:t>Granularity: Avoid using 'Read/Write' access unless business processes strictly require it, adhering to the Principle of Least Privilege.</w:t>
+      </w:r>
+    </w:p>
+    <w:p/>
+    <w:tbl>
+      <w:tblPr>
+        <w:tblStyle w:val="TableGrid"/>
+        <w:tblW w:w="0" w:type="auto"/>
+        <w:tblLook w:val="04A0" w:firstRow="1" w:lastRow="0" w:firstColumn="1" w:lastColumn="0" w:noHBand="0" w:noVBand="1"/>
+      </w:tblPr>
+      <w:tblGrid>
+        <w:gridCol w:w="8640"/>
+      </w:tblGrid>
+      <w:tr>
+        <w:tc>
+          <w:tcPr>
+            <w:tcW w:w="8640" w:type="dxa"/>
+            <w:tcBorders>
+              <w:top w:val="single" w:sz="4" w:space="0" w:color="E2EFDA"/>
+              <w:left w:val="single" w:sz="4" w:space="0" w:color="E2EFDA"/>
+              <w:bottom w:val="single" w:sz="4" w:space="0" w:color="E2EFDA"/>
+              <w:right w:val="single" w:sz="4" w:space="0" w:color="E2EFDA"/>
+            </w:tcBorders>
+            <w:shd w:val="clear" w:color="auto" w:fill="E2EFDA"/>
+            <w:tcMar>
+              <w:top w:w="100" w:type="dxa"/>
+              <w:left w:w="100" w:type="dxa"/>
+              <w:bottom w:w="100" w:type="dxa"/>
+              <w:right w:w="100" w:type="dxa"/>
+            </w:tcMar>
+          </w:tcPr>
+          <w:p>
+            <w:r>
+              <w:rPr>
+                <w:rFonts w:ascii="Calibri" w:hAnsi="Calibri"/>
+                <w:b/>
+                <w:color w:val="375623"/>
+              </w:rPr>
+              <w:t xml:space="preserve">  ✔  Best Practices</w:t>
+            </w:r>
+          </w:p>
+        </w:tc>
+      </w:tr>
+    </w:tbl>
+    <w:p/>
+    <w:p>
+      <w:pPr>
+        <w:pStyle w:val="ListBullet"/>
+      </w:pPr>
+      <w:r>
+        <w:rPr>
+          <w:rFonts w:ascii="Calibri" w:hAnsi="Calibri"/>
+          <w:color w:val="375623"/>
+          <w:sz w:val="21"/>
+        </w:rPr>
+        <w:lastRenderedPageBreak/>
+        <w:t>Utilize Public Groups as the target for sharing rules to simplify administration and minimize record-level recalculations.</w:t>
+      </w:r>
+    </w:p>
+    <w:p>
+      <w:pPr>
+        <w:pStyle w:val="ListBullet"/>
+      </w:pPr>
+      <w:r>
+        <w:rPr>
+          <w:rFonts w:ascii="Calibri" w:hAnsi="Calibri"/>
+          <w:color w:val="375623"/>
+          <w:sz w:val="21"/>
+        </w:rPr>
+        <w:t>Avoid creating sharing rules that overlap with the Role Hierarchy to keep the sharing table lean.</w:t>
+      </w:r>
+    </w:p>
+    <w:p>
+      <w:pPr>
+        <w:pStyle w:val="ListBullet"/>
+        <w:rPr>
+          <w:highlight w:val="yellow"/>
+        </w:rPr>
+      </w:pPr>
+      <w:r>
+        <w:rPr>
+          <w:rFonts w:ascii="Calibri" w:hAnsi="Calibri"/>
+          <w:b/>
+          <w:bCs/>
+          <w:color w:val="375623"/>
+          <w:sz w:val="21"/>
+        </w:rPr>
+        <w:t>Use 'Role and Internal Subordinates'</w:t>
+      </w:r>
+      <w:r>
+        <w:rPr>
+          <w:rFonts w:ascii="Calibri" w:hAnsi="Calibri"/>
+          <w:color w:val="375623"/>
+          <w:sz w:val="21"/>
+        </w:rPr>
+        <w:t xml:space="preserve"> instead of </w:t>
+      </w:r>
+      <w:r>
+        <w:rPr>
+          <w:rFonts w:ascii="Calibri" w:hAnsi="Calibri"/>
+          <w:b/>
+          <w:bCs/>
+          <w:i/>
+          <w:iCs/>
+          <w:color w:val="375623"/>
+          <w:sz w:val="21"/>
+        </w:rPr>
+        <w:t>'Role and Subordinates'</w:t>
+      </w:r>
+      <w:r>
+        <w:rPr>
+          <w:rFonts w:ascii="Calibri" w:hAnsi="Calibri"/>
+          <w:color w:val="375623"/>
+          <w:sz w:val="21"/>
+        </w:rPr>
+        <w:t xml:space="preserve"> to </w:t>
+      </w:r>
+      <w:r>
+        <w:rPr>
+          <w:rFonts w:ascii="Calibri" w:hAnsi="Calibri"/>
+          <w:color w:val="375623"/>
+          <w:sz w:val="21"/>
+          <w:highlight w:val="yellow"/>
+        </w:rPr>
+        <w:t>exclude external community users from internal data visibility.</w:t>
+      </w:r>
+    </w:p>
+    <w:p>
+      <w:pPr>
+        <w:pStyle w:val="ListBullet"/>
+      </w:pPr>
+      <w:r>
+        <w:rPr>
+          <w:rFonts w:ascii="Calibri" w:hAnsi="Calibri"/>
+          <w:color w:val="375623"/>
+          <w:sz w:val="21"/>
+        </w:rPr>
+        <w:t>Monitor the 300-rule limit per object during the design phase; if exceeding, consider Apex Managed Sharing or scoping changes.</w:t>
+      </w:r>
+    </w:p>
+    <w:p>
+      <w:pPr>
+        <w:pStyle w:val="ListBullet"/>
+      </w:pPr>
+      <w:r>
+        <w:rPr>
+          <w:rFonts w:ascii="Calibri" w:hAnsi="Calibri"/>
+          <w:color w:val="375623"/>
+          <w:sz w:val="21"/>
+        </w:rPr>
+        <w:t>Regularly run the 'Sharing Model' report to audit who has access to what and why.</w:t>
+      </w:r>
+    </w:p>
+    <w:p/>
+    <w:tbl>
+      <w:tblPr>
+        <w:tblStyle w:val="TableGrid"/>
+        <w:tblW w:w="0" w:type="auto"/>
+        <w:tblLook w:val="04A0" w:firstRow="1" w:lastRow="0" w:firstColumn="1" w:lastColumn="0" w:noHBand="0" w:noVBand="1"/>
+      </w:tblPr>
+      <w:tblGrid>
+        <w:gridCol w:w="8640"/>
+      </w:tblGrid>
+      <w:tr>
+        <w:tc>
+          <w:tcPr>
+            <w:tcW w:w="8640" w:type="dxa"/>
+            <w:tcBorders>
+              <w:top w:val="single" w:sz="4" w:space="0" w:color="FCE4D6"/>
+              <w:left w:val="single" w:sz="4" w:space="0" w:color="FCE4D6"/>
+              <w:bottom w:val="single" w:sz="4" w:space="0" w:color="FCE4D6"/>
+              <w:right w:val="single" w:sz="4" w:space="0" w:color="FCE4D6"/>
+            </w:tcBorders>
+            <w:shd w:val="clear" w:color="auto" w:fill="FCE4D6"/>
+            <w:tcMar>
+              <w:top w:w="100" w:type="dxa"/>
+              <w:left w:w="100" w:type="dxa"/>
+              <w:bottom w:w="100" w:type="dxa"/>
+              <w:right w:w="100" w:type="dxa"/>
+            </w:tcMar>
+          </w:tcPr>
+          <w:p>
+            <w:r>
+              <w:rPr>
+                <w:rFonts w:ascii="Calibri" w:hAnsi="Calibri"/>
+                <w:b/>
+                <w:color w:val="833C00"/>
+              </w:rPr>
+              <w:t xml:space="preserve">  ⚠  Limitations</w:t>
+            </w:r>
+          </w:p>
+        </w:tc>
+      </w:tr>
+    </w:tbl>
+    <w:p/>
+    <w:p>
+      <w:pPr>
+        <w:pStyle w:val="ListBullet"/>
+      </w:pPr>
+      <w:r>
+        <w:rPr>
+          <w:rFonts w:ascii="Calibri" w:hAnsi="Calibri"/>
+          <w:color w:val="833C00"/>
+          <w:sz w:val="21"/>
+        </w:rPr>
+        <w:t>Maximum of 300 sharing rules per object (cumulative).</w:t>
+      </w:r>
+    </w:p>
+    <w:p>
+      <w:pPr>
+        <w:pStyle w:val="ListBullet"/>
+      </w:pPr>
+      <w:r>
+        <w:rPr>
+          <w:rFonts w:ascii="Calibri" w:hAnsi="Calibri"/>
+          <w:color w:val="833C00"/>
+          <w:sz w:val="21"/>
+        </w:rPr>
+        <w:t>Maximum of 50 criteria-based sharing rules per object.</w:t>
+      </w:r>
+    </w:p>
+    <w:p>
+      <w:pPr>
+        <w:pStyle w:val="ListBullet"/>
+      </w:pPr>
+      <w:r>
+        <w:rPr>
+          <w:rFonts w:ascii="Calibri" w:hAnsi="Calibri"/>
+          <w:color w:val="833C00"/>
+          <w:sz w:val="21"/>
+        </w:rPr>
+        <w:t>Cannot share records with specific individual users; must use Groups, Roles, or Territories.</w:t>
+      </w:r>
+    </w:p>
+    <w:p>
+      <w:pPr>
+        <w:pStyle w:val="ListBullet"/>
+      </w:pPr>
+      <w:r>
+        <w:rPr>
+          <w:rFonts w:ascii="Calibri" w:hAnsi="Calibri"/>
+          <w:color w:val="833C00"/>
+          <w:sz w:val="21"/>
+          <w:highlight w:val="yellow"/>
+        </w:rPr>
+        <w:t>Criteria-based sharing cannot utilize related object fields (cross-object logic) directly.</w:t>
+      </w:r>
+    </w:p>
+    <w:p>
+      <w:pPr>
+        <w:pStyle w:val="ListBullet"/>
+        <w:rPr>
+          <w:highlight w:val="yellow"/>
+        </w:rPr>
+      </w:pPr>
+      <w:r>
+        <w:rPr>
+          <w:rFonts w:ascii="Calibri" w:hAnsi="Calibri"/>
+          <w:color w:val="833C00"/>
+          <w:sz w:val="21"/>
+          <w:highlight w:val="yellow"/>
+        </w:rPr>
+        <w:t>Owner-based rules do not apply to objects where the OWD is set to 'Controlled by Parent'.</w:t>
+      </w:r>
+    </w:p>
+    <w:p/>
+    <w:tbl>
+      <w:tblPr>
+        <w:tblStyle w:val="TableGrid"/>
+        <w:tblW w:w="0" w:type="auto"/>
+        <w:tblLook w:val="04A0" w:firstRow="1" w:lastRow="0" w:firstColumn="1" w:lastColumn="0" w:noHBand="0" w:noVBand="1"/>
+      </w:tblPr>
+      <w:tblGrid>
+        <w:gridCol w:w="8640"/>
+      </w:tblGrid>
+      <w:tr>
+        <w:tc>
+          <w:tcPr>
+            <w:tcW w:w="8640" w:type="dxa"/>
+            <w:tcBorders>
+              <w:top w:val="single" w:sz="4" w:space="0" w:color="2E75B6"/>
+              <w:left w:val="single" w:sz="4" w:space="0" w:color="2E75B6"/>
+              <w:bottom w:val="single" w:sz="4" w:space="0" w:color="2E75B6"/>
+              <w:right w:val="single" w:sz="4" w:space="0" w:color="2E75B6"/>
+            </w:tcBorders>
+            <w:shd w:val="clear" w:color="auto" w:fill="2E75B6"/>
+            <w:tcMar>
+              <w:top w:w="100" w:type="dxa"/>
+              <w:left w:w="100" w:type="dxa"/>
+              <w:bottom w:w="100" w:type="dxa"/>
+              <w:right w:w="100" w:type="dxa"/>
+            </w:tcMar>
+          </w:tcPr>
+          <w:p>
+            <w:r>
+              <w:rPr>
+                <w:rFonts w:ascii="Calibri" w:hAnsi="Calibri"/>
+                <w:b/>
+                <w:color w:val="FFFFFF"/>
+                <w:sz w:val="24"/>
+              </w:rPr>
+              <w:t xml:space="preserve">  Data Access Flow</w:t>
+            </w:r>
+          </w:p>
+        </w:tc>
+      </w:tr>
+    </w:tbl>
+    <w:p/>
+    <w:tbl>
+      <w:tblPr>
+        <w:tblStyle w:val="TableGrid"/>
+        <w:tblW w:w="0" w:type="auto"/>
+        <w:tblLook w:val="04A0" w:firstRow="1" w:lastRow="0" w:firstColumn="1" w:lastColumn="0" w:noHBand="0" w:noVBand="1"/>
+      </w:tblPr>
+      <w:tblGrid>
+        <w:gridCol w:w="8640"/>
+      </w:tblGrid>
+      <w:tr>
+        <w:tc>
+          <w:tcPr>
+            <w:tcW w:w="8640" w:type="dxa"/>
+            <w:tcBorders>
+              <w:top w:val="single" w:sz="18" w:space="0" w:color="2E75B6"/>
+              <w:left w:val="single" w:sz="18" w:space="0" w:color="2E75B6"/>
+              <w:bottom w:val="single" w:sz="18" w:space="0" w:color="2E75B6"/>
+              <w:right w:val="single" w:sz="18" w:space="0" w:color="2E75B6"/>
+            </w:tcBorders>
+            <w:shd w:val="clear" w:color="auto" w:fill="EBF3FB"/>
+          </w:tcPr>
+          <w:p>
+            <w:r>
+              <w:rPr>
+                <w:rFonts w:ascii="Consolas" w:hAnsi="Consolas"/>
+                <w:color w:val="1F3864"/>
+                <w:sz w:val="20"/>
+              </w:rPr>
+              <w:t>Record Request  →  [OWD Check: Private?]  →  Yes  →  [Is User Owner?]  →  No  →  [Is User Above Owner in Hierarchy?]  →  No  →  [Evaluate Owner-Based Sharing Rules]  →  No Match  →  [Evaluate Criteria-Based Sharing Rules]  →  No Match  →  Access Denied</w:t>
+            </w:r>
+          </w:p>
+        </w:tc>
+      </w:tr>
+    </w:tbl>
+    <w:p/>
+    <w:tbl>
+      <w:tblPr>
+        <w:tblStyle w:val="TableGrid"/>
+        <w:tblW w:w="0" w:type="auto"/>
+        <w:tblLook w:val="04A0" w:firstRow="1" w:lastRow="0" w:firstColumn="1" w:lastColumn="0" w:noHBand="0" w:noVBand="1"/>
+      </w:tblPr>
+      <w:tblGrid>
+        <w:gridCol w:w="8640"/>
+      </w:tblGrid>
+      <w:tr>
+        <w:tc>
+          <w:tcPr>
+            <w:tcW w:w="8640" w:type="dxa"/>
+            <w:tcBorders>
+              <w:top w:val="single" w:sz="4" w:space="0" w:color="FFF2CC"/>
+              <w:left w:val="single" w:sz="4" w:space="0" w:color="FFF2CC"/>
+              <w:bottom w:val="single" w:sz="4" w:space="0" w:color="FFF2CC"/>
+              <w:right w:val="single" w:sz="4" w:space="0" w:color="FFF2CC"/>
+            </w:tcBorders>
+            <w:shd w:val="clear" w:color="auto" w:fill="FFF2CC"/>
+            <w:tcMar>
+              <w:top w:w="100" w:type="dxa"/>
+              <w:left w:w="100" w:type="dxa"/>
+              <w:bottom w:w="100" w:type="dxa"/>
+              <w:right w:w="100" w:type="dxa"/>
+            </w:tcMar>
+          </w:tcPr>
+          <w:p>
+            <w:r>
+              <w:rPr>
+                <w:rFonts w:ascii="Calibri" w:hAnsi="Calibri"/>
+                <w:b/>
+                <w:color w:val="7F6000"/>
+              </w:rPr>
+              <w:t xml:space="preserve">  Example</w:t>
+            </w:r>
+          </w:p>
+        </w:tc>
+      </w:tr>
+    </w:tbl>
+    <w:p/>
+    <w:tbl>
+      <w:tblPr>
+        <w:tblStyle w:val="TableGrid"/>
+        <w:tblW w:w="0" w:type="auto"/>
+        <w:tblLook w:val="04A0" w:firstRow="1" w:lastRow="0" w:firstColumn="1" w:lastColumn="0" w:noHBand="0" w:noVBand="1"/>
+      </w:tblPr>
+      <w:tblGrid>
+        <w:gridCol w:w="8640"/>
+      </w:tblGrid>
+      <w:tr>
+        <w:tc>
+          <w:tcPr>
+            <w:tcW w:w="8640" w:type="dxa"/>
+            <w:tcBorders>
+              <w:top w:val="single" w:sz="18" w:space="0" w:color="F4B942"/>
+              <w:left w:val="single" w:sz="18" w:space="0" w:color="F4B942"/>
+              <w:bottom w:val="single" w:sz="18" w:space="0" w:color="F4B942"/>
+              <w:right w:val="single" w:sz="18" w:space="0" w:color="F4B942"/>
+            </w:tcBorders>
+            <w:shd w:val="clear" w:color="auto" w:fill="FFF2CC"/>
+          </w:tcPr>
+          <w:p>
+            <w:r>
+              <w:rPr>
+                <w:rFonts w:ascii="Consolas" w:hAnsi="Consolas"/>
+                <w:color w:val="7F6000"/>
+                <w:sz w:val="20"/>
+              </w:rPr>
+              <w:t>An Architect configures a Criteria-Based Sharing Rule on the 'Opportunity' object where 'Amount &gt; 1000000'. The rule shares these records with the 'Executive Leadership' Public Group with 'Read Only' access, ensuring high-value deals are visible to leadership regardless of the owner's position in the role hierarchy.</w:t>
+            </w:r>
+          </w:p>
+        </w:tc>
+      </w:tr>
+    </w:tbl>
+    <w:p/>
+    <w:p>
+      <w:r>
+        <w:br w:type="page"/>
+      </w:r>
+    </w:p>
+    <w:tbl>
+      <w:tblPr>
+        <w:tblStyle w:val="TableGrid"/>
+        <w:tblW w:w="0" w:type="auto"/>
+        <w:tblLook w:val="04A0" w:firstRow="1" w:lastRow="0" w:firstColumn="1" w:lastColumn="0" w:noHBand="0" w:noVBand="1"/>
+      </w:tblPr>
+      <w:tblGrid>
+        <w:gridCol w:w="8640"/>
+      </w:tblGrid>
+      <w:tr>
+        <w:tc>
+          <w:tcPr>
+            <w:tcW w:w="8640" w:type="dxa"/>
+            <w:tcBorders>
+              <w:top w:val="single" w:sz="4" w:space="0" w:color="1F3864"/>
+              <w:left w:val="single" w:sz="4" w:space="0" w:color="1F3864"/>
+              <w:bottom w:val="single" w:sz="4" w:space="0" w:color="1F3864"/>
+              <w:right w:val="single" w:sz="4" w:space="0" w:color="1F3864"/>
+            </w:tcBorders>
+            <w:shd w:val="clear" w:color="auto" w:fill="1F3864"/>
+            <w:tcMar>
+              <w:top w:w="100" w:type="dxa"/>
+              <w:left w:w="100" w:type="dxa"/>
+              <w:bottom w:w="100" w:type="dxa"/>
+              <w:right w:w="100" w:type="dxa"/>
+            </w:tcMar>
+          </w:tcPr>
+          <w:p>
+            <w:r>
+              <w:rPr>
+                <w:rFonts w:ascii="Calibri" w:hAnsi="Calibri"/>
+                <w:b/>
+                <w:color w:val="FFFFFF"/>
+                <w:sz w:val="32"/>
+              </w:rPr>
+              <w:lastRenderedPageBreak/>
+              <w:t xml:space="preserve">  Manual Sharing</w:t>
+            </w:r>
+          </w:p>
+        </w:tc>
+      </w:tr>
+    </w:tbl>
+    <w:p/>
+    <w:tbl>
+      <w:tblPr>
+        <w:tblStyle w:val="TableGrid"/>
+        <w:tblW w:w="0" w:type="auto"/>
+        <w:tblLook w:val="04A0" w:firstRow="1" w:lastRow="0" w:firstColumn="1" w:lastColumn="0" w:noHBand="0" w:noVBand="1"/>
+      </w:tblPr>
+      <w:tblGrid>
+        <w:gridCol w:w="8640"/>
+      </w:tblGrid>
+      <w:tr>
+        <w:tc>
+          <w:tcPr>
+            <w:tcW w:w="8640" w:type="dxa"/>
+            <w:tcBorders>
+              <w:top w:val="single" w:sz="4" w:space="0" w:color="2E75B6"/>
+              <w:left w:val="single" w:sz="4" w:space="0" w:color="2E75B6"/>
+              <w:bottom w:val="single" w:sz="4" w:space="0" w:color="2E75B6"/>
+              <w:right w:val="single" w:sz="4" w:space="0" w:color="2E75B6"/>
+            </w:tcBorders>
+            <w:shd w:val="clear" w:color="auto" w:fill="2E75B6"/>
+            <w:tcMar>
+              <w:top w:w="100" w:type="dxa"/>
+              <w:left w:w="100" w:type="dxa"/>
+              <w:bottom w:w="100" w:type="dxa"/>
+              <w:right w:w="100" w:type="dxa"/>
+            </w:tcMar>
+          </w:tcPr>
+          <w:p>
+            <w:r>
+              <w:rPr>
+                <w:rFonts w:ascii="Calibri" w:hAnsi="Calibri"/>
+                <w:b/>
+                <w:color w:val="FFFFFF"/>
+                <w:sz w:val="24"/>
+              </w:rPr>
+              <w:t xml:space="preserve">  Summary</w:t>
+            </w:r>
+          </w:p>
+        </w:tc>
+      </w:tr>
+    </w:tbl>
+    <w:p/>
+    <w:p>
+      <w:pPr>
+        <w:pStyle w:val="ListBullet"/>
+      </w:pPr>
+      <w:r>
+        <w:rPr>
+          <w:rFonts w:ascii="Calibri" w:hAnsi="Calibri"/>
+          <w:color w:val="1F3864"/>
+          <w:sz w:val="21"/>
+        </w:rPr>
+        <w:t>Manual sharing is a granular security mechanism in Salesforce that allows record owners and administrators to provide one-off access to specific records for users, groups, or roles. It acts as a flexible override for Organization-Wide Defaults (OWD), Role Hierarchies, and Sharing Rules when those automated mechanisms are insufficient for irregular business requirements.</w:t>
+      </w:r>
+    </w:p>
+    <w:p/>
+    <w:tbl>
+      <w:tblPr>
+        <w:tblStyle w:val="TableGrid"/>
+        <w:tblW w:w="0" w:type="auto"/>
+        <w:tblLook w:val="04A0" w:firstRow="1" w:lastRow="0" w:firstColumn="1" w:lastColumn="0" w:noHBand="0" w:noVBand="1"/>
+      </w:tblPr>
+      <w:tblGrid>
+        <w:gridCol w:w="8640"/>
+      </w:tblGrid>
+      <w:tr>
+        <w:tc>
+          <w:tcPr>
+            <w:tcW w:w="8640" w:type="dxa"/>
+            <w:tcBorders>
+              <w:top w:val="single" w:sz="4" w:space="0" w:color="D6E4F0"/>
+              <w:left w:val="single" w:sz="4" w:space="0" w:color="D6E4F0"/>
+              <w:bottom w:val="single" w:sz="4" w:space="0" w:color="D6E4F0"/>
+              <w:right w:val="single" w:sz="4" w:space="0" w:color="D6E4F0"/>
+            </w:tcBorders>
+            <w:shd w:val="clear" w:color="auto" w:fill="D6E4F0"/>
+            <w:tcMar>
+              <w:top w:w="100" w:type="dxa"/>
+              <w:left w:w="100" w:type="dxa"/>
+              <w:bottom w:w="100" w:type="dxa"/>
+              <w:right w:w="100" w:type="dxa"/>
+            </w:tcMar>
+          </w:tcPr>
+          <w:p>
+            <w:r>
+              <w:rPr>
+                <w:rFonts w:ascii="Calibri" w:hAnsi="Calibri"/>
+                <w:b/>
+                <w:color w:val="1F3864"/>
+              </w:rPr>
+              <w:t xml:space="preserve">  Technical Architecture and Data Model</w:t>
+            </w:r>
+          </w:p>
+        </w:tc>
+      </w:tr>
+    </w:tbl>
+    <w:p/>
+    <w:p>
+      <w:pPr>
+        <w:pStyle w:val="ListBullet"/>
+      </w:pPr>
+      <w:r>
+        <w:rPr>
+          <w:rFonts w:ascii="Calibri" w:hAnsi="Calibri"/>
+          <w:color w:val="1F3864"/>
+          <w:sz w:val="21"/>
+        </w:rPr>
+        <w:t>Manual sharing relies on the underlying 'Share' objects associated with standard and custom objects (e.g., LeadShare, Position__Share).</w:t>
+      </w:r>
+    </w:p>
+    <w:p>
+      <w:pPr>
+        <w:pStyle w:val="ListBullet"/>
+      </w:pPr>
+      <w:r>
+        <w:rPr>
+          <w:rFonts w:ascii="Calibri" w:hAnsi="Calibri"/>
+          <w:color w:val="1F3864"/>
+          <w:sz w:val="21"/>
+        </w:rPr>
+        <w:t>Each manual share record is defined by a 'RowCause' field value of 'Manual'.</w:t>
+      </w:r>
+    </w:p>
+    <w:p>
+      <w:pPr>
+        <w:pStyle w:val="ListBullet"/>
+      </w:pPr>
+      <w:r>
+        <w:rPr>
+          <w:rFonts w:ascii="Calibri" w:hAnsi="Calibri"/>
+          <w:color w:val="1F3864"/>
+          <w:sz w:val="21"/>
+        </w:rPr>
+        <w:t>The data model consists of ParentId (the record ID), UserOrGroupId (the grantee), and AccessLevel (Read or Edit).</w:t>
+      </w:r>
+    </w:p>
+    <w:p>
+      <w:pPr>
+        <w:pStyle w:val="ListBullet"/>
+      </w:pPr>
+      <w:r>
+        <w:rPr>
+          <w:rFonts w:ascii="Calibri" w:hAnsi="Calibri"/>
+          <w:color w:val="1F3864"/>
+          <w:sz w:val="21"/>
+        </w:rPr>
+        <w:t>Custom objects must have their Sharing Model set to 'Private' or 'Public Read Only' for the Share object to be accessible.</w:t>
+      </w:r>
+    </w:p>
+    <w:p/>
+    <w:tbl>
+      <w:tblPr>
+        <w:tblStyle w:val="TableGrid"/>
+        <w:tblW w:w="0" w:type="auto"/>
+        <w:tblLook w:val="04A0" w:firstRow="1" w:lastRow="0" w:firstColumn="1" w:lastColumn="0" w:noHBand="0" w:noVBand="1"/>
+      </w:tblPr>
+      <w:tblGrid>
+        <w:gridCol w:w="8640"/>
+      </w:tblGrid>
+      <w:tr>
+        <w:tc>
+          <w:tcPr>
+            <w:tcW w:w="8640" w:type="dxa"/>
+            <w:tcBorders>
+              <w:top w:val="single" w:sz="4" w:space="0" w:color="D6E4F0"/>
+              <w:left w:val="single" w:sz="4" w:space="0" w:color="D6E4F0"/>
+              <w:bottom w:val="single" w:sz="4" w:space="0" w:color="D6E4F0"/>
+              <w:right w:val="single" w:sz="4" w:space="0" w:color="D6E4F0"/>
+            </w:tcBorders>
+            <w:shd w:val="clear" w:color="auto" w:fill="D6E4F0"/>
+            <w:tcMar>
+              <w:top w:w="100" w:type="dxa"/>
+              <w:left w:w="100" w:type="dxa"/>
+              <w:bottom w:w="100" w:type="dxa"/>
+              <w:right w:w="100" w:type="dxa"/>
+            </w:tcMar>
+          </w:tcPr>
+          <w:p>
+            <w:r>
+              <w:rPr>
+                <w:rFonts w:ascii="Calibri" w:hAnsi="Calibri"/>
+                <w:b/>
+                <w:color w:val="1F3864"/>
+              </w:rPr>
+              <w:t xml:space="preserve">  Execution and Visibility</w:t>
+            </w:r>
+          </w:p>
+        </w:tc>
+      </w:tr>
+    </w:tbl>
+    <w:p/>
+    <w:p>
+      <w:pPr>
+        <w:pStyle w:val="ListBullet"/>
+      </w:pPr>
+      <w:r>
+        <w:rPr>
+          <w:rFonts w:ascii="Calibri" w:hAnsi="Calibri"/>
+          <w:color w:val="1F3864"/>
+          <w:sz w:val="21"/>
+        </w:rPr>
+        <w:t>Access can be granted by the record owner, users above the owner in the Role Hierarchy, or any user with the 'Modify All Data' permission.</w:t>
+      </w:r>
+    </w:p>
+    <w:p>
+      <w:pPr>
+        <w:pStyle w:val="ListBullet"/>
+      </w:pPr>
+      <w:r>
+        <w:rPr>
+          <w:rFonts w:ascii="Calibri" w:hAnsi="Calibri"/>
+          <w:color w:val="1F3864"/>
+          <w:sz w:val="21"/>
+        </w:rPr>
+        <w:t>The 'Share' button on the Lightning or Classic page layout provides the interface for manual sharing.</w:t>
+      </w:r>
+    </w:p>
+    <w:p>
+      <w:pPr>
+        <w:pStyle w:val="ListBullet"/>
+      </w:pPr>
+      <w:r>
+        <w:rPr>
+          <w:rFonts w:ascii="Calibri" w:hAnsi="Calibri"/>
+          <w:color w:val="1F3864"/>
+          <w:sz w:val="21"/>
+        </w:rPr>
+        <w:t>Programmatic inserts into Share objects with RowCause='Manual' are still considered manual shares and can be managed via the standard UI.</w:t>
+      </w:r>
+    </w:p>
+    <w:p>
+      <w:pPr>
+        <w:pStyle w:val="ListBullet"/>
+      </w:pPr>
+      <w:r>
+        <w:rPr>
+          <w:rFonts w:ascii="Calibri" w:hAnsi="Calibri"/>
+          <w:color w:val="1F3864"/>
+          <w:sz w:val="21"/>
+        </w:rPr>
+        <w:t>Manual sharing is only possible when the Organization-Wide Default (OWD) is more restrictive than the access being granted.</w:t>
+      </w:r>
+    </w:p>
+    <w:p/>
+    <w:tbl>
+      <w:tblPr>
+        <w:tblStyle w:val="TableGrid"/>
+        <w:tblW w:w="0" w:type="auto"/>
+        <w:tblLook w:val="04A0" w:firstRow="1" w:lastRow="0" w:firstColumn="1" w:lastColumn="0" w:noHBand="0" w:noVBand="1"/>
+      </w:tblPr>
+      <w:tblGrid>
+        <w:gridCol w:w="8640"/>
+      </w:tblGrid>
+      <w:tr>
+        <w:tc>
+          <w:tcPr>
+            <w:tcW w:w="8640" w:type="dxa"/>
+            <w:tcBorders>
+              <w:top w:val="single" w:sz="4" w:space="0" w:color="D6E4F0"/>
+              <w:left w:val="single" w:sz="4" w:space="0" w:color="D6E4F0"/>
+              <w:bottom w:val="single" w:sz="4" w:space="0" w:color="D6E4F0"/>
+              <w:right w:val="single" w:sz="4" w:space="0" w:color="D6E4F0"/>
+            </w:tcBorders>
+            <w:shd w:val="clear" w:color="auto" w:fill="D6E4F0"/>
+            <w:tcMar>
+              <w:top w:w="100" w:type="dxa"/>
+              <w:left w:w="100" w:type="dxa"/>
+              <w:bottom w:w="100" w:type="dxa"/>
+              <w:right w:w="100" w:type="dxa"/>
+            </w:tcMar>
+          </w:tcPr>
+          <w:p>
+            <w:r>
+              <w:rPr>
+                <w:rFonts w:ascii="Calibri" w:hAnsi="Calibri"/>
+                <w:b/>
+                <w:color w:val="1F3864"/>
+              </w:rPr>
+              <w:t xml:space="preserve">  Persistence and Lifecycle</w:t>
+            </w:r>
+          </w:p>
+        </w:tc>
+      </w:tr>
+    </w:tbl>
+    <w:p/>
+    <w:p>
+      <w:pPr>
+        <w:pStyle w:val="ListBullet"/>
+      </w:pPr>
+      <w:r>
+        <w:rPr>
+          <w:rFonts w:ascii="Calibri" w:hAnsi="Calibri"/>
+          <w:color w:val="1F3864"/>
+          <w:sz w:val="21"/>
+        </w:rPr>
+        <w:lastRenderedPageBreak/>
+        <w:t>Manual shares are ephemeral; they are automatically deleted by the system when the record owner changes.</w:t>
+      </w:r>
+    </w:p>
+    <w:p>
+      <w:pPr>
+        <w:pStyle w:val="ListBullet"/>
+      </w:pPr>
+      <w:r>
+        <w:rPr>
+          <w:rFonts w:ascii="Calibri" w:hAnsi="Calibri"/>
+          <w:color w:val="1F3864"/>
+          <w:sz w:val="21"/>
+        </w:rPr>
+        <w:t>Shares are also removed if the OWD is changed to a level that provides the same or more access than the manual share.</w:t>
+      </w:r>
+    </w:p>
+    <w:p>
+      <w:pPr>
+        <w:pStyle w:val="ListBullet"/>
+      </w:pPr>
+      <w:r>
+        <w:rPr>
+          <w:rFonts w:ascii="Calibri" w:hAnsi="Calibri"/>
+          <w:color w:val="1F3864"/>
+          <w:sz w:val="21"/>
+        </w:rPr>
+        <w:t>Manual shares do not persist during record transfer, unlike some types of Apex Managed Sharing.</w:t>
+      </w:r>
+    </w:p>
+    <w:p>
+      <w:pPr>
+        <w:pStyle w:val="ListBullet"/>
+      </w:pPr>
+      <w:r>
+        <w:rPr>
+          <w:rFonts w:ascii="Calibri" w:hAnsi="Calibri"/>
+          <w:color w:val="1F3864"/>
+          <w:sz w:val="21"/>
+        </w:rPr>
+        <w:t>Recalculation of sharing occurs whenever a user's group membership or role changes, but the manual share record remains tied to the specific UserOrGroupId.</w:t>
+      </w:r>
+    </w:p>
+    <w:p/>
+    <w:tbl>
+      <w:tblPr>
+        <w:tblStyle w:val="TableGrid"/>
+        <w:tblW w:w="0" w:type="auto"/>
+        <w:tblLook w:val="04A0" w:firstRow="1" w:lastRow="0" w:firstColumn="1" w:lastColumn="0" w:noHBand="0" w:noVBand="1"/>
+      </w:tblPr>
+      <w:tblGrid>
+        <w:gridCol w:w="8640"/>
+      </w:tblGrid>
+      <w:tr>
+        <w:tc>
+          <w:tcPr>
+            <w:tcW w:w="8640" w:type="dxa"/>
+            <w:tcBorders>
+              <w:top w:val="single" w:sz="4" w:space="0" w:color="E2EFDA"/>
+              <w:left w:val="single" w:sz="4" w:space="0" w:color="E2EFDA"/>
+              <w:bottom w:val="single" w:sz="4" w:space="0" w:color="E2EFDA"/>
+              <w:right w:val="single" w:sz="4" w:space="0" w:color="E2EFDA"/>
+            </w:tcBorders>
+            <w:shd w:val="clear" w:color="auto" w:fill="E2EFDA"/>
+            <w:tcMar>
+              <w:top w:w="100" w:type="dxa"/>
+              <w:left w:w="100" w:type="dxa"/>
+              <w:bottom w:w="100" w:type="dxa"/>
+              <w:right w:w="100" w:type="dxa"/>
+            </w:tcMar>
+          </w:tcPr>
+          <w:p>
+            <w:r>
+              <w:rPr>
+                <w:rFonts w:ascii="Calibri" w:hAnsi="Calibri"/>
+                <w:b/>
+                <w:color w:val="375623"/>
+              </w:rPr>
+              <w:t xml:space="preserve">  ✔  Best Practices</w:t>
+            </w:r>
+          </w:p>
+        </w:tc>
+      </w:tr>
+    </w:tbl>
+    <w:p/>
+    <w:p>
+      <w:pPr>
+        <w:pStyle w:val="ListBullet"/>
+      </w:pPr>
+      <w:r>
+        <w:rPr>
+          <w:rFonts w:ascii="Calibri" w:hAnsi="Calibri"/>
+          <w:color w:val="375623"/>
+          <w:sz w:val="21"/>
+        </w:rPr>
+        <w:t>Prefer sharing with Public Groups or Roles over individual users to reduce the volume of records in the Share object.</w:t>
+      </w:r>
+    </w:p>
+    <w:p>
+      <w:pPr>
+        <w:pStyle w:val="ListBullet"/>
+      </w:pPr>
+      <w:r>
+        <w:rPr>
+          <w:rFonts w:ascii="Calibri" w:hAnsi="Calibri"/>
+          <w:color w:val="375623"/>
+          <w:sz w:val="21"/>
+        </w:rPr>
+        <w:t>Use manual sharing only for ad-hoc, non-predictable access needs to maintain a manageable security architecture.</w:t>
+      </w:r>
+    </w:p>
+    <w:p>
+      <w:pPr>
+        <w:pStyle w:val="ListBullet"/>
+      </w:pPr>
+      <w:r>
+        <w:rPr>
+          <w:rFonts w:ascii="Calibri" w:hAnsi="Calibri"/>
+          <w:color w:val="375623"/>
+          <w:sz w:val="21"/>
+        </w:rPr>
+        <w:t>Periodically audit the Share objects via SOQL to identify and prune unnecessary manual access.</w:t>
+      </w:r>
+    </w:p>
+    <w:p>
+      <w:pPr>
+        <w:pStyle w:val="ListBullet"/>
+      </w:pPr>
+      <w:r>
+        <w:rPr>
+          <w:rFonts w:ascii="Calibri" w:hAnsi="Calibri"/>
+          <w:color w:val="375623"/>
+          <w:sz w:val="21"/>
+        </w:rPr>
+        <w:t>Include the 'Share' button on page layouts only for objects where business processes require exceptional access patterns.</w:t>
+      </w:r>
+    </w:p>
+    <w:p>
+      <w:pPr>
+        <w:pStyle w:val="ListBullet"/>
+      </w:pPr>
+      <w:r>
+        <w:rPr>
+          <w:rFonts w:ascii="Calibri" w:hAnsi="Calibri"/>
+          <w:color w:val="375623"/>
+          <w:sz w:val="21"/>
+        </w:rPr>
+        <w:t>Avoid manual sharing for high-volume automated processes; use Apex Managed Sharing with custom RowCauses instead.</w:t>
+      </w:r>
+    </w:p>
+    <w:p/>
+    <w:tbl>
+      <w:tblPr>
+        <w:tblStyle w:val="TableGrid"/>
+        <w:tblW w:w="0" w:type="auto"/>
+        <w:tblLook w:val="04A0" w:firstRow="1" w:lastRow="0" w:firstColumn="1" w:lastColumn="0" w:noHBand="0" w:noVBand="1"/>
+      </w:tblPr>
+      <w:tblGrid>
+        <w:gridCol w:w="8640"/>
+      </w:tblGrid>
+      <w:tr>
+        <w:tc>
+          <w:tcPr>
+            <w:tcW w:w="8640" w:type="dxa"/>
+            <w:tcBorders>
+              <w:top w:val="single" w:sz="4" w:space="0" w:color="FCE4D6"/>
+              <w:left w:val="single" w:sz="4" w:space="0" w:color="FCE4D6"/>
+              <w:bottom w:val="single" w:sz="4" w:space="0" w:color="FCE4D6"/>
+              <w:right w:val="single" w:sz="4" w:space="0" w:color="FCE4D6"/>
+            </w:tcBorders>
+            <w:shd w:val="clear" w:color="auto" w:fill="FCE4D6"/>
+            <w:tcMar>
+              <w:top w:w="100" w:type="dxa"/>
+              <w:left w:w="100" w:type="dxa"/>
+              <w:bottom w:w="100" w:type="dxa"/>
+              <w:right w:w="100" w:type="dxa"/>
+            </w:tcMar>
+          </w:tcPr>
+          <w:p>
+            <w:r>
+              <w:rPr>
+                <w:rFonts w:ascii="Calibri" w:hAnsi="Calibri"/>
+                <w:b/>
+                <w:color w:val="833C00"/>
+              </w:rPr>
+              <w:t xml:space="preserve">  ⚠  Limitations</w:t>
+            </w:r>
+          </w:p>
+        </w:tc>
+      </w:tr>
+    </w:tbl>
+    <w:p/>
+    <w:p>
+      <w:pPr>
+        <w:pStyle w:val="ListBullet"/>
+      </w:pPr>
+      <w:r>
+        <w:rPr>
+          <w:rFonts w:ascii="Calibri" w:hAnsi="Calibri"/>
+          <w:color w:val="833C00"/>
+          <w:sz w:val="21"/>
+        </w:rPr>
+        <w:t>Manual shares are lost upon record ownership transfer, requiring manual or automated re-sharing.</w:t>
+      </w:r>
+    </w:p>
+    <w:p>
+      <w:pPr>
+        <w:pStyle w:val="ListBullet"/>
+      </w:pPr>
+      <w:r>
+        <w:rPr>
+          <w:rFonts w:ascii="Calibri" w:hAnsi="Calibri"/>
+          <w:color w:val="833C00"/>
+          <w:sz w:val="21"/>
+        </w:rPr>
+        <w:t>Manual sharing cannot grant 'Full Access'; it is limited to 'Read Only' or 'Read/Write'.</w:t>
+      </w:r>
+    </w:p>
+    <w:p>
+      <w:pPr>
+        <w:pStyle w:val="ListBullet"/>
+      </w:pPr>
+      <w:r>
+        <w:rPr>
+          <w:rFonts w:ascii="Calibri" w:hAnsi="Calibri"/>
+          <w:color w:val="833C00"/>
+          <w:sz w:val="21"/>
+        </w:rPr>
+        <w:t>There is a hard limit of 5,000 share records per record across all sharing types, including manual shares.</w:t>
+      </w:r>
+    </w:p>
+    <w:p>
+      <w:pPr>
+        <w:pStyle w:val="ListBullet"/>
+      </w:pPr>
+      <w:r>
+        <w:rPr>
+          <w:rFonts w:ascii="Calibri" w:hAnsi="Calibri"/>
+          <w:color w:val="833C00"/>
+          <w:sz w:val="21"/>
+        </w:rPr>
+        <w:t>Manual sharing is not available for objects that are the detail side of a Master-Detail relationship, as they inherit sharing from the master.</w:t>
+      </w:r>
+    </w:p>
+    <w:p/>
+    <w:tbl>
+      <w:tblPr>
+        <w:tblStyle w:val="TableGrid"/>
+        <w:tblW w:w="0" w:type="auto"/>
+        <w:tblLook w:val="04A0" w:firstRow="1" w:lastRow="0" w:firstColumn="1" w:lastColumn="0" w:noHBand="0" w:noVBand="1"/>
+      </w:tblPr>
+      <w:tblGrid>
+        <w:gridCol w:w="8640"/>
+      </w:tblGrid>
+      <w:tr>
+        <w:tc>
+          <w:tcPr>
+            <w:tcW w:w="8640" w:type="dxa"/>
+            <w:tcBorders>
+              <w:top w:val="single" w:sz="4" w:space="0" w:color="2E75B6"/>
+              <w:left w:val="single" w:sz="4" w:space="0" w:color="2E75B6"/>
+              <w:bottom w:val="single" w:sz="4" w:space="0" w:color="2E75B6"/>
+              <w:right w:val="single" w:sz="4" w:space="0" w:color="2E75B6"/>
+            </w:tcBorders>
+            <w:shd w:val="clear" w:color="auto" w:fill="2E75B6"/>
+            <w:tcMar>
+              <w:top w:w="100" w:type="dxa"/>
+              <w:left w:w="100" w:type="dxa"/>
+              <w:bottom w:w="100" w:type="dxa"/>
+              <w:right w:w="100" w:type="dxa"/>
+            </w:tcMar>
+          </w:tcPr>
+          <w:p>
+            <w:r>
+              <w:rPr>
+                <w:rFonts w:ascii="Calibri" w:hAnsi="Calibri"/>
+                <w:b/>
+                <w:color w:val="FFFFFF"/>
+                <w:sz w:val="24"/>
+              </w:rPr>
+              <w:t xml:space="preserve">  Data Access Flow</w:t>
+            </w:r>
+          </w:p>
+        </w:tc>
+      </w:tr>
+    </w:tbl>
+    <w:p/>
+    <w:tbl>
+      <w:tblPr>
+        <w:tblStyle w:val="TableGrid"/>
+        <w:tblW w:w="0" w:type="auto"/>
+        <w:tblLook w:val="04A0" w:firstRow="1" w:lastRow="0" w:firstColumn="1" w:lastColumn="0" w:noHBand="0" w:noVBand="1"/>
+      </w:tblPr>
+      <w:tblGrid>
+        <w:gridCol w:w="8640"/>
+      </w:tblGrid>
+      <w:tr>
+        <w:tc>
+          <w:tcPr>
+            <w:tcW w:w="8640" w:type="dxa"/>
+            <w:tcBorders>
+              <w:top w:val="single" w:sz="18" w:space="0" w:color="2E75B6"/>
+              <w:left w:val="single" w:sz="18" w:space="0" w:color="2E75B6"/>
+              <w:bottom w:val="single" w:sz="18" w:space="0" w:color="2E75B6"/>
+              <w:right w:val="single" w:sz="18" w:space="0" w:color="2E75B6"/>
+            </w:tcBorders>
+            <w:shd w:val="clear" w:color="auto" w:fill="EBF3FB"/>
+          </w:tcPr>
+          <w:p>
+            <w:r>
+              <w:rPr>
+                <w:rFonts w:ascii="Consolas" w:hAnsi="Consolas"/>
+                <w:color w:val="1F3864"/>
+                <w:sz w:val="20"/>
+              </w:rPr>
+              <w:t xml:space="preserve">[Record Access Request]  →  [Check OWD: Is it Public Read/Write?]  →  (Yes: </w:t>
+            </w:r>
+            <w:r>
+              <w:rPr>
+                <w:rFonts w:ascii="Consolas" w:hAnsi="Consolas"/>
+                <w:color w:val="1F3864"/>
+                <w:sz w:val="20"/>
+              </w:rPr>
+              <w:lastRenderedPageBreak/>
+              <w:t>Access Granted)  →  (No: Check Role Hierarchy)  →  [Is User above Owner?]  →  (Yes: Access Granted)  →  (No: Check Sharing Rules)  →  [Match Criteria?]  →  (Yes: Access Granted)  →  (No: Check Manual Sharing)  →  [Is there a Manual Share record?]  →  (Yes: Access Granted)  →  (No: Access Denied)</w:t>
+            </w:r>
+          </w:p>
+        </w:tc>
+      </w:tr>
+    </w:tbl>
+    <w:p/>
+    <w:tbl>
+      <w:tblPr>
+        <w:tblStyle w:val="TableGrid"/>
+        <w:tblW w:w="0" w:type="auto"/>
+        <w:tblLook w:val="04A0" w:firstRow="1" w:lastRow="0" w:firstColumn="1" w:lastColumn="0" w:noHBand="0" w:noVBand="1"/>
+      </w:tblPr>
+      <w:tblGrid>
+        <w:gridCol w:w="8640"/>
+      </w:tblGrid>
+      <w:tr>
+        <w:tc>
+          <w:tcPr>
+            <w:tcW w:w="8640" w:type="dxa"/>
+            <w:tcBorders>
+              <w:top w:val="single" w:sz="4" w:space="0" w:color="FFF2CC"/>
+              <w:left w:val="single" w:sz="4" w:space="0" w:color="FFF2CC"/>
+              <w:bottom w:val="single" w:sz="4" w:space="0" w:color="FFF2CC"/>
+              <w:right w:val="single" w:sz="4" w:space="0" w:color="FFF2CC"/>
+            </w:tcBorders>
+            <w:shd w:val="clear" w:color="auto" w:fill="FFF2CC"/>
+            <w:tcMar>
+              <w:top w:w="100" w:type="dxa"/>
+              <w:left w:w="100" w:type="dxa"/>
+              <w:bottom w:w="100" w:type="dxa"/>
+              <w:right w:w="100" w:type="dxa"/>
+            </w:tcMar>
+          </w:tcPr>
+          <w:p>
+            <w:r>
+              <w:rPr>
+                <w:rFonts w:ascii="Calibri" w:hAnsi="Calibri"/>
+                <w:b/>
+                <w:color w:val="7F6000"/>
+              </w:rPr>
+              <w:t xml:space="preserve">  Example</w:t>
+            </w:r>
+          </w:p>
+        </w:tc>
+      </w:tr>
+    </w:tbl>
+    <w:p/>
+    <w:tbl>
+      <w:tblPr>
+        <w:tblStyle w:val="TableGrid"/>
+        <w:tblW w:w="0" w:type="auto"/>
+        <w:tblLook w:val="04A0" w:firstRow="1" w:lastRow="0" w:firstColumn="1" w:lastColumn="0" w:noHBand="0" w:noVBand="1"/>
+      </w:tblPr>
+      <w:tblGrid>
+        <w:gridCol w:w="8640"/>
+      </w:tblGrid>
+      <w:tr>
+        <w:tc>
+          <w:tcPr>
+            <w:tcW w:w="8640" w:type="dxa"/>
+            <w:tcBorders>
+              <w:top w:val="single" w:sz="18" w:space="0" w:color="F4B942"/>
+              <w:left w:val="single" w:sz="18" w:space="0" w:color="F4B942"/>
+              <w:bottom w:val="single" w:sz="18" w:space="0" w:color="F4B942"/>
+              <w:right w:val="single" w:sz="18" w:space="0" w:color="F4B942"/>
+            </w:tcBorders>
+            <w:shd w:val="clear" w:color="auto" w:fill="FFF2CC"/>
+          </w:tcPr>
+          <w:p>
+            <w:r>
+              <w:rPr>
+                <w:rFonts w:ascii="Consolas" w:hAnsi="Consolas"/>
+                <w:color w:val="7F6000"/>
+                <w:sz w:val="20"/>
+              </w:rPr>
+              <w:t>A Project Manager at a consulting firm owns a 'Project' record. They need a specific Architect from a different department to review the project details for one week. The Project Manager uses the 'Share' button to grant 'Read' access to the Architect specifically for that project record without changing the broader department-level sharing rules.</w:t>
+            </w:r>
+          </w:p>
+        </w:tc>
+      </w:tr>
+    </w:tbl>
+    <w:p/>
+    <w:p>
+      <w:r>
+        <w:br w:type="page"/>
+      </w:r>
+    </w:p>
+    <w:tbl>
+      <w:tblPr>
+        <w:tblStyle w:val="TableGrid"/>
+        <w:tblW w:w="0" w:type="auto"/>
+        <w:tblLook w:val="04A0" w:firstRow="1" w:lastRow="0" w:firstColumn="1" w:lastColumn="0" w:noHBand="0" w:noVBand="1"/>
+      </w:tblPr>
+      <w:tblGrid>
+        <w:gridCol w:w="8640"/>
+      </w:tblGrid>
+      <w:tr>
+        <w:tc>
+          <w:tcPr>
+            <w:tcW w:w="8640" w:type="dxa"/>
+            <w:tcBorders>
+              <w:top w:val="single" w:sz="4" w:space="0" w:color="1F3864"/>
+              <w:left w:val="single" w:sz="4" w:space="0" w:color="1F3864"/>
+              <w:bottom w:val="single" w:sz="4" w:space="0" w:color="1F3864"/>
+              <w:right w:val="single" w:sz="4" w:space="0" w:color="1F3864"/>
+            </w:tcBorders>
+            <w:shd w:val="clear" w:color="auto" w:fill="1F3864"/>
+            <w:tcMar>
+              <w:top w:w="100" w:type="dxa"/>
+              <w:left w:w="100" w:type="dxa"/>
+              <w:bottom w:w="100" w:type="dxa"/>
+              <w:right w:w="100" w:type="dxa"/>
+            </w:tcMar>
+          </w:tcPr>
+          <w:p>
+            <w:r>
+              <w:rPr>
+                <w:rFonts w:ascii="Calibri" w:hAnsi="Calibri"/>
+                <w:b/>
+                <w:color w:val="FFFFFF"/>
+                <w:sz w:val="32"/>
+              </w:rPr>
+              <w:lastRenderedPageBreak/>
+              <w:t xml:space="preserve">  Manual Sharing</w:t>
+            </w:r>
+          </w:p>
+        </w:tc>
+      </w:tr>
+    </w:tbl>
+    <w:p/>
+    <w:tbl>
+      <w:tblPr>
+        <w:tblStyle w:val="TableGrid"/>
+        <w:tblW w:w="0" w:type="auto"/>
+        <w:tblLook w:val="04A0" w:firstRow="1" w:lastRow="0" w:firstColumn="1" w:lastColumn="0" w:noHBand="0" w:noVBand="1"/>
+      </w:tblPr>
+      <w:tblGrid>
+        <w:gridCol w:w="8640"/>
+      </w:tblGrid>
+      <w:tr>
+        <w:tc>
+          <w:tcPr>
+            <w:tcW w:w="8640" w:type="dxa"/>
+            <w:tcBorders>
+              <w:top w:val="single" w:sz="4" w:space="0" w:color="2E75B6"/>
+              <w:left w:val="single" w:sz="4" w:space="0" w:color="2E75B6"/>
+              <w:bottom w:val="single" w:sz="4" w:space="0" w:color="2E75B6"/>
+              <w:right w:val="single" w:sz="4" w:space="0" w:color="2E75B6"/>
+            </w:tcBorders>
+            <w:shd w:val="clear" w:color="auto" w:fill="2E75B6"/>
+            <w:tcMar>
+              <w:top w:w="100" w:type="dxa"/>
+              <w:left w:w="100" w:type="dxa"/>
+              <w:bottom w:w="100" w:type="dxa"/>
+              <w:right w:w="100" w:type="dxa"/>
+            </w:tcMar>
+          </w:tcPr>
+          <w:p>
+            <w:r>
+              <w:rPr>
+                <w:rFonts w:ascii="Calibri" w:hAnsi="Calibri"/>
+                <w:b/>
+                <w:color w:val="FFFFFF"/>
+                <w:sz w:val="24"/>
+              </w:rPr>
+              <w:t xml:space="preserve">  Summary</w:t>
+            </w:r>
+          </w:p>
+        </w:tc>
+      </w:tr>
+    </w:tbl>
+    <w:p/>
+    <w:p>
+      <w:pPr>
+        <w:pStyle w:val="ListBullet"/>
+      </w:pPr>
+      <w:r>
+        <w:rPr>
+          <w:rFonts w:ascii="Calibri" w:hAnsi="Calibri"/>
+          <w:color w:val="1F3864"/>
+          <w:sz w:val="21"/>
+        </w:rPr>
+        <w:t>Manual sharing is an ad-hoc record-level security mechanism in Salesforce that allows record owners and administrators to grant specific users, groups, or roles access to records that they would not otherwise have through Organization-Wide Defaults (OWD), Role Hierarchies, or Sharing Rules.</w:t>
+      </w:r>
+    </w:p>
+    <w:p/>
+    <w:tbl>
+      <w:tblPr>
+        <w:tblStyle w:val="TableGrid"/>
+        <w:tblW w:w="0" w:type="auto"/>
+        <w:tblLook w:val="04A0" w:firstRow="1" w:lastRow="0" w:firstColumn="1" w:lastColumn="0" w:noHBand="0" w:noVBand="1"/>
+      </w:tblPr>
+      <w:tblGrid>
+        <w:gridCol w:w="8640"/>
+      </w:tblGrid>
+      <w:tr>
+        <w:tc>
+          <w:tcPr>
+            <w:tcW w:w="8640" w:type="dxa"/>
+            <w:tcBorders>
+              <w:top w:val="single" w:sz="4" w:space="0" w:color="D6E4F0"/>
+              <w:left w:val="single" w:sz="4" w:space="0" w:color="D6E4F0"/>
+              <w:bottom w:val="single" w:sz="4" w:space="0" w:color="D6E4F0"/>
+              <w:right w:val="single" w:sz="4" w:space="0" w:color="D6E4F0"/>
+            </w:tcBorders>
+            <w:shd w:val="clear" w:color="auto" w:fill="D6E4F0"/>
+            <w:tcMar>
+              <w:top w:w="100" w:type="dxa"/>
+              <w:left w:w="100" w:type="dxa"/>
+              <w:bottom w:w="100" w:type="dxa"/>
+              <w:right w:w="100" w:type="dxa"/>
+            </w:tcMar>
+          </w:tcPr>
+          <w:p>
+            <w:r>
+              <w:rPr>
+                <w:rFonts w:ascii="Calibri" w:hAnsi="Calibri"/>
+                <w:b/>
+                <w:color w:val="1F3864"/>
+              </w:rPr>
+              <w:t xml:space="preserve">  Technical Architecture and Data Model</w:t>
+            </w:r>
+          </w:p>
+        </w:tc>
+      </w:tr>
+    </w:tbl>
+    <w:p/>
+    <w:p>
+      <w:pPr>
+        <w:pStyle w:val="ListBullet"/>
+      </w:pPr>
+      <w:r>
+        <w:rPr>
+          <w:rFonts w:ascii="Calibri" w:hAnsi="Calibri"/>
+          <w:color w:val="1F3864"/>
+          <w:sz w:val="21"/>
+        </w:rPr>
+        <w:t>Manual sharing is implemented via Share objects. For custom objects, the naming convention is [ObjectName]__Share. For standard objects, it follows the pattern [ObjectName]Share (e.g., AccountShare, LeadShare).</w:t>
+      </w:r>
+    </w:p>
+    <w:p>
+      <w:pPr>
+        <w:pStyle w:val="ListBullet"/>
+      </w:pPr>
+      <w:r>
+        <w:rPr>
+          <w:rFonts w:ascii="Calibri" w:hAnsi="Calibri"/>
+          <w:color w:val="1F3864"/>
+          <w:sz w:val="21"/>
+        </w:rPr>
+        <w:t>Key fields in Share records include ParentId (the record being shared), UserOrGroupId (the recipient), and AccessLevel (Read, Edit, or All).</w:t>
+      </w:r>
+    </w:p>
+    <w:p>
+      <w:pPr>
+        <w:pStyle w:val="ListBullet"/>
+      </w:pPr>
+      <w:r>
+        <w:rPr>
+          <w:rFonts w:ascii="Calibri" w:hAnsi="Calibri"/>
+          <w:color w:val="1F3864"/>
+          <w:sz w:val="21"/>
+        </w:rPr>
+        <w:t>The RowCause field distinguishes the reason for access. For manual sharing, this field is explicitly set to 'Manual'.</w:t>
+      </w:r>
+    </w:p>
+    <w:p>
+      <w:pPr>
+        <w:pStyle w:val="ListBullet"/>
+      </w:pPr>
+      <w:r>
+        <w:rPr>
+          <w:rFonts w:ascii="Calibri" w:hAnsi="Calibri"/>
+          <w:color w:val="1F3864"/>
+          <w:sz w:val="21"/>
+        </w:rPr>
+        <w:t>Manual shares are stored in the same underlying database tables as automated sharing rules but are handled differently during record ownership changes.</w:t>
+      </w:r>
+    </w:p>
+    <w:p/>
+    <w:tbl>
+      <w:tblPr>
+        <w:tblStyle w:val="TableGrid"/>
+        <w:tblW w:w="0" w:type="auto"/>
+        <w:tblLook w:val="04A0" w:firstRow="1" w:lastRow="0" w:firstColumn="1" w:lastColumn="0" w:noHBand="0" w:noVBand="1"/>
+      </w:tblPr>
+      <w:tblGrid>
+        <w:gridCol w:w="8640"/>
+      </w:tblGrid>
+      <w:tr>
+        <w:tc>
+          <w:tcPr>
+            <w:tcW w:w="8640" w:type="dxa"/>
+            <w:tcBorders>
+              <w:top w:val="single" w:sz="4" w:space="0" w:color="D6E4F0"/>
+              <w:left w:val="single" w:sz="4" w:space="0" w:color="D6E4F0"/>
+              <w:bottom w:val="single" w:sz="4" w:space="0" w:color="D6E4F0"/>
+              <w:right w:val="single" w:sz="4" w:space="0" w:color="D6E4F0"/>
+            </w:tcBorders>
+            <w:shd w:val="clear" w:color="auto" w:fill="D6E4F0"/>
+            <w:tcMar>
+              <w:top w:w="100" w:type="dxa"/>
+              <w:left w:w="100" w:type="dxa"/>
+              <w:bottom w:w="100" w:type="dxa"/>
+              <w:right w:w="100" w:type="dxa"/>
+            </w:tcMar>
+          </w:tcPr>
+          <w:p>
+            <w:r>
+              <w:rPr>
+                <w:rFonts w:ascii="Calibri" w:hAnsi="Calibri"/>
+                <w:b/>
+                <w:color w:val="1F3864"/>
+              </w:rPr>
+              <w:t xml:space="preserve">  Lifecycle and Persistence</w:t>
+            </w:r>
+          </w:p>
+        </w:tc>
+      </w:tr>
+    </w:tbl>
+    <w:p/>
+    <w:p>
+      <w:pPr>
+        <w:pStyle w:val="ListBullet"/>
+      </w:pPr>
+      <w:r>
+        <w:rPr>
+          <w:rFonts w:ascii="Calibri" w:hAnsi="Calibri"/>
+          <w:color w:val="1F3864"/>
+          <w:sz w:val="21"/>
+        </w:rPr>
+        <w:t>Ownership Changes: A critical architectural consideration is that manual shares are automatically deleted when the record owner is changed.</w:t>
+      </w:r>
+    </w:p>
+    <w:p>
+      <w:pPr>
+        <w:pStyle w:val="ListBullet"/>
+      </w:pPr>
+      <w:r>
+        <w:rPr>
+          <w:rFonts w:ascii="Calibri" w:hAnsi="Calibri"/>
+          <w:color w:val="1F3864"/>
+          <w:sz w:val="21"/>
+        </w:rPr>
+        <w:t>Redundancy Logic: If a manual share is created that grants access equal to or less than the object's OWD, the share record is not maintained or is removed.</w:t>
+      </w:r>
+    </w:p>
+    <w:p>
+      <w:pPr>
+        <w:pStyle w:val="ListBullet"/>
+      </w:pPr>
+      <w:r>
+        <w:rPr>
+          <w:rFonts w:ascii="Calibri" w:hAnsi="Calibri"/>
+          <w:color w:val="1F3864"/>
+          <w:sz w:val="21"/>
+        </w:rPr>
+        <w:t>Programmatic Interaction: Even manual shares created via Apex or API are subject to deletion upon owner change unless an Apex Managed Sharing reason (custom RowCause) is used instead.</w:t>
+      </w:r>
+    </w:p>
+    <w:p>
+      <w:pPr>
+        <w:pStyle w:val="ListBullet"/>
+      </w:pPr>
+      <w:r>
+        <w:rPr>
+          <w:rFonts w:ascii="Calibri" w:hAnsi="Calibri"/>
+          <w:color w:val="1F3864"/>
+          <w:sz w:val="21"/>
+        </w:rPr>
+        <w:t>UI Accessibility: Records shared manually (including programmatically with RowCause 'Manual') can be managed via the 'Sharing' button on the Lightning record page layout.</w:t>
+      </w:r>
+    </w:p>
+    <w:p/>
+    <w:tbl>
+      <w:tblPr>
+        <w:tblStyle w:val="TableGrid"/>
+        <w:tblW w:w="0" w:type="auto"/>
+        <w:tblLook w:val="04A0" w:firstRow="1" w:lastRow="0" w:firstColumn="1" w:lastColumn="0" w:noHBand="0" w:noVBand="1"/>
+      </w:tblPr>
+      <w:tblGrid>
+        <w:gridCol w:w="8640"/>
+      </w:tblGrid>
+      <w:tr>
+        <w:tc>
+          <w:tcPr>
+            <w:tcW w:w="8640" w:type="dxa"/>
+            <w:tcBorders>
+              <w:top w:val="single" w:sz="4" w:space="0" w:color="D6E4F0"/>
+              <w:left w:val="single" w:sz="4" w:space="0" w:color="D6E4F0"/>
+              <w:bottom w:val="single" w:sz="4" w:space="0" w:color="D6E4F0"/>
+              <w:right w:val="single" w:sz="4" w:space="0" w:color="D6E4F0"/>
+            </w:tcBorders>
+            <w:shd w:val="clear" w:color="auto" w:fill="D6E4F0"/>
+            <w:tcMar>
+              <w:top w:w="100" w:type="dxa"/>
+              <w:left w:w="100" w:type="dxa"/>
+              <w:bottom w:w="100" w:type="dxa"/>
+              <w:right w:w="100" w:type="dxa"/>
+            </w:tcMar>
+          </w:tcPr>
+          <w:p>
+            <w:r>
+              <w:rPr>
+                <w:rFonts w:ascii="Calibri" w:hAnsi="Calibri"/>
+                <w:b/>
+                <w:color w:val="1F3864"/>
+              </w:rPr>
+              <w:lastRenderedPageBreak/>
+              <w:t xml:space="preserve">  Security and Governance</w:t>
+            </w:r>
+          </w:p>
+        </w:tc>
+      </w:tr>
+    </w:tbl>
+    <w:p/>
+    <w:p>
+      <w:pPr>
+        <w:pStyle w:val="ListBullet"/>
+      </w:pPr>
+      <w:r>
+        <w:rPr>
+          <w:rFonts w:ascii="Calibri" w:hAnsi="Calibri"/>
+          <w:color w:val="1F3864"/>
+          <w:sz w:val="21"/>
+        </w:rPr>
+        <w:t>Permission Requirements: To share a record manually, a user must be the record owner, an administrator, or a user above the owner in the role hierarchy with 'Edit' access.</w:t>
+      </w:r>
+    </w:p>
+    <w:p>
+      <w:pPr>
+        <w:pStyle w:val="ListBullet"/>
+      </w:pPr>
+      <w:r>
+        <w:rPr>
+          <w:rFonts w:ascii="Calibri" w:hAnsi="Calibri"/>
+          <w:color w:val="1F3864"/>
+          <w:sz w:val="21"/>
+        </w:rPr>
+        <w:t>Implicit Sharing: Manual sharing on child records may trigger implicit sharing logic for parent records (e.g., sharing a Contact may grant implicit Read access to the parent Account).</w:t>
+      </w:r>
+    </w:p>
+    <w:p>
+      <w:pPr>
+        <w:pStyle w:val="ListBullet"/>
+      </w:pPr>
+      <w:r>
+        <w:rPr>
+          <w:rFonts w:ascii="Calibri" w:hAnsi="Calibri"/>
+          <w:color w:val="1F3864"/>
+          <w:sz w:val="21"/>
+        </w:rPr>
+        <w:t>Auditing: Architects should implement custom logging or use Shield Event Monitoring to track manual sharing actions, as they represent deviations from the standard security model.</w:t>
+      </w:r>
+    </w:p>
+    <w:p/>
+    <w:tbl>
+      <w:tblPr>
+        <w:tblStyle w:val="TableGrid"/>
+        <w:tblW w:w="0" w:type="auto"/>
+        <w:tblLook w:val="04A0" w:firstRow="1" w:lastRow="0" w:firstColumn="1" w:lastColumn="0" w:noHBand="0" w:noVBand="1"/>
+      </w:tblPr>
+      <w:tblGrid>
+        <w:gridCol w:w="8640"/>
+      </w:tblGrid>
+      <w:tr>
+        <w:tc>
+          <w:tcPr>
+            <w:tcW w:w="8640" w:type="dxa"/>
+            <w:tcBorders>
+              <w:top w:val="single" w:sz="4" w:space="0" w:color="E2EFDA"/>
+              <w:left w:val="single" w:sz="4" w:space="0" w:color="E2EFDA"/>
+              <w:bottom w:val="single" w:sz="4" w:space="0" w:color="E2EFDA"/>
+              <w:right w:val="single" w:sz="4" w:space="0" w:color="E2EFDA"/>
+            </w:tcBorders>
+            <w:shd w:val="clear" w:color="auto" w:fill="E2EFDA"/>
+            <w:tcMar>
+              <w:top w:w="100" w:type="dxa"/>
+              <w:left w:w="100" w:type="dxa"/>
+              <w:bottom w:w="100" w:type="dxa"/>
+              <w:right w:w="100" w:type="dxa"/>
+            </w:tcMar>
+          </w:tcPr>
+          <w:p>
+            <w:r>
+              <w:rPr>
+                <w:rFonts w:ascii="Calibri" w:hAnsi="Calibri"/>
+                <w:b/>
+                <w:color w:val="375623"/>
+              </w:rPr>
+              <w:t xml:space="preserve">  ✔  Best Practices</w:t>
+            </w:r>
+          </w:p>
+        </w:tc>
+      </w:tr>
+    </w:tbl>
+    <w:p/>
+    <w:p>
+      <w:pPr>
+        <w:pStyle w:val="ListBullet"/>
+      </w:pPr>
+      <w:r>
+        <w:rPr>
+          <w:rFonts w:ascii="Calibri" w:hAnsi="Calibri"/>
+          <w:color w:val="375623"/>
+          <w:sz w:val="21"/>
+        </w:rPr>
+        <w:t>Use Public Groups for manual sharing instead of individual Users to reduce the volume of records in the Share table and simplify maintenance.</w:t>
+      </w:r>
+    </w:p>
+    <w:p>
+      <w:pPr>
+        <w:pStyle w:val="ListBullet"/>
+      </w:pPr>
+      <w:r>
+        <w:rPr>
+          <w:rFonts w:ascii="Calibri" w:hAnsi="Calibri"/>
+          <w:color w:val="375623"/>
+          <w:sz w:val="21"/>
+        </w:rPr>
+        <w:t>For requirements where sharing must persist after an ownership change, utilize Apex Managed Sharing with a custom RowCause instead of Manual Sharing.</w:t>
+      </w:r>
+    </w:p>
+    <w:p>
+      <w:pPr>
+        <w:pStyle w:val="ListBullet"/>
+      </w:pPr>
+      <w:r>
+        <w:rPr>
+          <w:rFonts w:ascii="Calibri" w:hAnsi="Calibri"/>
+          <w:color w:val="375623"/>
+          <w:sz w:val="21"/>
+        </w:rPr>
+        <w:t>Limit the number of users with 'Transfer Record' permissions to prevent the accidental wiping of manual share settings.</w:t>
+      </w:r>
+    </w:p>
+    <w:p>
+      <w:pPr>
+        <w:pStyle w:val="ListBullet"/>
+      </w:pPr>
+      <w:r>
+        <w:rPr>
+          <w:rFonts w:ascii="Calibri" w:hAnsi="Calibri"/>
+          <w:color w:val="375623"/>
+          <w:sz w:val="21"/>
+        </w:rPr>
+        <w:t>Regularly audit Share tables using SOQL where RowCause = 'Manual' to identify potential over-exposure of data.</w:t>
+      </w:r>
+    </w:p>
+    <w:p/>
+    <w:tbl>
+      <w:tblPr>
+        <w:tblStyle w:val="TableGrid"/>
+        <w:tblW w:w="0" w:type="auto"/>
+        <w:tblLook w:val="04A0" w:firstRow="1" w:lastRow="0" w:firstColumn="1" w:lastColumn="0" w:noHBand="0" w:noVBand="1"/>
+      </w:tblPr>
+      <w:tblGrid>
+        <w:gridCol w:w="8640"/>
+      </w:tblGrid>
+      <w:tr>
+        <w:tc>
+          <w:tcPr>
+            <w:tcW w:w="8640" w:type="dxa"/>
+            <w:tcBorders>
+              <w:top w:val="single" w:sz="4" w:space="0" w:color="FCE4D6"/>
+              <w:left w:val="single" w:sz="4" w:space="0" w:color="FCE4D6"/>
+              <w:bottom w:val="single" w:sz="4" w:space="0" w:color="FCE4D6"/>
+              <w:right w:val="single" w:sz="4" w:space="0" w:color="FCE4D6"/>
+            </w:tcBorders>
+            <w:shd w:val="clear" w:color="auto" w:fill="FCE4D6"/>
+            <w:tcMar>
+              <w:top w:w="100" w:type="dxa"/>
+              <w:left w:w="100" w:type="dxa"/>
+              <w:bottom w:w="100" w:type="dxa"/>
+              <w:right w:w="100" w:type="dxa"/>
+            </w:tcMar>
+          </w:tcPr>
+          <w:p>
+            <w:r>
+              <w:rPr>
+                <w:rFonts w:ascii="Calibri" w:hAnsi="Calibri"/>
+                <w:b/>
+                <w:color w:val="833C00"/>
+              </w:rPr>
+              <w:t xml:space="preserve">  ⚠  Limitations</w:t>
+            </w:r>
+          </w:p>
+        </w:tc>
+      </w:tr>
+    </w:tbl>
+    <w:p/>
+    <w:p>
+      <w:pPr>
+        <w:pStyle w:val="ListBullet"/>
+      </w:pPr>
+      <w:r>
+        <w:rPr>
+          <w:rFonts w:ascii="Calibri" w:hAnsi="Calibri"/>
+          <w:color w:val="833C00"/>
+          <w:sz w:val="21"/>
+        </w:rPr>
+        <w:t>Manual sharing is not available for objects where the OWD is set to 'Controlled by Parent'.</w:t>
+      </w:r>
+    </w:p>
+    <w:p>
+      <w:pPr>
+        <w:pStyle w:val="ListBullet"/>
+      </w:pPr>
+      <w:r>
+        <w:rPr>
+          <w:rFonts w:ascii="Calibri" w:hAnsi="Calibri"/>
+          <w:color w:val="833C00"/>
+          <w:sz w:val="21"/>
+        </w:rPr>
+        <w:t>Manual shares are ephemeral; they do not survive record owner changes.</w:t>
+      </w:r>
+    </w:p>
+    <w:p>
+      <w:pPr>
+        <w:pStyle w:val="ListBullet"/>
+      </w:pPr>
+      <w:r>
+        <w:rPr>
+          <w:rFonts w:ascii="Calibri" w:hAnsi="Calibri"/>
+          <w:color w:val="833C00"/>
+          <w:sz w:val="21"/>
+        </w:rPr>
+        <w:t>High volumes of manual shares can lead to performance bottlenecks during 'Sharing Recalculation' processes.</w:t>
+      </w:r>
+    </w:p>
+    <w:p>
+      <w:pPr>
+        <w:pStyle w:val="ListBullet"/>
+      </w:pPr>
+      <w:r>
+        <w:rPr>
+          <w:rFonts w:ascii="Calibri" w:hAnsi="Calibri"/>
+          <w:color w:val="833C00"/>
+          <w:sz w:val="21"/>
+        </w:rPr>
+        <w:t>Manual sharing cannot be used to restrict access; it can only grant additional access beyond the OWD.</w:t>
+      </w:r>
+    </w:p>
+    <w:p/>
+    <w:tbl>
+      <w:tblPr>
+        <w:tblStyle w:val="TableGrid"/>
+        <w:tblW w:w="0" w:type="auto"/>
+        <w:tblLook w:val="04A0" w:firstRow="1" w:lastRow="0" w:firstColumn="1" w:lastColumn="0" w:noHBand="0" w:noVBand="1"/>
+      </w:tblPr>
+      <w:tblGrid>
+        <w:gridCol w:w="8640"/>
+      </w:tblGrid>
+      <w:tr>
+        <w:tc>
+          <w:tcPr>
+            <w:tcW w:w="8640" w:type="dxa"/>
+            <w:tcBorders>
+              <w:top w:val="single" w:sz="4" w:space="0" w:color="2E75B6"/>
+              <w:left w:val="single" w:sz="4" w:space="0" w:color="2E75B6"/>
+              <w:bottom w:val="single" w:sz="4" w:space="0" w:color="2E75B6"/>
+              <w:right w:val="single" w:sz="4" w:space="0" w:color="2E75B6"/>
+            </w:tcBorders>
+            <w:shd w:val="clear" w:color="auto" w:fill="2E75B6"/>
+            <w:tcMar>
+              <w:top w:w="100" w:type="dxa"/>
+              <w:left w:w="100" w:type="dxa"/>
+              <w:bottom w:w="100" w:type="dxa"/>
+              <w:right w:w="100" w:type="dxa"/>
+            </w:tcMar>
+          </w:tcPr>
+          <w:p>
+            <w:r>
+              <w:rPr>
+                <w:rFonts w:ascii="Calibri" w:hAnsi="Calibri"/>
+                <w:b/>
+                <w:color w:val="FFFFFF"/>
+                <w:sz w:val="24"/>
+              </w:rPr>
+              <w:t xml:space="preserve">  Data Access Flow</w:t>
+            </w:r>
+          </w:p>
+        </w:tc>
+      </w:tr>
+    </w:tbl>
+    <w:p/>
+    <w:tbl>
+      <w:tblPr>
+        <w:tblStyle w:val="TableGrid"/>
+        <w:tblW w:w="0" w:type="auto"/>
+        <w:tblLook w:val="04A0" w:firstRow="1" w:lastRow="0" w:firstColumn="1" w:lastColumn="0" w:noHBand="0" w:noVBand="1"/>
+      </w:tblPr>
+      <w:tblGrid>
+        <w:gridCol w:w="8640"/>
+      </w:tblGrid>
+      <w:tr>
+        <w:tc>
+          <w:tcPr>
+            <w:tcW w:w="8640" w:type="dxa"/>
+            <w:tcBorders>
+              <w:top w:val="single" w:sz="18" w:space="0" w:color="2E75B6"/>
+              <w:left w:val="single" w:sz="18" w:space="0" w:color="2E75B6"/>
+              <w:bottom w:val="single" w:sz="18" w:space="0" w:color="2E75B6"/>
+              <w:right w:val="single" w:sz="18" w:space="0" w:color="2E75B6"/>
+            </w:tcBorders>
+            <w:shd w:val="clear" w:color="auto" w:fill="EBF3FB"/>
+          </w:tcPr>
+          <w:p>
+            <w:r>
+              <w:rPr>
+                <w:rFonts w:ascii="Consolas" w:hAnsi="Consolas"/>
+                <w:color w:val="1F3864"/>
+                <w:sz w:val="20"/>
+              </w:rPr>
+              <w:t xml:space="preserve">Record Owner  →  Click 'Sharing' Button  →  Select User/Group/Role  →  Set Access Level (Read/Edit)  →  Salesforce Engine  →  Creates [Object]Share </w:t>
+            </w:r>
+            <w:r>
+              <w:rPr>
+                <w:rFonts w:ascii="Consolas" w:hAnsi="Consolas"/>
+                <w:color w:val="1F3864"/>
+                <w:sz w:val="20"/>
+              </w:rPr>
+              <w:lastRenderedPageBreak/>
+              <w:t>Record  →  RowCause set to 'Manual'  →  Access Granted  →  [Event: Owner Change]  →  Salesforce Engine  →  Deletes Share Record  →  Access Revoked</w:t>
+            </w:r>
+          </w:p>
+        </w:tc>
+      </w:tr>
+    </w:tbl>
+    <w:p/>
+    <w:tbl>
+      <w:tblPr>
+        <w:tblStyle w:val="TableGrid"/>
+        <w:tblW w:w="0" w:type="auto"/>
+        <w:tblLook w:val="04A0" w:firstRow="1" w:lastRow="0" w:firstColumn="1" w:lastColumn="0" w:noHBand="0" w:noVBand="1"/>
+      </w:tblPr>
+      <w:tblGrid>
+        <w:gridCol w:w="8640"/>
+      </w:tblGrid>
+      <w:tr>
+        <w:tc>
+          <w:tcPr>
+            <w:tcW w:w="8640" w:type="dxa"/>
+            <w:tcBorders>
+              <w:top w:val="single" w:sz="4" w:space="0" w:color="FFF2CC"/>
+              <w:left w:val="single" w:sz="4" w:space="0" w:color="FFF2CC"/>
+              <w:bottom w:val="single" w:sz="4" w:space="0" w:color="FFF2CC"/>
+              <w:right w:val="single" w:sz="4" w:space="0" w:color="FFF2CC"/>
+            </w:tcBorders>
+            <w:shd w:val="clear" w:color="auto" w:fill="FFF2CC"/>
+            <w:tcMar>
+              <w:top w:w="100" w:type="dxa"/>
+              <w:left w:w="100" w:type="dxa"/>
+              <w:bottom w:w="100" w:type="dxa"/>
+              <w:right w:w="100" w:type="dxa"/>
+            </w:tcMar>
+          </w:tcPr>
+          <w:p>
+            <w:r>
+              <w:rPr>
+                <w:rFonts w:ascii="Calibri" w:hAnsi="Calibri"/>
+                <w:b/>
+                <w:color w:val="7F6000"/>
+              </w:rPr>
+              <w:t xml:space="preserve">  Example</w:t>
+            </w:r>
+          </w:p>
+        </w:tc>
+      </w:tr>
+    </w:tbl>
+    <w:p/>
+    <w:tbl>
+      <w:tblPr>
+        <w:tblStyle w:val="TableGrid"/>
+        <w:tblW w:w="0" w:type="auto"/>
+        <w:tblLook w:val="04A0" w:firstRow="1" w:lastRow="0" w:firstColumn="1" w:lastColumn="0" w:noHBand="0" w:noVBand="1"/>
+      </w:tblPr>
+      <w:tblGrid>
+        <w:gridCol w:w="8640"/>
+      </w:tblGrid>
+      <w:tr>
+        <w:tc>
+          <w:tcPr>
+            <w:tcW w:w="8640" w:type="dxa"/>
+            <w:tcBorders>
+              <w:top w:val="single" w:sz="18" w:space="0" w:color="F4B942"/>
+              <w:left w:val="single" w:sz="18" w:space="0" w:color="F4B942"/>
+              <w:bottom w:val="single" w:sz="18" w:space="0" w:color="F4B942"/>
+              <w:right w:val="single" w:sz="18" w:space="0" w:color="F4B942"/>
+            </w:tcBorders>
+            <w:shd w:val="clear" w:color="auto" w:fill="FFF2CC"/>
+          </w:tcPr>
+          <w:p>
+            <w:r>
+              <w:rPr>
+                <w:rFonts w:ascii="Consolas" w:hAnsi="Consolas"/>
+                <w:color w:val="7F6000"/>
+                <w:sz w:val="20"/>
+              </w:rPr>
+              <w:t>Inserting a manual share for a custom object 'Job_Application__c' via Apex: Job_Application__Share jobShare = new Job_Application__Share(); jobShare.ParentId = 'a01...'; jobShare.UserOrGroupId = '005...'; jobShare.AccessLevel = 'Read'; jobShare.RowCause = Schema.Job_Application__Share.RowCause.Manual; insert jobShare;</w:t>
             </w:r>
           </w:p>
         </w:tc>
@@ -7400,7 +10986,7 @@
   <w:abstractNum w:abstractNumId="8" w15:restartNumberingAfterBreak="0">
     <w:nsid w:val="FFFFFF89"/>
     <w:multiLevelType w:val="singleLevel"/>
-    <w:tmpl w:val="5210A160"/>
+    <w:tmpl w:val="E556C4E2"/>
     <w:lvl w:ilvl="0">
       <w:start w:val="1"/>
       <w:numFmt w:val="bullet"/>

</xml_diff>